<commit_message>
Correct Jun Yang's Chinese name in the guides and manual; log guide-for-adjudicator answer
Co-Authored-By: Claude Sonnet 5.5 <noreply@anthropic.com>
Claude-Session: https://claude.ai/code/session_01FRD7etKqYN8v2bbXeeLMRW
</commit_message>
<xml_diff>
--- a/Full-text screening guide (draft).docx
+++ b/Full-text screening guide (draft).docx
@@ -22,7 +22,7 @@
         <w:rPr>
           <w:rFonts w:ascii="Calibri" w:cs="Calibri" w:eastAsia="Microsoft YaHei" w:hAnsi="Calibri"/>
         </w:rPr>
-        <w:t xml:space="preserve">适用对象：舒俊（筛选员 1）、彭飞（筛选员 2）、杨军（仲裁）。草稿日期：2026 年 10 月 11 日（v2026-10-11a）。</w:t>
+        <w:t xml:space="preserve">适用对象：舒俊（筛选员 1）、彭飞（筛选员 2）、杨俊（仲裁）。草稿日期：2026 年 10 月 11 日（v2026-10-11a）。</w:t>
       </w:r>
       <w:r>
         <w:rPr>
@@ -205,7 +205,7 @@
         <w:rPr>
           <w:rFonts w:ascii="Calibri" w:cs="Calibri" w:eastAsia="Microsoft YaHei" w:hAnsi="Calibri"/>
         </w:rPr>
-        <w:t xml:space="preserve"> 分歧先讨论，讨论不了的交杨军（协议第 14 节）。独立完成之前，不看对方的记录，不讨论具体的篇目。</w:t>
+        <w:t xml:space="preserve"> 分歧先讨论，讨论不了的交杨俊（协议第 14 节）。独立完成之前，不看对方的记录，不讨论具体的篇目。</w:t>
       </w:r>
     </w:p>
     <w:p>
@@ -336,7 +336,7 @@
         <w:rPr>
           <w:rFonts w:ascii="Calibri" w:cs="Calibri" w:eastAsia="Microsoft YaHei" w:hAnsi="Calibri"/>
         </w:rPr>
-        <w:t xml:space="preserve">两人都完成后比对；分歧先讨论，讨论不了的交杨军（第 10 节）。</w:t>
+        <w:t xml:space="preserve">两人都完成后比对；分歧先讨论，讨论不了的交杨俊（第 10 节）。</w:t>
       </w:r>
     </w:p>
     <w:p>
@@ -5558,7 +5558,7 @@
         <w:rPr>
           <w:rFonts w:ascii="Calibri" w:cs="Calibri" w:eastAsia="Microsoft YaHei" w:hAnsi="Calibri"/>
         </w:rPr>
-        <w:t xml:space="preserve"> 先由舒俊和彭飞讨论；讨论不一致的交杨军。杨军直接看导出的清单（含决定、理由、备注）；填 </w:t>
+        <w:t xml:space="preserve"> 先由舒俊和彭飞讨论；讨论不一致的交杨俊。杨俊直接看导出的清单（含决定、理由、备注）；填 </w:t>
       </w:r>
       <w:r>
         <w:rPr>

</xml_diff>

<commit_message>
Date rule: reports published before 2000 are not sought; retrieval list, full-text guide v2026-10-17a and manuscript draft updated
Co-Authored-By: Claude Sonnet 5.5 <noreply@anthropic.com>
Claude-Session: https://claude.ai/code/session_01FRD7etKqYN8v2bbXeeLMRW
</commit_message>
<xml_diff>
--- a/Full-text screening guide (draft).docx
+++ b/Full-text screening guide (draft).docx
@@ -22,7 +22,21 @@
         <w:rPr>
           <w:rFonts w:ascii="Calibri" w:cs="Calibri" w:eastAsia="Microsoft YaHei" w:hAnsi="Calibri"/>
         </w:rPr>
-        <w:t xml:space="preserve">适用对象：舒俊（筛选员 1）、彭飞（筛选员 2）、杨俊（仲裁）。草稿日期：2026 年 10 月 11 日（v2026-10-11a）。</w:t>
+        <w:t xml:space="preserve">适用对象：舒俊（筛选员 1）、第二位全文筛选员（</w:t>
+      </w:r>
+      <w:r>
+        <w:rPr>
+          <w:rFonts w:ascii="Calibri" w:cs="Calibri" w:eastAsia="Microsoft YaHei" w:hAnsi="Calibri"/>
+          <w:b/>
+          <w:bCs/>
+        </w:rPr>
+        <w:t xml:space="preserve">待定</w:t>
+      </w:r>
+      <w:r>
+        <w:rPr>
+          <w:rFonts w:ascii="Calibri" w:cs="Calibri" w:eastAsia="Microsoft YaHei" w:hAnsi="Calibri"/>
+        </w:rPr>
+        <w:t xml:space="preserve">，尚未确定人选）、杨俊（仲裁）。草稿日期：2026 年 10 月 11 日（v2026-10-11a）；2026 年 10 月 17 日更新为 v2026-10-17a。</w:t>
       </w:r>
       <w:r>
         <w:rPr>
@@ -37,6 +51,54 @@
           <w:rFonts w:ascii="Calibri" w:cs="Calibri" w:eastAsia="Microsoft YaHei" w:hAnsi="Calibri"/>
         </w:rPr>
         <w:t xml:space="preserve"> 本指南只是把已注册协议（第 7、10、14 节）的纳入排除标准落成全文阶段的操作规则，不改变协议。带【建议】的是 Claude 的操作化，需要三位决定；第 13 节列出了所有待决定的事项。</w:t>
+      </w:r>
+    </w:p>
+    <w:p>
+      <w:pPr>
+        <w:spacing w:after="120"/>
+      </w:pPr>
+      <w:r>
+        <w:rPr>
+          <w:rFonts w:ascii="Calibri" w:cs="Calibri" w:eastAsia="Microsoft YaHei" w:hAnsi="Calibri"/>
+          <w:b/>
+          <w:bCs/>
+        </w:rPr>
+        <w:t xml:space="preserve">v2026-10-17a 的改动：</w:t>
+      </w:r>
+      <w:r>
+        <w:rPr>
+          <w:rFonts w:ascii="Calibri" w:cs="Calibri" w:eastAsia="Microsoft YaHei" w:hAnsi="Calibri"/>
+        </w:rPr>
+        <w:t xml:space="preserve"> (1) </w:t>
+      </w:r>
+      <w:r>
+        <w:rPr>
+          <w:rFonts w:ascii="Calibri" w:cs="Calibri" w:eastAsia="Microsoft YaHei" w:hAnsi="Calibri"/>
+          <w:b/>
+          <w:bCs/>
+        </w:rPr>
+        <w:t xml:space="preserve">新增日期规则：2000 年以前发表的报告不取全文</w:t>
+      </w:r>
+      <w:r>
+        <w:rPr>
+          <w:rFonts w:ascii="Calibri" w:cs="Calibri" w:eastAsia="Microsoft YaHei" w:hAnsi="Calibri"/>
+        </w:rPr>
+        <w:t xml:space="preserve">（作者 2026 年 10 月 17 日决定；理由码 </w:t>
+      </w:r>
+      <w:r>
+        <w:rPr>
+          <w:rFonts w:ascii="Consolas" w:cs="Consolas" w:eastAsia="Microsoft YaHei" w:hAnsi="Consolas"/>
+          <w:sz w:val="19"/>
+          <w:szCs w:val="19"/>
+          <w:shd w:fill="EEEEEE" w:val="clear"/>
+        </w:rPr>
+        <w:t xml:space="preserve">Y</w:t>
+      </w:r>
+      <w:r>
+        <w:rPr>
+          <w:rFonts w:ascii="Calibri" w:cs="Calibri" w:eastAsia="Microsoft YaHei" w:hAnsi="Calibri"/>
+        </w:rPr>
+        <w:t xml:space="preserve">，见 4.1）。这不是协议原有的纳入标准（协议第 7 节没有日期限制），是对已注册标准的偏离，要写进方案修订（v1.5）和方法部分的“偏离方案”；决定是在尚未取得任何全文、尚未提取任何数据时做出的。杨俊和第二位筛选员需要知道这一条。(2) 数量按标题摘要阶段的实际结果更新（第 1、4.1、14 节），不再用校准外推的估计。(3) 第二位筛选员尚未确定，文中原来写“彭飞”的地方改为“第二位筛选员”。(4) 理由码顺序加入 Y（第 5 节、D3）。除此之外，纳入排除的判断规则（6.2–6.7 和第 7 节的情形）没有改动。</w:t>
       </w:r>
     </w:p>
     <w:p>
@@ -105,135 +167,21 @@
         <w:rPr>
           <w:rFonts w:ascii="Calibri" w:cs="Calibri" w:eastAsia="Microsoft YaHei" w:hAnsi="Calibri"/>
         </w:rPr>
-        <w:t xml:space="preserve"> 标题摘要阶段结束后进入全文的记录，即两人一致的 Include 和 Maybe，加上分歧解决后的 Include 和 Maybe（标题摘要指南第 7 节）。具体数量要等标题摘要阶段结束才知道。按校准时进入全文的比例（48–56%）粗估：英文和中文记录共 2,173 条，约 1,050–1,220 篇需要取全文（外推，n = 50，误差很大）。英文、中文以外的 375 条不取全文，按 L 处理（见 4.1）。</w:t>
-      </w:r>
-    </w:p>
-    <w:p>
-      <w:pPr>
-        <w:pStyle w:val="ListParagraph"/>
-        <w:numPr>
-          <w:ilvl w:val="0"/>
-          <w:numId w:val="2"/>
-        </w:numPr>
-        <w:spacing w:after="60"/>
-      </w:pPr>
-      <w:r>
-        <w:rPr>
-          <w:rFonts w:ascii="Calibri" w:cs="Calibri" w:eastAsia="Microsoft YaHei" w:hAnsi="Calibri"/>
-          <w:b/>
-          <w:bCs/>
-        </w:rPr>
-        <w:t xml:space="preserve">与标题摘要阶段的区别：</w:t>
-      </w:r>
-      <w:r>
-        <w:rPr>
-          <w:rFonts w:ascii="Calibri" w:cs="Calibri" w:eastAsia="Microsoft YaHei" w:hAnsi="Calibri"/>
-        </w:rPr>
-        <w:t xml:space="preserve"> 这里</w:t>
-      </w:r>
-      <w:r>
-        <w:rPr>
-          <w:rFonts w:ascii="Calibri" w:cs="Calibri" w:eastAsia="Microsoft YaHei" w:hAnsi="Calibri"/>
-          <w:b/>
-          <w:bCs/>
-        </w:rPr>
-        <w:t xml:space="preserve">不再是"拿不准就留"</w:t>
-      </w:r>
-      <w:r>
-        <w:rPr>
-          <w:rFonts w:ascii="Calibri" w:cs="Calibri" w:eastAsia="Microsoft YaHei" w:hAnsi="Calibri"/>
-        </w:rPr>
-        <w:t xml:space="preserve">。全文提供了判断需要的信息，要依据全文里写的内容决定 Include 或 Exclude；</w:t>
-      </w:r>
-      <w:r>
-        <w:rPr>
-          <w:rFonts w:ascii="Calibri" w:cs="Calibri" w:eastAsia="Microsoft YaHei" w:hAnsi="Calibri"/>
-          <w:b/>
-          <w:bCs/>
-        </w:rPr>
-        <w:t xml:space="preserve">不要用 Maybe 表示拿不准</w:t>
-      </w:r>
-      <w:r>
-        <w:rPr>
-          <w:rFonts w:ascii="Calibri" w:cs="Calibri" w:eastAsia="Microsoft YaHei" w:hAnsi="Calibri"/>
-        </w:rPr>
-        <w:t xml:space="preserve">——先在备注里写明疑问，两人讨论，讨论不了的才走第 10 节的仲裁。</w:t>
-      </w:r>
-    </w:p>
-    <w:p>
-      <w:pPr>
-        <w:pStyle w:val="ListParagraph"/>
-        <w:numPr>
-          <w:ilvl w:val="0"/>
-          <w:numId w:val="2"/>
-        </w:numPr>
-        <w:spacing w:after="60"/>
-      </w:pPr>
-      <w:r>
-        <w:rPr>
-          <w:rFonts w:ascii="Calibri" w:cs="Calibri" w:eastAsia="Microsoft YaHei" w:hAnsi="Calibri"/>
-          <w:b/>
-          <w:bCs/>
-        </w:rPr>
-        <w:t xml:space="preserve">结果有三种：</w:t>
-      </w:r>
-      <w:r>
-        <w:rPr>
-          <w:rFonts w:ascii="Calibri" w:cs="Calibri" w:eastAsia="Microsoft YaHei" w:hAnsi="Calibri"/>
-        </w:rPr>
-        <w:t xml:space="preserve"> Include（进入数据提取）；Exclude（必须选一个固定理由）；Pending IPD（只有汇总数据，已索取或将要索取个体数据，见第 8 节，最终要变成前两种之一）。</w:t>
-      </w:r>
-    </w:p>
-    <w:p>
-      <w:pPr>
-        <w:pStyle w:val="ListParagraph"/>
-        <w:numPr>
-          <w:ilvl w:val="0"/>
-          <w:numId w:val="2"/>
-        </w:numPr>
-        <w:spacing w:after="60"/>
-      </w:pPr>
-      <w:r>
-        <w:rPr>
-          <w:rFonts w:ascii="Calibri" w:cs="Calibri" w:eastAsia="Microsoft YaHei" w:hAnsi="Calibri"/>
-          <w:b/>
-          <w:bCs/>
-        </w:rPr>
-        <w:t xml:space="preserve">仍然是两人独立、盲法。</w:t>
-      </w:r>
-      <w:r>
-        <w:rPr>
-          <w:rFonts w:ascii="Calibri" w:cs="Calibri" w:eastAsia="Microsoft YaHei" w:hAnsi="Calibri"/>
-        </w:rPr>
-        <w:t xml:space="preserve"> 分歧先讨论，讨论不了的交杨俊（协议第 14 节）。独立完成之前，不看对方的记录，不讨论具体的篇目。</w:t>
-      </w:r>
-    </w:p>
-    <w:p>
-      <w:pPr>
-        <w:pStyle w:val="Heading2"/>
-        <w:keepNext/>
-      </w:pPr>
-      <w:r>
-        <w:rPr>
-          <w:rFonts w:ascii="Calibri" w:cs="Calibri" w:eastAsia="Microsoft YaHei" w:hAnsi="Calibri"/>
-        </w:rPr>
-        <w:t xml:space="preserve">2. 一页流程</w:t>
-      </w:r>
-    </w:p>
-    <w:p>
-      <w:pPr>
-        <w:pStyle w:val="ListParagraph"/>
-        <w:numPr>
-          <w:ilvl w:val="0"/>
-          <w:numId w:val="3"/>
-        </w:numPr>
-        <w:spacing w:after="60"/>
-      </w:pPr>
-      <w:r>
-        <w:rPr>
-          <w:rFonts w:ascii="Calibri" w:cs="Calibri" w:eastAsia="Microsoft YaHei" w:hAnsi="Calibri"/>
-        </w:rPr>
-        <w:t xml:space="preserve">从标题摘要阶段的最终决定生成全文清单（脚本 </w:t>
+        <w:t xml:space="preserve"> 标题摘要阶段结束后进入全文的记录，即两人一致的 Include 和 Maybe，加上分歧解决后的 Include 和 Maybe（标题摘要指南第 7 节）。标题摘要阶段已于 2026 年 10 月 17 日结束：2,548 条记录里 1,064 条进入全文（两人都保留的 762 条，加杨俊盲评后保留的 302 条），再加杨俊判为 E4、但第二位评审员保留的 27 条（作者 10 月 17 日决定一并取全文核对，因为 E4 常常基于截断的摘要，可能掩盖病例系列），共 </w:t>
+      </w:r>
+      <w:r>
+        <w:rPr>
+          <w:rFonts w:ascii="Calibri" w:cs="Calibri" w:eastAsia="Microsoft YaHei" w:hAnsi="Calibri"/>
+          <w:b/>
+          <w:bCs/>
+        </w:rPr>
+        <w:t xml:space="preserve">1,091 条</w:t>
+      </w:r>
+      <w:r>
+        <w:rPr>
+          <w:rFonts w:ascii="Calibri" w:cs="Calibri" w:eastAsia="Microsoft YaHei" w:hAnsi="Calibri"/>
+        </w:rPr>
+        <w:t xml:space="preserve">。清单在 </w:t>
       </w:r>
       <w:r>
         <w:rPr>
@@ -242,253 +190,13 @@
           <w:szCs w:val="19"/>
           <w:shd w:fill="EEEEEE" w:val="clear"/>
         </w:rPr>
-        <w:t xml:space="preserve">tools/screening_conflicts.py</w:t>
-      </w:r>
-      <w:r>
-        <w:rPr>
-          <w:rFonts w:ascii="Calibri" w:cs="Calibri" w:eastAsia="Microsoft YaHei" w:hAnsi="Calibri"/>
-        </w:rPr>
-        <w:t xml:space="preserve"> 的输出）。</w:t>
-      </w:r>
-    </w:p>
-    <w:p>
-      <w:pPr>
-        <w:pStyle w:val="ListParagraph"/>
-        <w:numPr>
-          <w:ilvl w:val="0"/>
-          <w:numId w:val="3"/>
-        </w:numPr>
-        <w:spacing w:after="60"/>
-      </w:pPr>
-      <w:r>
-        <w:rPr>
-          <w:rFonts w:ascii="Calibri" w:cs="Calibri" w:eastAsia="Microsoft YaHei" w:hAnsi="Calibri"/>
-          <w:b/>
-          <w:bCs/>
-        </w:rPr>
-        <w:t xml:space="preserve">按语种分流：</w:t>
-      </w:r>
-      <w:r>
-        <w:rPr>
-          <w:rFonts w:ascii="Calibri" w:cs="Calibri" w:eastAsia="Microsoft YaHei" w:hAnsi="Calibri"/>
-        </w:rPr>
-        <w:t xml:space="preserve"> 非英文、非中文 → 理由 L，不取全文（4.1）。</w:t>
-      </w:r>
-    </w:p>
-    <w:p>
-      <w:pPr>
-        <w:pStyle w:val="ListParagraph"/>
-        <w:numPr>
-          <w:ilvl w:val="0"/>
-          <w:numId w:val="3"/>
-        </w:numPr>
-        <w:spacing w:after="60"/>
-      </w:pPr>
-      <w:r>
-        <w:rPr>
-          <w:rFonts w:ascii="Calibri" w:cs="Calibri" w:eastAsia="Microsoft YaHei" w:hAnsi="Calibri"/>
-          <w:b/>
-          <w:bCs/>
-        </w:rPr>
-        <w:t xml:space="preserve">取全文：</w:t>
-      </w:r>
-      <w:r>
-        <w:rPr>
-          <w:rFonts w:ascii="Calibri" w:cs="Calibri" w:eastAsia="Microsoft YaHei" w:hAnsi="Calibri"/>
-        </w:rPr>
-        <w:t xml:space="preserve"> 取不到 → 理由 D，记下试过的途径（4.2、4.3）。</w:t>
-      </w:r>
-    </w:p>
-    <w:p>
-      <w:pPr>
-        <w:pStyle w:val="ListParagraph"/>
-        <w:numPr>
-          <w:ilvl w:val="0"/>
-          <w:numId w:val="3"/>
-        </w:numPr>
-        <w:spacing w:after="60"/>
-      </w:pPr>
-      <w:r>
-        <w:rPr>
-          <w:rFonts w:ascii="Calibri" w:cs="Calibri" w:eastAsia="Microsoft YaHei" w:hAnsi="Calibri"/>
-          <w:b/>
-          <w:bCs/>
-        </w:rPr>
-        <w:t xml:space="preserve">两人各自独立读全文</w:t>
-      </w:r>
-      <w:r>
-        <w:rPr>
-          <w:rFonts w:ascii="Calibri" w:cs="Calibri" w:eastAsia="Microsoft YaHei" w:hAnsi="Calibri"/>
-        </w:rPr>
-        <w:t xml:space="preserve">，按第 6 节的顺序回答问题，把决定记到记录表（第 9 节）。</w:t>
-      </w:r>
-    </w:p>
-    <w:p>
-      <w:pPr>
-        <w:pStyle w:val="ListParagraph"/>
-        <w:numPr>
-          <w:ilvl w:val="0"/>
-          <w:numId w:val="3"/>
-        </w:numPr>
-        <w:spacing w:after="60"/>
-      </w:pPr>
-      <w:r>
-        <w:rPr>
-          <w:rFonts w:ascii="Calibri" w:cs="Calibri" w:eastAsia="Microsoft YaHei" w:hAnsi="Calibri"/>
-        </w:rPr>
-        <w:t xml:space="preserve">两人都完成后比对；分歧先讨论，讨论不了的交杨俊（第 10 节）。</w:t>
-      </w:r>
-    </w:p>
-    <w:p>
-      <w:pPr>
-        <w:pStyle w:val="ListParagraph"/>
-        <w:numPr>
-          <w:ilvl w:val="0"/>
-          <w:numId w:val="3"/>
-        </w:numPr>
-        <w:spacing w:after="60"/>
-      </w:pPr>
-      <w:r>
-        <w:rPr>
-          <w:rFonts w:ascii="Calibri" w:cs="Calibri" w:eastAsia="Microsoft YaHei" w:hAnsi="Calibri"/>
-        </w:rPr>
-        <w:t xml:space="preserve">只有汇总数据的报告：一次性批量发 IPD 索取邮件，间隔 4 周发两封（第 8 节）。</w:t>
-      </w:r>
-    </w:p>
-    <w:p>
-      <w:pPr>
-        <w:pStyle w:val="ListParagraph"/>
-        <w:numPr>
-          <w:ilvl w:val="0"/>
-          <w:numId w:val="3"/>
-        </w:numPr>
-        <w:spacing w:after="60"/>
-      </w:pPr>
-      <w:r>
-        <w:rPr>
-          <w:rFonts w:ascii="Calibri" w:cs="Calibri" w:eastAsia="Microsoft YaHei" w:hAnsi="Calibri"/>
-        </w:rPr>
-        <w:t xml:space="preserve">最终名单 → 数据提取（提取工作簿）。</w:t>
-      </w:r>
-    </w:p>
-    <w:p>
-      <w:pPr>
-        <w:pStyle w:val="ListParagraph"/>
-        <w:numPr>
-          <w:ilvl w:val="0"/>
-          <w:numId w:val="3"/>
-        </w:numPr>
-        <w:spacing w:after="60"/>
-      </w:pPr>
-      <w:r>
-        <w:rPr>
-          <w:rFonts w:ascii="Calibri" w:cs="Calibri" w:eastAsia="Microsoft YaHei" w:hAnsi="Calibri"/>
-        </w:rPr>
-        <w:t xml:space="preserve">统计 PRISMA 数字（第 11 节）。</w:t>
-      </w:r>
-    </w:p>
-    <w:p>
-      <w:pPr>
-        <w:pStyle w:val="Heading2"/>
-        <w:keepNext/>
-      </w:pPr>
-      <w:r>
-        <w:rPr>
-          <w:rFonts w:ascii="Calibri" w:cs="Calibri" w:eastAsia="Microsoft YaHei" w:hAnsi="Calibri"/>
-        </w:rPr>
-        <w:t xml:space="preserve">3. 用什么工具记录</w:t>
-      </w:r>
-    </w:p>
-    <w:p>
-      <w:pPr>
-        <w:pStyle w:val="ListParagraph"/>
-        <w:numPr>
-          <w:ilvl w:val="0"/>
-          <w:numId w:val="2"/>
-        </w:numPr>
-        <w:spacing w:after="60"/>
-      </w:pPr>
-      <w:r>
-        <w:rPr>
-          <w:rFonts w:ascii="Calibri" w:cs="Calibri" w:eastAsia="Microsoft YaHei" w:hAnsi="Calibri"/>
-          <w:b/>
-          <w:bCs/>
-        </w:rPr>
-        <w:t xml:space="preserve">首选 Rayyan 的 Full text screening 标签</w:t>
-      </w:r>
-      <w:r>
-        <w:rPr>
-          <w:rFonts w:ascii="Calibri" w:cs="Calibri" w:eastAsia="Microsoft YaHei" w:hAnsi="Calibri"/>
-        </w:rPr>
-        <w:t xml:space="preserve">（项目顶部有）。但 Claude 没有操作过这个标签：怎么把记录送进去、是否继续保持盲法、Attach PDF 怎么用、理由和标签怎么设置，都没有核实过（手册 V6）。开始之前请对照实际界面核对，核对结果补充到本指南。</w:t>
-      </w:r>
-    </w:p>
-    <w:p>
-      <w:pPr>
-        <w:pStyle w:val="ListParagraph"/>
-        <w:numPr>
-          <w:ilvl w:val="0"/>
-          <w:numId w:val="2"/>
-        </w:numPr>
-        <w:spacing w:after="60"/>
-      </w:pPr>
-      <w:r>
-        <w:rPr>
-          <w:rFonts w:ascii="Calibri" w:cs="Calibri" w:eastAsia="Microsoft YaHei" w:hAnsi="Calibri"/>
-          <w:b/>
-          <w:bCs/>
-        </w:rPr>
-        <w:t xml:space="preserve">备用（也可作为 Rayyan 之外的备份）：</w:t>
-      </w:r>
-      <w:r>
-        <w:rPr>
-          <w:rFonts w:ascii="Calibri" w:cs="Calibri" w:eastAsia="Microsoft YaHei" w:hAnsi="Calibri"/>
-        </w:rPr>
-        <w:t xml:space="preserve"> 提取工作簿里的 </w:t>
-      </w:r>
-      <w:r>
-        <w:rPr>
-          <w:rFonts w:ascii="Calibri" w:cs="Calibri" w:eastAsia="Microsoft YaHei" w:hAnsi="Calibri"/>
-          <w:b/>
-          <w:bCs/>
-        </w:rPr>
-        <w:t xml:space="preserve">FT_log</w:t>
-      </w:r>
-      <w:r>
-        <w:rPr>
-          <w:rFonts w:ascii="Calibri" w:cs="Calibri" w:eastAsia="Microsoft YaHei" w:hAnsi="Calibri"/>
-        </w:rPr>
-        <w:t xml:space="preserve"> 表，每人一份，列见第 9 节。无论用哪种，</w:t>
-      </w:r>
-      <w:r>
-        <w:rPr>
-          <w:rFonts w:ascii="Calibri" w:cs="Calibri" w:eastAsia="Microsoft YaHei" w:hAnsi="Calibri"/>
-          <w:b/>
-          <w:bCs/>
-        </w:rPr>
-        <w:t xml:space="preserve">理由名称一字不差</w:t>
-      </w:r>
-      <w:r>
-        <w:rPr>
-          <w:rFonts w:ascii="Calibri" w:cs="Calibri" w:eastAsia="Microsoft YaHei" w:hAnsi="Calibri"/>
-        </w:rPr>
-        <w:t xml:space="preserve">（第 5 节），盲法照旧。</w:t>
-      </w:r>
-    </w:p>
-    <w:p>
-      <w:pPr>
-        <w:pStyle w:val="ListParagraph"/>
-        <w:numPr>
-          <w:ilvl w:val="0"/>
-          <w:numId w:val="2"/>
-        </w:numPr>
-        <w:spacing w:after="60"/>
-      </w:pPr>
-      <w:r>
-        <w:rPr>
-          <w:rFonts w:ascii="Calibri" w:cs="Calibri" w:eastAsia="Microsoft YaHei" w:hAnsi="Calibri"/>
-        </w:rPr>
-        <w:t xml:space="preserve">Pending IPD 在 Rayyan 里怎么表示没有验证。【建议】用 Maybe 加标签 </w:t>
+        <w:t xml:space="preserve">search/screening/rescreen/fulltext_retrieval_list.csv</w:t>
+      </w:r>
+      <w:r>
+        <w:rPr>
+          <w:rFonts w:ascii="Calibri" w:cs="Calibri" w:eastAsia="Microsoft YaHei" w:hAnsi="Calibri"/>
+        </w:rPr>
+        <w:t xml:space="preserve">，计数在同目录的 </w:t>
       </w:r>
       <w:r>
         <w:rPr>
@@ -497,37 +205,127 @@
           <w:szCs w:val="19"/>
           <w:shd w:fill="EEEEEE" w:val="clear"/>
         </w:rPr>
-        <w:t xml:space="preserve">ipd-pending</w:t>
-      </w:r>
-      <w:r>
-        <w:rPr>
-          <w:rFonts w:ascii="Calibri" w:cs="Calibri" w:eastAsia="Microsoft YaHei" w:hAnsi="Calibri"/>
-        </w:rPr>
-        <w:t xml:space="preserve">；或者全文阶段的决定只记在 FT_log 里，Rayyan 只用来存 PDF。</w:t>
-      </w:r>
-    </w:p>
-    <w:p>
-      <w:pPr>
-        <w:pStyle w:val="ListParagraph"/>
-        <w:numPr>
-          <w:ilvl w:val="0"/>
-          <w:numId w:val="2"/>
-        </w:numPr>
-        <w:spacing w:after="60"/>
-      </w:pPr>
-      <w:r>
-        <w:rPr>
-          <w:rFonts w:ascii="Calibri" w:cs="Calibri" w:eastAsia="Microsoft YaHei" w:hAnsi="Calibri"/>
-          <w:b/>
-          <w:bCs/>
-        </w:rPr>
-        <w:t xml:space="preserve">PDF 的存放：</w:t>
-      </w:r>
-      <w:r>
-        <w:rPr>
-          <w:rFonts w:ascii="Calibri" w:cs="Calibri" w:eastAsia="Microsoft YaHei" w:hAnsi="Calibri"/>
-        </w:rPr>
-        <w:t xml:space="preserve"> 按 WS 编号命名（如 WS0123.pdf），放在各自的电脑或单位网盘。【建议】PDF 不放进仓库（版权和体积）；仓库里只放记录表。</w:t>
+        <w:t xml:space="preserve">fulltext_retrieval_summary.txt</w:t>
+      </w:r>
+      <w:r>
+        <w:rPr>
+          <w:rFonts w:ascii="Calibri" w:cs="Calibri" w:eastAsia="Microsoft YaHei" w:hAnsi="Calibri"/>
+        </w:rPr>
+        <w:t xml:space="preserve">。</w:t>
+      </w:r>
+      <w:r>
+        <w:rPr>
+          <w:rFonts w:ascii="Calibri" w:cs="Calibri" w:eastAsia="Microsoft YaHei" w:hAnsi="Calibri"/>
+          <w:b/>
+          <w:bCs/>
+        </w:rPr>
+        <w:t xml:space="preserve">其中 485 条发表于 2000 年以前（理由 Y），66 条是英文、中文以外的语种且发表于 2000 年或以后（理由 L），都不取全文；实际要取全文的是 540 篇</w:t>
+      </w:r>
+      <w:r>
+        <w:rPr>
+          <w:rFonts w:ascii="Calibri" w:cs="Calibri" w:eastAsia="Microsoft YaHei" w:hAnsi="Calibri"/>
+        </w:rPr>
+        <w:t xml:space="preserve">（英文 439、中文 101；有摘要 362、没有摘要 178）。</w:t>
+      </w:r>
+    </w:p>
+    <w:p>
+      <w:pPr>
+        <w:pStyle w:val="ListParagraph"/>
+        <w:numPr>
+          <w:ilvl w:val="0"/>
+          <w:numId w:val="2"/>
+        </w:numPr>
+        <w:spacing w:after="60"/>
+      </w:pPr>
+      <w:r>
+        <w:rPr>
+          <w:rFonts w:ascii="Calibri" w:cs="Calibri" w:eastAsia="Microsoft YaHei" w:hAnsi="Calibri"/>
+          <w:b/>
+          <w:bCs/>
+        </w:rPr>
+        <w:t xml:space="preserve">与标题摘要阶段的区别：</w:t>
+      </w:r>
+      <w:r>
+        <w:rPr>
+          <w:rFonts w:ascii="Calibri" w:cs="Calibri" w:eastAsia="Microsoft YaHei" w:hAnsi="Calibri"/>
+        </w:rPr>
+        <w:t xml:space="preserve"> 这里</w:t>
+      </w:r>
+      <w:r>
+        <w:rPr>
+          <w:rFonts w:ascii="Calibri" w:cs="Calibri" w:eastAsia="Microsoft YaHei" w:hAnsi="Calibri"/>
+          <w:b/>
+          <w:bCs/>
+        </w:rPr>
+        <w:t xml:space="preserve">不再是"拿不准就留"</w:t>
+      </w:r>
+      <w:r>
+        <w:rPr>
+          <w:rFonts w:ascii="Calibri" w:cs="Calibri" w:eastAsia="Microsoft YaHei" w:hAnsi="Calibri"/>
+        </w:rPr>
+        <w:t xml:space="preserve">。全文提供了判断需要的信息，要依据全文里写的内容决定 Include 或 Exclude；</w:t>
+      </w:r>
+      <w:r>
+        <w:rPr>
+          <w:rFonts w:ascii="Calibri" w:cs="Calibri" w:eastAsia="Microsoft YaHei" w:hAnsi="Calibri"/>
+          <w:b/>
+          <w:bCs/>
+        </w:rPr>
+        <w:t xml:space="preserve">不要用 Maybe 表示拿不准</w:t>
+      </w:r>
+      <w:r>
+        <w:rPr>
+          <w:rFonts w:ascii="Calibri" w:cs="Calibri" w:eastAsia="Microsoft YaHei" w:hAnsi="Calibri"/>
+        </w:rPr>
+        <w:t xml:space="preserve">——先在备注里写明疑问，两人讨论，讨论不了的才走第 10 节的仲裁。</w:t>
+      </w:r>
+    </w:p>
+    <w:p>
+      <w:pPr>
+        <w:pStyle w:val="ListParagraph"/>
+        <w:numPr>
+          <w:ilvl w:val="0"/>
+          <w:numId w:val="2"/>
+        </w:numPr>
+        <w:spacing w:after="60"/>
+      </w:pPr>
+      <w:r>
+        <w:rPr>
+          <w:rFonts w:ascii="Calibri" w:cs="Calibri" w:eastAsia="Microsoft YaHei" w:hAnsi="Calibri"/>
+          <w:b/>
+          <w:bCs/>
+        </w:rPr>
+        <w:t xml:space="preserve">结果有三种：</w:t>
+      </w:r>
+      <w:r>
+        <w:rPr>
+          <w:rFonts w:ascii="Calibri" w:cs="Calibri" w:eastAsia="Microsoft YaHei" w:hAnsi="Calibri"/>
+        </w:rPr>
+        <w:t xml:space="preserve"> Include（进入数据提取）；Exclude（必须选一个固定理由）；Pending IPD（只有汇总数据，已索取或将要索取个体数据，见第 8 节，最终要变成前两种之一）。</w:t>
+      </w:r>
+    </w:p>
+    <w:p>
+      <w:pPr>
+        <w:pStyle w:val="ListParagraph"/>
+        <w:numPr>
+          <w:ilvl w:val="0"/>
+          <w:numId w:val="2"/>
+        </w:numPr>
+        <w:spacing w:after="60"/>
+      </w:pPr>
+      <w:r>
+        <w:rPr>
+          <w:rFonts w:ascii="Calibri" w:cs="Calibri" w:eastAsia="Microsoft YaHei" w:hAnsi="Calibri"/>
+          <w:b/>
+          <w:bCs/>
+        </w:rPr>
+        <w:t xml:space="preserve">仍然是两人独立、盲法。</w:t>
+      </w:r>
+      <w:r>
+        <w:rPr>
+          <w:rFonts w:ascii="Calibri" w:cs="Calibri" w:eastAsia="Microsoft YaHei" w:hAnsi="Calibri"/>
+        </w:rPr>
+        <w:t xml:space="preserve"> 分歧先讨论，讨论不了的交杨俊（协议第 14 节）。独立完成之前，不看对方的记录，不讨论具体的篇目。</w:t>
       </w:r>
     </w:p>
     <w:p>
@@ -539,73 +337,23 @@
         <w:rPr>
           <w:rFonts w:ascii="Calibri" w:cs="Calibri" w:eastAsia="Microsoft YaHei" w:hAnsi="Calibri"/>
         </w:rPr>
-        <w:t xml:space="preserve">4. 获取全文</w:t>
-      </w:r>
-    </w:p>
-    <w:p>
-      <w:pPr>
-        <w:pStyle w:val="Heading3"/>
-        <w:keepNext/>
-      </w:pPr>
-      <w:r>
-        <w:rPr>
-          <w:rFonts w:ascii="Calibri" w:cs="Calibri" w:eastAsia="Microsoft YaHei" w:hAnsi="Calibri"/>
-        </w:rPr>
-        <w:t xml:space="preserve">4.1 先按语种分流</w:t>
-      </w:r>
-    </w:p>
-    <w:p>
-      <w:pPr>
-        <w:pStyle w:val="ListParagraph"/>
-        <w:numPr>
-          <w:ilvl w:val="0"/>
-          <w:numId w:val="2"/>
-        </w:numPr>
-        <w:spacing w:after="60"/>
-      </w:pPr>
-      <w:r>
-        <w:rPr>
-          <w:rFonts w:ascii="Calibri" w:cs="Calibri" w:eastAsia="Microsoft YaHei" w:hAnsi="Calibri"/>
-        </w:rPr>
-        <w:t xml:space="preserve">记录的语种看 RIS 里的语种字段：英文 1,446 条、中文 727 条、其他 375 条（法 80、德 54、西 48、俄 42、意 41、日 15、葡 14 等，另有 8 条语种未定，需要人工看一眼）。</w:t>
-      </w:r>
-    </w:p>
-    <w:p>
-      <w:pPr>
-        <w:pStyle w:val="ListParagraph"/>
-        <w:numPr>
-          <w:ilvl w:val="0"/>
-          <w:numId w:val="2"/>
-        </w:numPr>
-        <w:spacing w:after="60"/>
-      </w:pPr>
-      <w:r>
-        <w:rPr>
-          <w:rFonts w:ascii="Calibri" w:cs="Calibri" w:eastAsia="Microsoft YaHei" w:hAnsi="Calibri"/>
-          <w:b/>
-          <w:bCs/>
-        </w:rPr>
-        <w:t xml:space="preserve">英文、中文以外的语种：</w:t>
-      </w:r>
-      <w:r>
-        <w:rPr>
-          <w:rFonts w:ascii="Calibri" w:cs="Calibri" w:eastAsia="Microsoft YaHei" w:hAnsi="Calibri"/>
-        </w:rPr>
-        <w:t xml:space="preserve"> 协议第 10 节规定"列出并计数，不提取"。这些记录选理由 </w:t>
-      </w:r>
-      <w:r>
-        <w:rPr>
-          <w:rFonts w:ascii="Calibri" w:cs="Calibri" w:eastAsia="Microsoft YaHei" w:hAnsi="Calibri"/>
-          <w:b/>
-          <w:bCs/>
-        </w:rPr>
-        <w:t xml:space="preserve">L</w:t>
-      </w:r>
-      <w:r>
-        <w:rPr>
-          <w:rFonts w:ascii="Calibri" w:cs="Calibri" w:eastAsia="Microsoft YaHei" w:hAnsi="Calibri"/>
-        </w:rPr>
-        <w:t xml:space="preserve">，加标签 </w:t>
+        <w:t xml:space="preserve">2. 一页流程</w:t>
+      </w:r>
+    </w:p>
+    <w:p>
+      <w:pPr>
+        <w:pStyle w:val="ListParagraph"/>
+        <w:numPr>
+          <w:ilvl w:val="0"/>
+          <w:numId w:val="3"/>
+        </w:numPr>
+        <w:spacing w:after="60"/>
+      </w:pPr>
+      <w:r>
+        <w:rPr>
+          <w:rFonts w:ascii="Calibri" w:cs="Calibri" w:eastAsia="Microsoft YaHei" w:hAnsi="Calibri"/>
+        </w:rPr>
+        <w:t xml:space="preserve">全文清单已生成：</w:t>
       </w:r>
       <w:r>
         <w:rPr>
@@ -614,6 +362,616 @@
           <w:szCs w:val="19"/>
           <w:shd w:fill="EEEEEE" w:val="clear"/>
         </w:rPr>
+        <w:t xml:space="preserve">search/screening/rescreen/fulltext_retrieval_list.csv</w:t>
+      </w:r>
+      <w:r>
+        <w:rPr>
+          <w:rFonts w:ascii="Calibri" w:cs="Calibri" w:eastAsia="Microsoft YaHei" w:hAnsi="Calibri"/>
+        </w:rPr>
+        <w:t xml:space="preserve">（脚本 </w:t>
+      </w:r>
+      <w:r>
+        <w:rPr>
+          <w:rFonts w:ascii="Consolas" w:cs="Consolas" w:eastAsia="Microsoft YaHei" w:hAnsi="Consolas"/>
+          <w:sz w:val="19"/>
+          <w:szCs w:val="19"/>
+          <w:shd w:fill="EEEEEE" w:val="clear"/>
+        </w:rPr>
+        <w:t xml:space="preserve">tools/make_fulltext_retrieval_list.py</w:t>
+      </w:r>
+      <w:r>
+        <w:rPr>
+          <w:rFonts w:ascii="Calibri" w:cs="Calibri" w:eastAsia="Microsoft YaHei" w:hAnsi="Calibri"/>
+        </w:rPr>
+        <w:t xml:space="preserve">；1,091 条）。</w:t>
+      </w:r>
+    </w:p>
+    <w:p>
+      <w:pPr>
+        <w:pStyle w:val="ListParagraph"/>
+        <w:numPr>
+          <w:ilvl w:val="0"/>
+          <w:numId w:val="3"/>
+        </w:numPr>
+        <w:spacing w:after="60"/>
+      </w:pPr>
+      <w:r>
+        <w:rPr>
+          <w:rFonts w:ascii="Calibri" w:cs="Calibri" w:eastAsia="Microsoft YaHei" w:hAnsi="Calibri"/>
+          <w:b/>
+          <w:bCs/>
+        </w:rPr>
+        <w:t xml:space="preserve">先按发表年份、再按语种分流：</w:t>
+      </w:r>
+      <w:r>
+        <w:rPr>
+          <w:rFonts w:ascii="Calibri" w:cs="Calibri" w:eastAsia="Microsoft YaHei" w:hAnsi="Calibri"/>
+        </w:rPr>
+        <w:t xml:space="preserve"> 发表于 2000 年以前 → 理由 Y；其余里非英文、非中文 → 理由 L；都不取全文（4.1）。剩下的 540 篇取全文。</w:t>
+      </w:r>
+    </w:p>
+    <w:p>
+      <w:pPr>
+        <w:pStyle w:val="ListParagraph"/>
+        <w:numPr>
+          <w:ilvl w:val="0"/>
+          <w:numId w:val="3"/>
+        </w:numPr>
+        <w:spacing w:after="60"/>
+      </w:pPr>
+      <w:r>
+        <w:rPr>
+          <w:rFonts w:ascii="Calibri" w:cs="Calibri" w:eastAsia="Microsoft YaHei" w:hAnsi="Calibri"/>
+          <w:b/>
+          <w:bCs/>
+        </w:rPr>
+        <w:t xml:space="preserve">取全文：</w:t>
+      </w:r>
+      <w:r>
+        <w:rPr>
+          <w:rFonts w:ascii="Calibri" w:cs="Calibri" w:eastAsia="Microsoft YaHei" w:hAnsi="Calibri"/>
+        </w:rPr>
+        <w:t xml:space="preserve"> 取不到 → 理由 D，记下试过的途径（4.2、4.3）。</w:t>
+      </w:r>
+    </w:p>
+    <w:p>
+      <w:pPr>
+        <w:pStyle w:val="ListParagraph"/>
+        <w:numPr>
+          <w:ilvl w:val="0"/>
+          <w:numId w:val="3"/>
+        </w:numPr>
+        <w:spacing w:after="60"/>
+      </w:pPr>
+      <w:r>
+        <w:rPr>
+          <w:rFonts w:ascii="Calibri" w:cs="Calibri" w:eastAsia="Microsoft YaHei" w:hAnsi="Calibri"/>
+          <w:b/>
+          <w:bCs/>
+        </w:rPr>
+        <w:t xml:space="preserve">两人各自独立读全文</w:t>
+      </w:r>
+      <w:r>
+        <w:rPr>
+          <w:rFonts w:ascii="Calibri" w:cs="Calibri" w:eastAsia="Microsoft YaHei" w:hAnsi="Calibri"/>
+        </w:rPr>
+        <w:t xml:space="preserve">，按第 6 节的顺序回答问题，把决定记到记录表（第 9 节）。</w:t>
+      </w:r>
+    </w:p>
+    <w:p>
+      <w:pPr>
+        <w:pStyle w:val="ListParagraph"/>
+        <w:numPr>
+          <w:ilvl w:val="0"/>
+          <w:numId w:val="3"/>
+        </w:numPr>
+        <w:spacing w:after="60"/>
+      </w:pPr>
+      <w:r>
+        <w:rPr>
+          <w:rFonts w:ascii="Calibri" w:cs="Calibri" w:eastAsia="Microsoft YaHei" w:hAnsi="Calibri"/>
+        </w:rPr>
+        <w:t xml:space="preserve">两人都完成后比对；分歧先讨论，讨论不了的交杨俊（第 10 节）。</w:t>
+      </w:r>
+    </w:p>
+    <w:p>
+      <w:pPr>
+        <w:pStyle w:val="ListParagraph"/>
+        <w:numPr>
+          <w:ilvl w:val="0"/>
+          <w:numId w:val="3"/>
+        </w:numPr>
+        <w:spacing w:after="60"/>
+      </w:pPr>
+      <w:r>
+        <w:rPr>
+          <w:rFonts w:ascii="Calibri" w:cs="Calibri" w:eastAsia="Microsoft YaHei" w:hAnsi="Calibri"/>
+        </w:rPr>
+        <w:t xml:space="preserve">只有汇总数据的报告：一次性批量发 IPD 索取邮件，间隔 4 周发两封（第 8 节）。</w:t>
+      </w:r>
+    </w:p>
+    <w:p>
+      <w:pPr>
+        <w:pStyle w:val="ListParagraph"/>
+        <w:numPr>
+          <w:ilvl w:val="0"/>
+          <w:numId w:val="3"/>
+        </w:numPr>
+        <w:spacing w:after="60"/>
+      </w:pPr>
+      <w:r>
+        <w:rPr>
+          <w:rFonts w:ascii="Calibri" w:cs="Calibri" w:eastAsia="Microsoft YaHei" w:hAnsi="Calibri"/>
+        </w:rPr>
+        <w:t xml:space="preserve">最终名单 → 数据提取（提取工作簿）。</w:t>
+      </w:r>
+    </w:p>
+    <w:p>
+      <w:pPr>
+        <w:pStyle w:val="ListParagraph"/>
+        <w:numPr>
+          <w:ilvl w:val="0"/>
+          <w:numId w:val="3"/>
+        </w:numPr>
+        <w:spacing w:after="60"/>
+      </w:pPr>
+      <w:r>
+        <w:rPr>
+          <w:rFonts w:ascii="Calibri" w:cs="Calibri" w:eastAsia="Microsoft YaHei" w:hAnsi="Calibri"/>
+        </w:rPr>
+        <w:t xml:space="preserve">统计 PRISMA 数字（第 11 节）。</w:t>
+      </w:r>
+    </w:p>
+    <w:p>
+      <w:pPr>
+        <w:pStyle w:val="Heading2"/>
+        <w:keepNext/>
+      </w:pPr>
+      <w:r>
+        <w:rPr>
+          <w:rFonts w:ascii="Calibri" w:cs="Calibri" w:eastAsia="Microsoft YaHei" w:hAnsi="Calibri"/>
+        </w:rPr>
+        <w:t xml:space="preserve">3. 用什么工具记录</w:t>
+      </w:r>
+    </w:p>
+    <w:p>
+      <w:pPr>
+        <w:pStyle w:val="ListParagraph"/>
+        <w:numPr>
+          <w:ilvl w:val="0"/>
+          <w:numId w:val="2"/>
+        </w:numPr>
+        <w:spacing w:after="60"/>
+      </w:pPr>
+      <w:r>
+        <w:rPr>
+          <w:rFonts w:ascii="Calibri" w:cs="Calibri" w:eastAsia="Microsoft YaHei" w:hAnsi="Calibri"/>
+          <w:b/>
+          <w:bCs/>
+        </w:rPr>
+        <w:t xml:space="preserve">首选 Rayyan 的 Full text screening 标签</w:t>
+      </w:r>
+      <w:r>
+        <w:rPr>
+          <w:rFonts w:ascii="Calibri" w:cs="Calibri" w:eastAsia="Microsoft YaHei" w:hAnsi="Calibri"/>
+        </w:rPr>
+        <w:t xml:space="preserve">（项目顶部有）。但 Claude 没有操作过这个标签：怎么把记录送进去、是否继续保持盲法、Attach PDF 怎么用、理由和标签怎么设置，都没有核实过（手册 V6）。开始之前请对照实际界面核对，核对结果补充到本指南。</w:t>
+      </w:r>
+    </w:p>
+    <w:p>
+      <w:pPr>
+        <w:pStyle w:val="ListParagraph"/>
+        <w:numPr>
+          <w:ilvl w:val="0"/>
+          <w:numId w:val="2"/>
+        </w:numPr>
+        <w:spacing w:after="60"/>
+      </w:pPr>
+      <w:r>
+        <w:rPr>
+          <w:rFonts w:ascii="Calibri" w:cs="Calibri" w:eastAsia="Microsoft YaHei" w:hAnsi="Calibri"/>
+          <w:b/>
+          <w:bCs/>
+        </w:rPr>
+        <w:t xml:space="preserve">备用（也可作为 Rayyan 之外的备份）：</w:t>
+      </w:r>
+      <w:r>
+        <w:rPr>
+          <w:rFonts w:ascii="Calibri" w:cs="Calibri" w:eastAsia="Microsoft YaHei" w:hAnsi="Calibri"/>
+        </w:rPr>
+        <w:t xml:space="preserve"> 提取工作簿里的 </w:t>
+      </w:r>
+      <w:r>
+        <w:rPr>
+          <w:rFonts w:ascii="Calibri" w:cs="Calibri" w:eastAsia="Microsoft YaHei" w:hAnsi="Calibri"/>
+          <w:b/>
+          <w:bCs/>
+        </w:rPr>
+        <w:t xml:space="preserve">FT_log</w:t>
+      </w:r>
+      <w:r>
+        <w:rPr>
+          <w:rFonts w:ascii="Calibri" w:cs="Calibri" w:eastAsia="Microsoft YaHei" w:hAnsi="Calibri"/>
+        </w:rPr>
+        <w:t xml:space="preserve"> 表，每人一份，列见第 9 节。无论用哪种，</w:t>
+      </w:r>
+      <w:r>
+        <w:rPr>
+          <w:rFonts w:ascii="Calibri" w:cs="Calibri" w:eastAsia="Microsoft YaHei" w:hAnsi="Calibri"/>
+          <w:b/>
+          <w:bCs/>
+        </w:rPr>
+        <w:t xml:space="preserve">理由名称一字不差</w:t>
+      </w:r>
+      <w:r>
+        <w:rPr>
+          <w:rFonts w:ascii="Calibri" w:cs="Calibri" w:eastAsia="Microsoft YaHei" w:hAnsi="Calibri"/>
+        </w:rPr>
+        <w:t xml:space="preserve">（第 5 节），盲法照旧。</w:t>
+      </w:r>
+    </w:p>
+    <w:p>
+      <w:pPr>
+        <w:pStyle w:val="ListParagraph"/>
+        <w:numPr>
+          <w:ilvl w:val="0"/>
+          <w:numId w:val="2"/>
+        </w:numPr>
+        <w:spacing w:after="60"/>
+      </w:pPr>
+      <w:r>
+        <w:rPr>
+          <w:rFonts w:ascii="Calibri" w:cs="Calibri" w:eastAsia="Microsoft YaHei" w:hAnsi="Calibri"/>
+        </w:rPr>
+        <w:t xml:space="preserve">Pending IPD 在 Rayyan 里怎么表示没有验证。【建议】用 Maybe 加标签 </w:t>
+      </w:r>
+      <w:r>
+        <w:rPr>
+          <w:rFonts w:ascii="Consolas" w:cs="Consolas" w:eastAsia="Microsoft YaHei" w:hAnsi="Consolas"/>
+          <w:sz w:val="19"/>
+          <w:szCs w:val="19"/>
+          <w:shd w:fill="EEEEEE" w:val="clear"/>
+        </w:rPr>
+        <w:t xml:space="preserve">ipd-pending</w:t>
+      </w:r>
+      <w:r>
+        <w:rPr>
+          <w:rFonts w:ascii="Calibri" w:cs="Calibri" w:eastAsia="Microsoft YaHei" w:hAnsi="Calibri"/>
+        </w:rPr>
+        <w:t xml:space="preserve">；或者全文阶段的决定只记在 FT_log 里，Rayyan 只用来存 PDF。</w:t>
+      </w:r>
+    </w:p>
+    <w:p>
+      <w:pPr>
+        <w:pStyle w:val="ListParagraph"/>
+        <w:numPr>
+          <w:ilvl w:val="0"/>
+          <w:numId w:val="2"/>
+        </w:numPr>
+        <w:spacing w:after="60"/>
+      </w:pPr>
+      <w:r>
+        <w:rPr>
+          <w:rFonts w:ascii="Calibri" w:cs="Calibri" w:eastAsia="Microsoft YaHei" w:hAnsi="Calibri"/>
+          <w:b/>
+          <w:bCs/>
+        </w:rPr>
+        <w:t xml:space="preserve">PDF 的存放：</w:t>
+      </w:r>
+      <w:r>
+        <w:rPr>
+          <w:rFonts w:ascii="Calibri" w:cs="Calibri" w:eastAsia="Microsoft YaHei" w:hAnsi="Calibri"/>
+        </w:rPr>
+        <w:t xml:space="preserve"> 按 WS 编号命名（如 WS0123.pdf），放在各自的电脑或单位网盘。【建议】PDF 不放进仓库（版权和体积）；仓库里只放记录表。</w:t>
+      </w:r>
+    </w:p>
+    <w:p>
+      <w:pPr>
+        <w:pStyle w:val="Heading2"/>
+        <w:keepNext/>
+      </w:pPr>
+      <w:r>
+        <w:rPr>
+          <w:rFonts w:ascii="Calibri" w:cs="Calibri" w:eastAsia="Microsoft YaHei" w:hAnsi="Calibri"/>
+        </w:rPr>
+        <w:t xml:space="preserve">4. 获取全文</w:t>
+      </w:r>
+    </w:p>
+    <w:p>
+      <w:pPr>
+        <w:pStyle w:val="Heading3"/>
+        <w:keepNext/>
+      </w:pPr>
+      <w:r>
+        <w:rPr>
+          <w:rFonts w:ascii="Calibri" w:cs="Calibri" w:eastAsia="Microsoft YaHei" w:hAnsi="Calibri"/>
+        </w:rPr>
+        <w:t xml:space="preserve">4.1 先按发表年份分流，再按语种分流</w:t>
+      </w:r>
+    </w:p>
+    <w:p>
+      <w:pPr>
+        <w:spacing w:after="120"/>
+      </w:pPr>
+      <w:r>
+        <w:rPr>
+          <w:rFonts w:ascii="Calibri" w:cs="Calibri" w:eastAsia="Microsoft YaHei" w:hAnsi="Calibri"/>
+          <w:b/>
+          <w:bCs/>
+        </w:rPr>
+        <w:t xml:space="preserve">第一步：发表年份（理由 Y，作者 2026 年 10 月 17 日决定）。</w:t>
+      </w:r>
+    </w:p>
+    <w:p>
+      <w:pPr>
+        <w:pStyle w:val="ListParagraph"/>
+        <w:numPr>
+          <w:ilvl w:val="0"/>
+          <w:numId w:val="2"/>
+        </w:numPr>
+        <w:spacing w:after="60"/>
+      </w:pPr>
+      <w:r>
+        <w:rPr>
+          <w:rFonts w:ascii="Calibri" w:cs="Calibri" w:eastAsia="Microsoft YaHei" w:hAnsi="Calibri"/>
+        </w:rPr>
+        <w:t xml:space="preserve">清单里</w:t>
+      </w:r>
+      <w:r>
+        <w:rPr>
+          <w:rFonts w:ascii="Calibri" w:cs="Calibri" w:eastAsia="Microsoft YaHei" w:hAnsi="Calibri"/>
+          <w:b/>
+          <w:bCs/>
+        </w:rPr>
+        <w:t xml:space="preserve">发表年份早于 2000 年</w:t>
+      </w:r>
+      <w:r>
+        <w:rPr>
+          <w:rFonts w:ascii="Calibri" w:cs="Calibri" w:eastAsia="Microsoft YaHei" w:hAnsi="Calibri"/>
+        </w:rPr>
+        <w:t xml:space="preserve">的记录，不取全文，也不做任何纳入排除的判断，理由选 </w:t>
+      </w:r>
+      <w:r>
+        <w:rPr>
+          <w:rFonts w:ascii="Calibri" w:cs="Calibri" w:eastAsia="Microsoft YaHei" w:hAnsi="Calibri"/>
+          <w:b/>
+          <w:bCs/>
+        </w:rPr>
+        <w:t xml:space="preserve">Y</w:t>
+      </w:r>
+      <w:r>
+        <w:rPr>
+          <w:rFonts w:ascii="Calibri" w:cs="Calibri" w:eastAsia="Microsoft YaHei" w:hAnsi="Calibri"/>
+        </w:rPr>
+        <w:t xml:space="preserve">（Rayyan 名称 </w:t>
+      </w:r>
+      <w:r>
+        <w:rPr>
+          <w:rFonts w:ascii="Consolas" w:cs="Consolas" w:eastAsia="Microsoft YaHei" w:hAnsi="Consolas"/>
+          <w:sz w:val="19"/>
+          <w:szCs w:val="19"/>
+          <w:shd w:fill="EEEEEE" w:val="clear"/>
+        </w:rPr>
+        <w:t xml:space="preserve">Y published before 2000</w:t>
+      </w:r>
+      <w:r>
+        <w:rPr>
+          <w:rFonts w:ascii="Calibri" w:cs="Calibri" w:eastAsia="Microsoft YaHei" w:hAnsi="Calibri"/>
+        </w:rPr>
+        <w:t xml:space="preserve">，若用 FT_log 则在 </w:t>
+      </w:r>
+      <w:r>
+        <w:rPr>
+          <w:rFonts w:ascii="Consolas" w:cs="Consolas" w:eastAsia="Microsoft YaHei" w:hAnsi="Consolas"/>
+          <w:sz w:val="19"/>
+          <w:szCs w:val="19"/>
+          <w:shd w:fill="EEEEEE" w:val="clear"/>
+        </w:rPr>
+        <w:t xml:space="preserve">reason</w:t>
+      </w:r>
+      <w:r>
+        <w:rPr>
+          <w:rFonts w:ascii="Calibri" w:cs="Calibri" w:eastAsia="Microsoft YaHei" w:hAnsi="Calibri"/>
+        </w:rPr>
+        <w:t xml:space="preserve"> 列写这个名称）。年份取数据库记录里的发表年份（清单的 </w:t>
+      </w:r>
+      <w:r>
+        <w:rPr>
+          <w:rFonts w:ascii="Consolas" w:cs="Consolas" w:eastAsia="Microsoft YaHei" w:hAnsi="Consolas"/>
+          <w:sz w:val="19"/>
+          <w:szCs w:val="19"/>
+          <w:shd w:fill="EEEEEE" w:val="clear"/>
+        </w:rPr>
+        <w:t xml:space="preserve">year</w:t>
+      </w:r>
+      <w:r>
+        <w:rPr>
+          <w:rFonts w:ascii="Calibri" w:cs="Calibri" w:eastAsia="Microsoft YaHei" w:hAnsi="Calibri"/>
+        </w:rPr>
+        <w:t xml:space="preserve"> 列）；2000 年发表的</w:t>
+      </w:r>
+      <w:r>
+        <w:rPr>
+          <w:rFonts w:ascii="Calibri" w:cs="Calibri" w:eastAsia="Microsoft YaHei" w:hAnsi="Calibri"/>
+          <w:b/>
+          <w:bCs/>
+        </w:rPr>
+        <w:t xml:space="preserve">要取</w:t>
+      </w:r>
+      <w:r>
+        <w:rPr>
+          <w:rFonts w:ascii="Calibri" w:cs="Calibri" w:eastAsia="Microsoft YaHei" w:hAnsi="Calibri"/>
+        </w:rPr>
+        <w:t xml:space="preserve">。清单里没有缺年份的记录；以后如果遇到，按“要取全文”处理。</w:t>
+      </w:r>
+    </w:p>
+    <w:p>
+      <w:pPr>
+        <w:pStyle w:val="ListParagraph"/>
+        <w:numPr>
+          <w:ilvl w:val="0"/>
+          <w:numId w:val="2"/>
+        </w:numPr>
+        <w:spacing w:after="60"/>
+      </w:pPr>
+      <w:r>
+        <w:rPr>
+          <w:rFonts w:ascii="Calibri" w:cs="Calibri" w:eastAsia="Microsoft YaHei" w:hAnsi="Calibri"/>
+        </w:rPr>
+        <w:t xml:space="preserve">当前清单里有 485 条（英文 256、中文 67、其他语种 162；有摘要 189、没有摘要 296）。其中包括 6 条 E4 安全网记录（WS1767、WS2213、WS2221、WS1043、WS1084、WS0990，年份 1976–1999）：日期规则优先，这 6 条也不取。</w:t>
+      </w:r>
+    </w:p>
+    <w:p>
+      <w:pPr>
+        <w:pStyle w:val="ListParagraph"/>
+        <w:numPr>
+          <w:ilvl w:val="0"/>
+          <w:numId w:val="2"/>
+        </w:numPr>
+        <w:spacing w:after="60"/>
+      </w:pPr>
+      <w:r>
+        <w:rPr>
+          <w:rFonts w:ascii="Calibri" w:cs="Calibri" w:eastAsia="Microsoft YaHei" w:hAnsi="Calibri"/>
+          <w:b/>
+          <w:bCs/>
+        </w:rPr>
+        <w:t xml:space="preserve">预试验的 53 篇不例外</w:t>
+      </w:r>
+      <w:r>
+        <w:rPr>
+          <w:rFonts w:ascii="Calibri" w:cs="Calibri" w:eastAsia="Microsoft YaHei" w:hAnsi="Calibri"/>
+        </w:rPr>
+        <w:t xml:space="preserve">（标题摘要指南的决定：先导文献与其他记录一样处理）。受影响的有 Hirose 1998（1 名儿童）；其余 IPD 文献都在 2000 年或以后。</w:t>
+      </w:r>
+    </w:p>
+    <w:p>
+      <w:pPr>
+        <w:pStyle w:val="ListParagraph"/>
+        <w:numPr>
+          <w:ilvl w:val="0"/>
+          <w:numId w:val="2"/>
+        </w:numPr>
+        <w:spacing w:after="60"/>
+      </w:pPr>
+      <w:r>
+        <w:rPr>
+          <w:rFonts w:ascii="Calibri" w:cs="Calibri" w:eastAsia="Microsoft YaHei" w:hAnsi="Calibri"/>
+          <w:b/>
+          <w:bCs/>
+        </w:rPr>
+        <w:t xml:space="preserve">这是对已注册纳入标准（无日期限制）的偏离。</w:t>
+      </w:r>
+      <w:r>
+        <w:rPr>
+          <w:rFonts w:ascii="Calibri" w:cs="Calibri" w:eastAsia="Microsoft YaHei" w:hAnsi="Calibri"/>
+        </w:rPr>
+        <w:t xml:space="preserve"> 规则是在没有看过任何提取数据时定的，理由主要是可行性：这个时期的报告大多没有摘要、全文很难获取。</w:t>
+      </w:r>
+      <w:r>
+        <w:rPr>
+          <w:rFonts w:ascii="Calibri" w:cs="Calibri" w:eastAsia="Microsoft YaHei" w:hAnsi="Calibri"/>
+          <w:b/>
+          <w:bCs/>
+        </w:rPr>
+        <w:t xml:space="preserve">不要说 2000 年以前的数据质量更差——没有证据。</w:t>
+      </w:r>
+      <w:r>
+        <w:rPr>
+          <w:rFonts w:ascii="Calibri" w:cs="Calibri" w:eastAsia="Microsoft YaHei" w:hAnsi="Calibri"/>
+        </w:rPr>
+        <w:t xml:space="preserve"> 局限要在论文里写明：先导文献最早只到 1998 年，说明不了更早的文献里有什么；2000 年以前的病例（包括可能的长病程病例）没有被纳入。</w:t>
+      </w:r>
+    </w:p>
+    <w:p>
+      <w:pPr>
+        <w:pStyle w:val="ListParagraph"/>
+        <w:numPr>
+          <w:ilvl w:val="0"/>
+          <w:numId w:val="2"/>
+        </w:numPr>
+        <w:spacing w:after="60"/>
+      </w:pPr>
+      <w:r>
+        <w:rPr>
+          <w:rFonts w:ascii="Calibri" w:cs="Calibri" w:eastAsia="Microsoft YaHei" w:hAnsi="Calibri"/>
+        </w:rPr>
+        <w:t xml:space="preserve">方案里原有的敏感性分析“排除 2000 年以前发表的报告”现在对 2000 年起的数据没有意义，统计分析时要同步修改（交 Ji Wang 在分析计划修订里处理）。</w:t>
+      </w:r>
+    </w:p>
+    <w:p>
+      <w:pPr>
+        <w:spacing w:after="120"/>
+      </w:pPr>
+      <w:r>
+        <w:rPr>
+          <w:rFonts w:ascii="Calibri" w:cs="Calibri" w:eastAsia="Microsoft YaHei" w:hAnsi="Calibri"/>
+          <w:b/>
+          <w:bCs/>
+        </w:rPr>
+        <w:t xml:space="preserve">第二步：语种。</w:t>
+      </w:r>
+    </w:p>
+    <w:p>
+      <w:pPr>
+        <w:pStyle w:val="ListParagraph"/>
+        <w:numPr>
+          <w:ilvl w:val="0"/>
+          <w:numId w:val="2"/>
+        </w:numPr>
+        <w:spacing w:after="60"/>
+      </w:pPr>
+      <w:r>
+        <w:rPr>
+          <w:rFonts w:ascii="Calibri" w:cs="Calibri" w:eastAsia="Microsoft YaHei" w:hAnsi="Calibri"/>
+        </w:rPr>
+        <w:t xml:space="preserve">记录的语种看 RIS 里的语种字段（英文、中文、其他；另有少数语种未定，需要人工看一眼）。当前清单里发表于 2000 年及以后的记录：英文 439、中文 101、其他语种 66。</w:t>
+      </w:r>
+    </w:p>
+    <w:p>
+      <w:pPr>
+        <w:pStyle w:val="ListParagraph"/>
+        <w:numPr>
+          <w:ilvl w:val="0"/>
+          <w:numId w:val="2"/>
+        </w:numPr>
+        <w:spacing w:after="60"/>
+      </w:pPr>
+      <w:r>
+        <w:rPr>
+          <w:rFonts w:ascii="Calibri" w:cs="Calibri" w:eastAsia="Microsoft YaHei" w:hAnsi="Calibri"/>
+          <w:b/>
+          <w:bCs/>
+        </w:rPr>
+        <w:t xml:space="preserve">英文、中文以外的语种：</w:t>
+      </w:r>
+      <w:r>
+        <w:rPr>
+          <w:rFonts w:ascii="Calibri" w:cs="Calibri" w:eastAsia="Microsoft YaHei" w:hAnsi="Calibri"/>
+        </w:rPr>
+        <w:t xml:space="preserve"> 协议第 10 节规定“列出并计数，不提取”。这些记录选理由 </w:t>
+      </w:r>
+      <w:r>
+        <w:rPr>
+          <w:rFonts w:ascii="Calibri" w:cs="Calibri" w:eastAsia="Microsoft YaHei" w:hAnsi="Calibri"/>
+          <w:b/>
+          <w:bCs/>
+        </w:rPr>
+        <w:t xml:space="preserve">L</w:t>
+      </w:r>
+      <w:r>
+        <w:rPr>
+          <w:rFonts w:ascii="Calibri" w:cs="Calibri" w:eastAsia="Microsoft YaHei" w:hAnsi="Calibri"/>
+        </w:rPr>
+        <w:t xml:space="preserve">，加标签 </w:t>
+      </w:r>
+      <w:r>
+        <w:rPr>
+          <w:rFonts w:ascii="Consolas" w:cs="Consolas" w:eastAsia="Microsoft YaHei" w:hAnsi="Consolas"/>
+          <w:sz w:val="19"/>
+          <w:szCs w:val="19"/>
+          <w:shd w:fill="EEEEEE" w:val="clear"/>
+        </w:rPr>
         <w:t xml:space="preserve">lang-other</w:t>
       </w:r>
       <w:r>
@@ -621,6 +979,20 @@
           <w:rFonts w:ascii="Calibri" w:cs="Calibri" w:eastAsia="Microsoft YaHei" w:hAnsi="Calibri"/>
         </w:rPr>
         <w:t xml:space="preserve">，不取全文，也不做 Include/Exclude 判断。</w:t>
+      </w:r>
+      <w:r>
+        <w:rPr>
+          <w:rFonts w:ascii="Calibri" w:cs="Calibri" w:eastAsia="Microsoft YaHei" w:hAnsi="Calibri"/>
+          <w:b/>
+          <w:bCs/>
+        </w:rPr>
+        <w:t xml:space="preserve">如果同时早于 2000 年，只记 Y，不再记 L</w:t>
+      </w:r>
+      <w:r>
+        <w:rPr>
+          <w:rFonts w:ascii="Calibri" w:cs="Calibri" w:eastAsia="Microsoft YaHei" w:hAnsi="Calibri"/>
+        </w:rPr>
+        <w:t xml:space="preserve">（每条只算一个理由，PRISMA 数字不重复）。</w:t>
       </w:r>
     </w:p>
     <w:p>
@@ -1024,7 +1396,7 @@
                 <w:sz w:val="20"/>
                 <w:szCs w:val="20"/>
               </w:rPr>
-              <w:t xml:space="preserve">L</w:t>
+              <w:t xml:space="preserve">Y</w:t>
             </w:r>
           </w:p>
         </w:tc>
@@ -1052,7 +1424,7 @@
                 <w:szCs w:val="20"/>
                 <w:shd w:fill="EEEEEE" w:val="clear"/>
               </w:rPr>
-              <w:t xml:space="preserve">L other language</w:t>
+              <w:t xml:space="preserve">Y published before 2000</w:t>
             </w:r>
           </w:p>
         </w:tc>
@@ -1079,7 +1451,7 @@
                 <w:sz w:val="20"/>
                 <w:szCs w:val="20"/>
               </w:rPr>
-              <w:t xml:space="preserve">全文既不是英文也不是中文；列出并计数，不提取</w:t>
+              <w:t xml:space="preserve">发表年份早于 2000 年；不取全文，不判断（4.1）</w:t>
             </w:r>
           </w:p>
         </w:tc>
@@ -1112,7 +1484,7 @@
                 <w:sz w:val="20"/>
                 <w:szCs w:val="20"/>
               </w:rPr>
-              <w:t xml:space="preserve">D</w:t>
+              <w:t xml:space="preserve">L</w:t>
             </w:r>
           </w:p>
         </w:tc>
@@ -1140,7 +1512,7 @@
                 <w:szCs w:val="20"/>
                 <w:shd w:fill="EEEEEE" w:val="clear"/>
               </w:rPr>
-              <w:t xml:space="preserve">D no full text</w:t>
+              <w:t xml:space="preserve">L other language</w:t>
             </w:r>
           </w:p>
         </w:tc>
@@ -1167,7 +1539,7 @@
                 <w:sz w:val="20"/>
                 <w:szCs w:val="20"/>
               </w:rPr>
-              <w:t xml:space="preserve">所有途径都拿不到全文</w:t>
+              <w:t xml:space="preserve">全文既不是英文也不是中文；列出并计数，不提取</w:t>
             </w:r>
           </w:p>
         </w:tc>
@@ -1200,7 +1572,7 @@
                 <w:sz w:val="20"/>
                 <w:szCs w:val="20"/>
               </w:rPr>
-              <w:t xml:space="preserve">E5</w:t>
+              <w:t xml:space="preserve">D</w:t>
             </w:r>
           </w:p>
         </w:tc>
@@ -1228,7 +1600,7 @@
                 <w:szCs w:val="20"/>
                 <w:shd w:fill="EEEEEE" w:val="clear"/>
               </w:rPr>
-              <w:t xml:space="preserve">E5 not a formal article</w:t>
+              <w:t xml:space="preserve">D no full text</w:t>
             </w:r>
           </w:p>
         </w:tc>
@@ -1255,7 +1627,7 @@
                 <w:sz w:val="20"/>
                 <w:szCs w:val="20"/>
               </w:rPr>
-              <w:t xml:space="preserve">只有摘要的会议报告、专利、报纸、产品说明</w:t>
+              <w:t xml:space="preserve">所有途径都拿不到全文</w:t>
             </w:r>
           </w:p>
         </w:tc>
@@ -1288,7 +1660,7 @@
                 <w:sz w:val="20"/>
                 <w:szCs w:val="20"/>
               </w:rPr>
-              <w:t xml:space="preserve">E4</w:t>
+              <w:t xml:space="preserve">E5</w:t>
             </w:r>
           </w:p>
         </w:tc>
@@ -1316,7 +1688,7 @@
                 <w:szCs w:val="20"/>
                 <w:shd w:fill="EEEEEE" w:val="clear"/>
               </w:rPr>
-              <w:t xml:space="preserve">E4 no original patient data</w:t>
+              <w:t xml:space="preserve">E5 not a formal article</w:t>
             </w:r>
           </w:p>
         </w:tc>
@@ -1343,7 +1715,7 @@
                 <w:sz w:val="20"/>
                 <w:szCs w:val="20"/>
               </w:rPr>
-              <w:t xml:space="preserve">没有新病例的综述、社论、评论；只评论他人文章的信件</w:t>
+              <w:t xml:space="preserve">只有摘要的会议报告、专利、报纸、产品说明</w:t>
             </w:r>
           </w:p>
         </w:tc>
@@ -1376,7 +1748,7 @@
                 <w:sz w:val="20"/>
                 <w:szCs w:val="20"/>
               </w:rPr>
-              <w:t xml:space="preserve">E1</w:t>
+              <w:t xml:space="preserve">E4</w:t>
             </w:r>
           </w:p>
         </w:tc>
@@ -1404,7 +1776,7 @@
                 <w:szCs w:val="20"/>
                 <w:shd w:fill="EEEEEE" w:val="clear"/>
               </w:rPr>
-              <w:t xml:space="preserve">E1 non-human</w:t>
+              <w:t xml:space="preserve">E4 no original patient data</w:t>
             </w:r>
           </w:p>
         </w:tc>
@@ -1431,7 +1803,7 @@
                 <w:sz w:val="20"/>
                 <w:szCs w:val="20"/>
               </w:rPr>
-              <w:t xml:space="preserve">动物、兽医、实验</w:t>
+              <w:t xml:space="preserve">没有新病例的综述、社论、评论；只评论他人文章的信件</w:t>
             </w:r>
           </w:p>
         </w:tc>
@@ -1464,7 +1836,7 @@
                 <w:sz w:val="20"/>
                 <w:szCs w:val="20"/>
               </w:rPr>
-              <w:t xml:space="preserve">E2</w:t>
+              <w:t xml:space="preserve">E1</w:t>
             </w:r>
           </w:p>
         </w:tc>
@@ -1492,7 +1864,7 @@
                 <w:szCs w:val="20"/>
                 <w:shd w:fill="EEEEEE" w:val="clear"/>
               </w:rPr>
-              <w:t xml:space="preserve">E2 not wandering spleen</w:t>
+              <w:t xml:space="preserve">E1 non-human</w:t>
             </w:r>
           </w:p>
         </w:tc>
@@ -1519,7 +1891,7 @@
                 <w:sz w:val="20"/>
                 <w:szCs w:val="20"/>
               </w:rPr>
-              <w:t xml:space="preserve">全文显示不是游走脾，或没有影像或手术依据证实是游走脾（6.3）</w:t>
+              <w:t xml:space="preserve">动物、兽医、实验</w:t>
             </w:r>
           </w:p>
         </w:tc>
@@ -1552,7 +1924,7 @@
                 <w:sz w:val="20"/>
                 <w:szCs w:val="20"/>
               </w:rPr>
-              <w:t xml:space="preserve">E3</w:t>
+              <w:t xml:space="preserve">E2</w:t>
             </w:r>
           </w:p>
         </w:tc>
@@ -1580,7 +1952,7 @@
                 <w:szCs w:val="20"/>
                 <w:shd w:fill="EEEEEE" w:val="clear"/>
               </w:rPr>
-              <w:t xml:space="preserve">E3 adults only</w:t>
+              <w:t xml:space="preserve">E2 not wandering spleen</w:t>
             </w:r>
           </w:p>
         </w:tc>
@@ -1607,7 +1979,7 @@
                 <w:sz w:val="20"/>
                 <w:szCs w:val="20"/>
               </w:rPr>
-              <w:t xml:space="preserve">全部患者 ≥ 18 岁</w:t>
+              <w:t xml:space="preserve">全文显示不是游走脾，或没有影像或手术依据证实是游走脾（6.3）</w:t>
             </w:r>
           </w:p>
         </w:tc>
@@ -1640,7 +2012,7 @@
                 <w:sz w:val="20"/>
                 <w:szCs w:val="20"/>
               </w:rPr>
-              <w:t xml:space="preserve">A</w:t>
+              <w:t xml:space="preserve">E3</w:t>
             </w:r>
           </w:p>
         </w:tc>
@@ -1668,7 +2040,7 @@
                 <w:szCs w:val="20"/>
                 <w:shd w:fill="EEEEEE" w:val="clear"/>
               </w:rPr>
-              <w:t xml:space="preserve">A aggregate data only</w:t>
+              <w:t xml:space="preserve">E3 adults only</w:t>
             </w:r>
           </w:p>
         </w:tc>
@@ -1695,7 +2067,7 @@
                 <w:sz w:val="20"/>
                 <w:szCs w:val="20"/>
               </w:rPr>
-              <w:t xml:space="preserve">只有汇总数据，没有个体数据（第 8 节）</w:t>
+              <w:t xml:space="preserve">全部患者 ≥ 18 岁</w:t>
             </w:r>
           </w:p>
         </w:tc>
@@ -1728,7 +2100,7 @@
                 <w:sz w:val="20"/>
                 <w:szCs w:val="20"/>
               </w:rPr>
-              <w:t xml:space="preserve">N</w:t>
+              <w:t xml:space="preserve">A</w:t>
             </w:r>
           </w:p>
         </w:tc>
@@ -1756,7 +2128,7 @@
                 <w:szCs w:val="20"/>
                 <w:shd w:fill="EEEEEE" w:val="clear"/>
               </w:rPr>
-              <w:t xml:space="preserve">N age not confirmed under 18</w:t>
+              <w:t xml:space="preserve">A aggregate data only</w:t>
             </w:r>
           </w:p>
         </w:tc>
@@ -1783,7 +2155,7 @@
                 <w:sz w:val="20"/>
                 <w:szCs w:val="20"/>
               </w:rPr>
-              <w:t xml:space="preserve">个体报告了，但无法确认患者小于 18 岁（6.4）</w:t>
+              <w:t xml:space="preserve">只有汇总数据，没有个体数据（第 8 节）</w:t>
             </w:r>
           </w:p>
         </w:tc>
@@ -1816,6 +2188,94 @@
                 <w:sz w:val="20"/>
                 <w:szCs w:val="20"/>
               </w:rPr>
+              <w:t xml:space="preserve">N</w:t>
+            </w:r>
+          </w:p>
+        </w:tc>
+        <w:tc>
+          <w:tcPr>
+            <w:tcW w:type="dxa" w:w="2400"/>
+            <w:tcBorders>
+              <w:top w:val="single" w:color="BBBBBB" w:sz="4"/>
+              <w:left w:val="single" w:color="BBBBBB" w:sz="4"/>
+              <w:bottom w:val="single" w:color="BBBBBB" w:sz="4"/>
+              <w:right w:val="single" w:color="BBBBBB" w:sz="4"/>
+            </w:tcBorders>
+            <w:tcMar>
+              <w:top w:type="dxa" w:w="60"/>
+              <w:left w:type="dxa" w:w="100"/>
+              <w:bottom w:type="dxa" w:w="60"/>
+              <w:right w:type="dxa" w:w="100"/>
+            </w:tcMar>
+          </w:tcPr>
+          <w:p>
+            <w:r>
+              <w:rPr>
+                <w:rFonts w:ascii="Consolas" w:cs="Consolas" w:eastAsia="Microsoft YaHei" w:hAnsi="Consolas"/>
+                <w:sz w:val="20"/>
+                <w:szCs w:val="20"/>
+                <w:shd w:fill="EEEEEE" w:val="clear"/>
+              </w:rPr>
+              <w:t xml:space="preserve">N age not confirmed under 18</w:t>
+            </w:r>
+          </w:p>
+        </w:tc>
+        <w:tc>
+          <w:tcPr>
+            <w:tcW w:type="dxa" w:w="5726"/>
+            <w:tcBorders>
+              <w:top w:val="single" w:color="BBBBBB" w:sz="4"/>
+              <w:left w:val="single" w:color="BBBBBB" w:sz="4"/>
+              <w:bottom w:val="single" w:color="BBBBBB" w:sz="4"/>
+              <w:right w:val="single" w:color="BBBBBB" w:sz="4"/>
+            </w:tcBorders>
+            <w:tcMar>
+              <w:top w:type="dxa" w:w="60"/>
+              <w:left w:type="dxa" w:w="100"/>
+              <w:bottom w:type="dxa" w:w="60"/>
+              <w:right w:type="dxa" w:w="100"/>
+            </w:tcMar>
+          </w:tcPr>
+          <w:p>
+            <w:r>
+              <w:rPr>
+                <w:rFonts w:ascii="Calibri" w:cs="Calibri" w:eastAsia="Microsoft YaHei" w:hAnsi="Calibri"/>
+                <w:sz w:val="20"/>
+                <w:szCs w:val="20"/>
+              </w:rPr>
+              <w:t xml:space="preserve">个体报告了，但无法确认患者小于 18 岁（6.4）</w:t>
+            </w:r>
+          </w:p>
+        </w:tc>
+      </w:tr>
+      <w:tr>
+        <w:trPr>
+          <w:cantSplit/>
+          <w:tblHeader w:val="false"/>
+        </w:trPr>
+        <w:tc>
+          <w:tcPr>
+            <w:tcW w:type="dxa" w:w="900"/>
+            <w:tcBorders>
+              <w:top w:val="single" w:color="BBBBBB" w:sz="4"/>
+              <w:left w:val="single" w:color="BBBBBB" w:sz="4"/>
+              <w:bottom w:val="single" w:color="BBBBBB" w:sz="4"/>
+              <w:right w:val="single" w:color="BBBBBB" w:sz="4"/>
+            </w:tcBorders>
+            <w:tcMar>
+              <w:top w:type="dxa" w:w="60"/>
+              <w:left w:type="dxa" w:w="100"/>
+              <w:bottom w:type="dxa" w:w="60"/>
+              <w:right w:type="dxa" w:w="100"/>
+            </w:tcMar>
+          </w:tcPr>
+          <w:p>
+            <w:r>
+              <w:rPr>
+                <w:rFonts w:ascii="Calibri" w:cs="Calibri" w:eastAsia="Microsoft YaHei" w:hAnsi="Calibri"/>
+                <w:sz w:val="20"/>
+                <w:szCs w:val="20"/>
+              </w:rPr>
               <w:t xml:space="preserve">E6</w:t>
             </w:r>
           </w:p>
@@ -1920,7 +2380,7 @@
         <w:rPr>
           <w:rFonts w:ascii="Calibri" w:cs="Calibri" w:eastAsia="Microsoft YaHei" w:hAnsi="Calibri"/>
         </w:rPr>
-        <w:t xml:space="preserve"> 已经存在。L、D、A、N 的名称是 Claude 的建议（手册 S10），尚未建立。</w:t>
+        <w:t xml:space="preserve"> 已经存在。Y、L、D、A、N 的名称是 Claude 的建议（手册 S10），尚未建立。</w:t>
       </w:r>
     </w:p>
     <w:p>
@@ -1939,7 +2399,7 @@
         <w:rPr>
           <w:rFonts w:ascii="Calibri" w:cs="Calibri" w:eastAsia="Microsoft YaHei" w:hAnsi="Calibri"/>
         </w:rPr>
-        <w:t xml:space="preserve">【建议】这与标题摘要阶段不同：那里"任选一条适用的"，因为标题摘要阶段的理由不影响谁进入全文，也不进入 PRISMA 图；全文阶段的理由要进入 PRISMA 图，每篇只能算一条，固定顺序可以让计数可重复，也避免两人"决定一样、理由不同"被当作分歧。</w:t>
+        <w:t xml:space="preserve">【建议】这与标题摘要阶段不同：那里"任选一条适用的"，因为标题摘要阶段的理由不影响谁进入全文，也不进入 PRISMA 图；全文阶段的理由要进入 PRISMA 图，每篇只能算一条，固定顺序（Y 排在最前，因为它不需要读全文）可以让计数可重复，也避免两人"决定一样、理由不同"被当作分歧。</w:t>
       </w:r>
     </w:p>
     <w:p>
@@ -3146,7 +3606,7 @@
                 <w:sz w:val="20"/>
                 <w:szCs w:val="20"/>
               </w:rPr>
-              <w:t xml:space="preserve">英文、中文以外的语种</w:t>
+              <w:t xml:space="preserve">发表于 2000 年以前</w:t>
             </w:r>
           </w:p>
         </w:tc>
@@ -3175,32 +3635,15 @@
                 <w:sz w:val="20"/>
                 <w:szCs w:val="20"/>
               </w:rPr>
-              <w:t xml:space="preserve">L</w:t>
-            </w:r>
-            <w:r>
-              <w:rPr>
-                <w:rFonts w:ascii="Calibri" w:cs="Calibri" w:eastAsia="Microsoft YaHei" w:hAnsi="Calibri"/>
-                <w:sz w:val="20"/>
-                <w:szCs w:val="20"/>
-              </w:rPr>
-              <w:t xml:space="preserve">，加标签 </w:t>
-            </w:r>
-            <w:r>
-              <w:rPr>
-                <w:rFonts w:ascii="Consolas" w:cs="Consolas" w:eastAsia="Microsoft YaHei" w:hAnsi="Consolas"/>
-                <w:sz w:val="20"/>
-                <w:szCs w:val="20"/>
-                <w:shd w:fill="EEEEEE" w:val="clear"/>
-              </w:rPr>
-              <w:t xml:space="preserve">lang-other</w:t>
-            </w:r>
-            <w:r>
-              <w:rPr>
-                <w:rFonts w:ascii="Calibri" w:cs="Calibri" w:eastAsia="Microsoft YaHei" w:hAnsi="Calibri"/>
-                <w:sz w:val="20"/>
-                <w:szCs w:val="20"/>
-              </w:rPr>
-              <w:t xml:space="preserve">，不取全文</w:t>
+              <w:t xml:space="preserve">Y</w:t>
+            </w:r>
+            <w:r>
+              <w:rPr>
+                <w:rFonts w:ascii="Calibri" w:cs="Calibri" w:eastAsia="Microsoft YaHei" w:hAnsi="Calibri"/>
+                <w:sz w:val="20"/>
+                <w:szCs w:val="20"/>
+              </w:rPr>
+              <w:t xml:space="preserve">，不取全文，不判断（包括预试验的文献和 E4 安全网记录）</w:t>
             </w:r>
           </w:p>
         </w:tc>
@@ -3233,7 +3676,7 @@
                 <w:sz w:val="20"/>
                 <w:szCs w:val="20"/>
               </w:rPr>
-              <w:t xml:space="preserve">所有途径都拿不到全文</w:t>
+              <w:t xml:space="preserve">英文、中文以外的语种（2000 年或以后发表）</w:t>
             </w:r>
           </w:p>
         </w:tc>
@@ -3262,15 +3705,32 @@
                 <w:sz w:val="20"/>
                 <w:szCs w:val="20"/>
               </w:rPr>
-              <w:t xml:space="preserve">D</w:t>
-            </w:r>
-            <w:r>
-              <w:rPr>
-                <w:rFonts w:ascii="Calibri" w:cs="Calibri" w:eastAsia="Microsoft YaHei" w:hAnsi="Calibri"/>
-                <w:sz w:val="20"/>
-                <w:szCs w:val="20"/>
-              </w:rPr>
-              <w:t xml:space="preserve">（另一位再试一次后确认）</w:t>
+              <w:t xml:space="preserve">L</w:t>
+            </w:r>
+            <w:r>
+              <w:rPr>
+                <w:rFonts w:ascii="Calibri" w:cs="Calibri" w:eastAsia="Microsoft YaHei" w:hAnsi="Calibri"/>
+                <w:sz w:val="20"/>
+                <w:szCs w:val="20"/>
+              </w:rPr>
+              <w:t xml:space="preserve">，加标签 </w:t>
+            </w:r>
+            <w:r>
+              <w:rPr>
+                <w:rFonts w:ascii="Consolas" w:cs="Consolas" w:eastAsia="Microsoft YaHei" w:hAnsi="Consolas"/>
+                <w:sz w:val="20"/>
+                <w:szCs w:val="20"/>
+                <w:shd w:fill="EEEEEE" w:val="clear"/>
+              </w:rPr>
+              <w:t xml:space="preserve">lang-other</w:t>
+            </w:r>
+            <w:r>
+              <w:rPr>
+                <w:rFonts w:ascii="Calibri" w:cs="Calibri" w:eastAsia="Microsoft YaHei" w:hAnsi="Calibri"/>
+                <w:sz w:val="20"/>
+                <w:szCs w:val="20"/>
+              </w:rPr>
+              <w:t xml:space="preserve">，不取全文</w:t>
             </w:r>
           </w:p>
         </w:tc>
@@ -3303,7 +3763,7 @@
                 <w:sz w:val="20"/>
                 <w:szCs w:val="20"/>
               </w:rPr>
-              <w:t xml:space="preserve">会议报告，全文只有摘要</w:t>
+              <w:t xml:space="preserve">所有途径都拿不到全文</w:t>
             </w:r>
           </w:p>
         </w:tc>
@@ -3332,7 +3792,15 @@
                 <w:sz w:val="20"/>
                 <w:szCs w:val="20"/>
               </w:rPr>
-              <w:t xml:space="preserve">E5</w:t>
+              <w:t xml:space="preserve">D</w:t>
+            </w:r>
+            <w:r>
+              <w:rPr>
+                <w:rFonts w:ascii="Calibri" w:cs="Calibri" w:eastAsia="Microsoft YaHei" w:hAnsi="Calibri"/>
+                <w:sz w:val="20"/>
+                <w:szCs w:val="20"/>
+              </w:rPr>
+              <w:t xml:space="preserve">（另一位再试一次后确认）</w:t>
             </w:r>
           </w:p>
         </w:tc>
@@ -3365,7 +3833,7 @@
                 <w:sz w:val="20"/>
                 <w:szCs w:val="20"/>
               </w:rPr>
-              <w:t xml:space="preserve">中文会议论文，全文是完整论文</w:t>
+              <w:t xml:space="preserve">会议报告，全文只有摘要</w:t>
             </w:r>
           </w:p>
         </w:tc>
@@ -3389,10 +3857,12 @@
             <w:r>
               <w:rPr>
                 <w:rFonts w:ascii="Calibri" w:cs="Calibri" w:eastAsia="Microsoft YaHei" w:hAnsi="Calibri"/>
-                <w:sz w:val="20"/>
-                <w:szCs w:val="20"/>
-              </w:rPr>
-              <w:t xml:space="preserve">按期刊文章判断</w:t>
+                <w:b/>
+                <w:bCs/>
+                <w:sz w:val="20"/>
+                <w:szCs w:val="20"/>
+              </w:rPr>
+              <w:t xml:space="preserve">E5</w:t>
             </w:r>
           </w:p>
         </w:tc>
@@ -3425,7 +3895,7 @@
                 <w:sz w:val="20"/>
                 <w:szCs w:val="20"/>
               </w:rPr>
-              <w:t xml:space="preserve">学位论文，含临床病例资料</w:t>
+              <w:t xml:space="preserve">中文会议论文，全文是完整论文</w:t>
             </w:r>
           </w:p>
         </w:tc>
@@ -3452,17 +3922,7 @@
                 <w:sz w:val="20"/>
                 <w:szCs w:val="20"/>
               </w:rPr>
-              <w:t xml:space="preserve">按文章判断；动物实验 </w:t>
-            </w:r>
-            <w:r>
-              <w:rPr>
-                <w:rFonts w:ascii="Calibri" w:cs="Calibri" w:eastAsia="Microsoft YaHei" w:hAnsi="Calibri"/>
-                <w:b/>
-                <w:bCs/>
-                <w:sz w:val="20"/>
-                <w:szCs w:val="20"/>
-              </w:rPr>
-              <w:t xml:space="preserve">E1</w:t>
+              <w:t xml:space="preserve">按期刊文章判断</w:t>
             </w:r>
           </w:p>
         </w:tc>
@@ -3495,7 +3955,7 @@
                 <w:sz w:val="20"/>
                 <w:szCs w:val="20"/>
               </w:rPr>
-              <w:t xml:space="preserve">综述，没有新病例</w:t>
+              <w:t xml:space="preserve">学位论文，含临床病例资料</w:t>
             </w:r>
           </w:p>
         </w:tc>
@@ -3516,6 +3976,14 @@
             </w:tcMar>
           </w:tcPr>
           <w:p>
+            <w:r>
+              <w:rPr>
+                <w:rFonts w:ascii="Calibri" w:cs="Calibri" w:eastAsia="Microsoft YaHei" w:hAnsi="Calibri"/>
+                <w:sz w:val="20"/>
+                <w:szCs w:val="20"/>
+              </w:rPr>
+              <w:t xml:space="preserve">按文章判断；动物实验 </w:t>
+            </w:r>
             <w:r>
               <w:rPr>
                 <w:rFonts w:ascii="Calibri" w:cs="Calibri" w:eastAsia="Microsoft YaHei" w:hAnsi="Calibri"/>
@@ -3524,32 +3992,7 @@
                 <w:sz w:val="20"/>
                 <w:szCs w:val="20"/>
               </w:rPr>
-              <w:t xml:space="preserve">E4</w:t>
-            </w:r>
-            <w:r>
-              <w:rPr>
-                <w:rFonts w:ascii="Calibri" w:cs="Calibri" w:eastAsia="Microsoft YaHei" w:hAnsi="Calibri"/>
-                <w:sz w:val="20"/>
-                <w:szCs w:val="20"/>
-              </w:rPr>
-              <w:t xml:space="preserve">，加 </w:t>
-            </w:r>
-            <w:r>
-              <w:rPr>
-                <w:rFonts w:ascii="Consolas" w:cs="Consolas" w:eastAsia="Microsoft YaHei" w:hAnsi="Consolas"/>
-                <w:sz w:val="20"/>
-                <w:szCs w:val="20"/>
-                <w:shd w:fill="EEEEEE" w:val="clear"/>
-              </w:rPr>
-              <w:t xml:space="preserve">review-for-refs</w:t>
-            </w:r>
-            <w:r>
-              <w:rPr>
-                <w:rFonts w:ascii="Calibri" w:cs="Calibri" w:eastAsia="Microsoft YaHei" w:hAnsi="Calibri"/>
-                <w:sz w:val="20"/>
-                <w:szCs w:val="20"/>
-              </w:rPr>
-              <w:t xml:space="preserve">；不从综述表里取别人的病例</w:t>
+              <w:t xml:space="preserve">E1</w:t>
             </w:r>
           </w:p>
         </w:tc>
@@ -3582,7 +4025,7 @@
                 <w:sz w:val="20"/>
                 <w:szCs w:val="20"/>
               </w:rPr>
-              <w:t xml:space="preserve">病例报告加文献复习</w:t>
+              <w:t xml:space="preserve">综述，没有新病例</w:t>
             </w:r>
           </w:p>
         </w:tc>
@@ -3606,10 +4049,37 @@
             <w:r>
               <w:rPr>
                 <w:rFonts w:ascii="Calibri" w:cs="Calibri" w:eastAsia="Microsoft YaHei" w:hAnsi="Calibri"/>
-                <w:sz w:val="20"/>
-                <w:szCs w:val="20"/>
-              </w:rPr>
-              <w:t xml:space="preserve">Include，只取本文的新病例</w:t>
+                <w:b/>
+                <w:bCs/>
+                <w:sz w:val="20"/>
+                <w:szCs w:val="20"/>
+              </w:rPr>
+              <w:t xml:space="preserve">E4</w:t>
+            </w:r>
+            <w:r>
+              <w:rPr>
+                <w:rFonts w:ascii="Calibri" w:cs="Calibri" w:eastAsia="Microsoft YaHei" w:hAnsi="Calibri"/>
+                <w:sz w:val="20"/>
+                <w:szCs w:val="20"/>
+              </w:rPr>
+              <w:t xml:space="preserve">，加 </w:t>
+            </w:r>
+            <w:r>
+              <w:rPr>
+                <w:rFonts w:ascii="Consolas" w:cs="Consolas" w:eastAsia="Microsoft YaHei" w:hAnsi="Consolas"/>
+                <w:sz w:val="20"/>
+                <w:szCs w:val="20"/>
+                <w:shd w:fill="EEEEEE" w:val="clear"/>
+              </w:rPr>
+              <w:t xml:space="preserve">review-for-refs</w:t>
+            </w:r>
+            <w:r>
+              <w:rPr>
+                <w:rFonts w:ascii="Calibri" w:cs="Calibri" w:eastAsia="Microsoft YaHei" w:hAnsi="Calibri"/>
+                <w:sz w:val="20"/>
+                <w:szCs w:val="20"/>
+              </w:rPr>
+              <w:t xml:space="preserve">；不从综述表里取别人的病例</w:t>
             </w:r>
           </w:p>
         </w:tc>
@@ -3642,7 +4112,7 @@
                 <w:sz w:val="20"/>
                 <w:szCs w:val="20"/>
               </w:rPr>
-              <w:t xml:space="preserve">只评论他人文章的信件</w:t>
+              <w:t xml:space="preserve">病例报告加文献复习</w:t>
             </w:r>
           </w:p>
         </w:tc>
@@ -3666,12 +4136,10 @@
             <w:r>
               <w:rPr>
                 <w:rFonts w:ascii="Calibri" w:cs="Calibri" w:eastAsia="Microsoft YaHei" w:hAnsi="Calibri"/>
-                <w:b/>
-                <w:bCs/>
-                <w:sz w:val="20"/>
-                <w:szCs w:val="20"/>
-              </w:rPr>
-              <w:t xml:space="preserve">E4</w:t>
+                <w:sz w:val="20"/>
+                <w:szCs w:val="20"/>
+              </w:rPr>
+              <w:t xml:space="preserve">Include，只取本文的新病例</w:t>
             </w:r>
           </w:p>
         </w:tc>
@@ -3704,7 +4172,7 @@
                 <w:sz w:val="20"/>
                 <w:szCs w:val="20"/>
               </w:rPr>
-              <w:t xml:space="preserve">动物、兽医</w:t>
+              <w:t xml:space="preserve">只评论他人文章的信件</w:t>
             </w:r>
           </w:p>
         </w:tc>
@@ -3733,7 +4201,7 @@
                 <w:sz w:val="20"/>
                 <w:szCs w:val="20"/>
               </w:rPr>
-              <w:t xml:space="preserve">E1</w:t>
+              <w:t xml:space="preserve">E4</w:t>
             </w:r>
           </w:p>
         </w:tc>
@@ -3766,7 +4234,7 @@
                 <w:sz w:val="20"/>
                 <w:szCs w:val="20"/>
               </w:rPr>
-              <w:t xml:space="preserve">副脾（含游走副脾）扭转</w:t>
+              <w:t xml:space="preserve">动物、兽医</w:t>
             </w:r>
           </w:p>
         </w:tc>
@@ -3795,7 +4263,7 @@
                 <w:sz w:val="20"/>
                 <w:szCs w:val="20"/>
               </w:rPr>
-              <w:t xml:space="preserve">E2</w:t>
+              <w:t xml:space="preserve">E1</w:t>
             </w:r>
           </w:p>
         </w:tc>
@@ -3828,7 +4296,7 @@
                 <w:sz w:val="20"/>
                 <w:szCs w:val="20"/>
               </w:rPr>
-              <w:t xml:space="preserve">脾种植、脾异位妊娠、移植脾</w:t>
+              <w:t xml:space="preserve">副脾（含游走副脾）扭转</w:t>
             </w:r>
           </w:p>
         </w:tc>
@@ -3890,7 +4358,7 @@
                 <w:sz w:val="20"/>
                 <w:szCs w:val="20"/>
               </w:rPr>
-              <w:t xml:space="preserve">正位脾扭转，作者明确脾在原位、韧带完好</w:t>
+              <w:t xml:space="preserve">脾种植、脾异位妊娠、移植脾</w:t>
             </w:r>
           </w:p>
         </w:tc>
@@ -3952,7 +4420,7 @@
                 <w:sz w:val="20"/>
                 <w:szCs w:val="20"/>
               </w:rPr>
-              <w:t xml:space="preserve">儿童脾蒂扭转，全文没写位置和韧带</w:t>
+              <w:t xml:space="preserve">正位脾扭转，作者明确脾在原位、韧带完好</w:t>
             </w:r>
           </w:p>
         </w:tc>
@@ -3976,27 +4444,12 @@
             <w:r>
               <w:rPr>
                 <w:rFonts w:ascii="Calibri" w:cs="Calibri" w:eastAsia="Microsoft YaHei" w:hAnsi="Calibri"/>
-                <w:sz w:val="20"/>
-                <w:szCs w:val="20"/>
-              </w:rPr>
-              <w:t xml:space="preserve">D1：【建议】Include，</w:t>
-            </w:r>
-            <w:r>
-              <w:rPr>
-                <w:rFonts w:ascii="Consolas" w:cs="Consolas" w:eastAsia="Microsoft YaHei" w:hAnsi="Consolas"/>
-                <w:sz w:val="20"/>
-                <w:szCs w:val="20"/>
-                <w:shd w:fill="EEEEEE" w:val="clear"/>
-              </w:rPr>
-              <w:t xml:space="preserve">ws_basis</w:t>
-            </w:r>
-            <w:r>
-              <w:rPr>
-                <w:rFonts w:ascii="Calibri" w:cs="Calibri" w:eastAsia="Microsoft YaHei" w:hAnsi="Calibri"/>
-                <w:sz w:val="20"/>
-                <w:szCs w:val="20"/>
-              </w:rPr>
-              <w:t xml:space="preserve"> = Torsion only</w:t>
+                <w:b/>
+                <w:bCs/>
+                <w:sz w:val="20"/>
+                <w:szCs w:val="20"/>
+              </w:rPr>
+              <w:t xml:space="preserve">E2</w:t>
             </w:r>
           </w:p>
         </w:tc>
@@ -4029,7 +4482,7 @@
                 <w:sz w:val="20"/>
                 <w:szCs w:val="20"/>
               </w:rPr>
-              <w:t xml:space="preserve">只有临床诊断，没有影像也没有手术</w:t>
+              <w:t xml:space="preserve">儿童脾蒂扭转，全文没写位置和韧带</w:t>
             </w:r>
           </w:p>
         </w:tc>
@@ -4053,20 +4506,27 @@
             <w:r>
               <w:rPr>
                 <w:rFonts w:ascii="Calibri" w:cs="Calibri" w:eastAsia="Microsoft YaHei" w:hAnsi="Calibri"/>
-                <w:b/>
-                <w:bCs/>
-                <w:sz w:val="20"/>
-                <w:szCs w:val="20"/>
-              </w:rPr>
-              <w:t xml:space="preserve">E2</w:t>
-            </w:r>
-            <w:r>
-              <w:rPr>
-                <w:rFonts w:ascii="Calibri" w:cs="Calibri" w:eastAsia="Microsoft YaHei" w:hAnsi="Calibri"/>
-                <w:sz w:val="20"/>
-                <w:szCs w:val="20"/>
-              </w:rPr>
-              <w:t xml:space="preserve">，备注 "not confirmed"</w:t>
+                <w:sz w:val="20"/>
+                <w:szCs w:val="20"/>
+              </w:rPr>
+              <w:t xml:space="preserve">D1：【建议】Include，</w:t>
+            </w:r>
+            <w:r>
+              <w:rPr>
+                <w:rFonts w:ascii="Consolas" w:cs="Consolas" w:eastAsia="Microsoft YaHei" w:hAnsi="Consolas"/>
+                <w:sz w:val="20"/>
+                <w:szCs w:val="20"/>
+                <w:shd w:fill="EEEEEE" w:val="clear"/>
+              </w:rPr>
+              <w:t xml:space="preserve">ws_basis</w:t>
+            </w:r>
+            <w:r>
+              <w:rPr>
+                <w:rFonts w:ascii="Calibri" w:cs="Calibri" w:eastAsia="Microsoft YaHei" w:hAnsi="Calibri"/>
+                <w:sz w:val="20"/>
+                <w:szCs w:val="20"/>
+              </w:rPr>
+              <w:t xml:space="preserve"> = Torsion only</w:t>
             </w:r>
           </w:p>
         </w:tc>
@@ -4099,7 +4559,7 @@
                 <w:sz w:val="20"/>
                 <w:szCs w:val="20"/>
               </w:rPr>
-              <w:t xml:space="preserve">伴先天性膈疝或膈膨升的游走脾</w:t>
+              <w:t xml:space="preserve">只有临床诊断，没有影像也没有手术</w:t>
             </w:r>
           </w:p>
         </w:tc>
@@ -4123,10 +4583,20 @@
             <w:r>
               <w:rPr>
                 <w:rFonts w:ascii="Calibri" w:cs="Calibri" w:eastAsia="Microsoft YaHei" w:hAnsi="Calibri"/>
-                <w:sz w:val="20"/>
-                <w:szCs w:val="20"/>
-              </w:rPr>
-              <w:t xml:space="preserve">Include（亚组）</w:t>
+                <w:b/>
+                <w:bCs/>
+                <w:sz w:val="20"/>
+                <w:szCs w:val="20"/>
+              </w:rPr>
+              <w:t xml:space="preserve">E2</w:t>
+            </w:r>
+            <w:r>
+              <w:rPr>
+                <w:rFonts w:ascii="Calibri" w:cs="Calibri" w:eastAsia="Microsoft YaHei" w:hAnsi="Calibri"/>
+                <w:sz w:val="20"/>
+                <w:szCs w:val="20"/>
+              </w:rPr>
+              <w:t xml:space="preserve">，备注 "not confirmed"</w:t>
             </w:r>
           </w:p>
         </w:tc>
@@ -4159,7 +4629,7 @@
                 <w:sz w:val="20"/>
                 <w:szCs w:val="20"/>
               </w:rPr>
-              <w:t xml:space="preserve">胃扭转、胃出口梗阻、胰尾扭转合并游走脾</w:t>
+              <w:t xml:space="preserve">伴先天性膈疝或膈膨升的游走脾</w:t>
             </w:r>
           </w:p>
         </w:tc>
@@ -4219,7 +4689,7 @@
                 <w:sz w:val="20"/>
                 <w:szCs w:val="20"/>
               </w:rPr>
-              <w:t xml:space="preserve">未手术、保守治疗的游走脾患儿</w:t>
+              <w:t xml:space="preserve">胃扭转、胃出口梗阻、胰尾扭转合并游走脾</w:t>
             </w:r>
           </w:p>
         </w:tc>
@@ -4246,7 +4716,7 @@
                 <w:sz w:val="20"/>
                 <w:szCs w:val="20"/>
               </w:rPr>
-              <w:t xml:space="preserve">Include（描述性汇总，不进主要分析）</w:t>
+              <w:t xml:space="preserve">Include（亚组）</w:t>
             </w:r>
           </w:p>
         </w:tc>
@@ -4279,7 +4749,7 @@
                 <w:sz w:val="20"/>
                 <w:szCs w:val="20"/>
               </w:rPr>
-              <w:t xml:space="preserve">缺少症状持续时间或脾脏存活判断</w:t>
+              <w:t xml:space="preserve">未手术、保守治疗的游走脾患儿</w:t>
             </w:r>
           </w:p>
         </w:tc>
@@ -4306,7 +4776,7 @@
                 <w:sz w:val="20"/>
                 <w:szCs w:val="20"/>
               </w:rPr>
-              <w:t xml:space="preserve">Include（进不了主要分析）</w:t>
+              <w:t xml:space="preserve">Include（描述性汇总，不进主要分析）</w:t>
             </w:r>
           </w:p>
         </w:tc>
@@ -4339,7 +4809,7 @@
                 <w:sz w:val="20"/>
                 <w:szCs w:val="20"/>
               </w:rPr>
-              <w:t xml:space="preserve">成人和儿童混合，个体年龄可分</w:t>
+              <w:t xml:space="preserve">缺少症状持续时间或脾脏存活判断</w:t>
             </w:r>
           </w:p>
         </w:tc>
@@ -4366,7 +4836,7 @@
                 <w:sz w:val="20"/>
                 <w:szCs w:val="20"/>
               </w:rPr>
-              <w:t xml:space="preserve">Include，只提取小于 18 岁的</w:t>
+              <w:t xml:space="preserve">Include（进不了主要分析）</w:t>
             </w:r>
           </w:p>
         </w:tc>
@@ -4399,7 +4869,7 @@
                 <w:sz w:val="20"/>
                 <w:szCs w:val="20"/>
               </w:rPr>
-              <w:t xml:space="preserve">成人和儿童混合，只有均数和范围</w:t>
+              <w:t xml:space="preserve">成人和儿童混合，个体年龄可分</w:t>
             </w:r>
           </w:p>
         </w:tc>
@@ -4423,20 +4893,10 @@
             <w:r>
               <w:rPr>
                 <w:rFonts w:ascii="Calibri" w:cs="Calibri" w:eastAsia="Microsoft YaHei" w:hAnsi="Calibri"/>
-                <w:b/>
-                <w:bCs/>
-                <w:sz w:val="20"/>
-                <w:szCs w:val="20"/>
-              </w:rPr>
-              <w:t xml:space="preserve">A</w:t>
-            </w:r>
-            <w:r>
-              <w:rPr>
-                <w:rFonts w:ascii="Calibri" w:cs="Calibri" w:eastAsia="Microsoft YaHei" w:hAnsi="Calibri"/>
-                <w:sz w:val="20"/>
-                <w:szCs w:val="20"/>
-              </w:rPr>
-              <w:t xml:space="preserve">（Pending IPD）</w:t>
+                <w:sz w:val="20"/>
+                <w:szCs w:val="20"/>
+              </w:rPr>
+              <w:t xml:space="preserve">Include，只提取小于 18 岁的</w:t>
             </w:r>
           </w:p>
         </w:tc>
@@ -4469,7 +4929,7 @@
                 <w:sz w:val="20"/>
                 <w:szCs w:val="20"/>
               </w:rPr>
-              <w:t xml:space="preserve">全部是成人</w:t>
+              <w:t xml:space="preserve">成人和儿童混合，只有均数和范围</w:t>
             </w:r>
           </w:p>
         </w:tc>
@@ -4498,7 +4958,15 @@
                 <w:sz w:val="20"/>
                 <w:szCs w:val="20"/>
               </w:rPr>
-              <w:t xml:space="preserve">E3</w:t>
+              <w:t xml:space="preserve">A</w:t>
+            </w:r>
+            <w:r>
+              <w:rPr>
+                <w:rFonts w:ascii="Calibri" w:cs="Calibri" w:eastAsia="Microsoft YaHei" w:hAnsi="Calibri"/>
+                <w:sz w:val="20"/>
+                <w:szCs w:val="20"/>
+              </w:rPr>
+              <w:t xml:space="preserve">（Pending IPD）</w:t>
             </w:r>
           </w:p>
         </w:tc>
@@ -4531,7 +4999,7 @@
                 <w:sz w:val="20"/>
                 <w:szCs w:val="20"/>
               </w:rPr>
-              <w:t xml:space="preserve">报告的年龄是"18 岁"</w:t>
+              <w:t xml:space="preserve">全部是成人</w:t>
             </w:r>
           </w:p>
         </w:tc>
@@ -4552,14 +5020,6 @@
             </w:tcMar>
           </w:tcPr>
           <w:p>
-            <w:r>
-              <w:rPr>
-                <w:rFonts w:ascii="Calibri" w:cs="Calibri" w:eastAsia="Microsoft YaHei" w:hAnsi="Calibri"/>
-                <w:sz w:val="20"/>
-                <w:szCs w:val="20"/>
-              </w:rPr>
-              <w:t xml:space="preserve">不是小于 18 岁；全是这类则 </w:t>
-            </w:r>
             <w:r>
               <w:rPr>
                 <w:rFonts w:ascii="Calibri" w:cs="Calibri" w:eastAsia="Microsoft YaHei" w:hAnsi="Calibri"/>
@@ -4601,7 +5061,7 @@
                 <w:sz w:val="20"/>
                 <w:szCs w:val="20"/>
               </w:rPr>
-              <w:t xml:space="preserve">只写"儿童、小儿、患儿"，没有具体年龄</w:t>
+              <w:t xml:space="preserve">报告的年龄是"18 岁"</w:t>
             </w:r>
           </w:p>
         </w:tc>
@@ -4628,7 +5088,17 @@
                 <w:sz w:val="20"/>
                 <w:szCs w:val="20"/>
               </w:rPr>
-              <w:t xml:space="preserve">D2：【建议】Include，年龄记 NR</w:t>
+              <w:t xml:space="preserve">不是小于 18 岁；全是这类则 </w:t>
+            </w:r>
+            <w:r>
+              <w:rPr>
+                <w:rFonts w:ascii="Calibri" w:cs="Calibri" w:eastAsia="Microsoft YaHei" w:hAnsi="Calibri"/>
+                <w:b/>
+                <w:bCs/>
+                <w:sz w:val="20"/>
+                <w:szCs w:val="20"/>
+              </w:rPr>
+              <w:t xml:space="preserve">E3</w:t>
             </w:r>
           </w:p>
         </w:tc>
@@ -4661,7 +5131,7 @@
                 <w:sz w:val="20"/>
                 <w:szCs w:val="20"/>
               </w:rPr>
-              <w:t xml:space="preserve">只写"青少年、adolescent"</w:t>
+              <w:t xml:space="preserve">只写"儿童、小儿、患儿"，没有具体年龄</w:t>
             </w:r>
           </w:p>
         </w:tc>
@@ -4685,12 +5155,10 @@
             <w:r>
               <w:rPr>
                 <w:rFonts w:ascii="Calibri" w:cs="Calibri" w:eastAsia="Microsoft YaHei" w:hAnsi="Calibri"/>
-                <w:b/>
-                <w:bCs/>
-                <w:sz w:val="20"/>
-                <w:szCs w:val="20"/>
-              </w:rPr>
-              <w:t xml:space="preserve">N</w:t>
+                <w:sz w:val="20"/>
+                <w:szCs w:val="20"/>
+              </w:rPr>
+              <w:t xml:space="preserve">D2：【建议】Include，年龄记 NR</w:t>
             </w:r>
           </w:p>
         </w:tc>
@@ -4723,7 +5191,7 @@
                 <w:sz w:val="20"/>
                 <w:szCs w:val="20"/>
               </w:rPr>
-              <w:t xml:space="preserve">个体数据在图或表里</w:t>
+              <w:t xml:space="preserve">只写"青少年、adolescent"</w:t>
             </w:r>
           </w:p>
         </w:tc>
@@ -4747,10 +5215,12 @@
             <w:r>
               <w:rPr>
                 <w:rFonts w:ascii="Calibri" w:cs="Calibri" w:eastAsia="Microsoft YaHei" w:hAnsi="Calibri"/>
-                <w:sz w:val="20"/>
-                <w:szCs w:val="20"/>
-              </w:rPr>
-              <w:t xml:space="preserve">算个体可得，Include</w:t>
+                <w:b/>
+                <w:bCs/>
+                <w:sz w:val="20"/>
+                <w:szCs w:val="20"/>
+              </w:rPr>
+              <w:t xml:space="preserve">N</w:t>
             </w:r>
           </w:p>
         </w:tc>
@@ -4783,6 +5253,66 @@
                 <w:sz w:val="20"/>
                 <w:szCs w:val="20"/>
               </w:rPr>
+              <w:t xml:space="preserve">个体数据在图或表里</w:t>
+            </w:r>
+          </w:p>
+        </w:tc>
+        <w:tc>
+          <w:tcPr>
+            <w:tcW w:type="dxa" w:w="4726"/>
+            <w:tcBorders>
+              <w:top w:val="single" w:color="BBBBBB" w:sz="4"/>
+              <w:left w:val="single" w:color="BBBBBB" w:sz="4"/>
+              <w:bottom w:val="single" w:color="BBBBBB" w:sz="4"/>
+              <w:right w:val="single" w:color="BBBBBB" w:sz="4"/>
+            </w:tcBorders>
+            <w:tcMar>
+              <w:top w:type="dxa" w:w="60"/>
+              <w:left w:type="dxa" w:w="100"/>
+              <w:bottom w:type="dxa" w:w="60"/>
+              <w:right w:type="dxa" w:w="100"/>
+            </w:tcMar>
+          </w:tcPr>
+          <w:p>
+            <w:r>
+              <w:rPr>
+                <w:rFonts w:ascii="Calibri" w:cs="Calibri" w:eastAsia="Microsoft YaHei" w:hAnsi="Calibri"/>
+                <w:sz w:val="20"/>
+                <w:szCs w:val="20"/>
+              </w:rPr>
+              <w:t xml:space="preserve">算个体可得，Include</w:t>
+            </w:r>
+          </w:p>
+        </w:tc>
+      </w:tr>
+      <w:tr>
+        <w:trPr>
+          <w:cantSplit/>
+          <w:tblHeader w:val="false"/>
+        </w:trPr>
+        <w:tc>
+          <w:tcPr>
+            <w:tcW w:type="dxa" w:w="4300"/>
+            <w:tcBorders>
+              <w:top w:val="single" w:color="BBBBBB" w:sz="4"/>
+              <w:left w:val="single" w:color="BBBBBB" w:sz="4"/>
+              <w:bottom w:val="single" w:color="BBBBBB" w:sz="4"/>
+              <w:right w:val="single" w:color="BBBBBB" w:sz="4"/>
+            </w:tcBorders>
+            <w:tcMar>
+              <w:top w:type="dxa" w:w="60"/>
+              <w:left w:type="dxa" w:w="100"/>
+              <w:bottom w:type="dxa" w:w="60"/>
+              <w:right w:type="dxa" w:w="100"/>
+            </w:tcMar>
+          </w:tcPr>
+          <w:p>
+            <w:r>
+              <w:rPr>
+                <w:rFonts w:ascii="Calibri" w:cs="Calibri" w:eastAsia="Microsoft YaHei" w:hAnsi="Calibri"/>
+                <w:sz w:val="20"/>
+                <w:szCs w:val="20"/>
+              </w:rPr>
               <w:t xml:space="preserve">同一患者出现在两篇报告里</w:t>
             </w:r>
           </w:p>
@@ -5215,7 +5745,7 @@
         <w:rPr>
           <w:rFonts w:ascii="Calibri" w:cs="Calibri" w:eastAsia="Microsoft YaHei" w:hAnsi="Calibri"/>
         </w:rPr>
-        <w:t xml:space="preserve">（R1 舒俊 / R2 彭飞 / Consensus）、</w:t>
+        <w:t xml:space="preserve">（R1 舒俊 / R2 第二位全文筛选员 / Consensus）、</w:t>
       </w:r>
       <w:r>
         <w:rPr>
@@ -5558,7 +6088,7 @@
         <w:rPr>
           <w:rFonts w:ascii="Calibri" w:cs="Calibri" w:eastAsia="Microsoft YaHei" w:hAnsi="Calibri"/>
         </w:rPr>
-        <w:t xml:space="preserve"> 先由舒俊和彭飞讨论；讨论不一致的交杨俊。杨俊直接看导出的清单（含决定、理由、备注）；填 </w:t>
+        <w:t xml:space="preserve"> 先由两位筛选员讨论；讨论不一致的交杨俊。杨俊直接看导出的清单（含决定、理由、备注）；填 </w:t>
       </w:r>
       <w:r>
         <w:rPr>
@@ -5710,6 +6240,22 @@
         <w:rPr>
           <w:rFonts w:ascii="Calibri" w:cs="Calibri" w:eastAsia="Microsoft YaHei" w:hAnsi="Calibri"/>
         </w:rPr>
+        <w:t xml:space="preserve">因发表早于 2000 年未取全文的记录数（理由 Y，单独列出；当前 485）。</w:t>
+      </w:r>
+    </w:p>
+    <w:p>
+      <w:pPr>
+        <w:pStyle w:val="ListParagraph"/>
+        <w:numPr>
+          <w:ilvl w:val="0"/>
+          <w:numId w:val="2"/>
+        </w:numPr>
+        <w:spacing w:after="60"/>
+      </w:pPr>
+      <w:r>
+        <w:rPr>
+          <w:rFonts w:ascii="Calibri" w:cs="Calibri" w:eastAsia="Microsoft YaHei" w:hAnsi="Calibri"/>
+        </w:rPr>
         <w:t xml:space="preserve">因语种选 L 的记录数（应与 </w:t>
       </w:r>
       <w:r>
@@ -5725,7 +6271,7 @@
         <w:rPr>
           <w:rFonts w:ascii="Calibri" w:cs="Calibri" w:eastAsia="Microsoft YaHei" w:hAnsi="Calibri"/>
         </w:rPr>
-        <w:t xml:space="preserve"> 标签数一致，单独列出）。</w:t>
+        <w:t xml:space="preserve"> 标签数一致，单独列出；只含 2000 年及以后发表的，当前 66）。</w:t>
       </w:r>
     </w:p>
     <w:p>
@@ -5837,7 +6383,21 @@
         <w:rPr>
           <w:rFonts w:ascii="Calibri" w:cs="Calibri" w:eastAsia="Microsoft YaHei" w:hAnsi="Calibri"/>
         </w:rPr>
-        <w:t xml:space="preserve">方法部分要如实写：谁、何时、用什么工具筛选；是否盲法；校准的情况；理由的选择顺序；D 的尝试途径；IPD 索取的做法和结果。</w:t>
+        <w:t xml:space="preserve">方法部分要如实写：谁、何时、用什么工具筛选；是否盲法；校准的情况；理由的选择顺序；D 的尝试途径；IPD 索取的做法和结果；</w:t>
+      </w:r>
+      <w:r>
+        <w:rPr>
+          <w:rFonts w:ascii="Calibri" w:cs="Calibri" w:eastAsia="Microsoft YaHei" w:hAnsi="Calibri"/>
+          <w:b/>
+          <w:bCs/>
+        </w:rPr>
+        <w:t xml:space="preserve">2000 年日期规则（何时决定、为什么、对哪些记录生效）和 27 条 E4 安全网记录</w:t>
+      </w:r>
+      <w:r>
+        <w:rPr>
+          <w:rFonts w:ascii="Calibri" w:cs="Calibri" w:eastAsia="Microsoft YaHei" w:hAnsi="Calibri"/>
+        </w:rPr>
+        <w:t xml:space="preserve">，二者都是对方案的偏离。</w:t>
       </w:r>
     </w:p>
     <w:p>
@@ -5874,7 +6434,22 @@
         <w:rPr>
           <w:rFonts w:ascii="Calibri" w:cs="Calibri" w:eastAsia="Microsoft YaHei" w:hAnsi="Calibri"/>
         </w:rPr>
-        <w:t xml:space="preserve">。建议在正式开始全文筛选前，两人各自独立处理同样的 20 篇（从全文清单随机抽，并且至少含：中文 3 篇、综述 2 篇、系列报告 3 篇），比较，讨论分歧，必要时修改本指南。校准用的 20 篇在正式筛选里照样再处理一遍。</w:t>
+        <w:t xml:space="preserve">。建议在正式开始全文筛选前，两人各自独立处理同样的 20 篇（从 540 篇待取全文的清单（</w:t>
+      </w:r>
+      <w:r>
+        <w:rPr>
+          <w:rFonts w:ascii="Consolas" w:cs="Consolas" w:eastAsia="Microsoft YaHei" w:hAnsi="Consolas"/>
+          <w:sz w:val="19"/>
+          <w:szCs w:val="19"/>
+          <w:shd w:fill="EEEEEE" w:val="clear"/>
+        </w:rPr>
+        <w:t xml:space="preserve">retrieval_class</w:t>
+      </w:r>
+      <w:r>
+        <w:rPr>
+          <w:rFonts w:ascii="Calibri" w:cs="Calibri" w:eastAsia="Microsoft YaHei" w:hAnsi="Calibri"/>
+        </w:rPr>
+        <w:t xml:space="preserve"> = retrieve）里随机抽，并且至少含：中文 3 篇、综述 2 篇、系列报告 3 篇），比较，讨论分歧，必要时修改本指南。校准用的 20 篇在正式筛选里照样再处理一遍。</w:t>
       </w:r>
     </w:p>
     <w:p>
@@ -6275,7 +6850,7 @@
                 <w:sz w:val="20"/>
                 <w:szCs w:val="20"/>
               </w:rPr>
-              <w:t xml:space="preserve">L → D → E5 → E4 → E1 → E2 → E3 → A → N → E6，选第一条适用的。见第 5 节</w:t>
+              <w:t xml:space="preserve">Y → L → D → E5 → E4 → E1 → E2 → E3 → A → N → E6，选第一条适用的。见第 5 节</w:t>
             </w:r>
           </w:p>
         </w:tc>
@@ -6812,23 +7387,39 @@
         <w:rPr>
           <w:rFonts w:ascii="Calibri" w:cs="Calibri" w:eastAsia="Microsoft YaHei" w:hAnsi="Calibri"/>
         </w:rPr>
-        <w:t xml:space="preserve">1,050–1,220 篇这个数是从 50 条校准外推的，真实数量要等标题摘要阶段结束。</w:t>
-      </w:r>
-    </w:p>
-    <w:p>
-      <w:pPr>
-        <w:pStyle w:val="ListParagraph"/>
-        <w:numPr>
-          <w:ilvl w:val="0"/>
-          <w:numId w:val="2"/>
-        </w:numPr>
-        <w:spacing w:after="60"/>
-      </w:pPr>
-      <w:r>
-        <w:rPr>
-          <w:rFonts w:ascii="Calibri" w:cs="Calibri" w:eastAsia="Microsoft YaHei" w:hAnsi="Calibri"/>
-        </w:rPr>
-        <w:t xml:space="preserve">其他语种（375 条，约 15%）不提取是协议的规定，但它们里面可能有符合条件的儿童病例；这是局限，要写进论文。</w:t>
+        <w:t xml:space="preserve">540 篇是按 2000 年规则之后的实际数；其中无摘要的 178 篇，标题摘要阶段已按“无摘要只用 Maybe 或 Exclude”进入全文，全文阶段才第一次读到内容。</w:t>
+      </w:r>
+    </w:p>
+    <w:p>
+      <w:pPr>
+        <w:pStyle w:val="ListParagraph"/>
+        <w:numPr>
+          <w:ilvl w:val="0"/>
+          <w:numId w:val="2"/>
+        </w:numPr>
+        <w:spacing w:after="60"/>
+      </w:pPr>
+      <w:r>
+        <w:rPr>
+          <w:rFonts w:ascii="Calibri" w:cs="Calibri" w:eastAsia="Microsoft YaHei" w:hAnsi="Calibri"/>
+        </w:rPr>
+        <w:t xml:space="preserve">其他语种不提取是协议的规定，但它们里面可能有符合条件的儿童病例（进入全文清单的有 228 条，其中 162 条同时早于 2000 年）；这是局限，要写进论文。</w:t>
+      </w:r>
+    </w:p>
+    <w:p>
+      <w:pPr>
+        <w:pStyle w:val="ListParagraph"/>
+        <w:numPr>
+          <w:ilvl w:val="0"/>
+          <w:numId w:val="2"/>
+        </w:numPr>
+        <w:spacing w:after="60"/>
+      </w:pPr>
+      <w:r>
+        <w:rPr>
+          <w:rFonts w:ascii="Calibri" w:cs="Calibri" w:eastAsia="Microsoft YaHei" w:hAnsi="Calibri"/>
+        </w:rPr>
+        <w:t xml:space="preserve">2000 年规则让先导研究里的 1 篇（Hirose 1998）落在范围之外，也意味着更早的文献里的病例没有进入分析；先导研究没有 1998 年以前的文献，所以它说明不了这部分文献里有什么。</w:t>
       </w:r>
     </w:p>
     <w:p>
@@ -6928,7 +7519,7 @@
         <w:sz w:val="17"/>
         <w:szCs w:val="17"/>
       </w:rPr>
-      <w:t xml:space="preserve">全文筛选指南 v2026-10-11a   |   第 </w:t>
+      <w:t xml:space="preserve">全文筛选指南 v2026-10-17a   |   第 </w:t>
     </w:r>
     <w:r>
       <w:rPr>

</xml_diff>

<commit_message>
Second full-text reviewer: Hongqiang Bian; guide and FT_log hint updated
Co-Authored-By: Claude Sonnet 5.5 <noreply@anthropic.com>
Claude-Session: https://claude.ai/code/session_01FRD7etKqYN8v2bbXeeLMRW
</commit_message>
<xml_diff>
--- a/Full-text screening guide (draft).docx
+++ b/Full-text screening guide (draft).docx
@@ -22,21 +22,7 @@
         <w:rPr>
           <w:rFonts w:ascii="Calibri" w:cs="Calibri" w:eastAsia="Microsoft YaHei" w:hAnsi="Calibri"/>
         </w:rPr>
-        <w:t xml:space="preserve">适用对象：舒俊（筛选员 1）、第二位全文筛选员（</w:t>
-      </w:r>
-      <w:r>
-        <w:rPr>
-          <w:rFonts w:ascii="Calibri" w:cs="Calibri" w:eastAsia="Microsoft YaHei" w:hAnsi="Calibri"/>
-          <w:b/>
-          <w:bCs/>
-        </w:rPr>
-        <w:t xml:space="preserve">待定</w:t>
-      </w:r>
-      <w:r>
-        <w:rPr>
-          <w:rFonts w:ascii="Calibri" w:cs="Calibri" w:eastAsia="Microsoft YaHei" w:hAnsi="Calibri"/>
-        </w:rPr>
-        <w:t xml:space="preserve">，尚未确定人选）、杨俊（仲裁）。草稿日期：2026 年 10 月 11 日（v2026-10-11a）；2026 年 10 月 17 日更新为 v2026-10-17a。</w:t>
+        <w:t xml:space="preserve">适用对象：舒俊（筛选员 1）、卞宏强（筛选员 2，作者 2026 年 10 月 17 日决定）、杨俊（仲裁）。草稿日期：2026 年 10 月 11 日（v2026-10-11a）；2026 年 10 月 17 日更新为 v2026-10-17a。</w:t>
       </w:r>
       <w:r>
         <w:rPr>
@@ -98,7 +84,21 @@
         <w:rPr>
           <w:rFonts w:ascii="Calibri" w:cs="Calibri" w:eastAsia="Microsoft YaHei" w:hAnsi="Calibri"/>
         </w:rPr>
-        <w:t xml:space="preserve">，见 4.1）。这不是协议原有的纳入标准（协议第 7 节没有日期限制），是对已注册标准的偏离，要写进方案修订（v1.5）和方法部分的“偏离方案”；决定是在尚未取得任何全文、尚未提取任何数据时做出的。杨俊和第二位筛选员需要知道这一条。(2) 数量按标题摘要阶段的实际结果更新（第 1、4.1、14 节），不再用校准外推的估计。(3) 第二位筛选员尚未确定，文中原来写“彭飞”的地方改为“第二位筛选员”。(4) 理由码顺序加入 Y（第 5 节、D3）。除此之外，纳入排除的判断规则（6.2–6.7 和第 7 节的情形）没有改动。</w:t>
+        <w:t xml:space="preserve">，见 4.1）。这不是协议原有的纳入标准（协议第 7 节没有日期限制），是对已注册标准的偏离，要写进方案修订（v1.5）和方法部分的“偏离方案”；决定是在尚未取得任何全文、尚未提取任何数据时做出的。杨俊和第二位筛选员需要知道这一条。(2) 数量按标题摘要阶段的实际结果更新（第 1、4.1、14 节），不再用校准外推的估计。(3) </w:t>
+      </w:r>
+      <w:r>
+        <w:rPr>
+          <w:rFonts w:ascii="Calibri" w:cs="Calibri" w:eastAsia="Microsoft YaHei" w:hAnsi="Calibri"/>
+          <w:b/>
+          <w:bCs/>
+        </w:rPr>
+        <w:t xml:space="preserve">全文阶段的第二位筛选员是卞宏强</w:t>
+      </w:r>
+      <w:r>
+        <w:rPr>
+          <w:rFonts w:ascii="Calibri" w:cs="Calibri" w:eastAsia="Microsoft YaHei" w:hAnsi="Calibri"/>
+        </w:rPr>
+        <w:t xml:space="preserve">（作者 2026 年 10 月 17 日决定）。已注册的方案里第二评审员是彭飞，所以这是又一项偏离，要写进方案修订（v1.5）和方法部分；卞宏强已在 PROSPERO 团队名单里，不需要新增成员。他需要先读完标题摘要指南的第 1、5 节和本指南，再做第 12 节的 20 篇校准。(4) 理由码顺序加入 Y（第 5 节、D3）。除此之外，纳入排除的判断规则（6.2–6.7 和第 7 节的情形）没有改动。</w:t>
       </w:r>
     </w:p>
     <w:p>
@@ -5745,7 +5745,7 @@
         <w:rPr>
           <w:rFonts w:ascii="Calibri" w:cs="Calibri" w:eastAsia="Microsoft YaHei" w:hAnsi="Calibri"/>
         </w:rPr>
-        <w:t xml:space="preserve">（R1 舒俊 / R2 第二位全文筛选员 / Consensus）、</w:t>
+        <w:t xml:space="preserve">（R1 舒俊 / R2 卞宏强 / Consensus）、</w:t>
       </w:r>
       <w:r>
         <w:rPr>

</xml_diff>

<commit_message>
Full-text guide: D1-D8 decided, FT_log as formal record (no Rayyan), decision sheet, FT_time_log sheet
Co-Authored-By: Claude Sonnet 5.5 <noreply@anthropic.com>
Claude-Session: https://claude.ai/code/session_01FRD7etKqYN8v2bbXeeLMRW
</commit_message>
<xml_diff>
--- a/Full-text screening guide (draft).docx
+++ b/Full-text screening guide (draft).docx
@@ -30,46 +30,13 @@
           <w:b/>
           <w:bCs/>
         </w:rPr>
-        <w:t xml:space="preserve">状态：草稿，三位确认后生效。</w:t>
-      </w:r>
-      <w:r>
-        <w:rPr>
-          <w:rFonts w:ascii="Calibri" w:cs="Calibri" w:eastAsia="Microsoft YaHei" w:hAnsi="Calibri"/>
-        </w:rPr>
-        <w:t xml:space="preserve"> 本指南只是把已注册协议（第 7、10、14 节）的纳入排除标准落成全文阶段的操作规则，不改变协议。带【建议】的是 Claude 的操作化，需要三位决定；第 13 节列出了所有待决定的事项。</w:t>
-      </w:r>
-    </w:p>
-    <w:p>
-      <w:pPr>
-        <w:spacing w:after="120"/>
-      </w:pPr>
-      <w:r>
-        <w:rPr>
-          <w:rFonts w:ascii="Calibri" w:cs="Calibri" w:eastAsia="Microsoft YaHei" w:hAnsi="Calibri"/>
-          <w:b/>
-          <w:bCs/>
-        </w:rPr>
-        <w:t xml:space="preserve">v2026-10-17a 的改动：</w:t>
-      </w:r>
-      <w:r>
-        <w:rPr>
-          <w:rFonts w:ascii="Calibri" w:cs="Calibri" w:eastAsia="Microsoft YaHei" w:hAnsi="Calibri"/>
-        </w:rPr>
-        <w:t xml:space="preserve"> (1) </w:t>
-      </w:r>
-      <w:r>
-        <w:rPr>
-          <w:rFonts w:ascii="Calibri" w:cs="Calibri" w:eastAsia="Microsoft YaHei" w:hAnsi="Calibri"/>
-          <w:b/>
-          <w:bCs/>
-        </w:rPr>
-        <w:t xml:space="preserve">新增日期规则：2000 年以前发表的报告不取全文</w:t>
-      </w:r>
-      <w:r>
-        <w:rPr>
-          <w:rFonts w:ascii="Calibri" w:cs="Calibri" w:eastAsia="Microsoft YaHei" w:hAnsi="Calibri"/>
-        </w:rPr>
-        <w:t xml:space="preserve">（作者 2026 年 10 月 17 日决定；理由码 </w:t>
+        <w:t xml:space="preserve">状态：作者已于 2026 年 10 月 17 日决定 D1–D8（第 13 节）；杨俊和卞宏强尚未确认，确认后生效。</w:t>
+      </w:r>
+      <w:r>
+        <w:rPr>
+          <w:rFonts w:ascii="Calibri" w:cs="Calibri" w:eastAsia="Microsoft YaHei" w:hAnsi="Calibri"/>
+        </w:rPr>
+        <w:t xml:space="preserve"> 决定表另有一页版本（</w:t>
       </w:r>
       <w:r>
         <w:rPr>
@@ -78,6 +45,54 @@
           <w:szCs w:val="19"/>
           <w:shd w:fill="EEEEEE" w:val="clear"/>
         </w:rPr>
+        <w:t xml:space="preserve">Full-text screening - decision sheet D1-D8.docx</w:t>
+      </w:r>
+      <w:r>
+        <w:rPr>
+          <w:rFonts w:ascii="Calibri" w:cs="Calibri" w:eastAsia="Microsoft YaHei" w:hAnsi="Calibri"/>
+        </w:rPr>
+        <w:t xml:space="preserve">），供三位签字确认。 本指南只是把已注册协议（第 7、10、14 节）的纳入排除标准落成全文阶段的操作规则，不改变协议。带【建议】的是 Claude 的操作化，需要三位决定；第 13 节列出了所有待决定的事项。</w:t>
+      </w:r>
+    </w:p>
+    <w:p>
+      <w:pPr>
+        <w:spacing w:after="120"/>
+      </w:pPr>
+      <w:r>
+        <w:rPr>
+          <w:rFonts w:ascii="Calibri" w:cs="Calibri" w:eastAsia="Microsoft YaHei" w:hAnsi="Calibri"/>
+          <w:b/>
+          <w:bCs/>
+        </w:rPr>
+        <w:t xml:space="preserve">v2026-10-17a 的改动：</w:t>
+      </w:r>
+      <w:r>
+        <w:rPr>
+          <w:rFonts w:ascii="Calibri" w:cs="Calibri" w:eastAsia="Microsoft YaHei" w:hAnsi="Calibri"/>
+        </w:rPr>
+        <w:t xml:space="preserve"> (1) </w:t>
+      </w:r>
+      <w:r>
+        <w:rPr>
+          <w:rFonts w:ascii="Calibri" w:cs="Calibri" w:eastAsia="Microsoft YaHei" w:hAnsi="Calibri"/>
+          <w:b/>
+          <w:bCs/>
+        </w:rPr>
+        <w:t xml:space="preserve">新增日期规则：2000 年以前发表的报告不取全文</w:t>
+      </w:r>
+      <w:r>
+        <w:rPr>
+          <w:rFonts w:ascii="Calibri" w:cs="Calibri" w:eastAsia="Microsoft YaHei" w:hAnsi="Calibri"/>
+        </w:rPr>
+        <w:t xml:space="preserve">（作者 2026 年 10 月 17 日决定；理由码 </w:t>
+      </w:r>
+      <w:r>
+        <w:rPr>
+          <w:rFonts w:ascii="Consolas" w:cs="Consolas" w:eastAsia="Microsoft YaHei" w:hAnsi="Consolas"/>
+          <w:sz w:val="19"/>
+          <w:szCs w:val="19"/>
+          <w:shd w:fill="EEEEEE" w:val="clear"/>
+        </w:rPr>
         <w:t xml:space="preserve">Y</w:t>
       </w:r>
       <w:r>
@@ -98,7 +113,35 @@
         <w:rPr>
           <w:rFonts w:ascii="Calibri" w:cs="Calibri" w:eastAsia="Microsoft YaHei" w:hAnsi="Calibri"/>
         </w:rPr>
-        <w:t xml:space="preserve">（作者 2026 年 10 月 17 日决定）。已注册的方案里第二评审员是彭飞，所以这是又一项偏离，要写进方案修订（v1.5）和方法部分；卞宏强已在 PROSPERO 团队名单里，不需要新增成员。他需要先读完标题摘要指南的第 1、5 节和本指南，再做第 12 节的 20 篇校准。(4) 理由码顺序加入 Y（第 5 节、D3）。除此之外，纳入排除的判断规则（6.2–6.7 和第 7 节的情形）没有改动。</w:t>
+        <w:t xml:space="preserve">（作者 2026 年 10 月 17 日决定）。已注册的方案里第二评审员是彭飞，所以这是又一项偏离，要写进方案修订（v1.5）和方法部分；卞宏强已在 PROSPERO 团队名单里，不需要新增成员。他需要先读完标题摘要指南的第 1、5 节和本指南，再做第 12 节的 20 篇校准。(4) 理由码顺序加入 Y（第 5 节、D3）。(5) </w:t>
+      </w:r>
+      <w:r>
+        <w:rPr>
+          <w:rFonts w:ascii="Calibri" w:cs="Calibri" w:eastAsia="Microsoft YaHei" w:hAnsi="Calibri"/>
+          <w:b/>
+          <w:bCs/>
+        </w:rPr>
+        <w:t xml:space="preserve">D1–D8 已由作者决定</w:t>
+      </w:r>
+      <w:r>
+        <w:rPr>
+          <w:rFonts w:ascii="Calibri" w:cs="Calibri" w:eastAsia="Microsoft YaHei" w:hAnsi="Calibri"/>
+        </w:rPr>
+        <w:t xml:space="preserve">（第 13 节），按 Claude 的建议，其中 D4 采用新建议：</w:t>
+      </w:r>
+      <w:r>
+        <w:rPr>
+          <w:rFonts w:ascii="Calibri" w:cs="Calibri" w:eastAsia="Microsoft YaHei" w:hAnsi="Calibri"/>
+          <w:b/>
+          <w:bCs/>
+        </w:rPr>
+        <w:t xml:space="preserve">全文阶段不用 Rayyan，以提取工作簿里的 FT_log 为正式记录</w:t>
+      </w:r>
+      <w:r>
+        <w:rPr>
+          <w:rFonts w:ascii="Calibri" w:cs="Calibri" w:eastAsia="Microsoft YaHei" w:hAnsi="Calibri"/>
+        </w:rPr>
+        <w:t xml:space="preserve">（第 3 节），并新增 FT_time_log 时间记录。(6) 凡是写【建议】而现在已决定的地方，改为【已决定】。除此之外，纳入排除的判断规则（6.2–6.7 和第 7 节的情形）没有改动。</w:t>
       </w:r>
     </w:p>
     <w:p>
@@ -455,7 +498,7 @@
         <w:rPr>
           <w:rFonts w:ascii="Calibri" w:cs="Calibri" w:eastAsia="Microsoft YaHei" w:hAnsi="Calibri"/>
         </w:rPr>
-        <w:t xml:space="preserve">，按第 6 节的顺序回答问题，把决定记到记录表（第 9 节）。</w:t>
+        <w:t xml:space="preserve">，按第 6 节的顺序回答问题，把决定记到各自的 FT_log（第 9 节），把每次开始和结束的时间记到 FT_time_log。</w:t>
       </w:r>
     </w:p>
     <w:p>
@@ -531,99 +574,55 @@
         <w:rPr>
           <w:rFonts w:ascii="Calibri" w:cs="Calibri" w:eastAsia="Microsoft YaHei" w:hAnsi="Calibri"/>
         </w:rPr>
-        <w:t xml:space="preserve">3. 用什么工具记录</w:t>
-      </w:r>
-    </w:p>
-    <w:p>
-      <w:pPr>
-        <w:pStyle w:val="ListParagraph"/>
-        <w:numPr>
-          <w:ilvl w:val="0"/>
-          <w:numId w:val="2"/>
-        </w:numPr>
-        <w:spacing w:after="60"/>
-      </w:pPr>
-      <w:r>
-        <w:rPr>
-          <w:rFonts w:ascii="Calibri" w:cs="Calibri" w:eastAsia="Microsoft YaHei" w:hAnsi="Calibri"/>
-          <w:b/>
-          <w:bCs/>
-        </w:rPr>
-        <w:t xml:space="preserve">首选 Rayyan 的 Full text screening 标签</w:t>
-      </w:r>
-      <w:r>
-        <w:rPr>
-          <w:rFonts w:ascii="Calibri" w:cs="Calibri" w:eastAsia="Microsoft YaHei" w:hAnsi="Calibri"/>
-        </w:rPr>
-        <w:t xml:space="preserve">（项目顶部有）。但 Claude 没有操作过这个标签：怎么把记录送进去、是否继续保持盲法、Attach PDF 怎么用、理由和标签怎么设置，都没有核实过（手册 V6）。开始之前请对照实际界面核对，核对结果补充到本指南。</w:t>
-      </w:r>
-    </w:p>
-    <w:p>
-      <w:pPr>
-        <w:pStyle w:val="ListParagraph"/>
-        <w:numPr>
-          <w:ilvl w:val="0"/>
-          <w:numId w:val="2"/>
-        </w:numPr>
-        <w:spacing w:after="60"/>
-      </w:pPr>
-      <w:r>
-        <w:rPr>
-          <w:rFonts w:ascii="Calibri" w:cs="Calibri" w:eastAsia="Microsoft YaHei" w:hAnsi="Calibri"/>
-          <w:b/>
-          <w:bCs/>
-        </w:rPr>
-        <w:t xml:space="preserve">备用（也可作为 Rayyan 之外的备份）：</w:t>
-      </w:r>
-      <w:r>
-        <w:rPr>
-          <w:rFonts w:ascii="Calibri" w:cs="Calibri" w:eastAsia="Microsoft YaHei" w:hAnsi="Calibri"/>
-        </w:rPr>
-        <w:t xml:space="preserve"> 提取工作簿里的 </w:t>
-      </w:r>
-      <w:r>
-        <w:rPr>
-          <w:rFonts w:ascii="Calibri" w:cs="Calibri" w:eastAsia="Microsoft YaHei" w:hAnsi="Calibri"/>
-          <w:b/>
-          <w:bCs/>
-        </w:rPr>
-        <w:t xml:space="preserve">FT_log</w:t>
-      </w:r>
-      <w:r>
-        <w:rPr>
-          <w:rFonts w:ascii="Calibri" w:cs="Calibri" w:eastAsia="Microsoft YaHei" w:hAnsi="Calibri"/>
-        </w:rPr>
-        <w:t xml:space="preserve"> 表，每人一份，列见第 9 节。无论用哪种，</w:t>
-      </w:r>
-      <w:r>
-        <w:rPr>
-          <w:rFonts w:ascii="Calibri" w:cs="Calibri" w:eastAsia="Microsoft YaHei" w:hAnsi="Calibri"/>
-          <w:b/>
-          <w:bCs/>
-        </w:rPr>
-        <w:t xml:space="preserve">理由名称一字不差</w:t>
-      </w:r>
-      <w:r>
-        <w:rPr>
-          <w:rFonts w:ascii="Calibri" w:cs="Calibri" w:eastAsia="Microsoft YaHei" w:hAnsi="Calibri"/>
-        </w:rPr>
-        <w:t xml:space="preserve">（第 5 节），盲法照旧。</w:t>
-      </w:r>
-    </w:p>
-    <w:p>
-      <w:pPr>
-        <w:pStyle w:val="ListParagraph"/>
-        <w:numPr>
-          <w:ilvl w:val="0"/>
-          <w:numId w:val="2"/>
-        </w:numPr>
-        <w:spacing w:after="60"/>
-      </w:pPr>
-      <w:r>
-        <w:rPr>
-          <w:rFonts w:ascii="Calibri" w:cs="Calibri" w:eastAsia="Microsoft YaHei" w:hAnsi="Calibri"/>
-        </w:rPr>
-        <w:t xml:space="preserve">Pending IPD 在 Rayyan 里怎么表示没有验证。【建议】用 Maybe 加标签 </w:t>
+        <w:t xml:space="preserve">3. 用什么工具记录（D4，已决定）</w:t>
+      </w:r>
+    </w:p>
+    <w:p>
+      <w:pPr>
+        <w:pStyle w:val="ListParagraph"/>
+        <w:numPr>
+          <w:ilvl w:val="0"/>
+          <w:numId w:val="2"/>
+        </w:numPr>
+        <w:spacing w:after="60"/>
+      </w:pPr>
+      <w:r>
+        <w:rPr>
+          <w:rFonts w:ascii="Calibri" w:cs="Calibri" w:eastAsia="Microsoft YaHei" w:hAnsi="Calibri"/>
+          <w:b/>
+          <w:bCs/>
+        </w:rPr>
+        <w:t xml:space="preserve">正式记录是提取工作簿里的 FT_log 表</w:t>
+      </w:r>
+      <w:r>
+        <w:rPr>
+          <w:rFonts w:ascii="Calibri" w:cs="Calibri" w:eastAsia="Microsoft YaHei" w:hAnsi="Calibri"/>
+        </w:rPr>
+        <w:t xml:space="preserve">，不用 Rayyan 的 Full text screening 标签（我们没有试过这个功能，怎么送入记录、盲法、理由和标签都没有核实）。标题摘要阶段的两个 Rayyan 项目不再使用，也不在里面建 E5、L 等理由或标签。</w:t>
+      </w:r>
+    </w:p>
+    <w:p>
+      <w:pPr>
+        <w:pStyle w:val="ListParagraph"/>
+        <w:numPr>
+          <w:ilvl w:val="0"/>
+          <w:numId w:val="2"/>
+        </w:numPr>
+        <w:spacing w:after="60"/>
+      </w:pPr>
+      <w:r>
+        <w:rPr>
+          <w:rFonts w:ascii="Calibri" w:cs="Calibri" w:eastAsia="Microsoft YaHei" w:hAnsi="Calibri"/>
+          <w:b/>
+          <w:bCs/>
+        </w:rPr>
+        <w:t xml:space="preserve">每人一份副本</w:t>
+      </w:r>
+      <w:r>
+        <w:rPr>
+          <w:rFonts w:ascii="Calibri" w:cs="Calibri" w:eastAsia="Microsoft YaHei" w:hAnsi="Calibri"/>
+        </w:rPr>
+        <w:t xml:space="preserve">：文件名 </w:t>
       </w:r>
       <w:r>
         <w:rPr>
@@ -632,118 +631,13 @@
           <w:szCs w:val="19"/>
           <w:shd w:fill="EEEEEE" w:val="clear"/>
         </w:rPr>
-        <w:t xml:space="preserve">ipd-pending</w:t>
-      </w:r>
-      <w:r>
-        <w:rPr>
-          <w:rFonts w:ascii="Calibri" w:cs="Calibri" w:eastAsia="Microsoft YaHei" w:hAnsi="Calibri"/>
-        </w:rPr>
-        <w:t xml:space="preserve">；或者全文阶段的决定只记在 FT_log 里，Rayyan 只用来存 PDF。</w:t>
-      </w:r>
-    </w:p>
-    <w:p>
-      <w:pPr>
-        <w:pStyle w:val="ListParagraph"/>
-        <w:numPr>
-          <w:ilvl w:val="0"/>
-          <w:numId w:val="2"/>
-        </w:numPr>
-        <w:spacing w:after="60"/>
-      </w:pPr>
-      <w:r>
-        <w:rPr>
-          <w:rFonts w:ascii="Calibri" w:cs="Calibri" w:eastAsia="Microsoft YaHei" w:hAnsi="Calibri"/>
-          <w:b/>
-          <w:bCs/>
-        </w:rPr>
-        <w:t xml:space="preserve">PDF 的存放：</w:t>
-      </w:r>
-      <w:r>
-        <w:rPr>
-          <w:rFonts w:ascii="Calibri" w:cs="Calibri" w:eastAsia="Microsoft YaHei" w:hAnsi="Calibri"/>
-        </w:rPr>
-        <w:t xml:space="preserve"> 按 WS 编号命名（如 WS0123.pdf），放在各自的电脑或单位网盘。【建议】PDF 不放进仓库（版权和体积）；仓库里只放记录表。</w:t>
-      </w:r>
-    </w:p>
-    <w:p>
-      <w:pPr>
-        <w:pStyle w:val="Heading2"/>
-        <w:keepNext/>
-      </w:pPr>
-      <w:r>
-        <w:rPr>
-          <w:rFonts w:ascii="Calibri" w:cs="Calibri" w:eastAsia="Microsoft YaHei" w:hAnsi="Calibri"/>
-        </w:rPr>
-        <w:t xml:space="preserve">4. 获取全文</w:t>
-      </w:r>
-    </w:p>
-    <w:p>
-      <w:pPr>
-        <w:pStyle w:val="Heading3"/>
-        <w:keepNext/>
-      </w:pPr>
-      <w:r>
-        <w:rPr>
-          <w:rFonts w:ascii="Calibri" w:cs="Calibri" w:eastAsia="Microsoft YaHei" w:hAnsi="Calibri"/>
-        </w:rPr>
-        <w:t xml:space="preserve">4.1 先按发表年份分流，再按语种分流</w:t>
-      </w:r>
-    </w:p>
-    <w:p>
-      <w:pPr>
-        <w:spacing w:after="120"/>
-      </w:pPr>
-      <w:r>
-        <w:rPr>
-          <w:rFonts w:ascii="Calibri" w:cs="Calibri" w:eastAsia="Microsoft YaHei" w:hAnsi="Calibri"/>
-          <w:b/>
-          <w:bCs/>
-        </w:rPr>
-        <w:t xml:space="preserve">第一步：发表年份（理由 Y，作者 2026 年 10 月 17 日决定）。</w:t>
-      </w:r>
-    </w:p>
-    <w:p>
-      <w:pPr>
-        <w:pStyle w:val="ListParagraph"/>
-        <w:numPr>
-          <w:ilvl w:val="0"/>
-          <w:numId w:val="2"/>
-        </w:numPr>
-        <w:spacing w:after="60"/>
-      </w:pPr>
-      <w:r>
-        <w:rPr>
-          <w:rFonts w:ascii="Calibri" w:cs="Calibri" w:eastAsia="Microsoft YaHei" w:hAnsi="Calibri"/>
-        </w:rPr>
-        <w:t xml:space="preserve">清单里</w:t>
-      </w:r>
-      <w:r>
-        <w:rPr>
-          <w:rFonts w:ascii="Calibri" w:cs="Calibri" w:eastAsia="Microsoft YaHei" w:hAnsi="Calibri"/>
-          <w:b/>
-          <w:bCs/>
-        </w:rPr>
-        <w:t xml:space="preserve">发表年份早于 2000 年</w:t>
-      </w:r>
-      <w:r>
-        <w:rPr>
-          <w:rFonts w:ascii="Calibri" w:cs="Calibri" w:eastAsia="Microsoft YaHei" w:hAnsi="Calibri"/>
-        </w:rPr>
-        <w:t xml:space="preserve">的记录，不取全文，也不做任何纳入排除的判断，理由选 </w:t>
-      </w:r>
-      <w:r>
-        <w:rPr>
-          <w:rFonts w:ascii="Calibri" w:cs="Calibri" w:eastAsia="Microsoft YaHei" w:hAnsi="Calibri"/>
-          <w:b/>
-          <w:bCs/>
-        </w:rPr>
-        <w:t xml:space="preserve">Y</w:t>
-      </w:r>
-      <w:r>
-        <w:rPr>
-          <w:rFonts w:ascii="Calibri" w:cs="Calibri" w:eastAsia="Microsoft YaHei" w:hAnsi="Calibri"/>
-        </w:rPr>
-        <w:t xml:space="preserve">（Rayyan 名称 </w:t>
+        <w:t xml:space="preserve">FT_R1.xlsx</w:t>
+      </w:r>
+      <w:r>
+        <w:rPr>
+          <w:rFonts w:ascii="Calibri" w:cs="Calibri" w:eastAsia="Microsoft YaHei" w:hAnsi="Calibri"/>
+        </w:rPr>
+        <w:t xml:space="preserve">（舒俊）、</w:t>
       </w:r>
       <w:r>
         <w:rPr>
@@ -752,13 +646,13 @@
           <w:szCs w:val="19"/>
           <w:shd w:fill="EEEEEE" w:val="clear"/>
         </w:rPr>
-        <w:t xml:space="preserve">Y published before 2000</w:t>
-      </w:r>
-      <w:r>
-        <w:rPr>
-          <w:rFonts w:ascii="Calibri" w:cs="Calibri" w:eastAsia="Microsoft YaHei" w:hAnsi="Calibri"/>
-        </w:rPr>
-        <w:t xml:space="preserve">，若用 FT_log 则在 </w:t>
+        <w:t xml:space="preserve">FT_R2.xlsx</w:t>
+      </w:r>
+      <w:r>
+        <w:rPr>
+          <w:rFonts w:ascii="Calibri" w:cs="Calibri" w:eastAsia="Microsoft YaHei" w:hAnsi="Calibri"/>
+        </w:rPr>
+        <w:t xml:space="preserve">（卞宏强）；每次用完另存一份带日期的副本（如 </w:t>
       </w:r>
       <w:r>
         <w:rPr>
@@ -767,13 +661,45 @@
           <w:szCs w:val="19"/>
           <w:shd w:fill="EEEEEE" w:val="clear"/>
         </w:rPr>
-        <w:t xml:space="preserve">reason</w:t>
-      </w:r>
-      <w:r>
-        <w:rPr>
-          <w:rFonts w:ascii="Calibri" w:cs="Calibri" w:eastAsia="Microsoft YaHei" w:hAnsi="Calibri"/>
-        </w:rPr>
-        <w:t xml:space="preserve"> 列写这个名称）。年份取数据库记录里的发表年份（清单的 </w:t>
+        <w:t xml:space="preserve">FT_R2_2026-11-03.xlsx</w:t>
+      </w:r>
+      <w:r>
+        <w:rPr>
+          <w:rFonts w:ascii="Calibri" w:cs="Calibri" w:eastAsia="Microsoft YaHei" w:hAnsi="Calibri"/>
+        </w:rPr>
+        <w:t xml:space="preserve">），不覆盖旧的。</w:t>
+      </w:r>
+      <w:r>
+        <w:rPr>
+          <w:rFonts w:ascii="Calibri" w:cs="Calibri" w:eastAsia="Microsoft YaHei" w:hAnsi="Calibri"/>
+          <w:b/>
+          <w:bCs/>
+        </w:rPr>
+        <w:t xml:space="preserve">两人都完成之前，不看对方的文件，不讨论具体的篇目。</w:t>
+      </w:r>
+    </w:p>
+    <w:p>
+      <w:pPr>
+        <w:pStyle w:val="ListParagraph"/>
+        <w:numPr>
+          <w:ilvl w:val="0"/>
+          <w:numId w:val="2"/>
+        </w:numPr>
+        <w:spacing w:after="60"/>
+      </w:pPr>
+      <w:r>
+        <w:rPr>
+          <w:rFonts w:ascii="Calibri" w:cs="Calibri" w:eastAsia="Microsoft YaHei" w:hAnsi="Calibri"/>
+          <w:b/>
+          <w:bCs/>
+        </w:rPr>
+        <w:t xml:space="preserve">理由名称</w:t>
+      </w:r>
+      <w:r>
+        <w:rPr>
+          <w:rFonts w:ascii="Calibri" w:cs="Calibri" w:eastAsia="Microsoft YaHei" w:hAnsi="Calibri"/>
+        </w:rPr>
+        <w:t xml:space="preserve">就是 FT_log </w:t>
       </w:r>
       <w:r>
         <w:rPr>
@@ -782,188 +708,37 @@
           <w:szCs w:val="19"/>
           <w:shd w:fill="EEEEEE" w:val="clear"/>
         </w:rPr>
-        <w:t xml:space="preserve">year</w:t>
-      </w:r>
-      <w:r>
-        <w:rPr>
-          <w:rFonts w:ascii="Calibri" w:cs="Calibri" w:eastAsia="Microsoft YaHei" w:hAnsi="Calibri"/>
-        </w:rPr>
-        <w:t xml:space="preserve"> 列）；2000 年发表的</w:t>
-      </w:r>
-      <w:r>
-        <w:rPr>
-          <w:rFonts w:ascii="Calibri" w:cs="Calibri" w:eastAsia="Microsoft YaHei" w:hAnsi="Calibri"/>
-          <w:b/>
-          <w:bCs/>
-        </w:rPr>
-        <w:t xml:space="preserve">要取</w:t>
-      </w:r>
-      <w:r>
-        <w:rPr>
-          <w:rFonts w:ascii="Calibri" w:cs="Calibri" w:eastAsia="Microsoft YaHei" w:hAnsi="Calibri"/>
-        </w:rPr>
-        <w:t xml:space="preserve">。清单里没有缺年份的记录；以后如果遇到，按“要取全文”处理。</w:t>
-      </w:r>
-    </w:p>
-    <w:p>
-      <w:pPr>
-        <w:pStyle w:val="ListParagraph"/>
-        <w:numPr>
-          <w:ilvl w:val="0"/>
-          <w:numId w:val="2"/>
-        </w:numPr>
-        <w:spacing w:after="60"/>
-      </w:pPr>
-      <w:r>
-        <w:rPr>
-          <w:rFonts w:ascii="Calibri" w:cs="Calibri" w:eastAsia="Microsoft YaHei" w:hAnsi="Calibri"/>
-        </w:rPr>
-        <w:t xml:space="preserve">当前清单里有 485 条（英文 256、中文 67、其他语种 162；有摘要 189、没有摘要 296）。其中包括 6 条 E4 安全网记录（WS1767、WS2213、WS2221、WS1043、WS1084、WS0990，年份 1976–1999）：日期规则优先，这 6 条也不取。</w:t>
-      </w:r>
-    </w:p>
-    <w:p>
-      <w:pPr>
-        <w:pStyle w:val="ListParagraph"/>
-        <w:numPr>
-          <w:ilvl w:val="0"/>
-          <w:numId w:val="2"/>
-        </w:numPr>
-        <w:spacing w:after="60"/>
-      </w:pPr>
-      <w:r>
-        <w:rPr>
-          <w:rFonts w:ascii="Calibri" w:cs="Calibri" w:eastAsia="Microsoft YaHei" w:hAnsi="Calibri"/>
-          <w:b/>
-          <w:bCs/>
-        </w:rPr>
-        <w:t xml:space="preserve">预试验的 53 篇不例外</w:t>
-      </w:r>
-      <w:r>
-        <w:rPr>
-          <w:rFonts w:ascii="Calibri" w:cs="Calibri" w:eastAsia="Microsoft YaHei" w:hAnsi="Calibri"/>
-        </w:rPr>
-        <w:t xml:space="preserve">（标题摘要指南的决定：先导文献与其他记录一样处理）。受影响的有 Hirose 1998（1 名儿童）；其余 IPD 文献都在 2000 年或以后。</w:t>
-      </w:r>
-    </w:p>
-    <w:p>
-      <w:pPr>
-        <w:pStyle w:val="ListParagraph"/>
-        <w:numPr>
-          <w:ilvl w:val="0"/>
-          <w:numId w:val="2"/>
-        </w:numPr>
-        <w:spacing w:after="60"/>
-      </w:pPr>
-      <w:r>
-        <w:rPr>
-          <w:rFonts w:ascii="Calibri" w:cs="Calibri" w:eastAsia="Microsoft YaHei" w:hAnsi="Calibri"/>
-          <w:b/>
-          <w:bCs/>
-        </w:rPr>
-        <w:t xml:space="preserve">这是对已注册纳入标准（无日期限制）的偏离。</w:t>
-      </w:r>
-      <w:r>
-        <w:rPr>
-          <w:rFonts w:ascii="Calibri" w:cs="Calibri" w:eastAsia="Microsoft YaHei" w:hAnsi="Calibri"/>
-        </w:rPr>
-        <w:t xml:space="preserve"> 规则是在没有看过任何提取数据时定的，理由主要是可行性：这个时期的报告大多没有摘要、全文很难获取。</w:t>
-      </w:r>
-      <w:r>
-        <w:rPr>
-          <w:rFonts w:ascii="Calibri" w:cs="Calibri" w:eastAsia="Microsoft YaHei" w:hAnsi="Calibri"/>
-          <w:b/>
-          <w:bCs/>
-        </w:rPr>
-        <w:t xml:space="preserve">不要说 2000 年以前的数据质量更差——没有证据。</w:t>
-      </w:r>
-      <w:r>
-        <w:rPr>
-          <w:rFonts w:ascii="Calibri" w:cs="Calibri" w:eastAsia="Microsoft YaHei" w:hAnsi="Calibri"/>
-        </w:rPr>
-        <w:t xml:space="preserve"> 局限要在论文里写明：先导文献最早只到 1998 年，说明不了更早的文献里有什么；2000 年以前的病例（包括可能的长病程病例）没有被纳入。</w:t>
-      </w:r>
-    </w:p>
-    <w:p>
-      <w:pPr>
-        <w:pStyle w:val="ListParagraph"/>
-        <w:numPr>
-          <w:ilvl w:val="0"/>
-          <w:numId w:val="2"/>
-        </w:numPr>
-        <w:spacing w:after="60"/>
-      </w:pPr>
-      <w:r>
-        <w:rPr>
-          <w:rFonts w:ascii="Calibri" w:cs="Calibri" w:eastAsia="Microsoft YaHei" w:hAnsi="Calibri"/>
-        </w:rPr>
-        <w:t xml:space="preserve">方案里原有的敏感性分析“排除 2000 年以前发表的报告”现在对 2000 年起的数据没有意义，统计分析时要同步修改（交 Ji Wang 在分析计划修订里处理）。</w:t>
-      </w:r>
-    </w:p>
-    <w:p>
-      <w:pPr>
-        <w:spacing w:after="120"/>
-      </w:pPr>
-      <w:r>
-        <w:rPr>
-          <w:rFonts w:ascii="Calibri" w:cs="Calibri" w:eastAsia="Microsoft YaHei" w:hAnsi="Calibri"/>
-          <w:b/>
-          <w:bCs/>
-        </w:rPr>
-        <w:t xml:space="preserve">第二步：语种。</w:t>
-      </w:r>
-    </w:p>
-    <w:p>
-      <w:pPr>
-        <w:pStyle w:val="ListParagraph"/>
-        <w:numPr>
-          <w:ilvl w:val="0"/>
-          <w:numId w:val="2"/>
-        </w:numPr>
-        <w:spacing w:after="60"/>
-      </w:pPr>
-      <w:r>
-        <w:rPr>
-          <w:rFonts w:ascii="Calibri" w:cs="Calibri" w:eastAsia="Microsoft YaHei" w:hAnsi="Calibri"/>
-        </w:rPr>
-        <w:t xml:space="preserve">记录的语种看 RIS 里的语种字段（英文、中文、其他；另有少数语种未定，需要人工看一眼）。当前清单里发表于 2000 年及以后的记录：英文 439、中文 101、其他语种 66。</w:t>
-      </w:r>
-    </w:p>
-    <w:p>
-      <w:pPr>
-        <w:pStyle w:val="ListParagraph"/>
-        <w:numPr>
-          <w:ilvl w:val="0"/>
-          <w:numId w:val="2"/>
-        </w:numPr>
-        <w:spacing w:after="60"/>
-      </w:pPr>
-      <w:r>
-        <w:rPr>
-          <w:rFonts w:ascii="Calibri" w:cs="Calibri" w:eastAsia="Microsoft YaHei" w:hAnsi="Calibri"/>
-          <w:b/>
-          <w:bCs/>
-        </w:rPr>
-        <w:t xml:space="preserve">英文、中文以外的语种：</w:t>
-      </w:r>
-      <w:r>
-        <w:rPr>
-          <w:rFonts w:ascii="Calibri" w:cs="Calibri" w:eastAsia="Microsoft YaHei" w:hAnsi="Calibri"/>
-        </w:rPr>
-        <w:t xml:space="preserve"> 协议第 10 节规定“列出并计数，不提取”。这些记录选理由 </w:t>
-      </w:r>
-      <w:r>
-        <w:rPr>
-          <w:rFonts w:ascii="Calibri" w:cs="Calibri" w:eastAsia="Microsoft YaHei" w:hAnsi="Calibri"/>
-          <w:b/>
-          <w:bCs/>
-        </w:rPr>
-        <w:t xml:space="preserve">L</w:t>
-      </w:r>
-      <w:r>
-        <w:rPr>
-          <w:rFonts w:ascii="Calibri" w:cs="Calibri" w:eastAsia="Microsoft YaHei" w:hAnsi="Calibri"/>
-        </w:rPr>
-        <w:t xml:space="preserve">，加标签 </w:t>
+        <w:t xml:space="preserve">reason</w:t>
+      </w:r>
+      <w:r>
+        <w:rPr>
+          <w:rFonts w:ascii="Calibri" w:cs="Calibri" w:eastAsia="Microsoft YaHei" w:hAnsi="Calibri"/>
+        </w:rPr>
+        <w:t xml:space="preserve"> 列下拉列表里的写法（Lists 表），一字不差；含义见第 5 节。</w:t>
+      </w:r>
+    </w:p>
+    <w:p>
+      <w:pPr>
+        <w:pStyle w:val="ListParagraph"/>
+        <w:numPr>
+          <w:ilvl w:val="0"/>
+          <w:numId w:val="2"/>
+        </w:numPr>
+        <w:spacing w:after="60"/>
+      </w:pPr>
+      <w:r>
+        <w:rPr>
+          <w:rFonts w:ascii="Calibri" w:cs="Calibri" w:eastAsia="Microsoft YaHei" w:hAnsi="Calibri"/>
+          <w:b/>
+          <w:bCs/>
+        </w:rPr>
+        <w:t xml:space="preserve">Pending IPD</w:t>
+      </w:r>
+      <w:r>
+        <w:rPr>
+          <w:rFonts w:ascii="Calibri" w:cs="Calibri" w:eastAsia="Microsoft YaHei" w:hAnsi="Calibri"/>
+        </w:rPr>
+        <w:t xml:space="preserve"> 只是 FT_log </w:t>
       </w:r>
       <w:r>
         <w:rPr>
@@ -972,13 +747,454 @@
           <w:szCs w:val="19"/>
           <w:shd w:fill="EEEEEE" w:val="clear"/>
         </w:rPr>
-        <w:t xml:space="preserve">lang-other</w:t>
-      </w:r>
-      <w:r>
-        <w:rPr>
-          <w:rFonts w:ascii="Calibri" w:cs="Calibri" w:eastAsia="Microsoft YaHei" w:hAnsi="Calibri"/>
-        </w:rPr>
-        <w:t xml:space="preserve">，不取全文，也不做 Include/Exclude 判断。</w:t>
+        <w:t xml:space="preserve">decision</w:t>
+      </w:r>
+      <w:r>
+        <w:rPr>
+          <w:rFonts w:ascii="Calibri" w:cs="Calibri" w:eastAsia="Microsoft YaHei" w:hAnsi="Calibri"/>
+        </w:rPr>
+        <w:t xml:space="preserve"> 列的一个取值（理由选 A），不在别处设标签。</w:t>
+      </w:r>
+    </w:p>
+    <w:p>
+      <w:pPr>
+        <w:pStyle w:val="ListParagraph"/>
+        <w:numPr>
+          <w:ilvl w:val="0"/>
+          <w:numId w:val="2"/>
+        </w:numPr>
+        <w:spacing w:after="60"/>
+      </w:pPr>
+      <w:r>
+        <w:rPr>
+          <w:rFonts w:ascii="Calibri" w:cs="Calibri" w:eastAsia="Microsoft YaHei" w:hAnsi="Calibri"/>
+          <w:b/>
+          <w:bCs/>
+        </w:rPr>
+        <w:t xml:space="preserve">时间记录：</w:t>
+      </w:r>
+      <w:r>
+        <w:rPr>
+          <w:rFonts w:ascii="Calibri" w:cs="Calibri" w:eastAsia="Microsoft YaHei" w:hAnsi="Calibri"/>
+        </w:rPr>
+        <w:t xml:space="preserve"> 每次开始和结束全文筛选，在 </w:t>
+      </w:r>
+      <w:r>
+        <w:rPr>
+          <w:rFonts w:ascii="Calibri" w:cs="Calibri" w:eastAsia="Microsoft YaHei" w:hAnsi="Calibri"/>
+          <w:b/>
+          <w:bCs/>
+        </w:rPr>
+        <w:t xml:space="preserve">FT_time_log</w:t>
+      </w:r>
+      <w:r>
+        <w:rPr>
+          <w:rFonts w:ascii="Calibri" w:cs="Calibri" w:eastAsia="Microsoft YaHei" w:hAnsi="Calibri"/>
+        </w:rPr>
+        <w:t xml:space="preserve"> 表写一行（日期、起止时间、这一段处理的篇数）。Rayyan 有自带的时间戳日志，FT_log 没有，这张表用来代替它。</w:t>
+      </w:r>
+    </w:p>
+    <w:p>
+      <w:pPr>
+        <w:pStyle w:val="ListParagraph"/>
+        <w:numPr>
+          <w:ilvl w:val="0"/>
+          <w:numId w:val="2"/>
+        </w:numPr>
+        <w:spacing w:after="60"/>
+      </w:pPr>
+      <w:r>
+        <w:rPr>
+          <w:rFonts w:ascii="Calibri" w:cs="Calibri" w:eastAsia="Microsoft YaHei" w:hAnsi="Calibri"/>
+          <w:b/>
+          <w:bCs/>
+        </w:rPr>
+        <w:t xml:space="preserve">中途检查：</w:t>
+      </w:r>
+      <w:r>
+        <w:rPr>
+          <w:rFonts w:ascii="Calibri" w:cs="Calibri" w:eastAsia="Microsoft YaHei" w:hAnsi="Calibri"/>
+        </w:rPr>
+        <w:t xml:space="preserve"> 每人完成前 50 篇后，把自己的 FT_log 和 FT_time_log 交给杨俊保管（不交给对方），由他决定怎么转交 Claude 核对格式和进度（用时、是否有空白理由、理由名称是否正确）；Claude 只报告汇总，不把某一篇的对方决定告诉筛选员。两人都完成后再互相交换。</w:t>
+      </w:r>
+    </w:p>
+    <w:p>
+      <w:pPr>
+        <w:pStyle w:val="ListParagraph"/>
+        <w:numPr>
+          <w:ilvl w:val="0"/>
+          <w:numId w:val="2"/>
+        </w:numPr>
+        <w:spacing w:after="60"/>
+      </w:pPr>
+      <w:r>
+        <w:rPr>
+          <w:rFonts w:ascii="Calibri" w:cs="Calibri" w:eastAsia="Microsoft YaHei" w:hAnsi="Calibri"/>
+          <w:b/>
+          <w:bCs/>
+        </w:rPr>
+        <w:t xml:space="preserve">检索清单：</w:t>
+      </w:r>
+      <w:r>
+        <w:rPr>
+          <w:rFonts w:ascii="Calibri" w:cs="Calibri" w:eastAsia="Microsoft YaHei" w:hAnsi="Calibri"/>
+        </w:rPr>
+        <w:t xml:space="preserve"> 要不要取全文、理由 Y 和 L 的记录，都在 </w:t>
+      </w:r>
+      <w:r>
+        <w:rPr>
+          <w:rFonts w:ascii="Consolas" w:cs="Consolas" w:eastAsia="Microsoft YaHei" w:hAnsi="Consolas"/>
+          <w:sz w:val="19"/>
+          <w:szCs w:val="19"/>
+          <w:shd w:fill="EEEEEE" w:val="clear"/>
+        </w:rPr>
+        <w:t xml:space="preserve">search/screening/rescreen/fulltext_retrieval_list.csv</w:t>
+      </w:r>
+      <w:r>
+        <w:rPr>
+          <w:rFonts w:ascii="Calibri" w:cs="Calibri" w:eastAsia="Microsoft YaHei" w:hAnsi="Calibri"/>
+        </w:rPr>
+        <w:t xml:space="preserve"> 里（</w:t>
+      </w:r>
+      <w:r>
+        <w:rPr>
+          <w:rFonts w:ascii="Consolas" w:cs="Consolas" w:eastAsia="Microsoft YaHei" w:hAnsi="Consolas"/>
+          <w:sz w:val="19"/>
+          <w:szCs w:val="19"/>
+          <w:shd w:fill="EEEEEE" w:val="clear"/>
+        </w:rPr>
+        <w:t xml:space="preserve">retrieval_class</w:t>
+      </w:r>
+      <w:r>
+        <w:rPr>
+          <w:rFonts w:ascii="Calibri" w:cs="Calibri" w:eastAsia="Microsoft YaHei" w:hAnsi="Calibri"/>
+        </w:rPr>
+        <w:t xml:space="preserve">）。Y、L 不进 FT_log（没有人读它们），数字从检索清单统计；只有取到全文后才发现语种不是英文或中文的，才在 FT_log 里记 L。</w:t>
+      </w:r>
+    </w:p>
+    <w:p>
+      <w:pPr>
+        <w:pStyle w:val="ListParagraph"/>
+        <w:numPr>
+          <w:ilvl w:val="0"/>
+          <w:numId w:val="2"/>
+        </w:numPr>
+        <w:spacing w:after="60"/>
+      </w:pPr>
+      <w:r>
+        <w:rPr>
+          <w:rFonts w:ascii="Calibri" w:cs="Calibri" w:eastAsia="Microsoft YaHei" w:hAnsi="Calibri"/>
+          <w:b/>
+          <w:bCs/>
+        </w:rPr>
+        <w:t xml:space="preserve">PDF 的存放：</w:t>
+      </w:r>
+      <w:r>
+        <w:rPr>
+          <w:rFonts w:ascii="Calibri" w:cs="Calibri" w:eastAsia="Microsoft YaHei" w:hAnsi="Calibri"/>
+        </w:rPr>
+        <w:t xml:space="preserve"> 按 WS 编号命名（如 WS0123.pdf），放在各自的电脑或单位网盘。PDF 不放进仓库（版权和体积）；仓库里只放记录表。</w:t>
+      </w:r>
+    </w:p>
+    <w:p>
+      <w:pPr>
+        <w:pStyle w:val="Heading2"/>
+        <w:keepNext/>
+      </w:pPr>
+      <w:r>
+        <w:rPr>
+          <w:rFonts w:ascii="Calibri" w:cs="Calibri" w:eastAsia="Microsoft YaHei" w:hAnsi="Calibri"/>
+        </w:rPr>
+        <w:t xml:space="preserve">4. 获取全文</w:t>
+      </w:r>
+    </w:p>
+    <w:p>
+      <w:pPr>
+        <w:pStyle w:val="Heading3"/>
+        <w:keepNext/>
+      </w:pPr>
+      <w:r>
+        <w:rPr>
+          <w:rFonts w:ascii="Calibri" w:cs="Calibri" w:eastAsia="Microsoft YaHei" w:hAnsi="Calibri"/>
+        </w:rPr>
+        <w:t xml:space="preserve">4.1 先按发表年份分流，再按语种分流</w:t>
+      </w:r>
+    </w:p>
+    <w:p>
+      <w:pPr>
+        <w:spacing w:after="120"/>
+      </w:pPr>
+      <w:r>
+        <w:rPr>
+          <w:rFonts w:ascii="Calibri" w:cs="Calibri" w:eastAsia="Microsoft YaHei" w:hAnsi="Calibri"/>
+          <w:b/>
+          <w:bCs/>
+        </w:rPr>
+        <w:t xml:space="preserve">第一步：发表年份（理由 Y，作者 2026 年 10 月 17 日决定）。</w:t>
+      </w:r>
+    </w:p>
+    <w:p>
+      <w:pPr>
+        <w:pStyle w:val="ListParagraph"/>
+        <w:numPr>
+          <w:ilvl w:val="0"/>
+          <w:numId w:val="2"/>
+        </w:numPr>
+        <w:spacing w:after="60"/>
+      </w:pPr>
+      <w:r>
+        <w:rPr>
+          <w:rFonts w:ascii="Calibri" w:cs="Calibri" w:eastAsia="Microsoft YaHei" w:hAnsi="Calibri"/>
+        </w:rPr>
+        <w:t xml:space="preserve">清单里</w:t>
+      </w:r>
+      <w:r>
+        <w:rPr>
+          <w:rFonts w:ascii="Calibri" w:cs="Calibri" w:eastAsia="Microsoft YaHei" w:hAnsi="Calibri"/>
+          <w:b/>
+          <w:bCs/>
+        </w:rPr>
+        <w:t xml:space="preserve">发表年份早于 2000 年</w:t>
+      </w:r>
+      <w:r>
+        <w:rPr>
+          <w:rFonts w:ascii="Calibri" w:cs="Calibri" w:eastAsia="Microsoft YaHei" w:hAnsi="Calibri"/>
+        </w:rPr>
+        <w:t xml:space="preserve">的记录，不取全文，也不做任何纳入排除的判断，理由是 </w:t>
+      </w:r>
+      <w:r>
+        <w:rPr>
+          <w:rFonts w:ascii="Calibri" w:cs="Calibri" w:eastAsia="Microsoft YaHei" w:hAnsi="Calibri"/>
+          <w:b/>
+          <w:bCs/>
+        </w:rPr>
+        <w:t xml:space="preserve">Y</w:t>
+      </w:r>
+      <w:r>
+        <w:rPr>
+          <w:rFonts w:ascii="Calibri" w:cs="Calibri" w:eastAsia="Microsoft YaHei" w:hAnsi="Calibri"/>
+        </w:rPr>
+        <w:t xml:space="preserve">（</w:t>
+      </w:r>
+      <w:r>
+        <w:rPr>
+          <w:rFonts w:ascii="Consolas" w:cs="Consolas" w:eastAsia="Microsoft YaHei" w:hAnsi="Consolas"/>
+          <w:sz w:val="19"/>
+          <w:szCs w:val="19"/>
+          <w:shd w:fill="EEEEEE" w:val="clear"/>
+        </w:rPr>
+        <w:t xml:space="preserve">Y published before 2000</w:t>
+      </w:r>
+      <w:r>
+        <w:rPr>
+          <w:rFonts w:ascii="Calibri" w:cs="Calibri" w:eastAsia="Microsoft YaHei" w:hAnsi="Calibri"/>
+        </w:rPr>
+        <w:t xml:space="preserve">），记在检索清单的 </w:t>
+      </w:r>
+      <w:r>
+        <w:rPr>
+          <w:rFonts w:ascii="Consolas" w:cs="Consolas" w:eastAsia="Microsoft YaHei" w:hAnsi="Consolas"/>
+          <w:sz w:val="19"/>
+          <w:szCs w:val="19"/>
+          <w:shd w:fill="EEEEEE" w:val="clear"/>
+        </w:rPr>
+        <w:t xml:space="preserve">retrieval_class</w:t>
+      </w:r>
+      <w:r>
+        <w:rPr>
+          <w:rFonts w:ascii="Calibri" w:cs="Calibri" w:eastAsia="Microsoft YaHei" w:hAnsi="Calibri"/>
+        </w:rPr>
+        <w:t xml:space="preserve"> 里，不进 FT_log。年份取数据库记录里的发表年份（清单的 </w:t>
+      </w:r>
+      <w:r>
+        <w:rPr>
+          <w:rFonts w:ascii="Consolas" w:cs="Consolas" w:eastAsia="Microsoft YaHei" w:hAnsi="Consolas"/>
+          <w:sz w:val="19"/>
+          <w:szCs w:val="19"/>
+          <w:shd w:fill="EEEEEE" w:val="clear"/>
+        </w:rPr>
+        <w:t xml:space="preserve">year</w:t>
+      </w:r>
+      <w:r>
+        <w:rPr>
+          <w:rFonts w:ascii="Calibri" w:cs="Calibri" w:eastAsia="Microsoft YaHei" w:hAnsi="Calibri"/>
+        </w:rPr>
+        <w:t xml:space="preserve"> 列）；2000 年发表的</w:t>
+      </w:r>
+      <w:r>
+        <w:rPr>
+          <w:rFonts w:ascii="Calibri" w:cs="Calibri" w:eastAsia="Microsoft YaHei" w:hAnsi="Calibri"/>
+          <w:b/>
+          <w:bCs/>
+        </w:rPr>
+        <w:t xml:space="preserve">要取</w:t>
+      </w:r>
+      <w:r>
+        <w:rPr>
+          <w:rFonts w:ascii="Calibri" w:cs="Calibri" w:eastAsia="Microsoft YaHei" w:hAnsi="Calibri"/>
+        </w:rPr>
+        <w:t xml:space="preserve">。清单里没有缺年份的记录；以后如果遇到，按“要取全文”处理。</w:t>
+      </w:r>
+    </w:p>
+    <w:p>
+      <w:pPr>
+        <w:pStyle w:val="ListParagraph"/>
+        <w:numPr>
+          <w:ilvl w:val="0"/>
+          <w:numId w:val="2"/>
+        </w:numPr>
+        <w:spacing w:after="60"/>
+      </w:pPr>
+      <w:r>
+        <w:rPr>
+          <w:rFonts w:ascii="Calibri" w:cs="Calibri" w:eastAsia="Microsoft YaHei" w:hAnsi="Calibri"/>
+        </w:rPr>
+        <w:t xml:space="preserve">当前清单里有 485 条（英文 256、中文 67、其他语种 162；有摘要 189、没有摘要 296）。其中包括 6 条 E4 安全网记录（WS1767、WS2213、WS2221、WS1043、WS1084、WS0990，年份 1976–1999）：日期规则优先，这 6 条也不取。</w:t>
+      </w:r>
+    </w:p>
+    <w:p>
+      <w:pPr>
+        <w:pStyle w:val="ListParagraph"/>
+        <w:numPr>
+          <w:ilvl w:val="0"/>
+          <w:numId w:val="2"/>
+        </w:numPr>
+        <w:spacing w:after="60"/>
+      </w:pPr>
+      <w:r>
+        <w:rPr>
+          <w:rFonts w:ascii="Calibri" w:cs="Calibri" w:eastAsia="Microsoft YaHei" w:hAnsi="Calibri"/>
+          <w:b/>
+          <w:bCs/>
+        </w:rPr>
+        <w:t xml:space="preserve">预试验的 53 篇不例外</w:t>
+      </w:r>
+      <w:r>
+        <w:rPr>
+          <w:rFonts w:ascii="Calibri" w:cs="Calibri" w:eastAsia="Microsoft YaHei" w:hAnsi="Calibri"/>
+        </w:rPr>
+        <w:t xml:space="preserve">（标题摘要指南的决定：先导文献与其他记录一样处理）。受影响的有 Hirose 1998（1 名儿童）；其余 IPD 文献都在 2000 年或以后。</w:t>
+      </w:r>
+    </w:p>
+    <w:p>
+      <w:pPr>
+        <w:pStyle w:val="ListParagraph"/>
+        <w:numPr>
+          <w:ilvl w:val="0"/>
+          <w:numId w:val="2"/>
+        </w:numPr>
+        <w:spacing w:after="60"/>
+      </w:pPr>
+      <w:r>
+        <w:rPr>
+          <w:rFonts w:ascii="Calibri" w:cs="Calibri" w:eastAsia="Microsoft YaHei" w:hAnsi="Calibri"/>
+          <w:b/>
+          <w:bCs/>
+        </w:rPr>
+        <w:t xml:space="preserve">这是对已注册纳入标准（无日期限制）的偏离。</w:t>
+      </w:r>
+      <w:r>
+        <w:rPr>
+          <w:rFonts w:ascii="Calibri" w:cs="Calibri" w:eastAsia="Microsoft YaHei" w:hAnsi="Calibri"/>
+        </w:rPr>
+        <w:t xml:space="preserve"> 规则是在没有看过任何提取数据时定的，理由主要是可行性：这个时期的报告大多没有摘要、全文很难获取。</w:t>
+      </w:r>
+      <w:r>
+        <w:rPr>
+          <w:rFonts w:ascii="Calibri" w:cs="Calibri" w:eastAsia="Microsoft YaHei" w:hAnsi="Calibri"/>
+          <w:b/>
+          <w:bCs/>
+        </w:rPr>
+        <w:t xml:space="preserve">不要说 2000 年以前的数据质量更差——没有证据。</w:t>
+      </w:r>
+      <w:r>
+        <w:rPr>
+          <w:rFonts w:ascii="Calibri" w:cs="Calibri" w:eastAsia="Microsoft YaHei" w:hAnsi="Calibri"/>
+        </w:rPr>
+        <w:t xml:space="preserve"> 局限要在论文里写明：先导文献最早只到 1998 年，说明不了更早的文献里有什么；2000 年以前的病例（包括可能的长病程病例）没有被纳入。</w:t>
+      </w:r>
+    </w:p>
+    <w:p>
+      <w:pPr>
+        <w:pStyle w:val="ListParagraph"/>
+        <w:numPr>
+          <w:ilvl w:val="0"/>
+          <w:numId w:val="2"/>
+        </w:numPr>
+        <w:spacing w:after="60"/>
+      </w:pPr>
+      <w:r>
+        <w:rPr>
+          <w:rFonts w:ascii="Calibri" w:cs="Calibri" w:eastAsia="Microsoft YaHei" w:hAnsi="Calibri"/>
+        </w:rPr>
+        <w:t xml:space="preserve">方案里原有的敏感性分析“排除 2000 年以前发表的报告”现在对 2000 年起的数据没有意义，统计分析时要同步修改（交 Ji Wang 在分析计划修订里处理）。</w:t>
+      </w:r>
+    </w:p>
+    <w:p>
+      <w:pPr>
+        <w:spacing w:after="120"/>
+      </w:pPr>
+      <w:r>
+        <w:rPr>
+          <w:rFonts w:ascii="Calibri" w:cs="Calibri" w:eastAsia="Microsoft YaHei" w:hAnsi="Calibri"/>
+          <w:b/>
+          <w:bCs/>
+        </w:rPr>
+        <w:t xml:space="preserve">第二步：语种。</w:t>
+      </w:r>
+    </w:p>
+    <w:p>
+      <w:pPr>
+        <w:pStyle w:val="ListParagraph"/>
+        <w:numPr>
+          <w:ilvl w:val="0"/>
+          <w:numId w:val="2"/>
+        </w:numPr>
+        <w:spacing w:after="60"/>
+      </w:pPr>
+      <w:r>
+        <w:rPr>
+          <w:rFonts w:ascii="Calibri" w:cs="Calibri" w:eastAsia="Microsoft YaHei" w:hAnsi="Calibri"/>
+        </w:rPr>
+        <w:t xml:space="preserve">记录的语种看 RIS 里的语种字段（英文、中文、其他；另有少数语种未定，需要人工看一眼）。当前清单里发表于 2000 年及以后的记录：英文 439、中文 101、其他语种 66。</w:t>
+      </w:r>
+    </w:p>
+    <w:p>
+      <w:pPr>
+        <w:pStyle w:val="ListParagraph"/>
+        <w:numPr>
+          <w:ilvl w:val="0"/>
+          <w:numId w:val="2"/>
+        </w:numPr>
+        <w:spacing w:after="60"/>
+      </w:pPr>
+      <w:r>
+        <w:rPr>
+          <w:rFonts w:ascii="Calibri" w:cs="Calibri" w:eastAsia="Microsoft YaHei" w:hAnsi="Calibri"/>
+          <w:b/>
+          <w:bCs/>
+        </w:rPr>
+        <w:t xml:space="preserve">英文、中文以外的语种：</w:t>
+      </w:r>
+      <w:r>
+        <w:rPr>
+          <w:rFonts w:ascii="Calibri" w:cs="Calibri" w:eastAsia="Microsoft YaHei" w:hAnsi="Calibri"/>
+        </w:rPr>
+        <w:t xml:space="preserve"> 协议第 10 节规定“列出并计数，不提取”。这些记录的理由是 </w:t>
+      </w:r>
+      <w:r>
+        <w:rPr>
+          <w:rFonts w:ascii="Calibri" w:cs="Calibri" w:eastAsia="Microsoft YaHei" w:hAnsi="Calibri"/>
+          <w:b/>
+          <w:bCs/>
+        </w:rPr>
+        <w:t xml:space="preserve">L</w:t>
+      </w:r>
+      <w:r>
+        <w:rPr>
+          <w:rFonts w:ascii="Calibri" w:cs="Calibri" w:eastAsia="Microsoft YaHei" w:hAnsi="Calibri"/>
+        </w:rPr>
+        <w:t xml:space="preserve">，记在检索清单里，不取全文，也不做 Include/Exclude 判断。</w:t>
       </w:r>
       <w:r>
         <w:rPr>
@@ -1333,7 +1549,28 @@
                 <w:sz w:val="20"/>
                 <w:szCs w:val="20"/>
               </w:rPr>
-              <w:t xml:space="preserve">Rayyan 名称（建议）</w:t>
+              <w:t xml:space="preserve">名称（FT_log </w:t>
+            </w:r>
+            <w:r>
+              <w:rPr>
+                <w:rFonts w:ascii="Consolas" w:cs="Consolas" w:eastAsia="Microsoft YaHei" w:hAnsi="Consolas"/>
+                <w:b/>
+                <w:bCs/>
+                <w:sz w:val="20"/>
+                <w:szCs w:val="20"/>
+                <w:shd w:fill="EEEEEE" w:val="clear"/>
+              </w:rPr>
+              <w:t xml:space="preserve">reason</w:t>
+            </w:r>
+            <w:r>
+              <w:rPr>
+                <w:rFonts w:ascii="Calibri" w:cs="Calibri" w:eastAsia="Microsoft YaHei" w:hAnsi="Calibri"/>
+                <w:b/>
+                <w:bCs/>
+                <w:sz w:val="20"/>
+                <w:szCs w:val="20"/>
+              </w:rPr>
+              <w:t xml:space="preserve"> 下拉列表里的写法）</w:t>
             </w:r>
           </w:p>
         </w:tc>
@@ -2350,7 +2587,201 @@
         <w:rPr>
           <w:rFonts w:ascii="Calibri" w:cs="Calibri" w:eastAsia="Microsoft YaHei" w:hAnsi="Calibri"/>
         </w:rPr>
-        <w:t xml:space="preserve">E1–E4 在 Rayyan 的正式项目里已经建好；E5、E6 和标签 </w:t>
+        <w:t xml:space="preserve">全文阶段不用 Rayyan（第 3 节），所以不需要在 Rayyan 里建理由；L、D、E1–E6、A、N 已在 FT_log 的下拉列表里。Y 不进 FT_log（由检索清单计数）。</w:t>
+      </w:r>
+    </w:p>
+    <w:p>
+      <w:pPr>
+        <w:spacing w:after="120"/>
+      </w:pPr>
+      <w:r>
+        <w:rPr>
+          <w:rFonts w:ascii="Calibri" w:cs="Calibri" w:eastAsia="Microsoft YaHei" w:hAnsi="Calibri"/>
+          <w:b/>
+          <w:bCs/>
+        </w:rPr>
+        <w:t xml:space="preserve">一篇同时符合多条理由时，按上表从上到下，选第一条适用的。</w:t>
+      </w:r>
+      <w:r>
+        <w:rPr>
+          <w:rFonts w:ascii="Calibri" w:cs="Calibri" w:eastAsia="Microsoft YaHei" w:hAnsi="Calibri"/>
+        </w:rPr>
+        <w:t xml:space="preserve">【已决定，D3】这与标题摘要阶段不同：那里"任选一条适用的"，因为标题摘要阶段的理由不影响谁进入全文，也不进入 PRISMA 图；全文阶段的理由要进入 PRISMA 图，每篇只能算一条，固定顺序（Y 排在最前，因为它不需要读全文）可以让计数可重复，也避免两人"决定一样、理由不同"被当作分歧。</w:t>
+      </w:r>
+    </w:p>
+    <w:p>
+      <w:pPr>
+        <w:spacing w:after="120"/>
+      </w:pPr>
+      <w:r>
+        <w:rPr>
+          <w:rFonts w:ascii="Calibri" w:cs="Calibri" w:eastAsia="Microsoft YaHei" w:hAnsi="Calibri"/>
+        </w:rPr>
+        <w:t xml:space="preserve">注意 A 排在 N 前面：一篇只有汇总数据又无法确认年龄的报告（例如"年龄 3–60 岁，均数 22 岁"），索取到个体数据后年龄问题也就解决了，所以先按 A 处理。</w:t>
+      </w:r>
+    </w:p>
+    <w:p>
+      <w:pPr>
+        <w:pStyle w:val="Heading2"/>
+        <w:keepNext/>
+      </w:pPr>
+      <w:r>
+        <w:rPr>
+          <w:rFonts w:ascii="Calibri" w:cs="Calibri" w:eastAsia="Microsoft YaHei" w:hAnsi="Calibri"/>
+        </w:rPr>
+        <w:t xml:space="preserve">6. 逐篇判断：按顺序回答的问题</w:t>
+      </w:r>
+    </w:p>
+    <w:p>
+      <w:pPr>
+        <w:pStyle w:val="Heading3"/>
+        <w:keepNext/>
+      </w:pPr>
+      <w:r>
+        <w:rPr>
+          <w:rFonts w:ascii="Calibri" w:cs="Calibri" w:eastAsia="Microsoft YaHei" w:hAnsi="Calibri"/>
+        </w:rPr>
+        <w:t xml:space="preserve">6.1 第 1–3 题：语种、全文、是不是正式文章</w:t>
+      </w:r>
+    </w:p>
+    <w:p>
+      <w:pPr>
+        <w:pStyle w:val="ListParagraph"/>
+        <w:numPr>
+          <w:ilvl w:val="0"/>
+          <w:numId w:val="5"/>
+        </w:numPr>
+        <w:spacing w:after="60"/>
+      </w:pPr>
+      <w:r>
+        <w:rPr>
+          <w:rFonts w:ascii="Calibri" w:cs="Calibri" w:eastAsia="Microsoft YaHei" w:hAnsi="Calibri"/>
+        </w:rPr>
+        <w:t xml:space="preserve">全文是英文或中文吗？不是 → </w:t>
+      </w:r>
+      <w:r>
+        <w:rPr>
+          <w:rFonts w:ascii="Calibri" w:cs="Calibri" w:eastAsia="Microsoft YaHei" w:hAnsi="Calibri"/>
+          <w:b/>
+          <w:bCs/>
+        </w:rPr>
+        <w:t xml:space="preserve">L</w:t>
+      </w:r>
+      <w:r>
+        <w:rPr>
+          <w:rFonts w:ascii="Calibri" w:cs="Calibri" w:eastAsia="Microsoft YaHei" w:hAnsi="Calibri"/>
+        </w:rPr>
+        <w:t xml:space="preserve">。</w:t>
+      </w:r>
+    </w:p>
+    <w:p>
+      <w:pPr>
+        <w:pStyle w:val="ListParagraph"/>
+        <w:numPr>
+          <w:ilvl w:val="0"/>
+          <w:numId w:val="5"/>
+        </w:numPr>
+        <w:spacing w:after="60"/>
+      </w:pPr>
+      <w:r>
+        <w:rPr>
+          <w:rFonts w:ascii="Calibri" w:cs="Calibri" w:eastAsia="Microsoft YaHei" w:hAnsi="Calibri"/>
+        </w:rPr>
+        <w:t xml:space="preserve">取得到全文吗？取不到（按 4.3）→ </w:t>
+      </w:r>
+      <w:r>
+        <w:rPr>
+          <w:rFonts w:ascii="Calibri" w:cs="Calibri" w:eastAsia="Microsoft YaHei" w:hAnsi="Calibri"/>
+          <w:b/>
+          <w:bCs/>
+        </w:rPr>
+        <w:t xml:space="preserve">D</w:t>
+      </w:r>
+      <w:r>
+        <w:rPr>
+          <w:rFonts w:ascii="Calibri" w:cs="Calibri" w:eastAsia="Microsoft YaHei" w:hAnsi="Calibri"/>
+        </w:rPr>
+        <w:t xml:space="preserve">。</w:t>
+      </w:r>
+    </w:p>
+    <w:p>
+      <w:pPr>
+        <w:pStyle w:val="ListParagraph"/>
+        <w:numPr>
+          <w:ilvl w:val="0"/>
+          <w:numId w:val="5"/>
+        </w:numPr>
+        <w:spacing w:after="60"/>
+      </w:pPr>
+      <w:r>
+        <w:rPr>
+          <w:rFonts w:ascii="Calibri" w:cs="Calibri" w:eastAsia="Microsoft YaHei" w:hAnsi="Calibri"/>
+        </w:rPr>
+        <w:t xml:space="preserve">是正式文章吗？只有摘要的会议报告、专利、报纸、产品说明 → </w:t>
+      </w:r>
+      <w:r>
+        <w:rPr>
+          <w:rFonts w:ascii="Calibri" w:cs="Calibri" w:eastAsia="Microsoft YaHei" w:hAnsi="Calibri"/>
+          <w:b/>
+          <w:bCs/>
+        </w:rPr>
+        <w:t xml:space="preserve">E5</w:t>
+      </w:r>
+      <w:r>
+        <w:rPr>
+          <w:rFonts w:ascii="Calibri" w:cs="Calibri" w:eastAsia="Microsoft YaHei" w:hAnsi="Calibri"/>
+        </w:rPr>
+        <w:t xml:space="preserve">。中文会议论文如果全文是完整论文，按期刊文章继续判断（标题摘要指南第 8 节的决定）。</w:t>
+      </w:r>
+    </w:p>
+    <w:p>
+      <w:pPr>
+        <w:pStyle w:val="Heading3"/>
+        <w:keepNext/>
+      </w:pPr>
+      <w:r>
+        <w:rPr>
+          <w:rFonts w:ascii="Calibri" w:cs="Calibri" w:eastAsia="Microsoft YaHei" w:hAnsi="Calibri"/>
+        </w:rPr>
+        <w:t xml:space="preserve">6.2 第 4 题：有没有原始患者数据</w:t>
+      </w:r>
+    </w:p>
+    <w:p>
+      <w:pPr>
+        <w:pStyle w:val="ListParagraph"/>
+        <w:numPr>
+          <w:ilvl w:val="0"/>
+          <w:numId w:val="2"/>
+        </w:numPr>
+        <w:spacing w:after="60"/>
+      </w:pPr>
+      <w:r>
+        <w:rPr>
+          <w:rFonts w:ascii="Calibri" w:cs="Calibri" w:eastAsia="Microsoft YaHei" w:hAnsi="Calibri"/>
+          <w:b/>
+          <w:bCs/>
+        </w:rPr>
+        <w:t xml:space="preserve">没有新病例的综述</w:t>
+      </w:r>
+      <w:r>
+        <w:rPr>
+          <w:rFonts w:ascii="Calibri" w:cs="Calibri" w:eastAsia="Microsoft YaHei" w:hAnsi="Calibri"/>
+        </w:rPr>
+        <w:t xml:space="preserve">、社论、评论、只评论他人文章的信件 → </w:t>
+      </w:r>
+      <w:r>
+        <w:rPr>
+          <w:rFonts w:ascii="Calibri" w:cs="Calibri" w:eastAsia="Microsoft YaHei" w:hAnsi="Calibri"/>
+          <w:b/>
+          <w:bCs/>
+        </w:rPr>
+        <w:t xml:space="preserve">E4</w:t>
+      </w:r>
+      <w:r>
+        <w:rPr>
+          <w:rFonts w:ascii="Calibri" w:cs="Calibri" w:eastAsia="Microsoft YaHei" w:hAnsi="Calibri"/>
+        </w:rPr>
+        <w:t xml:space="preserve">，综述同时在 </w:t>
       </w:r>
       <w:r>
         <w:rPr>
@@ -2359,13 +2790,13 @@
           <w:szCs w:val="19"/>
           <w:shd w:fill="EEEEEE" w:val="clear"/>
         </w:rPr>
-        <w:t xml:space="preserve">lang-other</w:t>
-      </w:r>
-      <w:r>
-        <w:rPr>
-          <w:rFonts w:ascii="Calibri" w:cs="Calibri" w:eastAsia="Microsoft YaHei" w:hAnsi="Calibri"/>
-        </w:rPr>
-        <w:t xml:space="preserve"> 由第一次用到的人建（标题摘要指南第 3 节），标签 </w:t>
+        <w:t xml:space="preserve">note</w:t>
+      </w:r>
+      <w:r>
+        <w:rPr>
+          <w:rFonts w:ascii="Calibri" w:cs="Calibri" w:eastAsia="Microsoft YaHei" w:hAnsi="Calibri"/>
+        </w:rPr>
+        <w:t xml:space="preserve"> 列写 </w:t>
       </w:r>
       <w:r>
         <w:rPr>
@@ -2380,49 +2811,101 @@
         <w:rPr>
           <w:rFonts w:ascii="Calibri" w:cs="Calibri" w:eastAsia="Microsoft YaHei" w:hAnsi="Calibri"/>
         </w:rPr>
-        <w:t xml:space="preserve"> 已经存在。Y、L、D、A、N 的名称是 Claude 的建议（手册 S10），尚未建立。</w:t>
-      </w:r>
-    </w:p>
-    <w:p>
-      <w:pPr>
-        <w:spacing w:after="120"/>
-      </w:pPr>
-      <w:r>
-        <w:rPr>
-          <w:rFonts w:ascii="Calibri" w:cs="Calibri" w:eastAsia="Microsoft YaHei" w:hAnsi="Calibri"/>
-          <w:b/>
-          <w:bCs/>
-        </w:rPr>
-        <w:t xml:space="preserve">一篇同时符合多条理由时，按上表从上到下，选第一条适用的。</w:t>
-      </w:r>
-      <w:r>
-        <w:rPr>
-          <w:rFonts w:ascii="Calibri" w:cs="Calibri" w:eastAsia="Microsoft YaHei" w:hAnsi="Calibri"/>
-        </w:rPr>
-        <w:t xml:space="preserve">【建议】这与标题摘要阶段不同：那里"任选一条适用的"，因为标题摘要阶段的理由不影响谁进入全文，也不进入 PRISMA 图；全文阶段的理由要进入 PRISMA 图，每篇只能算一条，固定顺序（Y 排在最前，因为它不需要读全文）可以让计数可重复，也避免两人"决定一样、理由不同"被当作分歧。</w:t>
-      </w:r>
-    </w:p>
-    <w:p>
-      <w:pPr>
-        <w:spacing w:after="120"/>
-      </w:pPr>
-      <w:r>
-        <w:rPr>
-          <w:rFonts w:ascii="Calibri" w:cs="Calibri" w:eastAsia="Microsoft YaHei" w:hAnsi="Calibri"/>
-        </w:rPr>
-        <w:t xml:space="preserve">注意 A 排在 N 前面：一篇只有汇总数据又无法确认年龄的报告（例如"年龄 3–60 岁，均数 22 岁"），索取到个体数据后年龄问题也就解决了，所以先按 A 处理。</w:t>
-      </w:r>
-    </w:p>
-    <w:p>
-      <w:pPr>
-        <w:pStyle w:val="Heading2"/>
-        <w:keepNext/>
-      </w:pPr>
-      <w:r>
-        <w:rPr>
-          <w:rFonts w:ascii="Calibri" w:cs="Calibri" w:eastAsia="Microsoft YaHei" w:hAnsi="Calibri"/>
-        </w:rPr>
-        <w:t xml:space="preserve">6. 逐篇判断：按顺序回答的问题</w:t>
+        <w:t xml:space="preserve">。</w:t>
+      </w:r>
+    </w:p>
+    <w:p>
+      <w:pPr>
+        <w:pStyle w:val="ListParagraph"/>
+        <w:numPr>
+          <w:ilvl w:val="0"/>
+          <w:numId w:val="2"/>
+        </w:numPr>
+        <w:spacing w:after="60"/>
+      </w:pPr>
+      <w:r>
+        <w:rPr>
+          <w:rFonts w:ascii="Calibri" w:cs="Calibri" w:eastAsia="Microsoft YaHei" w:hAnsi="Calibri"/>
+          <w:b/>
+          <w:bCs/>
+        </w:rPr>
+        <w:t xml:space="preserve">病例报告加文献复习</w:t>
+      </w:r>
+      <w:r>
+        <w:rPr>
+          <w:rFonts w:ascii="Calibri" w:cs="Calibri" w:eastAsia="Microsoft YaHei" w:hAnsi="Calibri"/>
+        </w:rPr>
+        <w:t xml:space="preserve">（作者自己有新病例）→ 继续判断，</w:t>
+      </w:r>
+      <w:r>
+        <w:rPr>
+          <w:rFonts w:ascii="Calibri" w:cs="Calibri" w:eastAsia="Microsoft YaHei" w:hAnsi="Calibri"/>
+          <w:b/>
+          <w:bCs/>
+        </w:rPr>
+        <w:t xml:space="preserve">只提取本文的新病例</w:t>
+      </w:r>
+      <w:r>
+        <w:rPr>
+          <w:rFonts w:ascii="Calibri" w:cs="Calibri" w:eastAsia="Microsoft YaHei" w:hAnsi="Calibri"/>
+        </w:rPr>
+        <w:t xml:space="preserve">。</w:t>
+      </w:r>
+    </w:p>
+    <w:p>
+      <w:pPr>
+        <w:pStyle w:val="ListParagraph"/>
+        <w:numPr>
+          <w:ilvl w:val="0"/>
+          <w:numId w:val="2"/>
+        </w:numPr>
+        <w:spacing w:after="60"/>
+      </w:pPr>
+      <w:r>
+        <w:rPr>
+          <w:rFonts w:ascii="Calibri" w:cs="Calibri" w:eastAsia="Microsoft YaHei" w:hAnsi="Calibri"/>
+          <w:b/>
+          <w:bCs/>
+        </w:rPr>
+        <w:t xml:space="preserve">综述表格里别人的病例不提取（D8，已决定）。</w:t>
+      </w:r>
+      <w:r>
+        <w:rPr>
+          <w:rFonts w:ascii="Calibri" w:cs="Calibri" w:eastAsia="Microsoft YaHei" w:hAnsi="Calibri"/>
+        </w:rPr>
+        <w:t xml:space="preserve"> 这些病例的原始报告若在检索结果里，会单独评估；从综述表里取，会造成重复，也是二手数据（协议第 10 节：没有新病例的综述只用来核对参考文献）。</w:t>
+      </w:r>
+    </w:p>
+    <w:p>
+      <w:pPr>
+        <w:pStyle w:val="ListParagraph"/>
+        <w:numPr>
+          <w:ilvl w:val="0"/>
+          <w:numId w:val="2"/>
+        </w:numPr>
+        <w:spacing w:after="60"/>
+      </w:pPr>
+      <w:r>
+        <w:rPr>
+          <w:rFonts w:ascii="Calibri" w:cs="Calibri" w:eastAsia="Microsoft YaHei" w:hAnsi="Calibri"/>
+        </w:rPr>
+        <w:t xml:space="preserve">描述了患者的信件、"影像学图片"类的病例 → 继续判断。</w:t>
+      </w:r>
+    </w:p>
+    <w:p>
+      <w:pPr>
+        <w:pStyle w:val="ListParagraph"/>
+        <w:numPr>
+          <w:ilvl w:val="0"/>
+          <w:numId w:val="2"/>
+        </w:numPr>
+        <w:spacing w:after="60"/>
+      </w:pPr>
+      <w:r>
+        <w:rPr>
+          <w:rFonts w:ascii="Calibri" w:cs="Calibri" w:eastAsia="Microsoft YaHei" w:hAnsi="Calibri"/>
+        </w:rPr>
+        <w:t xml:space="preserve">学位论文：含临床病例资料的继续判断；动物或实验研究 → E1。</w:t>
       </w:r>
     </w:p>
     <w:p>
@@ -2434,147 +2917,258 @@
         <w:rPr>
           <w:rFonts w:ascii="Calibri" w:cs="Calibri" w:eastAsia="Microsoft YaHei" w:hAnsi="Calibri"/>
         </w:rPr>
-        <w:t xml:space="preserve">6.1 第 1–3 题：语种、全文、是不是正式文章</w:t>
-      </w:r>
-    </w:p>
-    <w:p>
-      <w:pPr>
-        <w:pStyle w:val="ListParagraph"/>
-        <w:numPr>
-          <w:ilvl w:val="0"/>
-          <w:numId w:val="5"/>
-        </w:numPr>
-        <w:spacing w:after="60"/>
-      </w:pPr>
-      <w:r>
-        <w:rPr>
-          <w:rFonts w:ascii="Calibri" w:cs="Calibri" w:eastAsia="Microsoft YaHei" w:hAnsi="Calibri"/>
-        </w:rPr>
-        <w:t xml:space="preserve">全文是英文或中文吗？不是 → </w:t>
-      </w:r>
-      <w:r>
-        <w:rPr>
-          <w:rFonts w:ascii="Calibri" w:cs="Calibri" w:eastAsia="Microsoft YaHei" w:hAnsi="Calibri"/>
-          <w:b/>
-          <w:bCs/>
-        </w:rPr>
-        <w:t xml:space="preserve">L</w:t>
-      </w:r>
-      <w:r>
-        <w:rPr>
-          <w:rFonts w:ascii="Calibri" w:cs="Calibri" w:eastAsia="Microsoft YaHei" w:hAnsi="Calibri"/>
-        </w:rPr>
-        <w:t xml:space="preserve">。</w:t>
-      </w:r>
-    </w:p>
-    <w:p>
-      <w:pPr>
-        <w:pStyle w:val="ListParagraph"/>
-        <w:numPr>
-          <w:ilvl w:val="0"/>
-          <w:numId w:val="5"/>
-        </w:numPr>
-        <w:spacing w:after="60"/>
-      </w:pPr>
-      <w:r>
-        <w:rPr>
-          <w:rFonts w:ascii="Calibri" w:cs="Calibri" w:eastAsia="Microsoft YaHei" w:hAnsi="Calibri"/>
-        </w:rPr>
-        <w:t xml:space="preserve">取得到全文吗？取不到（按 4.3）→ </w:t>
-      </w:r>
-      <w:r>
-        <w:rPr>
-          <w:rFonts w:ascii="Calibri" w:cs="Calibri" w:eastAsia="Microsoft YaHei" w:hAnsi="Calibri"/>
-          <w:b/>
-          <w:bCs/>
-        </w:rPr>
-        <w:t xml:space="preserve">D</w:t>
-      </w:r>
-      <w:r>
-        <w:rPr>
-          <w:rFonts w:ascii="Calibri" w:cs="Calibri" w:eastAsia="Microsoft YaHei" w:hAnsi="Calibri"/>
-        </w:rPr>
-        <w:t xml:space="preserve">。</w:t>
-      </w:r>
-    </w:p>
-    <w:p>
-      <w:pPr>
-        <w:pStyle w:val="ListParagraph"/>
-        <w:numPr>
-          <w:ilvl w:val="0"/>
-          <w:numId w:val="5"/>
-        </w:numPr>
-        <w:spacing w:after="60"/>
-      </w:pPr>
-      <w:r>
-        <w:rPr>
-          <w:rFonts w:ascii="Calibri" w:cs="Calibri" w:eastAsia="Microsoft YaHei" w:hAnsi="Calibri"/>
-        </w:rPr>
-        <w:t xml:space="preserve">是正式文章吗？只有摘要的会议报告、专利、报纸、产品说明 → </w:t>
-      </w:r>
-      <w:r>
-        <w:rPr>
-          <w:rFonts w:ascii="Calibri" w:cs="Calibri" w:eastAsia="Microsoft YaHei" w:hAnsi="Calibri"/>
-          <w:b/>
-          <w:bCs/>
-        </w:rPr>
-        <w:t xml:space="preserve">E5</w:t>
-      </w:r>
-      <w:r>
-        <w:rPr>
-          <w:rFonts w:ascii="Calibri" w:cs="Calibri" w:eastAsia="Microsoft YaHei" w:hAnsi="Calibri"/>
-        </w:rPr>
-        <w:t xml:space="preserve">。中文会议论文如果全文是完整论文，按期刊文章继续判断（标题摘要指南第 8 节的决定）。</w:t>
-      </w:r>
-    </w:p>
-    <w:p>
-      <w:pPr>
-        <w:pStyle w:val="Heading3"/>
-        <w:keepNext/>
-      </w:pPr>
-      <w:r>
-        <w:rPr>
-          <w:rFonts w:ascii="Calibri" w:cs="Calibri" w:eastAsia="Microsoft YaHei" w:hAnsi="Calibri"/>
-        </w:rPr>
-        <w:t xml:space="preserve">6.2 第 4 题：有没有原始患者数据</w:t>
-      </w:r>
-    </w:p>
-    <w:p>
-      <w:pPr>
-        <w:pStyle w:val="ListParagraph"/>
-        <w:numPr>
-          <w:ilvl w:val="0"/>
-          <w:numId w:val="2"/>
-        </w:numPr>
-        <w:spacing w:after="60"/>
-      </w:pPr>
-      <w:r>
-        <w:rPr>
-          <w:rFonts w:ascii="Calibri" w:cs="Calibri" w:eastAsia="Microsoft YaHei" w:hAnsi="Calibri"/>
-          <w:b/>
-          <w:bCs/>
-        </w:rPr>
-        <w:t xml:space="preserve">没有新病例的综述</w:t>
-      </w:r>
-      <w:r>
-        <w:rPr>
-          <w:rFonts w:ascii="Calibri" w:cs="Calibri" w:eastAsia="Microsoft YaHei" w:hAnsi="Calibri"/>
-        </w:rPr>
-        <w:t xml:space="preserve">、社论、评论、只评论他人文章的信件 → </w:t>
-      </w:r>
-      <w:r>
-        <w:rPr>
-          <w:rFonts w:ascii="Calibri" w:cs="Calibri" w:eastAsia="Microsoft YaHei" w:hAnsi="Calibri"/>
-          <w:b/>
-          <w:bCs/>
-        </w:rPr>
-        <w:t xml:space="preserve">E4</w:t>
-      </w:r>
-      <w:r>
-        <w:rPr>
-          <w:rFonts w:ascii="Calibri" w:cs="Calibri" w:eastAsia="Microsoft YaHei" w:hAnsi="Calibri"/>
-        </w:rPr>
-        <w:t xml:space="preserve">，综述同时加标签 </w:t>
+        <w:t xml:space="preserve">6.3 第 5–6 题：是不是人、是不是游走脾</w:t>
+      </w:r>
+    </w:p>
+    <w:p>
+      <w:pPr>
+        <w:spacing w:after="120"/>
+      </w:pPr>
+      <w:r>
+        <w:rPr>
+          <w:rFonts w:ascii="Calibri" w:cs="Calibri" w:eastAsia="Microsoft YaHei" w:hAnsi="Calibri"/>
+          <w:b/>
+          <w:bCs/>
+        </w:rPr>
+        <w:t xml:space="preserve">非人类 → E1。</w:t>
+      </w:r>
+    </w:p>
+    <w:p>
+      <w:pPr>
+        <w:spacing w:after="120"/>
+      </w:pPr>
+      <w:r>
+        <w:rPr>
+          <w:rFonts w:ascii="Calibri" w:cs="Calibri" w:eastAsia="Microsoft YaHei" w:hAnsi="Calibri"/>
+          <w:b/>
+          <w:bCs/>
+        </w:rPr>
+        <w:t xml:space="preserve">游走脾的定义（协议第 7 节）：</w:t>
+      </w:r>
+      <w:r>
+        <w:rPr>
+          <w:rFonts w:ascii="Calibri" w:cs="Calibri" w:eastAsia="Microsoft YaHei" w:hAnsi="Calibri"/>
+        </w:rPr>
+        <w:t xml:space="preserve"> 经影像和/或手术证实，脾脏异常活动，因脾的悬韧带缺如或松弛而离开左上腹的位置，伴或不伴脾蒂扭转。先天性和获得性（如胃底折叠术、肾切除术后）都符合，获得性病例之后作为亚组。</w:t>
+      </w:r>
+    </w:p>
+    <w:p>
+      <w:pPr>
+        <w:spacing w:after="120"/>
+      </w:pPr>
+      <w:r>
+        <w:rPr>
+          <w:rFonts w:ascii="Calibri" w:cs="Calibri" w:eastAsia="Microsoft YaHei" w:hAnsi="Calibri"/>
+          <w:b/>
+          <w:bCs/>
+        </w:rPr>
+        <w:t xml:space="preserve">符合：</w:t>
+      </w:r>
+    </w:p>
+    <w:p>
+      <w:pPr>
+        <w:pStyle w:val="ListParagraph"/>
+        <w:numPr>
+          <w:ilvl w:val="0"/>
+          <w:numId w:val="2"/>
+        </w:numPr>
+        <w:spacing w:after="60"/>
+      </w:pPr>
+      <w:r>
+        <w:rPr>
+          <w:rFonts w:ascii="Calibri" w:cs="Calibri" w:eastAsia="Microsoft YaHei" w:hAnsi="Calibri"/>
+        </w:rPr>
+        <w:t xml:space="preserve">报告称游走脾、异位脾、浮动脾、盆腔脾、脾下垂等，并且影像或手术所见显示脾脏位置异常或活动度大，或描述了脾韧带缺如或松弛、脾蒂过长。</w:t>
+      </w:r>
+    </w:p>
+    <w:p>
+      <w:pPr>
+        <w:pStyle w:val="ListParagraph"/>
+        <w:numPr>
+          <w:ilvl w:val="0"/>
+          <w:numId w:val="2"/>
+        </w:numPr>
+        <w:spacing w:after="60"/>
+      </w:pPr>
+      <w:r>
+        <w:rPr>
+          <w:rFonts w:ascii="Calibri" w:cs="Calibri" w:eastAsia="Microsoft YaHei" w:hAnsi="Calibri"/>
+        </w:rPr>
+        <w:t xml:space="preserve">伴胃扭转、胃出口梗阻、胰尾扭转、肠梗阻的游走脾（亚组）。</w:t>
+      </w:r>
+    </w:p>
+    <w:p>
+      <w:pPr>
+        <w:pStyle w:val="ListParagraph"/>
+        <w:numPr>
+          <w:ilvl w:val="0"/>
+          <w:numId w:val="2"/>
+        </w:numPr>
+        <w:spacing w:after="60"/>
+      </w:pPr>
+      <w:r>
+        <w:rPr>
+          <w:rFonts w:ascii="Calibri" w:cs="Calibri" w:eastAsia="Microsoft YaHei" w:hAnsi="Calibri"/>
+        </w:rPr>
+        <w:t xml:space="preserve">伴先天性膈疝或膈膨升的游走脾（协议第 17 节有这个亚组）。</w:t>
+      </w:r>
+    </w:p>
+    <w:p>
+      <w:pPr>
+        <w:pStyle w:val="ListParagraph"/>
+        <w:numPr>
+          <w:ilvl w:val="0"/>
+          <w:numId w:val="2"/>
+        </w:numPr>
+        <w:spacing w:after="60"/>
+      </w:pPr>
+      <w:r>
+        <w:rPr>
+          <w:rFonts w:ascii="Calibri" w:cs="Calibri" w:eastAsia="Microsoft YaHei" w:hAnsi="Calibri"/>
+        </w:rPr>
+        <w:t xml:space="preserve">未手术、保守治疗的游走脾患儿（协议第 7 节：做描述性汇总，不进入主要分析）。</w:t>
+      </w:r>
+    </w:p>
+    <w:p>
+      <w:pPr>
+        <w:spacing w:after="120"/>
+      </w:pPr>
+      <w:r>
+        <w:rPr>
+          <w:rFonts w:ascii="Calibri" w:cs="Calibri" w:eastAsia="Microsoft YaHei" w:hAnsi="Calibri"/>
+          <w:b/>
+          <w:bCs/>
+        </w:rPr>
+        <w:t xml:space="preserve">不符合 → E2：</w:t>
+      </w:r>
+    </w:p>
+    <w:p>
+      <w:pPr>
+        <w:pStyle w:val="ListParagraph"/>
+        <w:numPr>
+          <w:ilvl w:val="0"/>
+          <w:numId w:val="2"/>
+        </w:numPr>
+        <w:spacing w:after="60"/>
+      </w:pPr>
+      <w:r>
+        <w:rPr>
+          <w:rFonts w:ascii="Calibri" w:cs="Calibri" w:eastAsia="Microsoft YaHei" w:hAnsi="Calibri"/>
+        </w:rPr>
+        <w:t xml:space="preserve">副脾（包括游走的副脾）的扭转。</w:t>
+      </w:r>
+    </w:p>
+    <w:p>
+      <w:pPr>
+        <w:pStyle w:val="ListParagraph"/>
+        <w:numPr>
+          <w:ilvl w:val="0"/>
+          <w:numId w:val="2"/>
+        </w:numPr>
+        <w:spacing w:after="60"/>
+      </w:pPr>
+      <w:r>
+        <w:rPr>
+          <w:rFonts w:ascii="Calibri" w:cs="Calibri" w:eastAsia="Microsoft YaHei" w:hAnsi="Calibri"/>
+        </w:rPr>
+        <w:t xml:space="preserve">正常位置脾脏的扭转，作者明确写了脾在原位、韧带完好，扭转由其他原因引起（如肿瘤、囊肿牵拉）。</w:t>
+      </w:r>
+    </w:p>
+    <w:p>
+      <w:pPr>
+        <w:pStyle w:val="ListParagraph"/>
+        <w:numPr>
+          <w:ilvl w:val="0"/>
+          <w:numId w:val="2"/>
+        </w:numPr>
+        <w:spacing w:after="60"/>
+      </w:pPr>
+      <w:r>
+        <w:rPr>
+          <w:rFonts w:ascii="Calibri" w:cs="Calibri" w:eastAsia="Microsoft YaHei" w:hAnsi="Calibri"/>
+        </w:rPr>
+        <w:t xml:space="preserve">脾种植、脾异位妊娠、移植脾。</w:t>
+      </w:r>
+    </w:p>
+    <w:p>
+      <w:pPr>
+        <w:pStyle w:val="ListParagraph"/>
+        <w:numPr>
+          <w:ilvl w:val="0"/>
+          <w:numId w:val="2"/>
+        </w:numPr>
+        <w:spacing w:after="60"/>
+      </w:pPr>
+      <w:r>
+        <w:rPr>
+          <w:rFonts w:ascii="Calibri" w:cs="Calibri" w:eastAsia="Microsoft YaHei" w:hAnsi="Calibri"/>
+        </w:rPr>
+        <w:t xml:space="preserve">【建议】脾脏只是被疝入胸腔的膈疝内容物，或被肿块推移，作者没有诊断游走脾、也没有描述脾蒂活动度异常的。拿不准的两人讨论。</w:t>
+      </w:r>
+    </w:p>
+    <w:p>
+      <w:pPr>
+        <w:pStyle w:val="ListParagraph"/>
+        <w:numPr>
+          <w:ilvl w:val="0"/>
+          <w:numId w:val="2"/>
+        </w:numPr>
+        <w:spacing w:after="60"/>
+      </w:pPr>
+      <w:r>
+        <w:rPr>
+          <w:rFonts w:ascii="Calibri" w:cs="Calibri" w:eastAsia="Microsoft YaHei" w:hAnsi="Calibri"/>
+        </w:rPr>
+        <w:t xml:space="preserve">只有临床诊断（比如摸到可移动的腹部包块），既没有影像也没有手术证实 → E2，备注写"not confirmed"。</w:t>
+      </w:r>
+    </w:p>
+    <w:p>
+      <w:pPr>
+        <w:spacing w:after="120"/>
+      </w:pPr>
+      <w:r>
+        <w:rPr>
+          <w:rFonts w:ascii="Calibri" w:cs="Calibri" w:eastAsia="Microsoft YaHei" w:hAnsi="Calibri"/>
+          <w:b/>
+          <w:bCs/>
+        </w:rPr>
+        <w:t xml:space="preserve">只写了"脾扭转"，没有写脾脏位置和韧带的情形（D1，已决定）：</w:t>
+      </w:r>
+      <w:r>
+        <w:rPr>
+          <w:rFonts w:ascii="Calibri" w:cs="Calibri" w:eastAsia="Microsoft YaHei" w:hAnsi="Calibri"/>
+        </w:rPr>
+        <w:t xml:space="preserve"> 儿童的脾扭转几乎都发生在脾脏活动度异常的情况下，但协议的定义要求影像或手术证实了异位或活动。</w:t>
+      </w:r>
+    </w:p>
+    <w:p>
+      <w:pPr>
+        <w:pStyle w:val="ListParagraph"/>
+        <w:numPr>
+          <w:ilvl w:val="0"/>
+          <w:numId w:val="2"/>
+        </w:numPr>
+        <w:spacing w:after="60"/>
+      </w:pPr>
+      <w:r>
+        <w:rPr>
+          <w:rFonts w:ascii="Calibri" w:cs="Calibri" w:eastAsia="Microsoft YaHei" w:hAnsi="Calibri"/>
+        </w:rPr>
+        <w:t xml:space="preserve">【已决定，D1】</w:t>
+      </w:r>
+      <w:r>
+        <w:rPr>
+          <w:rFonts w:ascii="Calibri" w:cs="Calibri" w:eastAsia="Microsoft YaHei" w:hAnsi="Calibri"/>
+          <w:b/>
+          <w:bCs/>
+        </w:rPr>
+        <w:t xml:space="preserve">宽松加标记</w:t>
+      </w:r>
+      <w:r>
+        <w:rPr>
+          <w:rFonts w:ascii="Calibri" w:cs="Calibri" w:eastAsia="Microsoft YaHei" w:hAnsi="Calibri"/>
+        </w:rPr>
+        <w:t xml:space="preserve">：报告是儿童的脾蒂扭转，且没有说脾脏位置正常、韧带完好的，按游走脾纳入，并在提取表的 </w:t>
       </w:r>
       <w:r>
         <w:rPr>
@@ -2583,107 +3177,67 @@
           <w:szCs w:val="19"/>
           <w:shd w:fill="EEEEEE" w:val="clear"/>
         </w:rPr>
-        <w:t xml:space="preserve">review-for-refs</w:t>
-      </w:r>
-      <w:r>
-        <w:rPr>
-          <w:rFonts w:ascii="Calibri" w:cs="Calibri" w:eastAsia="Microsoft YaHei" w:hAnsi="Calibri"/>
-        </w:rPr>
-        <w:t xml:space="preserve">。</w:t>
-      </w:r>
-    </w:p>
-    <w:p>
-      <w:pPr>
-        <w:pStyle w:val="ListParagraph"/>
-        <w:numPr>
-          <w:ilvl w:val="0"/>
-          <w:numId w:val="2"/>
-        </w:numPr>
-        <w:spacing w:after="60"/>
-      </w:pPr>
-      <w:r>
-        <w:rPr>
-          <w:rFonts w:ascii="Calibri" w:cs="Calibri" w:eastAsia="Microsoft YaHei" w:hAnsi="Calibri"/>
-          <w:b/>
-          <w:bCs/>
-        </w:rPr>
-        <w:t xml:space="preserve">病例报告加文献复习</w:t>
-      </w:r>
-      <w:r>
-        <w:rPr>
-          <w:rFonts w:ascii="Calibri" w:cs="Calibri" w:eastAsia="Microsoft YaHei" w:hAnsi="Calibri"/>
-        </w:rPr>
-        <w:t xml:space="preserve">（作者自己有新病例）→ 继续判断，</w:t>
-      </w:r>
-      <w:r>
-        <w:rPr>
-          <w:rFonts w:ascii="Calibri" w:cs="Calibri" w:eastAsia="Microsoft YaHei" w:hAnsi="Calibri"/>
-          <w:b/>
-          <w:bCs/>
-        </w:rPr>
-        <w:t xml:space="preserve">只提取本文的新病例</w:t>
-      </w:r>
-      <w:r>
-        <w:rPr>
-          <w:rFonts w:ascii="Calibri" w:cs="Calibri" w:eastAsia="Microsoft YaHei" w:hAnsi="Calibri"/>
-        </w:rPr>
-        <w:t xml:space="preserve">。</w:t>
-      </w:r>
-    </w:p>
-    <w:p>
-      <w:pPr>
-        <w:pStyle w:val="ListParagraph"/>
-        <w:numPr>
-          <w:ilvl w:val="0"/>
-          <w:numId w:val="2"/>
-        </w:numPr>
-        <w:spacing w:after="60"/>
-      </w:pPr>
-      <w:r>
-        <w:rPr>
-          <w:rFonts w:ascii="Calibri" w:cs="Calibri" w:eastAsia="Microsoft YaHei" w:hAnsi="Calibri"/>
-          <w:b/>
-          <w:bCs/>
-        </w:rPr>
-        <w:t xml:space="preserve">综述表格里别人的病例不提取。</w:t>
-      </w:r>
-      <w:r>
-        <w:rPr>
-          <w:rFonts w:ascii="Calibri" w:cs="Calibri" w:eastAsia="Microsoft YaHei" w:hAnsi="Calibri"/>
-        </w:rPr>
-        <w:t xml:space="preserve">【建议】这些病例的原始报告若在检索结果里，会单独评估；从综述表里取，会造成重复，也是二手数据（协议第 10 节：没有新病例的综述只用来核对参考文献）。</w:t>
-      </w:r>
-    </w:p>
-    <w:p>
-      <w:pPr>
-        <w:pStyle w:val="ListParagraph"/>
-        <w:numPr>
-          <w:ilvl w:val="0"/>
-          <w:numId w:val="2"/>
-        </w:numPr>
-        <w:spacing w:after="60"/>
-      </w:pPr>
-      <w:r>
-        <w:rPr>
-          <w:rFonts w:ascii="Calibri" w:cs="Calibri" w:eastAsia="Microsoft YaHei" w:hAnsi="Calibri"/>
-        </w:rPr>
-        <w:t xml:space="preserve">描述了患者的信件、"影像学图片"类的病例 → 继续判断。</w:t>
-      </w:r>
-    </w:p>
-    <w:p>
-      <w:pPr>
-        <w:pStyle w:val="ListParagraph"/>
-        <w:numPr>
-          <w:ilvl w:val="0"/>
-          <w:numId w:val="2"/>
-        </w:numPr>
-        <w:spacing w:after="60"/>
-      </w:pPr>
-      <w:r>
-        <w:rPr>
-          <w:rFonts w:ascii="Calibri" w:cs="Calibri" w:eastAsia="Microsoft YaHei" w:hAnsi="Calibri"/>
-        </w:rPr>
-        <w:t xml:space="preserve">学位论文：含临床病例资料的继续判断；动物或实验研究 → E1。</w:t>
+        <w:t xml:space="preserve">ws_basis</w:t>
+      </w:r>
+      <w:r>
+        <w:rPr>
+          <w:rFonts w:ascii="Calibri" w:cs="Calibri" w:eastAsia="Microsoft YaHei" w:hAnsi="Calibri"/>
+        </w:rPr>
+        <w:t xml:space="preserve"> 里记"Torsion only, position not stated"。这样不会丢失真实的病例，将来也能把这一组单独拿出来看（但这个敏感性分析不在已注册的 8 个里，要做须作为新增分析声明）。</w:t>
+      </w:r>
+    </w:p>
+    <w:p>
+      <w:pPr>
+        <w:pStyle w:val="ListParagraph"/>
+        <w:numPr>
+          <w:ilvl w:val="0"/>
+          <w:numId w:val="2"/>
+        </w:numPr>
+        <w:spacing w:after="60"/>
+      </w:pPr>
+      <w:r>
+        <w:rPr>
+          <w:rFonts w:ascii="Calibri" w:cs="Calibri" w:eastAsia="Microsoft YaHei" w:hAnsi="Calibri"/>
+        </w:rPr>
+        <w:t xml:space="preserve">未采用的备选，</w:t>
+      </w:r>
+      <w:r>
+        <w:rPr>
+          <w:rFonts w:ascii="Calibri" w:cs="Calibri" w:eastAsia="Microsoft YaHei" w:hAnsi="Calibri"/>
+          <w:b/>
+          <w:bCs/>
+        </w:rPr>
+        <w:t xml:space="preserve">严格</w:t>
+      </w:r>
+      <w:r>
+        <w:rPr>
+          <w:rFonts w:ascii="Calibri" w:cs="Calibri" w:eastAsia="Microsoft YaHei" w:hAnsi="Calibri"/>
+        </w:rPr>
+        <w:t xml:space="preserve">：必须有位置或活动度的描述，否则一律 E2。会丢掉一部分真实病例，且偏向丢掉写得简短的老报告和中文报告。</w:t>
+      </w:r>
+    </w:p>
+    <w:p>
+      <w:pPr>
+        <w:pStyle w:val="ListParagraph"/>
+        <w:numPr>
+          <w:ilvl w:val="0"/>
+          <w:numId w:val="2"/>
+        </w:numPr>
+        <w:spacing w:after="60"/>
+      </w:pPr>
+      <w:r>
+        <w:rPr>
+          <w:rFonts w:ascii="Calibri" w:cs="Calibri" w:eastAsia="Microsoft YaHei" w:hAnsi="Calibri"/>
+          <w:b/>
+          <w:bCs/>
+        </w:rPr>
+        <w:t xml:space="preserve">注意：</w:t>
+      </w:r>
+      <w:r>
+        <w:rPr>
+          <w:rFonts w:ascii="Calibri" w:cs="Calibri" w:eastAsia="Microsoft YaHei" w:hAnsi="Calibri"/>
+        </w:rPr>
+        <w:t xml:space="preserve"> 只有作者明确写了脾在原位、韧带完好，或扭转另有原因（肿瘤、囊肿牵拉等），才按 E2 排除；仅仅“没写位置”不是排除理由。按关键词粗查，待取全文的 540 篇里约 47 篇（9%）提到扭转而没有出现“游走/异位/浮动”等词，其中约 25 篇带儿童的线索；这只是关键词估计，没有人读过这些记录。</w:t>
       </w:r>
     </w:p>
     <w:p>
@@ -2695,314 +3249,6 @@
         <w:rPr>
           <w:rFonts w:ascii="Calibri" w:cs="Calibri" w:eastAsia="Microsoft YaHei" w:hAnsi="Calibri"/>
         </w:rPr>
-        <w:t xml:space="preserve">6.3 第 5–6 题：是不是人、是不是游走脾</w:t>
-      </w:r>
-    </w:p>
-    <w:p>
-      <w:pPr>
-        <w:spacing w:after="120"/>
-      </w:pPr>
-      <w:r>
-        <w:rPr>
-          <w:rFonts w:ascii="Calibri" w:cs="Calibri" w:eastAsia="Microsoft YaHei" w:hAnsi="Calibri"/>
-          <w:b/>
-          <w:bCs/>
-        </w:rPr>
-        <w:t xml:space="preserve">非人类 → E1。</w:t>
-      </w:r>
-    </w:p>
-    <w:p>
-      <w:pPr>
-        <w:spacing w:after="120"/>
-      </w:pPr>
-      <w:r>
-        <w:rPr>
-          <w:rFonts w:ascii="Calibri" w:cs="Calibri" w:eastAsia="Microsoft YaHei" w:hAnsi="Calibri"/>
-          <w:b/>
-          <w:bCs/>
-        </w:rPr>
-        <w:t xml:space="preserve">游走脾的定义（协议第 7 节）：</w:t>
-      </w:r>
-      <w:r>
-        <w:rPr>
-          <w:rFonts w:ascii="Calibri" w:cs="Calibri" w:eastAsia="Microsoft YaHei" w:hAnsi="Calibri"/>
-        </w:rPr>
-        <w:t xml:space="preserve"> 经影像和/或手术证实，脾脏异常活动，因脾的悬韧带缺如或松弛而离开左上腹的位置，伴或不伴脾蒂扭转。先天性和获得性（如胃底折叠术、肾切除术后）都符合，获得性病例之后作为亚组。</w:t>
-      </w:r>
-    </w:p>
-    <w:p>
-      <w:pPr>
-        <w:spacing w:after="120"/>
-      </w:pPr>
-      <w:r>
-        <w:rPr>
-          <w:rFonts w:ascii="Calibri" w:cs="Calibri" w:eastAsia="Microsoft YaHei" w:hAnsi="Calibri"/>
-          <w:b/>
-          <w:bCs/>
-        </w:rPr>
-        <w:t xml:space="preserve">符合：</w:t>
-      </w:r>
-    </w:p>
-    <w:p>
-      <w:pPr>
-        <w:pStyle w:val="ListParagraph"/>
-        <w:numPr>
-          <w:ilvl w:val="0"/>
-          <w:numId w:val="2"/>
-        </w:numPr>
-        <w:spacing w:after="60"/>
-      </w:pPr>
-      <w:r>
-        <w:rPr>
-          <w:rFonts w:ascii="Calibri" w:cs="Calibri" w:eastAsia="Microsoft YaHei" w:hAnsi="Calibri"/>
-        </w:rPr>
-        <w:t xml:space="preserve">报告称游走脾、异位脾、浮动脾、盆腔脾、脾下垂等，并且影像或手术所见显示脾脏位置异常或活动度大，或描述了脾韧带缺如或松弛、脾蒂过长。</w:t>
-      </w:r>
-    </w:p>
-    <w:p>
-      <w:pPr>
-        <w:pStyle w:val="ListParagraph"/>
-        <w:numPr>
-          <w:ilvl w:val="0"/>
-          <w:numId w:val="2"/>
-        </w:numPr>
-        <w:spacing w:after="60"/>
-      </w:pPr>
-      <w:r>
-        <w:rPr>
-          <w:rFonts w:ascii="Calibri" w:cs="Calibri" w:eastAsia="Microsoft YaHei" w:hAnsi="Calibri"/>
-        </w:rPr>
-        <w:t xml:space="preserve">伴胃扭转、胃出口梗阻、胰尾扭转、肠梗阻的游走脾（亚组）。</w:t>
-      </w:r>
-    </w:p>
-    <w:p>
-      <w:pPr>
-        <w:pStyle w:val="ListParagraph"/>
-        <w:numPr>
-          <w:ilvl w:val="0"/>
-          <w:numId w:val="2"/>
-        </w:numPr>
-        <w:spacing w:after="60"/>
-      </w:pPr>
-      <w:r>
-        <w:rPr>
-          <w:rFonts w:ascii="Calibri" w:cs="Calibri" w:eastAsia="Microsoft YaHei" w:hAnsi="Calibri"/>
-        </w:rPr>
-        <w:t xml:space="preserve">伴先天性膈疝或膈膨升的游走脾（协议第 17 节有这个亚组）。</w:t>
-      </w:r>
-    </w:p>
-    <w:p>
-      <w:pPr>
-        <w:pStyle w:val="ListParagraph"/>
-        <w:numPr>
-          <w:ilvl w:val="0"/>
-          <w:numId w:val="2"/>
-        </w:numPr>
-        <w:spacing w:after="60"/>
-      </w:pPr>
-      <w:r>
-        <w:rPr>
-          <w:rFonts w:ascii="Calibri" w:cs="Calibri" w:eastAsia="Microsoft YaHei" w:hAnsi="Calibri"/>
-        </w:rPr>
-        <w:t xml:space="preserve">未手术、保守治疗的游走脾患儿（协议第 7 节：做描述性汇总，不进入主要分析）。</w:t>
-      </w:r>
-    </w:p>
-    <w:p>
-      <w:pPr>
-        <w:spacing w:after="120"/>
-      </w:pPr>
-      <w:r>
-        <w:rPr>
-          <w:rFonts w:ascii="Calibri" w:cs="Calibri" w:eastAsia="Microsoft YaHei" w:hAnsi="Calibri"/>
-          <w:b/>
-          <w:bCs/>
-        </w:rPr>
-        <w:t xml:space="preserve">不符合 → E2：</w:t>
-      </w:r>
-    </w:p>
-    <w:p>
-      <w:pPr>
-        <w:pStyle w:val="ListParagraph"/>
-        <w:numPr>
-          <w:ilvl w:val="0"/>
-          <w:numId w:val="2"/>
-        </w:numPr>
-        <w:spacing w:after="60"/>
-      </w:pPr>
-      <w:r>
-        <w:rPr>
-          <w:rFonts w:ascii="Calibri" w:cs="Calibri" w:eastAsia="Microsoft YaHei" w:hAnsi="Calibri"/>
-        </w:rPr>
-        <w:t xml:space="preserve">副脾（包括游走的副脾）的扭转。</w:t>
-      </w:r>
-    </w:p>
-    <w:p>
-      <w:pPr>
-        <w:pStyle w:val="ListParagraph"/>
-        <w:numPr>
-          <w:ilvl w:val="0"/>
-          <w:numId w:val="2"/>
-        </w:numPr>
-        <w:spacing w:after="60"/>
-      </w:pPr>
-      <w:r>
-        <w:rPr>
-          <w:rFonts w:ascii="Calibri" w:cs="Calibri" w:eastAsia="Microsoft YaHei" w:hAnsi="Calibri"/>
-        </w:rPr>
-        <w:t xml:space="preserve">正常位置脾脏的扭转，作者明确写了脾在原位、韧带完好，扭转由其他原因引起（如肿瘤、囊肿牵拉）。</w:t>
-      </w:r>
-    </w:p>
-    <w:p>
-      <w:pPr>
-        <w:pStyle w:val="ListParagraph"/>
-        <w:numPr>
-          <w:ilvl w:val="0"/>
-          <w:numId w:val="2"/>
-        </w:numPr>
-        <w:spacing w:after="60"/>
-      </w:pPr>
-      <w:r>
-        <w:rPr>
-          <w:rFonts w:ascii="Calibri" w:cs="Calibri" w:eastAsia="Microsoft YaHei" w:hAnsi="Calibri"/>
-        </w:rPr>
-        <w:t xml:space="preserve">脾种植、脾异位妊娠、移植脾。</w:t>
-      </w:r>
-    </w:p>
-    <w:p>
-      <w:pPr>
-        <w:pStyle w:val="ListParagraph"/>
-        <w:numPr>
-          <w:ilvl w:val="0"/>
-          <w:numId w:val="2"/>
-        </w:numPr>
-        <w:spacing w:after="60"/>
-      </w:pPr>
-      <w:r>
-        <w:rPr>
-          <w:rFonts w:ascii="Calibri" w:cs="Calibri" w:eastAsia="Microsoft YaHei" w:hAnsi="Calibri"/>
-        </w:rPr>
-        <w:t xml:space="preserve">【建议】脾脏只是被疝入胸腔的膈疝内容物，或被肿块推移，作者没有诊断游走脾、也没有描述脾蒂活动度异常的。拿不准的两人讨论。</w:t>
-      </w:r>
-    </w:p>
-    <w:p>
-      <w:pPr>
-        <w:pStyle w:val="ListParagraph"/>
-        <w:numPr>
-          <w:ilvl w:val="0"/>
-          <w:numId w:val="2"/>
-        </w:numPr>
-        <w:spacing w:after="60"/>
-      </w:pPr>
-      <w:r>
-        <w:rPr>
-          <w:rFonts w:ascii="Calibri" w:cs="Calibri" w:eastAsia="Microsoft YaHei" w:hAnsi="Calibri"/>
-        </w:rPr>
-        <w:t xml:space="preserve">只有临床诊断（比如摸到可移动的腹部包块），既没有影像也没有手术证实 → E2，备注写"not confirmed"。</w:t>
-      </w:r>
-    </w:p>
-    <w:p>
-      <w:pPr>
-        <w:spacing w:after="120"/>
-      </w:pPr>
-      <w:r>
-        <w:rPr>
-          <w:rFonts w:ascii="Calibri" w:cs="Calibri" w:eastAsia="Microsoft YaHei" w:hAnsi="Calibri"/>
-          <w:b/>
-          <w:bCs/>
-        </w:rPr>
-        <w:t xml:space="preserve">只写了"脾扭转"，没有写脾脏位置和韧带的情形（待决定 D1）：</w:t>
-      </w:r>
-      <w:r>
-        <w:rPr>
-          <w:rFonts w:ascii="Calibri" w:cs="Calibri" w:eastAsia="Microsoft YaHei" w:hAnsi="Calibri"/>
-        </w:rPr>
-        <w:t xml:space="preserve"> 儿童的脾扭转几乎都发生在脾脏活动度异常的情况下，但协议的定义要求影像或手术证实了异位或活动。</w:t>
-      </w:r>
-    </w:p>
-    <w:p>
-      <w:pPr>
-        <w:pStyle w:val="ListParagraph"/>
-        <w:numPr>
-          <w:ilvl w:val="0"/>
-          <w:numId w:val="2"/>
-        </w:numPr>
-        <w:spacing w:after="60"/>
-      </w:pPr>
-      <w:r>
-        <w:rPr>
-          <w:rFonts w:ascii="Calibri" w:cs="Calibri" w:eastAsia="Microsoft YaHei" w:hAnsi="Calibri"/>
-        </w:rPr>
-        <w:t xml:space="preserve">【建议，Claude 推荐】</w:t>
-      </w:r>
-      <w:r>
-        <w:rPr>
-          <w:rFonts w:ascii="Calibri" w:cs="Calibri" w:eastAsia="Microsoft YaHei" w:hAnsi="Calibri"/>
-          <w:b/>
-          <w:bCs/>
-        </w:rPr>
-        <w:t xml:space="preserve">宽松加标记</w:t>
-      </w:r>
-      <w:r>
-        <w:rPr>
-          <w:rFonts w:ascii="Calibri" w:cs="Calibri" w:eastAsia="Microsoft YaHei" w:hAnsi="Calibri"/>
-        </w:rPr>
-        <w:t xml:space="preserve">：报告是儿童的脾蒂扭转，且没有说脾脏位置正常、韧带完好的，按游走脾纳入，并在提取表的 </w:t>
-      </w:r>
-      <w:r>
-        <w:rPr>
-          <w:rFonts w:ascii="Consolas" w:cs="Consolas" w:eastAsia="Microsoft YaHei" w:hAnsi="Consolas"/>
-          <w:sz w:val="19"/>
-          <w:szCs w:val="19"/>
-          <w:shd w:fill="EEEEEE" w:val="clear"/>
-        </w:rPr>
-        <w:t xml:space="preserve">ws_basis</w:t>
-      </w:r>
-      <w:r>
-        <w:rPr>
-          <w:rFonts w:ascii="Calibri" w:cs="Calibri" w:eastAsia="Microsoft YaHei" w:hAnsi="Calibri"/>
-        </w:rPr>
-        <w:t xml:space="preserve"> 里记"Torsion only, position not stated"。这样不会丢失真实的病例，将来也能把这一组单独拿出来看（但这个敏感性分析不在已注册的 8 个里，要做须作为新增分析声明）。</w:t>
-      </w:r>
-    </w:p>
-    <w:p>
-      <w:pPr>
-        <w:pStyle w:val="ListParagraph"/>
-        <w:numPr>
-          <w:ilvl w:val="0"/>
-          <w:numId w:val="2"/>
-        </w:numPr>
-        <w:spacing w:after="60"/>
-      </w:pPr>
-      <w:r>
-        <w:rPr>
-          <w:rFonts w:ascii="Calibri" w:cs="Calibri" w:eastAsia="Microsoft YaHei" w:hAnsi="Calibri"/>
-        </w:rPr>
-        <w:t xml:space="preserve">备选，</w:t>
-      </w:r>
-      <w:r>
-        <w:rPr>
-          <w:rFonts w:ascii="Calibri" w:cs="Calibri" w:eastAsia="Microsoft YaHei" w:hAnsi="Calibri"/>
-          <w:b/>
-          <w:bCs/>
-        </w:rPr>
-        <w:t xml:space="preserve">严格</w:t>
-      </w:r>
-      <w:r>
-        <w:rPr>
-          <w:rFonts w:ascii="Calibri" w:cs="Calibri" w:eastAsia="Microsoft YaHei" w:hAnsi="Calibri"/>
-        </w:rPr>
-        <w:t xml:space="preserve">：必须有位置或活动度的描述，否则一律 E2，备注写"ws not established"。会丢掉一部分真实病例，且偏向丢掉写得简短的老报告和中文报告。</w:t>
-      </w:r>
-    </w:p>
-    <w:p>
-      <w:pPr>
-        <w:pStyle w:val="Heading3"/>
-        <w:keepNext/>
-      </w:pPr>
-      <w:r>
-        <w:rPr>
-          <w:rFonts w:ascii="Calibri" w:cs="Calibri" w:eastAsia="Microsoft YaHei" w:hAnsi="Calibri"/>
-        </w:rPr>
         <w:t xml:space="preserve">6.4 第 7 题：年龄</w:t>
       </w:r>
     </w:p>
@@ -3063,13 +3309,13 @@
           <w:b/>
           <w:bCs/>
         </w:rPr>
-        <w:t xml:space="preserve">只写"儿童、小儿、患儿、婴儿、新生儿"等词，没有具体年龄（待决定 D2）：</w:t>
-      </w:r>
-      <w:r>
-        <w:rPr>
-          <w:rFonts w:ascii="Calibri" w:cs="Calibri" w:eastAsia="Microsoft YaHei" w:hAnsi="Calibri"/>
-        </w:rPr>
-        <w:t xml:space="preserve">【建议】作者自己称为儿童，视为已确认小于 18 岁，纳入，年龄在提取表里记 NR，原文写法记在 </w:t>
+        <w:t xml:space="preserve">只写"儿童、小儿、患儿、婴儿、新生儿"等词，没有具体年龄（D2）：</w:t>
+      </w:r>
+      <w:r>
+        <w:rPr>
+          <w:rFonts w:ascii="Calibri" w:cs="Calibri" w:eastAsia="Microsoft YaHei" w:hAnsi="Calibri"/>
+        </w:rPr>
+        <w:t xml:space="preserve">【已决定】作者自己称为儿童，视为已确认小于 18 岁，纳入，年龄在提取表里记 NR，原文写法记在 </w:t>
       </w:r>
       <w:r>
         <w:rPr>
@@ -3713,24 +3959,7 @@
                 <w:sz w:val="20"/>
                 <w:szCs w:val="20"/>
               </w:rPr>
-              <w:t xml:space="preserve">，加标签 </w:t>
-            </w:r>
-            <w:r>
-              <w:rPr>
-                <w:rFonts w:ascii="Consolas" w:cs="Consolas" w:eastAsia="Microsoft YaHei" w:hAnsi="Consolas"/>
-                <w:sz w:val="20"/>
-                <w:szCs w:val="20"/>
-                <w:shd w:fill="EEEEEE" w:val="clear"/>
-              </w:rPr>
-              <w:t xml:space="preserve">lang-other</w:t>
-            </w:r>
-            <w:r>
-              <w:rPr>
-                <w:rFonts w:ascii="Calibri" w:cs="Calibri" w:eastAsia="Microsoft YaHei" w:hAnsi="Calibri"/>
-                <w:sz w:val="20"/>
-                <w:szCs w:val="20"/>
-              </w:rPr>
-              <w:t xml:space="preserve">，不取全文</w:t>
+              <w:t xml:space="preserve">，记在检索清单里，不取全文</w:t>
             </w:r>
           </w:p>
         </w:tc>
@@ -4062,7 +4291,24 @@
                 <w:sz w:val="20"/>
                 <w:szCs w:val="20"/>
               </w:rPr>
-              <w:t xml:space="preserve">，加 </w:t>
+              <w:t xml:space="preserve">，</w:t>
+            </w:r>
+            <w:r>
+              <w:rPr>
+                <w:rFonts w:ascii="Consolas" w:cs="Consolas" w:eastAsia="Microsoft YaHei" w:hAnsi="Consolas"/>
+                <w:sz w:val="20"/>
+                <w:szCs w:val="20"/>
+                <w:shd w:fill="EEEEEE" w:val="clear"/>
+              </w:rPr>
+              <w:t xml:space="preserve">note</w:t>
+            </w:r>
+            <w:r>
+              <w:rPr>
+                <w:rFonts w:ascii="Calibri" w:cs="Calibri" w:eastAsia="Microsoft YaHei" w:hAnsi="Calibri"/>
+                <w:sz w:val="20"/>
+                <w:szCs w:val="20"/>
+              </w:rPr>
+              <w:t xml:space="preserve"> 列写 </w:t>
             </w:r>
             <w:r>
               <w:rPr>
@@ -4509,7 +4755,7 @@
                 <w:sz w:val="20"/>
                 <w:szCs w:val="20"/>
               </w:rPr>
-              <w:t xml:space="preserve">D1：【建议】Include，</w:t>
+              <w:t xml:space="preserve">D1（已决定）：Include，</w:t>
             </w:r>
             <w:r>
               <w:rPr>
@@ -5158,7 +5404,7 @@
                 <w:sz w:val="20"/>
                 <w:szCs w:val="20"/>
               </w:rPr>
-              <w:t xml:space="preserve">D2：【建议】Include，年龄记 NR</w:t>
+              <w:t xml:space="preserve">D2（已决定）：Include，年龄记 NR</w:t>
             </w:r>
           </w:p>
         </w:tc>
@@ -5471,7 +5717,7 @@
           <w:b/>
           <w:bCs/>
         </w:rPr>
-        <w:t xml:space="preserve">决定怎么记（【建议】）：</w:t>
+        <w:t xml:space="preserve">决定怎么记（D4，已决定）：</w:t>
       </w:r>
       <w:r>
         <w:rPr>
@@ -5491,7 +5737,7 @@
         <w:rPr>
           <w:rFonts w:ascii="Calibri" w:cs="Calibri" w:eastAsia="Microsoft YaHei" w:hAnsi="Calibri"/>
         </w:rPr>
-        <w:t xml:space="preserve">（理由 A）。最后变成两种之一：收到个体数据 → </w:t>
+        <w:t xml:space="preserve">（理由 A），只记在 FT_log，不在别处设标签。最后变成两种之一：收到个体数据 → </w:t>
       </w:r>
       <w:r>
         <w:rPr>
@@ -5599,13 +5845,13 @@
           <w:b/>
           <w:bCs/>
         </w:rPr>
-        <w:t xml:space="preserve">等多久：</w:t>
-      </w:r>
-      <w:r>
-        <w:rPr>
-          <w:rFonts w:ascii="Calibri" w:cs="Calibri" w:eastAsia="Microsoft YaHei" w:hAnsi="Calibri"/>
-        </w:rPr>
-        <w:t xml:space="preserve">【建议】第二封发出后再等 4 周，到期未回复的最终定为 Exclude（理由 A）；不要让 Pending 一直悬着。协议只规定了发两封，没有规定等多久。</w:t>
+        <w:t xml:space="preserve">等多久（D6，已决定）：</w:t>
+      </w:r>
+      <w:r>
+        <w:rPr>
+          <w:rFonts w:ascii="Calibri" w:cs="Calibri" w:eastAsia="Microsoft YaHei" w:hAnsi="Calibri"/>
+        </w:rPr>
+        <w:t xml:space="preserve"> 第二封发出后再等 4 周，到期未回复的最终定为 Exclude（理由 A），即从第一封发出算起总共不超过 8 周；不要让 Pending 一直悬着。协议只规定了发两封，没有规定等多久。</w:t>
       </w:r>
     </w:p>
     <w:p>
@@ -6034,13 +6280,13 @@
           <w:b/>
           <w:bCs/>
         </w:rPr>
-        <w:t xml:space="preserve">两人都 Exclude、理由不同：</w:t>
-      </w:r>
-      <w:r>
-        <w:rPr>
-          <w:rFonts w:ascii="Calibri" w:cs="Calibri" w:eastAsia="Microsoft YaHei" w:hAnsi="Calibri"/>
-        </w:rPr>
-        <w:t xml:space="preserve">【建议】不算分歧，按第 5 节的顺序取第一条适用的理由，在记录里写明。</w:t>
+        <w:t xml:space="preserve">两人都 Exclude、理由不同（D3，已决定）：</w:t>
+      </w:r>
+      <w:r>
+        <w:rPr>
+          <w:rFonts w:ascii="Calibri" w:cs="Calibri" w:eastAsia="Microsoft YaHei" w:hAnsi="Calibri"/>
+        </w:rPr>
+        <w:t xml:space="preserve"> 不算分歧，按第 5 节的顺序取第一条适用的理由，在记录里写明。</w:t>
       </w:r>
     </w:p>
     <w:p>
@@ -6190,13 +6436,13 @@
           <w:b/>
           <w:bCs/>
         </w:rPr>
-        <w:t xml:space="preserve">一致性：</w:t>
-      </w:r>
-      <w:r>
-        <w:rPr>
-          <w:rFonts w:ascii="Calibri" w:cs="Calibri" w:eastAsia="Microsoft YaHei" w:hAnsi="Calibri"/>
-        </w:rPr>
-        <w:t xml:space="preserve">【建议】报告全文阶段的一致率和 Cohen's kappa（协议只要求提取阶段和——已决定的——标题摘要阶段报告 kappa）。</w:t>
+        <w:t xml:space="preserve">一致性（D7，已决定）：</w:t>
+      </w:r>
+      <w:r>
+        <w:rPr>
+          <w:rFonts w:ascii="Calibri" w:cs="Calibri" w:eastAsia="Microsoft YaHei" w:hAnsi="Calibri"/>
+        </w:rPr>
+        <w:t xml:space="preserve"> 报告全文阶段的原始一致率、分歧条数和 Cohen's kappa，不设门槛（协议只要求提取阶段和——已决定的——标题摘要阶段报告 kappa）。</w:t>
       </w:r>
     </w:p>
     <w:p>
@@ -6256,7 +6502,170 @@
         <w:rPr>
           <w:rFonts w:ascii="Calibri" w:cs="Calibri" w:eastAsia="Microsoft YaHei" w:hAnsi="Calibri"/>
         </w:rPr>
-        <w:t xml:space="preserve">因语种选 L 的记录数（应与 </w:t>
+        <w:t xml:space="preserve">因语种选 L 的记录数（与检索清单一致，单独列出；只含 2000 年及以后发表的，当前 66）。</w:t>
+      </w:r>
+    </w:p>
+    <w:p>
+      <w:pPr>
+        <w:pStyle w:val="ListParagraph"/>
+        <w:numPr>
+          <w:ilvl w:val="0"/>
+          <w:numId w:val="2"/>
+        </w:numPr>
+        <w:spacing w:after="60"/>
+      </w:pPr>
+      <w:r>
+        <w:rPr>
+          <w:rFonts w:ascii="Calibri" w:cs="Calibri" w:eastAsia="Microsoft YaHei" w:hAnsi="Calibri"/>
+        </w:rPr>
+        <w:t xml:space="preserve">全文检索数，未能检索的数（D）。</w:t>
+      </w:r>
+    </w:p>
+    <w:p>
+      <w:pPr>
+        <w:pStyle w:val="ListParagraph"/>
+        <w:numPr>
+          <w:ilvl w:val="0"/>
+          <w:numId w:val="2"/>
+        </w:numPr>
+        <w:spacing w:after="60"/>
+      </w:pPr>
+      <w:r>
+        <w:rPr>
+          <w:rFonts w:ascii="Calibri" w:cs="Calibri" w:eastAsia="Microsoft YaHei" w:hAnsi="Calibri"/>
+        </w:rPr>
+        <w:t xml:space="preserve">全文评估数。</w:t>
+      </w:r>
+    </w:p>
+    <w:p>
+      <w:pPr>
+        <w:pStyle w:val="ListParagraph"/>
+        <w:numPr>
+          <w:ilvl w:val="0"/>
+          <w:numId w:val="2"/>
+        </w:numPr>
+        <w:spacing w:after="60"/>
+      </w:pPr>
+      <w:r>
+        <w:rPr>
+          <w:rFonts w:ascii="Calibri" w:cs="Calibri" w:eastAsia="Microsoft YaHei" w:hAnsi="Calibri"/>
+        </w:rPr>
+        <w:t xml:space="preserve">全文排除数，按理由 E1–E6、A、N 分别列出。</w:t>
+      </w:r>
+    </w:p>
+    <w:p>
+      <w:pPr>
+        <w:pStyle w:val="ListParagraph"/>
+        <w:numPr>
+          <w:ilvl w:val="0"/>
+          <w:numId w:val="2"/>
+        </w:numPr>
+        <w:spacing w:after="60"/>
+      </w:pPr>
+      <w:r>
+        <w:rPr>
+          <w:rFonts w:ascii="Calibri" w:cs="Calibri" w:eastAsia="Microsoft YaHei" w:hAnsi="Calibri"/>
+        </w:rPr>
+        <w:t xml:space="preserve">Pending IPD：索取了多少篇、几篇回复、几篇收到个体数据；最终纳入和最终排除各多少。</w:t>
+      </w:r>
+    </w:p>
+    <w:p>
+      <w:pPr>
+        <w:pStyle w:val="ListParagraph"/>
+        <w:numPr>
+          <w:ilvl w:val="0"/>
+          <w:numId w:val="2"/>
+        </w:numPr>
+        <w:spacing w:after="60"/>
+      </w:pPr>
+      <w:r>
+        <w:rPr>
+          <w:rFonts w:ascii="Calibri" w:cs="Calibri" w:eastAsia="Microsoft YaHei" w:hAnsi="Calibri"/>
+        </w:rPr>
+        <w:t xml:space="preserve">纳入的报告数、纳入的儿童总数（个体数据来自发表报告的、来自作者提供的、本机构的 5 例分开）。</w:t>
+      </w:r>
+    </w:p>
+    <w:p>
+      <w:pPr>
+        <w:pStyle w:val="ListParagraph"/>
+        <w:numPr>
+          <w:ilvl w:val="0"/>
+          <w:numId w:val="2"/>
+        </w:numPr>
+        <w:spacing w:after="60"/>
+      </w:pPr>
+      <w:r>
+        <w:rPr>
+          <w:rFonts w:ascii="Calibri" w:cs="Calibri" w:eastAsia="Microsoft YaHei" w:hAnsi="Calibri"/>
+        </w:rPr>
+        <w:t xml:space="preserve">链接的重复报告数。</w:t>
+      </w:r>
+    </w:p>
+    <w:p>
+      <w:pPr>
+        <w:pStyle w:val="ListParagraph"/>
+        <w:numPr>
+          <w:ilvl w:val="0"/>
+          <w:numId w:val="2"/>
+        </w:numPr>
+        <w:spacing w:after="60"/>
+      </w:pPr>
+      <w:r>
+        <w:rPr>
+          <w:rFonts w:ascii="Calibri" w:cs="Calibri" w:eastAsia="Microsoft YaHei" w:hAnsi="Calibri"/>
+        </w:rPr>
+        <w:t xml:space="preserve">方法部分要如实写：谁、何时、用什么工具筛选；是否盲法；校准的情况；理由的选择顺序；D 的尝试途径；IPD 索取的做法和结果；</w:t>
+      </w:r>
+      <w:r>
+        <w:rPr>
+          <w:rFonts w:ascii="Calibri" w:cs="Calibri" w:eastAsia="Microsoft YaHei" w:hAnsi="Calibri"/>
+          <w:b/>
+          <w:bCs/>
+        </w:rPr>
+        <w:t xml:space="preserve">2000 年日期规则（何时决定、为什么、对哪些记录生效）和 27 条 E4 安全网记录</w:t>
+      </w:r>
+      <w:r>
+        <w:rPr>
+          <w:rFonts w:ascii="Calibri" w:cs="Calibri" w:eastAsia="Microsoft YaHei" w:hAnsi="Calibri"/>
+        </w:rPr>
+        <w:t xml:space="preserve">，二者都是对方案的偏离。</w:t>
+      </w:r>
+    </w:p>
+    <w:p>
+      <w:pPr>
+        <w:pStyle w:val="Heading2"/>
+        <w:keepNext/>
+      </w:pPr>
+      <w:r>
+        <w:rPr>
+          <w:rFonts w:ascii="Calibri" w:cs="Calibri" w:eastAsia="Microsoft YaHei" w:hAnsi="Calibri"/>
+        </w:rPr>
+        <w:t xml:space="preserve">12. 校准（D5，已决定）</w:t>
+      </w:r>
+    </w:p>
+    <w:p>
+      <w:pPr>
+        <w:spacing w:after="120"/>
+      </w:pPr>
+      <w:r>
+        <w:rPr>
+          <w:rFonts w:ascii="Calibri" w:cs="Calibri" w:eastAsia="Microsoft YaHei" w:hAnsi="Calibri"/>
+        </w:rPr>
+        <w:t xml:space="preserve">协议只规定了标题摘要阶段的 50 条校准和提取阶段的 10 篇校准，</w:t>
+      </w:r>
+      <w:r>
+        <w:rPr>
+          <w:rFonts w:ascii="Calibri" w:cs="Calibri" w:eastAsia="Microsoft YaHei" w:hAnsi="Calibri"/>
+          <w:b/>
+          <w:bCs/>
+        </w:rPr>
+        <w:t xml:space="preserve">没有规定全文阶段的校准</w:t>
+      </w:r>
+      <w:r>
+        <w:rPr>
+          <w:rFonts w:ascii="Calibri" w:cs="Calibri" w:eastAsia="Microsoft YaHei" w:hAnsi="Calibri"/>
+        </w:rPr>
+        <w:t xml:space="preserve">。在正式开始全文筛选前，两人各自独立处理同样的 20 篇（从 540 篇待取全文的清单（</w:t>
       </w:r>
       <w:r>
         <w:rPr>
@@ -6265,139 +6674,13 @@
           <w:szCs w:val="19"/>
           <w:shd w:fill="EEEEEE" w:val="clear"/>
         </w:rPr>
-        <w:t xml:space="preserve">lang-other</w:t>
-      </w:r>
-      <w:r>
-        <w:rPr>
-          <w:rFonts w:ascii="Calibri" w:cs="Calibri" w:eastAsia="Microsoft YaHei" w:hAnsi="Calibri"/>
-        </w:rPr>
-        <w:t xml:space="preserve"> 标签数一致，单独列出；只含 2000 年及以后发表的，当前 66）。</w:t>
-      </w:r>
-    </w:p>
-    <w:p>
-      <w:pPr>
-        <w:pStyle w:val="ListParagraph"/>
-        <w:numPr>
-          <w:ilvl w:val="0"/>
-          <w:numId w:val="2"/>
-        </w:numPr>
-        <w:spacing w:after="60"/>
-      </w:pPr>
-      <w:r>
-        <w:rPr>
-          <w:rFonts w:ascii="Calibri" w:cs="Calibri" w:eastAsia="Microsoft YaHei" w:hAnsi="Calibri"/>
-        </w:rPr>
-        <w:t xml:space="preserve">全文检索数，未能检索的数（D）。</w:t>
-      </w:r>
-    </w:p>
-    <w:p>
-      <w:pPr>
-        <w:pStyle w:val="ListParagraph"/>
-        <w:numPr>
-          <w:ilvl w:val="0"/>
-          <w:numId w:val="2"/>
-        </w:numPr>
-        <w:spacing w:after="60"/>
-      </w:pPr>
-      <w:r>
-        <w:rPr>
-          <w:rFonts w:ascii="Calibri" w:cs="Calibri" w:eastAsia="Microsoft YaHei" w:hAnsi="Calibri"/>
-        </w:rPr>
-        <w:t xml:space="preserve">全文评估数。</w:t>
-      </w:r>
-    </w:p>
-    <w:p>
-      <w:pPr>
-        <w:pStyle w:val="ListParagraph"/>
-        <w:numPr>
-          <w:ilvl w:val="0"/>
-          <w:numId w:val="2"/>
-        </w:numPr>
-        <w:spacing w:after="60"/>
-      </w:pPr>
-      <w:r>
-        <w:rPr>
-          <w:rFonts w:ascii="Calibri" w:cs="Calibri" w:eastAsia="Microsoft YaHei" w:hAnsi="Calibri"/>
-        </w:rPr>
-        <w:t xml:space="preserve">全文排除数，按理由 E1–E6、A、N 分别列出。</w:t>
-      </w:r>
-    </w:p>
-    <w:p>
-      <w:pPr>
-        <w:pStyle w:val="ListParagraph"/>
-        <w:numPr>
-          <w:ilvl w:val="0"/>
-          <w:numId w:val="2"/>
-        </w:numPr>
-        <w:spacing w:after="60"/>
-      </w:pPr>
-      <w:r>
-        <w:rPr>
-          <w:rFonts w:ascii="Calibri" w:cs="Calibri" w:eastAsia="Microsoft YaHei" w:hAnsi="Calibri"/>
-        </w:rPr>
-        <w:t xml:space="preserve">Pending IPD：索取了多少篇、几篇回复、几篇收到个体数据；最终纳入和最终排除各多少。</w:t>
-      </w:r>
-    </w:p>
-    <w:p>
-      <w:pPr>
-        <w:pStyle w:val="ListParagraph"/>
-        <w:numPr>
-          <w:ilvl w:val="0"/>
-          <w:numId w:val="2"/>
-        </w:numPr>
-        <w:spacing w:after="60"/>
-      </w:pPr>
-      <w:r>
-        <w:rPr>
-          <w:rFonts w:ascii="Calibri" w:cs="Calibri" w:eastAsia="Microsoft YaHei" w:hAnsi="Calibri"/>
-        </w:rPr>
-        <w:t xml:space="preserve">纳入的报告数、纳入的儿童总数（个体数据来自发表报告的、来自作者提供的、本机构的 5 例分开）。</w:t>
-      </w:r>
-    </w:p>
-    <w:p>
-      <w:pPr>
-        <w:pStyle w:val="ListParagraph"/>
-        <w:numPr>
-          <w:ilvl w:val="0"/>
-          <w:numId w:val="2"/>
-        </w:numPr>
-        <w:spacing w:after="60"/>
-      </w:pPr>
-      <w:r>
-        <w:rPr>
-          <w:rFonts w:ascii="Calibri" w:cs="Calibri" w:eastAsia="Microsoft YaHei" w:hAnsi="Calibri"/>
-        </w:rPr>
-        <w:t xml:space="preserve">链接的重复报告数。</w:t>
-      </w:r>
-    </w:p>
-    <w:p>
-      <w:pPr>
-        <w:pStyle w:val="ListParagraph"/>
-        <w:numPr>
-          <w:ilvl w:val="0"/>
-          <w:numId w:val="2"/>
-        </w:numPr>
-        <w:spacing w:after="60"/>
-      </w:pPr>
-      <w:r>
-        <w:rPr>
-          <w:rFonts w:ascii="Calibri" w:cs="Calibri" w:eastAsia="Microsoft YaHei" w:hAnsi="Calibri"/>
-        </w:rPr>
-        <w:t xml:space="preserve">方法部分要如实写：谁、何时、用什么工具筛选；是否盲法；校准的情况；理由的选择顺序；D 的尝试途径；IPD 索取的做法和结果；</w:t>
-      </w:r>
-      <w:r>
-        <w:rPr>
-          <w:rFonts w:ascii="Calibri" w:cs="Calibri" w:eastAsia="Microsoft YaHei" w:hAnsi="Calibri"/>
-          <w:b/>
-          <w:bCs/>
-        </w:rPr>
-        <w:t xml:space="preserve">2000 年日期规则（何时决定、为什么、对哪些记录生效）和 27 条 E4 安全网记录</w:t>
-      </w:r>
-      <w:r>
-        <w:rPr>
-          <w:rFonts w:ascii="Calibri" w:cs="Calibri" w:eastAsia="Microsoft YaHei" w:hAnsi="Calibri"/>
-        </w:rPr>
-        <w:t xml:space="preserve">，二者都是对方案的偏离。</w:t>
+        <w:t xml:space="preserve">retrieval_class</w:t>
+      </w:r>
+      <w:r>
+        <w:rPr>
+          <w:rFonts w:ascii="Calibri" w:cs="Calibri" w:eastAsia="Microsoft YaHei" w:hAnsi="Calibri"/>
+        </w:rPr>
+        <w:t xml:space="preserve"> = retrieve）里随机抽，并且至少含：中文 3 篇、综述 2 篇、系列报告 3 篇，另放 2–3 篇只写“扭转”、没写位置的 D1 类报告），比较，讨论分歧，必要时修改本指南。只记一致率，kappa 在 20 篇上没有意义。校准用的 20 篇在正式筛选里照样再处理一遍。抽样由 Claude 做（固定随机种子，清单和种子写进仓库）；抽样前不向筛选员透露任何一篇的内容或判断。</w:t>
       </w:r>
     </w:p>
     <w:p>
@@ -6409,59 +6692,7 @@
         <w:rPr>
           <w:rFonts w:ascii="Calibri" w:cs="Calibri" w:eastAsia="Microsoft YaHei" w:hAnsi="Calibri"/>
         </w:rPr>
-        <w:t xml:space="preserve">12. 校准 【建议】</w:t>
-      </w:r>
-    </w:p>
-    <w:p>
-      <w:pPr>
-        <w:spacing w:after="120"/>
-      </w:pPr>
-      <w:r>
-        <w:rPr>
-          <w:rFonts w:ascii="Calibri" w:cs="Calibri" w:eastAsia="Microsoft YaHei" w:hAnsi="Calibri"/>
-        </w:rPr>
-        <w:t xml:space="preserve">协议只规定了标题摘要阶段的 50 条校准和提取阶段的 10 篇校准，</w:t>
-      </w:r>
-      <w:r>
-        <w:rPr>
-          <w:rFonts w:ascii="Calibri" w:cs="Calibri" w:eastAsia="Microsoft YaHei" w:hAnsi="Calibri"/>
-          <w:b/>
-          <w:bCs/>
-        </w:rPr>
-        <w:t xml:space="preserve">没有规定全文阶段的校准</w:t>
-      </w:r>
-      <w:r>
-        <w:rPr>
-          <w:rFonts w:ascii="Calibri" w:cs="Calibri" w:eastAsia="Microsoft YaHei" w:hAnsi="Calibri"/>
-        </w:rPr>
-        <w:t xml:space="preserve">。建议在正式开始全文筛选前，两人各自独立处理同样的 20 篇（从 540 篇待取全文的清单（</w:t>
-      </w:r>
-      <w:r>
-        <w:rPr>
-          <w:rFonts w:ascii="Consolas" w:cs="Consolas" w:eastAsia="Microsoft YaHei" w:hAnsi="Consolas"/>
-          <w:sz w:val="19"/>
-          <w:szCs w:val="19"/>
-          <w:shd w:fill="EEEEEE" w:val="clear"/>
-        </w:rPr>
-        <w:t xml:space="preserve">retrieval_class</w:t>
-      </w:r>
-      <w:r>
-        <w:rPr>
-          <w:rFonts w:ascii="Calibri" w:cs="Calibri" w:eastAsia="Microsoft YaHei" w:hAnsi="Calibri"/>
-        </w:rPr>
-        <w:t xml:space="preserve"> = retrieve）里随机抽，并且至少含：中文 3 篇、综述 2 篇、系列报告 3 篇），比较，讨论分歧，必要时修改本指南。校准用的 20 篇在正式筛选里照样再处理一遍。</w:t>
-      </w:r>
-    </w:p>
-    <w:p>
-      <w:pPr>
-        <w:pStyle w:val="Heading2"/>
-        <w:keepNext/>
-      </w:pPr>
-      <w:r>
-        <w:rPr>
-          <w:rFonts w:ascii="Calibri" w:cs="Calibri" w:eastAsia="Microsoft YaHei" w:hAnsi="Calibri"/>
-        </w:rPr>
-        <w:t xml:space="preserve">13. 待决定事项（需要三位决定）</w:t>
+        <w:t xml:space="preserve">13. 决定表（作者 2026 年 10 月 17 日决定，按 Claude 的建议；杨俊、卞宏强尚未确认）</w:t>
       </w:r>
     </w:p>
     <w:tbl>
@@ -6572,7 +6803,7 @@
                 <w:sz w:val="20"/>
                 <w:szCs w:val="20"/>
               </w:rPr>
-              <w:t xml:space="preserve">Claude 的建议</w:t>
+              <w:t xml:space="preserve">决定</w:t>
             </w:r>
           </w:p>
         </w:tc>
@@ -6605,7 +6836,7 @@
                 <w:sz w:val="20"/>
                 <w:szCs w:val="20"/>
               </w:rPr>
-              <w:t xml:space="preserve">D1</w:t>
+              <w:t xml:space="preserve">Y</w:t>
             </w:r>
           </w:p>
         </w:tc>
@@ -6632,7 +6863,7 @@
                 <w:sz w:val="20"/>
                 <w:szCs w:val="20"/>
               </w:rPr>
-              <w:t xml:space="preserve">只写"脾扭转"、没写脾脏位置和韧带的儿童报告，是否算游走脾</w:t>
+              <w:t xml:space="preserve">发表日期规则</w:t>
             </w:r>
           </w:p>
         </w:tc>
@@ -6659,24 +6890,7 @@
                 <w:sz w:val="20"/>
                 <w:szCs w:val="20"/>
               </w:rPr>
-              <w:t xml:space="preserve">宽松加标记（Include，</w:t>
-            </w:r>
-            <w:r>
-              <w:rPr>
-                <w:rFonts w:ascii="Consolas" w:cs="Consolas" w:eastAsia="Microsoft YaHei" w:hAnsi="Consolas"/>
-                <w:sz w:val="20"/>
-                <w:szCs w:val="20"/>
-                <w:shd w:fill="EEEEEE" w:val="clear"/>
-              </w:rPr>
-              <w:t xml:space="preserve">ws_basis</w:t>
-            </w:r>
-            <w:r>
-              <w:rPr>
-                <w:rFonts w:ascii="Calibri" w:cs="Calibri" w:eastAsia="Microsoft YaHei" w:hAnsi="Calibri"/>
-                <w:sz w:val="20"/>
-                <w:szCs w:val="20"/>
-              </w:rPr>
-              <w:t xml:space="preserve"> = Torsion only）；备选严格（E2）。见 6.3</w:t>
+              <w:t xml:space="preserve">2000 年以前发表的不取全文，理由 Y（4.1）。偏离已注册的纳入标准，写进方案修订 v1.5</w:t>
             </w:r>
           </w:p>
         </w:tc>
@@ -6709,7 +6923,7 @@
                 <w:sz w:val="20"/>
                 <w:szCs w:val="20"/>
               </w:rPr>
-              <w:t xml:space="preserve">D2</w:t>
+              <w:t xml:space="preserve">人员</w:t>
             </w:r>
           </w:p>
         </w:tc>
@@ -6736,7 +6950,7 @@
                 <w:sz w:val="20"/>
                 <w:szCs w:val="20"/>
               </w:rPr>
-              <w:t xml:space="preserve">只写"儿童、小儿、患儿"、没有具体年龄的</w:t>
+              <w:t xml:space="preserve">全文阶段的第二位筛选员</w:t>
             </w:r>
           </w:p>
         </w:tc>
@@ -6763,7 +6977,7 @@
                 <w:sz w:val="20"/>
                 <w:szCs w:val="20"/>
               </w:rPr>
-              <w:t xml:space="preserve">视为已确认小于 18 岁，纳入，年龄记 NR；"青少年"仍是 N。见 6.4</w:t>
+              <w:t xml:space="preserve">卞宏强；舒俊为筛选员 1，杨俊仲裁。已注册方案里第二评审员是彭飞，所以也是偏离</w:t>
             </w:r>
           </w:p>
         </w:tc>
@@ -6796,7 +7010,7 @@
                 <w:sz w:val="20"/>
                 <w:szCs w:val="20"/>
               </w:rPr>
-              <w:t xml:space="preserve">D3</w:t>
+              <w:t xml:space="preserve">D1</w:t>
             </w:r>
           </w:p>
         </w:tc>
@@ -6823,7 +7037,7 @@
                 <w:sz w:val="20"/>
                 <w:szCs w:val="20"/>
               </w:rPr>
-              <w:t xml:space="preserve">一篇符合多条理由时的选择顺序</w:t>
+              <w:t xml:space="preserve">只写"脾扭转"、没写脾脏位置和韧带的儿童报告，是否算游走脾</w:t>
             </w:r>
           </w:p>
         </w:tc>
@@ -6847,10 +7061,37 @@
             <w:r>
               <w:rPr>
                 <w:rFonts w:ascii="Calibri" w:cs="Calibri" w:eastAsia="Microsoft YaHei" w:hAnsi="Calibri"/>
-                <w:sz w:val="20"/>
-                <w:szCs w:val="20"/>
-              </w:rPr>
-              <w:t xml:space="preserve">Y → L → D → E5 → E4 → E1 → E2 → E3 → A → N → E6，选第一条适用的。见第 5 节</w:t>
+                <w:b/>
+                <w:bCs/>
+                <w:sz w:val="20"/>
+                <w:szCs w:val="20"/>
+              </w:rPr>
+              <w:t xml:space="preserve">宽松加标记</w:t>
+            </w:r>
+            <w:r>
+              <w:rPr>
+                <w:rFonts w:ascii="Calibri" w:cs="Calibri" w:eastAsia="Microsoft YaHei" w:hAnsi="Calibri"/>
+                <w:sz w:val="20"/>
+                <w:szCs w:val="20"/>
+              </w:rPr>
+              <w:t xml:space="preserve">：Include，</w:t>
+            </w:r>
+            <w:r>
+              <w:rPr>
+                <w:rFonts w:ascii="Consolas" w:cs="Consolas" w:eastAsia="Microsoft YaHei" w:hAnsi="Consolas"/>
+                <w:sz w:val="20"/>
+                <w:szCs w:val="20"/>
+                <w:shd w:fill="EEEEEE" w:val="clear"/>
+              </w:rPr>
+              <w:t xml:space="preserve">ws_basis</w:t>
+            </w:r>
+            <w:r>
+              <w:rPr>
+                <w:rFonts w:ascii="Calibri" w:cs="Calibri" w:eastAsia="Microsoft YaHei" w:hAnsi="Calibri"/>
+                <w:sz w:val="20"/>
+                <w:szCs w:val="20"/>
+              </w:rPr>
+              <w:t xml:space="preserve"> = Torsion only；只有作者明确写了脾在原位、韧带完好或扭转另有原因才排除（E2）。事后可多做一个"去掉该标记病例"的分析，须声明为新增分析。见 6.3</w:t>
             </w:r>
           </w:p>
         </w:tc>
@@ -6883,7 +7124,7 @@
                 <w:sz w:val="20"/>
                 <w:szCs w:val="20"/>
               </w:rPr>
-              <w:t xml:space="preserve">D4</w:t>
+              <w:t xml:space="preserve">D2</w:t>
             </w:r>
           </w:p>
         </w:tc>
@@ -6910,7 +7151,7 @@
                 <w:sz w:val="20"/>
                 <w:szCs w:val="20"/>
               </w:rPr>
-              <w:t xml:space="preserve">L、D、A、N 在 Rayyan 里的名称；Pending IPD 怎么表示</w:t>
+              <w:t xml:space="preserve">只写"儿童、小儿、患儿"、没有具体年龄的</w:t>
             </w:r>
           </w:p>
         </w:tc>
@@ -6937,24 +7178,7 @@
                 <w:sz w:val="20"/>
                 <w:szCs w:val="20"/>
               </w:rPr>
-              <w:t xml:space="preserve">用第 5 节的名称；Pending IPD 用 Maybe 加标签 </w:t>
-            </w:r>
-            <w:r>
-              <w:rPr>
-                <w:rFonts w:ascii="Consolas" w:cs="Consolas" w:eastAsia="Microsoft YaHei" w:hAnsi="Consolas"/>
-                <w:sz w:val="20"/>
-                <w:szCs w:val="20"/>
-                <w:shd w:fill="EEEEEE" w:val="clear"/>
-              </w:rPr>
-              <w:t xml:space="preserve">ipd-pending</w:t>
-            </w:r>
-            <w:r>
-              <w:rPr>
-                <w:rFonts w:ascii="Calibri" w:cs="Calibri" w:eastAsia="Microsoft YaHei" w:hAnsi="Calibri"/>
-                <w:sz w:val="20"/>
-                <w:szCs w:val="20"/>
-              </w:rPr>
-              <w:t xml:space="preserve">，或只记在 FT_log</w:t>
+              <w:t xml:space="preserve">视为已确认小于 18 岁，纳入，年龄记 NR；只写"青少年/adolescent"的归 N。见 6.4</w:t>
             </w:r>
           </w:p>
         </w:tc>
@@ -6987,7 +7211,7 @@
                 <w:sz w:val="20"/>
                 <w:szCs w:val="20"/>
               </w:rPr>
-              <w:t xml:space="preserve">D5</w:t>
+              <w:t xml:space="preserve">D3</w:t>
             </w:r>
           </w:p>
         </w:tc>
@@ -7014,7 +7238,7 @@
                 <w:sz w:val="20"/>
                 <w:szCs w:val="20"/>
               </w:rPr>
-              <w:t xml:space="preserve">全文阶段先校准 20 篇</w:t>
+              <w:t xml:space="preserve">一篇符合多条理由时的选择顺序</w:t>
             </w:r>
           </w:p>
         </w:tc>
@@ -7041,7 +7265,7 @@
                 <w:sz w:val="20"/>
                 <w:szCs w:val="20"/>
               </w:rPr>
-              <w:t xml:space="preserve">做。见第 12 节</w:t>
+              <w:t xml:space="preserve">Y → L → D → E5 → E4 → E1 → E2 → E3 → A → N → E6，选第一条适用的；两人都 Exclude、只是理由不同，不算分歧。见第 5 节</w:t>
             </w:r>
           </w:p>
         </w:tc>
@@ -7074,7 +7298,7 @@
                 <w:sz w:val="20"/>
                 <w:szCs w:val="20"/>
               </w:rPr>
-              <w:t xml:space="preserve">D6</w:t>
+              <w:t xml:space="preserve">D4</w:t>
             </w:r>
           </w:p>
         </w:tc>
@@ -7101,7 +7325,7 @@
                 <w:sz w:val="20"/>
                 <w:szCs w:val="20"/>
               </w:rPr>
-              <w:t xml:space="preserve">第二封 IPD 邮件后的等待时间</w:t>
+              <w:t xml:space="preserve">用什么工具；理由名称；Pending IPD 怎么表示</w:t>
             </w:r>
           </w:p>
         </w:tc>
@@ -7125,10 +7349,20 @@
             <w:r>
               <w:rPr>
                 <w:rFonts w:ascii="Calibri" w:cs="Calibri" w:eastAsia="Microsoft YaHei" w:hAnsi="Calibri"/>
-                <w:sz w:val="20"/>
-                <w:szCs w:val="20"/>
-              </w:rPr>
-              <w:t xml:space="preserve">再等 4 周，到期未回复定为 Exclude（A）。见第 8 节</w:t>
+                <w:b/>
+                <w:bCs/>
+                <w:sz w:val="20"/>
+                <w:szCs w:val="20"/>
+              </w:rPr>
+              <w:t xml:space="preserve">全文阶段不用 Rayyan</w:t>
+            </w:r>
+            <w:r>
+              <w:rPr>
+                <w:rFonts w:ascii="Calibri" w:cs="Calibri" w:eastAsia="Microsoft YaHei" w:hAnsi="Calibri"/>
+                <w:sz w:val="20"/>
+                <w:szCs w:val="20"/>
+              </w:rPr>
+              <w:t xml:space="preserve">，以 FT_log 为正式记录（每人一份、互不查看），FT_time_log 记录时间；每人完成前 50 篇后交杨俊保管做中途检查；Pending IPD 只记在 FT_log。见第 3 节</w:t>
             </w:r>
           </w:p>
         </w:tc>
@@ -7161,7 +7395,7 @@
                 <w:sz w:val="20"/>
                 <w:szCs w:val="20"/>
               </w:rPr>
-              <w:t xml:space="preserve">D7</w:t>
+              <w:t xml:space="preserve">D5</w:t>
             </w:r>
           </w:p>
         </w:tc>
@@ -7188,7 +7422,7 @@
                 <w:sz w:val="20"/>
                 <w:szCs w:val="20"/>
               </w:rPr>
-              <w:t xml:space="preserve">全文阶段是否报告一致率和 kappa</w:t>
+              <w:t xml:space="preserve">全文阶段校准</w:t>
             </w:r>
           </w:p>
         </w:tc>
@@ -7215,7 +7449,7 @@
                 <w:sz w:val="20"/>
                 <w:szCs w:val="20"/>
               </w:rPr>
-              <w:t xml:space="preserve">报告。见第 10 节</w:t>
+              <w:t xml:space="preserve">做：两人独立处理同样的 20 篇（至少含中文 3、综述 2、系列报告 3，另放 2–3 篇 D1 类的），讨论分歧；只记一致率，kappa 此时无意义。见第 12 节</w:t>
             </w:r>
           </w:p>
         </w:tc>
@@ -7248,6 +7482,180 @@
                 <w:sz w:val="20"/>
                 <w:szCs w:val="20"/>
               </w:rPr>
+              <w:t xml:space="preserve">D6</w:t>
+            </w:r>
+          </w:p>
+        </w:tc>
+        <w:tc>
+          <w:tcPr>
+            <w:tcW w:type="dxa" w:w="2400"/>
+            <w:tcBorders>
+              <w:top w:val="single" w:color="BBBBBB" w:sz="4"/>
+              <w:left w:val="single" w:color="BBBBBB" w:sz="4"/>
+              <w:bottom w:val="single" w:color="BBBBBB" w:sz="4"/>
+              <w:right w:val="single" w:color="BBBBBB" w:sz="4"/>
+            </w:tcBorders>
+            <w:tcMar>
+              <w:top w:type="dxa" w:w="60"/>
+              <w:left w:type="dxa" w:w="100"/>
+              <w:bottom w:type="dxa" w:w="60"/>
+              <w:right w:type="dxa" w:w="100"/>
+            </w:tcMar>
+          </w:tcPr>
+          <w:p>
+            <w:r>
+              <w:rPr>
+                <w:rFonts w:ascii="Calibri" w:cs="Calibri" w:eastAsia="Microsoft YaHei" w:hAnsi="Calibri"/>
+                <w:sz w:val="20"/>
+                <w:szCs w:val="20"/>
+              </w:rPr>
+              <w:t xml:space="preserve">第二封 IPD 邮件后的等待时间</w:t>
+            </w:r>
+          </w:p>
+        </w:tc>
+        <w:tc>
+          <w:tcPr>
+            <w:tcW w:type="dxa" w:w="5726"/>
+            <w:tcBorders>
+              <w:top w:val="single" w:color="BBBBBB" w:sz="4"/>
+              <w:left w:val="single" w:color="BBBBBB" w:sz="4"/>
+              <w:bottom w:val="single" w:color="BBBBBB" w:sz="4"/>
+              <w:right w:val="single" w:color="BBBBBB" w:sz="4"/>
+            </w:tcBorders>
+            <w:tcMar>
+              <w:top w:type="dxa" w:w="60"/>
+              <w:left w:type="dxa" w:w="100"/>
+              <w:bottom w:type="dxa" w:w="60"/>
+              <w:right w:type="dxa" w:w="100"/>
+            </w:tcMar>
+          </w:tcPr>
+          <w:p>
+            <w:r>
+              <w:rPr>
+                <w:rFonts w:ascii="Calibri" w:cs="Calibri" w:eastAsia="Microsoft YaHei" w:hAnsi="Calibri"/>
+                <w:sz w:val="20"/>
+                <w:szCs w:val="20"/>
+              </w:rPr>
+              <w:t xml:space="preserve">再等 4 周，没回复定为 Exclude（A）；从第一封发出算起总共不超过 8 周。见第 8 节</w:t>
+            </w:r>
+          </w:p>
+        </w:tc>
+      </w:tr>
+      <w:tr>
+        <w:trPr>
+          <w:cantSplit/>
+          <w:tblHeader w:val="false"/>
+        </w:trPr>
+        <w:tc>
+          <w:tcPr>
+            <w:tcW w:type="dxa" w:w="900"/>
+            <w:tcBorders>
+              <w:top w:val="single" w:color="BBBBBB" w:sz="4"/>
+              <w:left w:val="single" w:color="BBBBBB" w:sz="4"/>
+              <w:bottom w:val="single" w:color="BBBBBB" w:sz="4"/>
+              <w:right w:val="single" w:color="BBBBBB" w:sz="4"/>
+            </w:tcBorders>
+            <w:tcMar>
+              <w:top w:type="dxa" w:w="60"/>
+              <w:left w:type="dxa" w:w="100"/>
+              <w:bottom w:type="dxa" w:w="60"/>
+              <w:right w:type="dxa" w:w="100"/>
+            </w:tcMar>
+          </w:tcPr>
+          <w:p>
+            <w:r>
+              <w:rPr>
+                <w:rFonts w:ascii="Calibri" w:cs="Calibri" w:eastAsia="Microsoft YaHei" w:hAnsi="Calibri"/>
+                <w:sz w:val="20"/>
+                <w:szCs w:val="20"/>
+              </w:rPr>
+              <w:t xml:space="preserve">D7</w:t>
+            </w:r>
+          </w:p>
+        </w:tc>
+        <w:tc>
+          <w:tcPr>
+            <w:tcW w:type="dxa" w:w="2400"/>
+            <w:tcBorders>
+              <w:top w:val="single" w:color="BBBBBB" w:sz="4"/>
+              <w:left w:val="single" w:color="BBBBBB" w:sz="4"/>
+              <w:bottom w:val="single" w:color="BBBBBB" w:sz="4"/>
+              <w:right w:val="single" w:color="BBBBBB" w:sz="4"/>
+            </w:tcBorders>
+            <w:tcMar>
+              <w:top w:type="dxa" w:w="60"/>
+              <w:left w:type="dxa" w:w="100"/>
+              <w:bottom w:type="dxa" w:w="60"/>
+              <w:right w:type="dxa" w:w="100"/>
+            </w:tcMar>
+          </w:tcPr>
+          <w:p>
+            <w:r>
+              <w:rPr>
+                <w:rFonts w:ascii="Calibri" w:cs="Calibri" w:eastAsia="Microsoft YaHei" w:hAnsi="Calibri"/>
+                <w:sz w:val="20"/>
+                <w:szCs w:val="20"/>
+              </w:rPr>
+              <w:t xml:space="preserve">全文阶段是否报告一致率和 kappa</w:t>
+            </w:r>
+          </w:p>
+        </w:tc>
+        <w:tc>
+          <w:tcPr>
+            <w:tcW w:type="dxa" w:w="5726"/>
+            <w:tcBorders>
+              <w:top w:val="single" w:color="BBBBBB" w:sz="4"/>
+              <w:left w:val="single" w:color="BBBBBB" w:sz="4"/>
+              <w:bottom w:val="single" w:color="BBBBBB" w:sz="4"/>
+              <w:right w:val="single" w:color="BBBBBB" w:sz="4"/>
+            </w:tcBorders>
+            <w:tcMar>
+              <w:top w:type="dxa" w:w="60"/>
+              <w:left w:type="dxa" w:w="100"/>
+              <w:bottom w:type="dxa" w:w="60"/>
+              <w:right w:type="dxa" w:w="100"/>
+            </w:tcMar>
+          </w:tcPr>
+          <w:p>
+            <w:r>
+              <w:rPr>
+                <w:rFonts w:ascii="Calibri" w:cs="Calibri" w:eastAsia="Microsoft YaHei" w:hAnsi="Calibri"/>
+                <w:sz w:val="20"/>
+                <w:szCs w:val="20"/>
+              </w:rPr>
+              <w:t xml:space="preserve">报告原始一致率、分歧条数和 kappa，不设门槛。见第 10 节</w:t>
+            </w:r>
+          </w:p>
+        </w:tc>
+      </w:tr>
+      <w:tr>
+        <w:trPr>
+          <w:cantSplit/>
+          <w:tblHeader w:val="false"/>
+        </w:trPr>
+        <w:tc>
+          <w:tcPr>
+            <w:tcW w:type="dxa" w:w="900"/>
+            <w:tcBorders>
+              <w:top w:val="single" w:color="BBBBBB" w:sz="4"/>
+              <w:left w:val="single" w:color="BBBBBB" w:sz="4"/>
+              <w:bottom w:val="single" w:color="BBBBBB" w:sz="4"/>
+              <w:right w:val="single" w:color="BBBBBB" w:sz="4"/>
+            </w:tcBorders>
+            <w:tcMar>
+              <w:top w:type="dxa" w:w="60"/>
+              <w:left w:type="dxa" w:w="100"/>
+              <w:bottom w:type="dxa" w:w="60"/>
+              <w:right w:type="dxa" w:w="100"/>
+            </w:tcMar>
+          </w:tcPr>
+          <w:p>
+            <w:r>
+              <w:rPr>
+                <w:rFonts w:ascii="Calibri" w:cs="Calibri" w:eastAsia="Microsoft YaHei" w:hAnsi="Calibri"/>
+                <w:sz w:val="20"/>
+                <w:szCs w:val="20"/>
+              </w:rPr>
               <w:t xml:space="preserve">D8</w:t>
             </w:r>
           </w:p>
@@ -7275,7 +7683,52 @@
                 <w:sz w:val="20"/>
                 <w:szCs w:val="20"/>
               </w:rPr>
-              <w:t xml:space="preserve">综述表里别人的病例不提取；</w:t>
+              <w:t xml:space="preserve">综述表里别人的病例；综述的参考文献核对</w:t>
+            </w:r>
+          </w:p>
+        </w:tc>
+        <w:tc>
+          <w:tcPr>
+            <w:tcW w:type="dxa" w:w="5726"/>
+            <w:tcBorders>
+              <w:top w:val="single" w:color="BBBBBB" w:sz="4"/>
+              <w:left w:val="single" w:color="BBBBBB" w:sz="4"/>
+              <w:bottom w:val="single" w:color="BBBBBB" w:sz="4"/>
+              <w:right w:val="single" w:color="BBBBBB" w:sz="4"/>
+            </w:tcBorders>
+            <w:tcMar>
+              <w:top w:type="dxa" w:w="60"/>
+              <w:left w:type="dxa" w:w="100"/>
+              <w:bottom w:type="dxa" w:w="60"/>
+              <w:right w:type="dxa" w:w="100"/>
+            </w:tcMar>
+          </w:tcPr>
+          <w:p>
+            <w:r>
+              <w:rPr>
+                <w:rFonts w:ascii="Calibri" w:cs="Calibri" w:eastAsia="Microsoft YaHei" w:hAnsi="Calibri"/>
+                <w:sz w:val="20"/>
+                <w:szCs w:val="20"/>
+              </w:rPr>
+              <w:t xml:space="preserve">不提取综述表里的病例。参考文献核对做</w:t>
+            </w:r>
+            <w:r>
+              <w:rPr>
+                <w:rFonts w:ascii="Calibri" w:cs="Calibri" w:eastAsia="Microsoft YaHei" w:hAnsi="Calibri"/>
+                <w:b/>
+                <w:bCs/>
+                <w:sz w:val="20"/>
+                <w:szCs w:val="20"/>
+              </w:rPr>
+              <w:t xml:space="preserve">有限版本</w:t>
+            </w:r>
+            <w:r>
+              <w:rPr>
+                <w:rFonts w:ascii="Calibri" w:cs="Calibri" w:eastAsia="Microsoft YaHei" w:hAnsi="Calibri"/>
+                <w:sz w:val="20"/>
+                <w:szCs w:val="20"/>
+              </w:rPr>
+              <w:t xml:space="preserve">：只核对方案 A8 所列的既往综述（去掉 2000 年以前的 Allen &amp; Andrews 1989），把参考文献与 2,548 条记录自动匹配，只读没匹配上的；其余带 </w:t>
             </w:r>
             <w:r>
               <w:rPr>
@@ -7292,34 +7745,7 @@
                 <w:sz w:val="20"/>
                 <w:szCs w:val="20"/>
               </w:rPr>
-              <w:t xml:space="preserve"> 标记的综述最后是否核对参考文献</w:t>
-            </w:r>
-          </w:p>
-        </w:tc>
-        <w:tc>
-          <w:tcPr>
-            <w:tcW w:type="dxa" w:w="5726"/>
-            <w:tcBorders>
-              <w:top w:val="single" w:color="BBBBBB" w:sz="4"/>
-              <w:left w:val="single" w:color="BBBBBB" w:sz="4"/>
-              <w:bottom w:val="single" w:color="BBBBBB" w:sz="4"/>
-              <w:right w:val="single" w:color="BBBBBB" w:sz="4"/>
-            </w:tcBorders>
-            <w:tcMar>
-              <w:top w:type="dxa" w:w="60"/>
-              <w:left w:type="dxa" w:w="100"/>
-              <w:bottom w:type="dxa" w:w="60"/>
-              <w:right w:type="dxa" w:w="100"/>
-            </w:tcMar>
-          </w:tcPr>
-          <w:p>
-            <w:r>
-              <w:rPr>
-                <w:rFonts w:ascii="Calibri" w:cs="Calibri" w:eastAsia="Microsoft YaHei" w:hAnsi="Calibri"/>
-                <w:sz w:val="20"/>
-                <w:szCs w:val="20"/>
-              </w:rPr>
-              <w:t xml:space="preserve">不提取；是否核对参考文献单独决定（修订说明承诺"终稿会说明是否做了"）</w:t>
+              <w:t xml:space="preserve"> 的综述不做，在局限性里写明。怎么导出参考文献、有多少条还没有核实，规模等看到数量再定</w:t>
             </w:r>
           </w:p>
         </w:tc>

</xml_diff>

<commit_message>
Full-text log comparison script (check and compare), guide references it
Co-Authored-By: Claude Sonnet 5.5 <noreply@anthropic.com>
Claude-Session: https://claude.ai/code/session_01FRD7etKqYN8v2bbXeeLMRW
</commit_message>
<xml_diff>
--- a/Full-text screening guide (draft).docx
+++ b/Full-text screening guide (draft).docx
@@ -815,7 +815,22 @@
         <w:rPr>
           <w:rFonts w:ascii="Calibri" w:cs="Calibri" w:eastAsia="Microsoft YaHei" w:hAnsi="Calibri"/>
         </w:rPr>
-        <w:t xml:space="preserve"> 每人完成前 50 篇后，把自己的 FT_log 和 FT_time_log 交给杨俊保管（不交给对方），由他决定怎么转交 Claude 核对格式和进度（用时、是否有空白理由、理由名称是否正确）；Claude 只报告汇总，不把某一篇的对方决定告诉筛选员。两人都完成后再互相交换。</w:t>
+        <w:t xml:space="preserve"> 每人完成前 50 篇后，把自己的 FT_log 和 FT_time_log 交给杨俊保管（不交给对方），由他决定怎么转交 Claude 核对格式和进度（用时、是否有空白理由、理由名称是否正确）；Claude 只报告汇总，不把某一篇的对方决定告诉筛选员。检查用脚本 </w:t>
+      </w:r>
+      <w:r>
+        <w:rPr>
+          <w:rFonts w:ascii="Consolas" w:cs="Consolas" w:eastAsia="Microsoft YaHei" w:hAnsi="Consolas"/>
+          <w:sz w:val="19"/>
+          <w:szCs w:val="19"/>
+          <w:shd w:fill="EEEEEE" w:val="clear"/>
+        </w:rPr>
+        <w:t xml:space="preserve">tools/compare_fulltext_logs.py check FT_R1.xlsx</w:t>
+      </w:r>
+      <w:r>
+        <w:rPr>
+          <w:rFonts w:ascii="Calibri" w:cs="Calibri" w:eastAsia="Microsoft YaHei" w:hAnsi="Calibri"/>
+        </w:rPr>
+        <w:t xml:space="preserve">（一次只看一份文件；列出决定值、理由名称、必填项、重复行、不该读的记录——发表早于 2000 年的，和用时：每小时处理超过 15 篇的时段会被标出来询问，这只是提示，不是结论）。两人都完成后再互相交换。</w:t>
       </w:r>
     </w:p>
     <w:p>
@@ -6397,13 +6412,13 @@
           <w:b/>
           <w:bCs/>
         </w:rPr>
-        <w:t xml:space="preserve">记录：</w:t>
-      </w:r>
-      <w:r>
-        <w:rPr>
-          <w:rFonts w:ascii="Calibri" w:cs="Calibri" w:eastAsia="Microsoft YaHei" w:hAnsi="Calibri"/>
-        </w:rPr>
-        <w:t xml:space="preserve"> 分歧条数、讨论解决条数、仲裁条数；填好的清单提交到仓库 </w:t>
+        <w:t xml:space="preserve">比对：</w:t>
+      </w:r>
+      <w:r>
+        <w:rPr>
+          <w:rFonts w:ascii="Calibri" w:cs="Calibri" w:eastAsia="Microsoft YaHei" w:hAnsi="Calibri"/>
+        </w:rPr>
+        <w:t xml:space="preserve"> 两人都完成后用 </w:t>
       </w:r>
       <w:r>
         <w:rPr>
@@ -6412,260 +6427,13 @@
           <w:szCs w:val="19"/>
           <w:shd w:fill="EEEEEE" w:val="clear"/>
         </w:rPr>
-        <w:t xml:space="preserve">search/screening/formal/</w:t>
-      </w:r>
-      <w:r>
-        <w:rPr>
-          <w:rFonts w:ascii="Calibri" w:cs="Calibri" w:eastAsia="Microsoft YaHei" w:hAnsi="Calibri"/>
-        </w:rPr>
-        <w:t xml:space="preserve">。</w:t>
-      </w:r>
-    </w:p>
-    <w:p>
-      <w:pPr>
-        <w:pStyle w:val="ListParagraph"/>
-        <w:numPr>
-          <w:ilvl w:val="0"/>
-          <w:numId w:val="2"/>
-        </w:numPr>
-        <w:spacing w:after="60"/>
-      </w:pPr>
-      <w:r>
-        <w:rPr>
-          <w:rFonts w:ascii="Calibri" w:cs="Calibri" w:eastAsia="Microsoft YaHei" w:hAnsi="Calibri"/>
-          <w:b/>
-          <w:bCs/>
-        </w:rPr>
-        <w:t xml:space="preserve">一致性（D7，已决定）：</w:t>
-      </w:r>
-      <w:r>
-        <w:rPr>
-          <w:rFonts w:ascii="Calibri" w:cs="Calibri" w:eastAsia="Microsoft YaHei" w:hAnsi="Calibri"/>
-        </w:rPr>
-        <w:t xml:space="preserve"> 报告全文阶段的原始一致率、分歧条数和 Cohen's kappa，不设门槛（协议只要求提取阶段和——已决定的——标题摘要阶段报告 kappa）。</w:t>
-      </w:r>
-    </w:p>
-    <w:p>
-      <w:pPr>
-        <w:pStyle w:val="Heading2"/>
-        <w:keepNext/>
-      </w:pPr>
-      <w:r>
-        <w:rPr>
-          <w:rFonts w:ascii="Calibri" w:cs="Calibri" w:eastAsia="Microsoft YaHei" w:hAnsi="Calibri"/>
-        </w:rPr>
-        <w:t xml:space="preserve">11. 要记录和报告的数字（PRISMA 2020）</w:t>
-      </w:r>
-    </w:p>
-    <w:p>
-      <w:pPr>
-        <w:pStyle w:val="ListParagraph"/>
-        <w:numPr>
-          <w:ilvl w:val="0"/>
-          <w:numId w:val="2"/>
-        </w:numPr>
-        <w:spacing w:after="60"/>
-      </w:pPr>
-      <w:r>
-        <w:rPr>
-          <w:rFonts w:ascii="Calibri" w:cs="Calibri" w:eastAsia="Microsoft YaHei" w:hAnsi="Calibri"/>
-        </w:rPr>
-        <w:t xml:space="preserve">标题摘要阶段结束后进入全文的记录数。</w:t>
-      </w:r>
-    </w:p>
-    <w:p>
-      <w:pPr>
-        <w:pStyle w:val="ListParagraph"/>
-        <w:numPr>
-          <w:ilvl w:val="0"/>
-          <w:numId w:val="2"/>
-        </w:numPr>
-        <w:spacing w:after="60"/>
-      </w:pPr>
-      <w:r>
-        <w:rPr>
-          <w:rFonts w:ascii="Calibri" w:cs="Calibri" w:eastAsia="Microsoft YaHei" w:hAnsi="Calibri"/>
-        </w:rPr>
-        <w:t xml:space="preserve">因发表早于 2000 年未取全文的记录数（理由 Y，单独列出；当前 485）。</w:t>
-      </w:r>
-    </w:p>
-    <w:p>
-      <w:pPr>
-        <w:pStyle w:val="ListParagraph"/>
-        <w:numPr>
-          <w:ilvl w:val="0"/>
-          <w:numId w:val="2"/>
-        </w:numPr>
-        <w:spacing w:after="60"/>
-      </w:pPr>
-      <w:r>
-        <w:rPr>
-          <w:rFonts w:ascii="Calibri" w:cs="Calibri" w:eastAsia="Microsoft YaHei" w:hAnsi="Calibri"/>
-        </w:rPr>
-        <w:t xml:space="preserve">因语种选 L 的记录数（与检索清单一致，单独列出；只含 2000 年及以后发表的，当前 66）。</w:t>
-      </w:r>
-    </w:p>
-    <w:p>
-      <w:pPr>
-        <w:pStyle w:val="ListParagraph"/>
-        <w:numPr>
-          <w:ilvl w:val="0"/>
-          <w:numId w:val="2"/>
-        </w:numPr>
-        <w:spacing w:after="60"/>
-      </w:pPr>
-      <w:r>
-        <w:rPr>
-          <w:rFonts w:ascii="Calibri" w:cs="Calibri" w:eastAsia="Microsoft YaHei" w:hAnsi="Calibri"/>
-        </w:rPr>
-        <w:t xml:space="preserve">全文检索数，未能检索的数（D）。</w:t>
-      </w:r>
-    </w:p>
-    <w:p>
-      <w:pPr>
-        <w:pStyle w:val="ListParagraph"/>
-        <w:numPr>
-          <w:ilvl w:val="0"/>
-          <w:numId w:val="2"/>
-        </w:numPr>
-        <w:spacing w:after="60"/>
-      </w:pPr>
-      <w:r>
-        <w:rPr>
-          <w:rFonts w:ascii="Calibri" w:cs="Calibri" w:eastAsia="Microsoft YaHei" w:hAnsi="Calibri"/>
-        </w:rPr>
-        <w:t xml:space="preserve">全文评估数。</w:t>
-      </w:r>
-    </w:p>
-    <w:p>
-      <w:pPr>
-        <w:pStyle w:val="ListParagraph"/>
-        <w:numPr>
-          <w:ilvl w:val="0"/>
-          <w:numId w:val="2"/>
-        </w:numPr>
-        <w:spacing w:after="60"/>
-      </w:pPr>
-      <w:r>
-        <w:rPr>
-          <w:rFonts w:ascii="Calibri" w:cs="Calibri" w:eastAsia="Microsoft YaHei" w:hAnsi="Calibri"/>
-        </w:rPr>
-        <w:t xml:space="preserve">全文排除数，按理由 E1–E6、A、N 分别列出。</w:t>
-      </w:r>
-    </w:p>
-    <w:p>
-      <w:pPr>
-        <w:pStyle w:val="ListParagraph"/>
-        <w:numPr>
-          <w:ilvl w:val="0"/>
-          <w:numId w:val="2"/>
-        </w:numPr>
-        <w:spacing w:after="60"/>
-      </w:pPr>
-      <w:r>
-        <w:rPr>
-          <w:rFonts w:ascii="Calibri" w:cs="Calibri" w:eastAsia="Microsoft YaHei" w:hAnsi="Calibri"/>
-        </w:rPr>
-        <w:t xml:space="preserve">Pending IPD：索取了多少篇、几篇回复、几篇收到个体数据；最终纳入和最终排除各多少。</w:t>
-      </w:r>
-    </w:p>
-    <w:p>
-      <w:pPr>
-        <w:pStyle w:val="ListParagraph"/>
-        <w:numPr>
-          <w:ilvl w:val="0"/>
-          <w:numId w:val="2"/>
-        </w:numPr>
-        <w:spacing w:after="60"/>
-      </w:pPr>
-      <w:r>
-        <w:rPr>
-          <w:rFonts w:ascii="Calibri" w:cs="Calibri" w:eastAsia="Microsoft YaHei" w:hAnsi="Calibri"/>
-        </w:rPr>
-        <w:t xml:space="preserve">纳入的报告数、纳入的儿童总数（个体数据来自发表报告的、来自作者提供的、本机构的 5 例分开）。</w:t>
-      </w:r>
-    </w:p>
-    <w:p>
-      <w:pPr>
-        <w:pStyle w:val="ListParagraph"/>
-        <w:numPr>
-          <w:ilvl w:val="0"/>
-          <w:numId w:val="2"/>
-        </w:numPr>
-        <w:spacing w:after="60"/>
-      </w:pPr>
-      <w:r>
-        <w:rPr>
-          <w:rFonts w:ascii="Calibri" w:cs="Calibri" w:eastAsia="Microsoft YaHei" w:hAnsi="Calibri"/>
-        </w:rPr>
-        <w:t xml:space="preserve">链接的重复报告数。</w:t>
-      </w:r>
-    </w:p>
-    <w:p>
-      <w:pPr>
-        <w:pStyle w:val="ListParagraph"/>
-        <w:numPr>
-          <w:ilvl w:val="0"/>
-          <w:numId w:val="2"/>
-        </w:numPr>
-        <w:spacing w:after="60"/>
-      </w:pPr>
-      <w:r>
-        <w:rPr>
-          <w:rFonts w:ascii="Calibri" w:cs="Calibri" w:eastAsia="Microsoft YaHei" w:hAnsi="Calibri"/>
-        </w:rPr>
-        <w:t xml:space="preserve">方法部分要如实写：谁、何时、用什么工具筛选；是否盲法；校准的情况；理由的选择顺序；D 的尝试途径；IPD 索取的做法和结果；</w:t>
-      </w:r>
-      <w:r>
-        <w:rPr>
-          <w:rFonts w:ascii="Calibri" w:cs="Calibri" w:eastAsia="Microsoft YaHei" w:hAnsi="Calibri"/>
-          <w:b/>
-          <w:bCs/>
-        </w:rPr>
-        <w:t xml:space="preserve">2000 年日期规则（何时决定、为什么、对哪些记录生效）和 27 条 E4 安全网记录</w:t>
-      </w:r>
-      <w:r>
-        <w:rPr>
-          <w:rFonts w:ascii="Calibri" w:cs="Calibri" w:eastAsia="Microsoft YaHei" w:hAnsi="Calibri"/>
-        </w:rPr>
-        <w:t xml:space="preserve">，二者都是对方案的偏离。</w:t>
-      </w:r>
-    </w:p>
-    <w:p>
-      <w:pPr>
-        <w:pStyle w:val="Heading2"/>
-        <w:keepNext/>
-      </w:pPr>
-      <w:r>
-        <w:rPr>
-          <w:rFonts w:ascii="Calibri" w:cs="Calibri" w:eastAsia="Microsoft YaHei" w:hAnsi="Calibri"/>
-        </w:rPr>
-        <w:t xml:space="preserve">12. 校准（D5，已决定）</w:t>
-      </w:r>
-    </w:p>
-    <w:p>
-      <w:pPr>
-        <w:spacing w:after="120"/>
-      </w:pPr>
-      <w:r>
-        <w:rPr>
-          <w:rFonts w:ascii="Calibri" w:cs="Calibri" w:eastAsia="Microsoft YaHei" w:hAnsi="Calibri"/>
-        </w:rPr>
-        <w:t xml:space="preserve">协议只规定了标题摘要阶段的 50 条校准和提取阶段的 10 篇校准，</w:t>
-      </w:r>
-      <w:r>
-        <w:rPr>
-          <w:rFonts w:ascii="Calibri" w:cs="Calibri" w:eastAsia="Microsoft YaHei" w:hAnsi="Calibri"/>
-          <w:b/>
-          <w:bCs/>
-        </w:rPr>
-        <w:t xml:space="preserve">没有规定全文阶段的校准</w:t>
-      </w:r>
-      <w:r>
-        <w:rPr>
-          <w:rFonts w:ascii="Calibri" w:cs="Calibri" w:eastAsia="Microsoft YaHei" w:hAnsi="Calibri"/>
-        </w:rPr>
-        <w:t xml:space="preserve">。在正式开始全文筛选前，两人各自独立处理同样的 20 篇（从 540 篇待取全文的清单（</w:t>
+        <w:t xml:space="preserve">python3 -I tools/compare_fulltext_logs.py compare FT_R1.xlsx FT_R2.xlsx --out &lt;目录&gt;</w:t>
+      </w:r>
+      <w:r>
+        <w:rPr>
+          <w:rFonts w:ascii="Calibri" w:cs="Calibri" w:eastAsia="Microsoft YaHei" w:hAnsi="Calibri"/>
+        </w:rPr>
+        <w:t xml:space="preserve">。它输出一致率和 kappa、分歧清单（</w:t>
       </w:r>
       <w:r>
         <w:rPr>
@@ -6674,13 +6442,358 @@
           <w:szCs w:val="19"/>
           <w:shd w:fill="EEEEEE" w:val="clear"/>
         </w:rPr>
+        <w:t xml:space="preserve">ft_conflicts_for_discussion.csv</w:t>
+      </w:r>
+      <w:r>
+        <w:rPr>
+          <w:rFonts w:ascii="Calibri" w:cs="Calibri" w:eastAsia="Microsoft YaHei" w:hAnsi="Calibri"/>
+        </w:rPr>
+        <w:t xml:space="preserve">，带讨论和仲裁的空列）、细节差异清单（</w:t>
+      </w:r>
+      <w:r>
+        <w:rPr>
+          <w:rFonts w:ascii="Consolas" w:cs="Consolas" w:eastAsia="Microsoft YaHei" w:hAnsi="Consolas"/>
+          <w:sz w:val="19"/>
+          <w:szCs w:val="19"/>
+          <w:shd w:fill="EEEEEE" w:val="clear"/>
+        </w:rPr>
+        <w:t xml:space="preserve">ft_detail_differences.csv</w:t>
+      </w:r>
+      <w:r>
+        <w:rPr>
+          <w:rFonts w:ascii="Calibri" w:cs="Calibri" w:eastAsia="Microsoft YaHei" w:hAnsi="Calibri"/>
+        </w:rPr>
+        <w:t xml:space="preserve">：两人都 Include 但 ws_basis、儿童数、重复链接不同；两人都 Exclude 但理由不同，附按 D3 顺序建议的理由）和每人的计数。</w:t>
+      </w:r>
+      <w:r>
+        <w:rPr>
+          <w:rFonts w:ascii="Calibri" w:cs="Calibri" w:eastAsia="Microsoft YaHei" w:hAnsi="Calibri"/>
+          <w:b/>
+          <w:bCs/>
+        </w:rPr>
+        <w:t xml:space="preserve">脚本把 Include 对 Pending IPD 也当作分歧</w:t>
+      </w:r>
+      <w:r>
+        <w:rPr>
+          <w:rFonts w:ascii="Calibri" w:cs="Calibri" w:eastAsia="Microsoft YaHei" w:hAnsi="Calibri"/>
+        </w:rPr>
+        <w:t xml:space="preserve">（指南只明说了 Include 对 Exclude、Pending IPD 对 Exclude；这是 Claude 的读法，需要三位确认）。加 </w:t>
+      </w:r>
+      <w:r>
+        <w:rPr>
+          <w:rFonts w:ascii="Consolas" w:cs="Consolas" w:eastAsia="Microsoft YaHei" w:hAnsi="Consolas"/>
+          <w:sz w:val="19"/>
+          <w:szCs w:val="19"/>
+          <w:shd w:fill="EEEEEE" w:val="clear"/>
+        </w:rPr>
+        <w:t xml:space="preserve">--aggregate-only</w:t>
+      </w:r>
+      <w:r>
+        <w:rPr>
+          <w:rFonts w:ascii="Calibri" w:cs="Calibri" w:eastAsia="Microsoft YaHei" w:hAnsi="Calibri"/>
+        </w:rPr>
+        <w:t xml:space="preserve"> 只打印汇总，不写文件，不显示篇目。</w:t>
+      </w:r>
+    </w:p>
+    <w:p>
+      <w:pPr>
+        <w:pStyle w:val="ListParagraph"/>
+        <w:numPr>
+          <w:ilvl w:val="0"/>
+          <w:numId w:val="2"/>
+        </w:numPr>
+        <w:spacing w:after="60"/>
+      </w:pPr>
+      <w:r>
+        <w:rPr>
+          <w:rFonts w:ascii="Calibri" w:cs="Calibri" w:eastAsia="Microsoft YaHei" w:hAnsi="Calibri"/>
+          <w:b/>
+          <w:bCs/>
+        </w:rPr>
+        <w:t xml:space="preserve">记录：</w:t>
+      </w:r>
+      <w:r>
+        <w:rPr>
+          <w:rFonts w:ascii="Calibri" w:cs="Calibri" w:eastAsia="Microsoft YaHei" w:hAnsi="Calibri"/>
+        </w:rPr>
+        <w:t xml:space="preserve"> 分歧条数、讨论解决条数、仲裁条数；填好的清单提交到仓库 </w:t>
+      </w:r>
+      <w:r>
+        <w:rPr>
+          <w:rFonts w:ascii="Consolas" w:cs="Consolas" w:eastAsia="Microsoft YaHei" w:hAnsi="Consolas"/>
+          <w:sz w:val="19"/>
+          <w:szCs w:val="19"/>
+          <w:shd w:fill="EEEEEE" w:val="clear"/>
+        </w:rPr>
+        <w:t xml:space="preserve">search/screening/fulltext/</w:t>
+      </w:r>
+      <w:r>
+        <w:rPr>
+          <w:rFonts w:ascii="Calibri" w:cs="Calibri" w:eastAsia="Microsoft YaHei" w:hAnsi="Calibri"/>
+        </w:rPr>
+        <w:t xml:space="preserve">（不含邮箱）。</w:t>
+      </w:r>
+    </w:p>
+    <w:p>
+      <w:pPr>
+        <w:pStyle w:val="ListParagraph"/>
+        <w:numPr>
+          <w:ilvl w:val="0"/>
+          <w:numId w:val="2"/>
+        </w:numPr>
+        <w:spacing w:after="60"/>
+      </w:pPr>
+      <w:r>
+        <w:rPr>
+          <w:rFonts w:ascii="Calibri" w:cs="Calibri" w:eastAsia="Microsoft YaHei" w:hAnsi="Calibri"/>
+          <w:b/>
+          <w:bCs/>
+        </w:rPr>
+        <w:t xml:space="preserve">一致性（D7，已决定）：</w:t>
+      </w:r>
+      <w:r>
+        <w:rPr>
+          <w:rFonts w:ascii="Calibri" w:cs="Calibri" w:eastAsia="Microsoft YaHei" w:hAnsi="Calibri"/>
+        </w:rPr>
+        <w:t xml:space="preserve"> 报告全文阶段的原始一致率、分歧条数和 Cohen's kappa，不设门槛（协议只要求提取阶段和——已决定的——标题摘要阶段报告 kappa）。</w:t>
+      </w:r>
+    </w:p>
+    <w:p>
+      <w:pPr>
+        <w:pStyle w:val="Heading2"/>
+        <w:keepNext/>
+      </w:pPr>
+      <w:r>
+        <w:rPr>
+          <w:rFonts w:ascii="Calibri" w:cs="Calibri" w:eastAsia="Microsoft YaHei" w:hAnsi="Calibri"/>
+        </w:rPr>
+        <w:t xml:space="preserve">11. 要记录和报告的数字（PRISMA 2020）</w:t>
+      </w:r>
+    </w:p>
+    <w:p>
+      <w:pPr>
+        <w:pStyle w:val="ListParagraph"/>
+        <w:numPr>
+          <w:ilvl w:val="0"/>
+          <w:numId w:val="2"/>
+        </w:numPr>
+        <w:spacing w:after="60"/>
+      </w:pPr>
+      <w:r>
+        <w:rPr>
+          <w:rFonts w:ascii="Calibri" w:cs="Calibri" w:eastAsia="Microsoft YaHei" w:hAnsi="Calibri"/>
+        </w:rPr>
+        <w:t xml:space="preserve">标题摘要阶段结束后进入全文的记录数。</w:t>
+      </w:r>
+    </w:p>
+    <w:p>
+      <w:pPr>
+        <w:pStyle w:val="ListParagraph"/>
+        <w:numPr>
+          <w:ilvl w:val="0"/>
+          <w:numId w:val="2"/>
+        </w:numPr>
+        <w:spacing w:after="60"/>
+      </w:pPr>
+      <w:r>
+        <w:rPr>
+          <w:rFonts w:ascii="Calibri" w:cs="Calibri" w:eastAsia="Microsoft YaHei" w:hAnsi="Calibri"/>
+        </w:rPr>
+        <w:t xml:space="preserve">因发表早于 2000 年未取全文的记录数（理由 Y，单独列出；当前 485）。</w:t>
+      </w:r>
+    </w:p>
+    <w:p>
+      <w:pPr>
+        <w:pStyle w:val="ListParagraph"/>
+        <w:numPr>
+          <w:ilvl w:val="0"/>
+          <w:numId w:val="2"/>
+        </w:numPr>
+        <w:spacing w:after="60"/>
+      </w:pPr>
+      <w:r>
+        <w:rPr>
+          <w:rFonts w:ascii="Calibri" w:cs="Calibri" w:eastAsia="Microsoft YaHei" w:hAnsi="Calibri"/>
+        </w:rPr>
+        <w:t xml:space="preserve">因语种选 L 的记录数（与检索清单一致，单独列出；只含 2000 年及以后发表的，当前 66）。</w:t>
+      </w:r>
+    </w:p>
+    <w:p>
+      <w:pPr>
+        <w:pStyle w:val="ListParagraph"/>
+        <w:numPr>
+          <w:ilvl w:val="0"/>
+          <w:numId w:val="2"/>
+        </w:numPr>
+        <w:spacing w:after="60"/>
+      </w:pPr>
+      <w:r>
+        <w:rPr>
+          <w:rFonts w:ascii="Calibri" w:cs="Calibri" w:eastAsia="Microsoft YaHei" w:hAnsi="Calibri"/>
+        </w:rPr>
+        <w:t xml:space="preserve">全文检索数，未能检索的数（D）。</w:t>
+      </w:r>
+    </w:p>
+    <w:p>
+      <w:pPr>
+        <w:pStyle w:val="ListParagraph"/>
+        <w:numPr>
+          <w:ilvl w:val="0"/>
+          <w:numId w:val="2"/>
+        </w:numPr>
+        <w:spacing w:after="60"/>
+      </w:pPr>
+      <w:r>
+        <w:rPr>
+          <w:rFonts w:ascii="Calibri" w:cs="Calibri" w:eastAsia="Microsoft YaHei" w:hAnsi="Calibri"/>
+        </w:rPr>
+        <w:t xml:space="preserve">全文评估数。</w:t>
+      </w:r>
+    </w:p>
+    <w:p>
+      <w:pPr>
+        <w:pStyle w:val="ListParagraph"/>
+        <w:numPr>
+          <w:ilvl w:val="0"/>
+          <w:numId w:val="2"/>
+        </w:numPr>
+        <w:spacing w:after="60"/>
+      </w:pPr>
+      <w:r>
+        <w:rPr>
+          <w:rFonts w:ascii="Calibri" w:cs="Calibri" w:eastAsia="Microsoft YaHei" w:hAnsi="Calibri"/>
+        </w:rPr>
+        <w:t xml:space="preserve">全文排除数，按理由 E1–E6、A、N 分别列出。</w:t>
+      </w:r>
+    </w:p>
+    <w:p>
+      <w:pPr>
+        <w:pStyle w:val="ListParagraph"/>
+        <w:numPr>
+          <w:ilvl w:val="0"/>
+          <w:numId w:val="2"/>
+        </w:numPr>
+        <w:spacing w:after="60"/>
+      </w:pPr>
+      <w:r>
+        <w:rPr>
+          <w:rFonts w:ascii="Calibri" w:cs="Calibri" w:eastAsia="Microsoft YaHei" w:hAnsi="Calibri"/>
+        </w:rPr>
+        <w:t xml:space="preserve">Pending IPD：索取了多少篇、几篇回复、几篇收到个体数据；最终纳入和最终排除各多少。</w:t>
+      </w:r>
+    </w:p>
+    <w:p>
+      <w:pPr>
+        <w:pStyle w:val="ListParagraph"/>
+        <w:numPr>
+          <w:ilvl w:val="0"/>
+          <w:numId w:val="2"/>
+        </w:numPr>
+        <w:spacing w:after="60"/>
+      </w:pPr>
+      <w:r>
+        <w:rPr>
+          <w:rFonts w:ascii="Calibri" w:cs="Calibri" w:eastAsia="Microsoft YaHei" w:hAnsi="Calibri"/>
+        </w:rPr>
+        <w:t xml:space="preserve">纳入的报告数、纳入的儿童总数（个体数据来自发表报告的、来自作者提供的、本机构的 5 例分开）。</w:t>
+      </w:r>
+    </w:p>
+    <w:p>
+      <w:pPr>
+        <w:pStyle w:val="ListParagraph"/>
+        <w:numPr>
+          <w:ilvl w:val="0"/>
+          <w:numId w:val="2"/>
+        </w:numPr>
+        <w:spacing w:after="60"/>
+      </w:pPr>
+      <w:r>
+        <w:rPr>
+          <w:rFonts w:ascii="Calibri" w:cs="Calibri" w:eastAsia="Microsoft YaHei" w:hAnsi="Calibri"/>
+        </w:rPr>
+        <w:t xml:space="preserve">链接的重复报告数。</w:t>
+      </w:r>
+    </w:p>
+    <w:p>
+      <w:pPr>
+        <w:pStyle w:val="ListParagraph"/>
+        <w:numPr>
+          <w:ilvl w:val="0"/>
+          <w:numId w:val="2"/>
+        </w:numPr>
+        <w:spacing w:after="60"/>
+      </w:pPr>
+      <w:r>
+        <w:rPr>
+          <w:rFonts w:ascii="Calibri" w:cs="Calibri" w:eastAsia="Microsoft YaHei" w:hAnsi="Calibri"/>
+        </w:rPr>
+        <w:t xml:space="preserve">方法部分要如实写：谁、何时、用什么工具筛选；是否盲法；校准的情况；理由的选择顺序；D 的尝试途径；IPD 索取的做法和结果；</w:t>
+      </w:r>
+      <w:r>
+        <w:rPr>
+          <w:rFonts w:ascii="Calibri" w:cs="Calibri" w:eastAsia="Microsoft YaHei" w:hAnsi="Calibri"/>
+          <w:b/>
+          <w:bCs/>
+        </w:rPr>
+        <w:t xml:space="preserve">2000 年日期规则（何时决定、为什么、对哪些记录生效）和 27 条 E4 安全网记录</w:t>
+      </w:r>
+      <w:r>
+        <w:rPr>
+          <w:rFonts w:ascii="Calibri" w:cs="Calibri" w:eastAsia="Microsoft YaHei" w:hAnsi="Calibri"/>
+        </w:rPr>
+        <w:t xml:space="preserve">，二者都是对方案的偏离。</w:t>
+      </w:r>
+    </w:p>
+    <w:p>
+      <w:pPr>
+        <w:pStyle w:val="Heading2"/>
+        <w:keepNext/>
+      </w:pPr>
+      <w:r>
+        <w:rPr>
+          <w:rFonts w:ascii="Calibri" w:cs="Calibri" w:eastAsia="Microsoft YaHei" w:hAnsi="Calibri"/>
+        </w:rPr>
+        <w:t xml:space="preserve">12. 校准（D5，已决定）</w:t>
+      </w:r>
+    </w:p>
+    <w:p>
+      <w:pPr>
+        <w:spacing w:after="120"/>
+      </w:pPr>
+      <w:r>
+        <w:rPr>
+          <w:rFonts w:ascii="Calibri" w:cs="Calibri" w:eastAsia="Microsoft YaHei" w:hAnsi="Calibri"/>
+        </w:rPr>
+        <w:t xml:space="preserve">协议只规定了标题摘要阶段的 50 条校准和提取阶段的 10 篇校准，</w:t>
+      </w:r>
+      <w:r>
+        <w:rPr>
+          <w:rFonts w:ascii="Calibri" w:cs="Calibri" w:eastAsia="Microsoft YaHei" w:hAnsi="Calibri"/>
+          <w:b/>
+          <w:bCs/>
+        </w:rPr>
+        <w:t xml:space="preserve">没有规定全文阶段的校准</w:t>
+      </w:r>
+      <w:r>
+        <w:rPr>
+          <w:rFonts w:ascii="Calibri" w:cs="Calibri" w:eastAsia="Microsoft YaHei" w:hAnsi="Calibri"/>
+        </w:rPr>
+        <w:t xml:space="preserve">。在正式开始全文筛选前，两人各自独立处理同样的 20 篇（从 540 篇待取全文的清单（</w:t>
+      </w:r>
+      <w:r>
+        <w:rPr>
+          <w:rFonts w:ascii="Consolas" w:cs="Consolas" w:eastAsia="Microsoft YaHei" w:hAnsi="Consolas"/>
+          <w:sz w:val="19"/>
+          <w:szCs w:val="19"/>
+          <w:shd w:fill="EEEEEE" w:val="clear"/>
+        </w:rPr>
         <w:t xml:space="preserve">retrieval_class</w:t>
       </w:r>
       <w:r>
         <w:rPr>
           <w:rFonts w:ascii="Calibri" w:cs="Calibri" w:eastAsia="Microsoft YaHei" w:hAnsi="Calibri"/>
         </w:rPr>
-        <w:t xml:space="preserve"> = retrieve）里随机抽，并且至少含：中文 3 篇、综述 2 篇、系列报告 3 篇，另放 2–3 篇只写“扭转”、没写位置的 D1 类报告），比较，讨论分歧，必要时修改本指南。只记一致率，kappa 在 20 篇上没有意义。校准用的 20 篇在正式筛选里照样再处理一遍。抽样由 Claude 做（固定随机种子，清单和种子写进仓库）；抽样前不向筛选员透露任何一篇的内容或判断。</w:t>
+        <w:t xml:space="preserve"> = retrieve）里随机抽，并且至少含：中文 3 篇、综述 2 篇、系列报告 3 篇，另放 2–3 篇只写“扭转”、没写位置的 D1 类报告），比较（用上面的比对脚本，两人都做完后才运行），讨论分歧，必要时修改本指南。只记一致率，kappa 在 20 篇上没有意义。校准用的 20 篇在正式筛选里照样再处理一遍。抽样由 Claude 做（固定随机种子，清单和种子写进仓库）；抽样前不向筛选员透露任何一篇的内容或判断。</w:t>
       </w:r>
     </w:p>
     <w:p>

</xml_diff>

<commit_message>
Full-text calibration set: 20 reports drawn (seed 20261018), script, list, key, design
Co-Authored-By: Claude Sonnet 5.5 <noreply@anthropic.com>
Claude-Session: https://claude.ai/code/session_01FRD7etKqYN8v2bbXeeLMRW
</commit_message>
<xml_diff>
--- a/Full-text screening guide (draft).docx
+++ b/Full-text screening guide (draft).docx
@@ -6793,7 +6793,65 @@
         <w:rPr>
           <w:rFonts w:ascii="Calibri" w:cs="Calibri" w:eastAsia="Microsoft YaHei" w:hAnsi="Calibri"/>
         </w:rPr>
-        <w:t xml:space="preserve"> = retrieve）里随机抽，并且至少含：中文 3 篇、综述 2 篇、系列报告 3 篇，另放 2–3 篇只写“扭转”、没写位置的 D1 类报告），比较（用上面的比对脚本，两人都做完后才运行），讨论分歧，必要时修改本指南。只记一致率，kappa 在 20 篇上没有意义。校准用的 20 篇在正式筛选里照样再处理一遍。抽样由 Claude 做（固定随机种子，清单和种子写进仓库）；抽样前不向筛选员透露任何一篇的内容或判断。</w:t>
+        <w:t xml:space="preserve"> = retrieve）里随机抽，并且至少含：中文 3 篇、综述 2 篇、系列报告 3 篇，另放 2–3 篇只写“扭转”、没写位置的 D1 类报告），比较（用上面的比对脚本，两人都做完后才运行），讨论分歧，必要时修改本指南。只记一致率，kappa 在 20 篇上没有意义。校准用的 20 篇在正式筛选里照样再处理一遍。</w:t>
+      </w:r>
+      <w:r>
+        <w:rPr>
+          <w:rFonts w:ascii="Calibri" w:cs="Calibri" w:eastAsia="Microsoft YaHei" w:hAnsi="Calibri"/>
+          <w:b/>
+          <w:bCs/>
+        </w:rPr>
+        <w:t xml:space="preserve">抽样已做（种子 20261018，脚本 tools/draw_ft_calibration.py，可重复）：</w:t>
+      </w:r>
+      <w:r>
+        <w:rPr>
+          <w:rFonts w:ascii="Calibri" w:cs="Calibri" w:eastAsia="Microsoft YaHei" w:hAnsi="Calibri"/>
+        </w:rPr>
+        <w:t xml:space="preserve"> 清单在 </w:t>
+      </w:r>
+      <w:r>
+        <w:rPr>
+          <w:rFonts w:ascii="Consolas" w:cs="Consolas" w:eastAsia="Microsoft YaHei" w:hAnsi="Consolas"/>
+          <w:sz w:val="19"/>
+          <w:szCs w:val="19"/>
+          <w:shd w:fill="EEEEEE" w:val="clear"/>
+        </w:rPr>
+        <w:t xml:space="preserve">search/screening/fulltext/calibration_20_list.csv</w:t>
+      </w:r>
+      <w:r>
+        <w:rPr>
+          <w:rFonts w:ascii="Calibri" w:cs="Calibri" w:eastAsia="Microsoft YaHei" w:hAnsi="Calibri"/>
+        </w:rPr>
+        <w:t xml:space="preserve">（20 篇，位置、WS 编号、年份、语种、有无摘要、标题、DOI、链接；不含任何分类标记）。各层是脚本按关键词做的粗分，不是对某一篇的判断；结果满足要求（中文 8、综述 2、系列报告 3、D1 类 5，按关键词计，同一篇可属于几层）。</w:t>
+      </w:r>
+      <w:r>
+        <w:rPr>
+          <w:rFonts w:ascii="Consolas" w:cs="Consolas" w:eastAsia="Microsoft YaHei" w:hAnsi="Consolas"/>
+          <w:sz w:val="19"/>
+          <w:szCs w:val="19"/>
+          <w:shd w:fill="EEEEEE" w:val="clear"/>
+        </w:rPr>
+        <w:t xml:space="preserve">calibration_20_key.csv</w:t>
+      </w:r>
+      <w:r>
+        <w:rPr>
+          <w:rFonts w:ascii="Calibri" w:cs="Calibri" w:eastAsia="Microsoft YaHei" w:hAnsi="Calibri"/>
+        </w:rPr>
+        <w:t xml:space="preserve"> 记着每篇属于哪一层，</w:t>
+      </w:r>
+      <w:r>
+        <w:rPr>
+          <w:rFonts w:ascii="Calibri" w:cs="Calibri" w:eastAsia="Microsoft YaHei" w:hAnsi="Calibri"/>
+          <w:b/>
+          <w:bCs/>
+        </w:rPr>
+        <w:t xml:space="preserve">两位筛选员都完成之前不要打开</w:t>
+      </w:r>
+      <w:r>
+        <w:rPr>
+          <w:rFonts w:ascii="Calibri" w:cs="Calibri" w:eastAsia="Microsoft YaHei" w:hAnsi="Calibri"/>
+        </w:rPr>
+        <w:t xml:space="preserve">。清单里没有记录“怎样进入全文阶段”的来源列。抽样前后，Claude 都没有对任何一篇的纳入排除给过意见，也不会给。</w:t>
       </w:r>
     </w:p>
     <w:p>

</xml_diff>

<commit_message>
Pre-filled FT_log workbooks for the 20 full-text calibration reports; guide v2026-10-18a
Adds --ft-only mode to the workbook generator, pending-row handling to the
FT_log comparison script, the two blank calibration workbooks (R1, R2), and
guide pointers plus a flagged no-automation rule.

Co-Authored-By: Claude Sonnet 5.5 <noreply@anthropic.com>
Claude-Session: https://claude.ai/code/session_01FRD7etKqYN8v2bbXeeLMRW
</commit_message>
<xml_diff>
--- a/Full-text screening guide (draft).docx
+++ b/Full-text screening guide (draft).docx
@@ -22,7 +22,7 @@
         <w:rPr>
           <w:rFonts w:ascii="Calibri" w:cs="Calibri" w:eastAsia="Microsoft YaHei" w:hAnsi="Calibri"/>
         </w:rPr>
-        <w:t xml:space="preserve">适用对象：舒俊（筛选员 1）、卞宏强（筛选员 2，作者 2026 年 10 月 17 日决定）、杨俊（仲裁）。草稿日期：2026 年 10 月 11 日（v2026-10-11a）；2026 年 10 月 17 日更新为 v2026-10-17a。</w:t>
+        <w:t xml:space="preserve">适用对象：舒俊（筛选员 1）、卞宏强（筛选员 2，作者 2026 年 10 月 17 日决定）、杨俊（仲裁）。草稿日期：2026 年 10 月 11 日（v2026-10-11a）；2026 年 10 月 17 日更新为 v2026-10-17a。2026 年 10 月 18 日更新为 v2026-10-18a（加入第 3 节“手工记录”一条和第 12 节校准工作簿的说明；判断规则未改）。</w:t>
       </w:r>
       <w:r>
         <w:rPr>
@@ -885,6 +885,45 @@
           <w:rFonts w:ascii="Calibri" w:cs="Calibri" w:eastAsia="Microsoft YaHei" w:hAnsi="Calibri"/>
         </w:rPr>
         <w:t xml:space="preserve">）。Y、L 不进 FT_log（没有人读它们），数字从检索清单统计；只有取到全文后才发现语种不是英文或中文的，才在 FT_log 里记 L。</w:t>
+      </w:r>
+    </w:p>
+    <w:p>
+      <w:pPr>
+        <w:pStyle w:val="ListParagraph"/>
+        <w:numPr>
+          <w:ilvl w:val="0"/>
+          <w:numId w:val="2"/>
+        </w:numPr>
+        <w:spacing w:after="60"/>
+      </w:pPr>
+      <w:r>
+        <w:rPr>
+          <w:rFonts w:ascii="Calibri" w:cs="Calibri" w:eastAsia="Microsoft YaHei" w:hAnsi="Calibri"/>
+          <w:b/>
+          <w:bCs/>
+        </w:rPr>
+        <w:t xml:space="preserve">手工记录，不借助自动化工具【Claude 新增，待作者和两位筛选员确认；不同意可删】：</w:t>
+      </w:r>
+      <w:r>
+        <w:rPr>
+          <w:rFonts w:ascii="Calibri" w:cs="Calibri" w:eastAsia="Microsoft YaHei" w:hAnsi="Calibri"/>
+        </w:rPr>
+        <w:t xml:space="preserve"> 每一篇全文由筛选员自己阅读后手工填写 FT_log；不使用 AI 工具（包括聊天机器人和编程助手）来判断或代填，也不使用宏、脚本、自动点击程序或浏览器扩展来录入。这与标题摘要阶段第 12 节的规则一致，只是把它写进了全文阶段。需要翻译一篇外文全文时，只能把它当作阅读辅助，判断仍由筛选员本人做出，并在 </w:t>
+      </w:r>
+      <w:r>
+        <w:rPr>
+          <w:rFonts w:ascii="Consolas" w:cs="Consolas" w:eastAsia="Microsoft YaHei" w:hAnsi="Consolas"/>
+          <w:sz w:val="19"/>
+          <w:szCs w:val="19"/>
+          <w:shd w:fill="EEEEEE" w:val="clear"/>
+        </w:rPr>
+        <w:t xml:space="preserve">note</w:t>
+      </w:r>
+      <w:r>
+        <w:rPr>
+          <w:rFonts w:ascii="Calibri" w:cs="Calibri" w:eastAsia="Microsoft YaHei" w:hAnsi="Calibri"/>
+        </w:rPr>
+        <w:t xml:space="preserve"> 列写明用了翻译。</w:t>
       </w:r>
     </w:p>
     <w:p>
@@ -6801,6 +6840,140 @@
           <w:b/>
           <w:bCs/>
         </w:rPr>
+        <w:t xml:space="preserve">已生成预填 WS 编号的空白 FT_log（2026 年 10 月 18 日）：</w:t>
+      </w:r>
+      <w:r>
+        <w:rPr>
+          <w:rFonts w:ascii="Calibri" w:cs="Calibri" w:eastAsia="Microsoft YaHei" w:hAnsi="Calibri"/>
+        </w:rPr>
+        <w:t xml:space="preserve"> </w:t>
+      </w:r>
+      <w:r>
+        <w:rPr>
+          <w:rFonts w:ascii="Consolas" w:cs="Consolas" w:eastAsia="Microsoft YaHei" w:hAnsi="Consolas"/>
+          <w:sz w:val="19"/>
+          <w:szCs w:val="19"/>
+          <w:shd w:fill="EEEEEE" w:val="clear"/>
+        </w:rPr>
+        <w:t xml:space="preserve">search/screening/fulltext/calibration_workbooks/FT_cal_R1_blank.xlsx</w:t>
+      </w:r>
+      <w:r>
+        <w:rPr>
+          <w:rFonts w:ascii="Calibri" w:cs="Calibri" w:eastAsia="Microsoft YaHei" w:hAnsi="Calibri"/>
+        </w:rPr>
+        <w:t xml:space="preserve">（舒俊）和 </w:t>
+      </w:r>
+      <w:r>
+        <w:rPr>
+          <w:rFonts w:ascii="Consolas" w:cs="Consolas" w:eastAsia="Microsoft YaHei" w:hAnsi="Consolas"/>
+          <w:sz w:val="19"/>
+          <w:szCs w:val="19"/>
+          <w:shd w:fill="EEEEEE" w:val="clear"/>
+        </w:rPr>
+        <w:t xml:space="preserve">FT_cal_R2_blank.xlsx</w:t>
+      </w:r>
+      <w:r>
+        <w:rPr>
+          <w:rFonts w:ascii="Calibri" w:cs="Calibri" w:eastAsia="Microsoft YaHei" w:hAnsi="Calibri"/>
+        </w:rPr>
+        <w:t xml:space="preserve">（卞宏强）。每份只含 README、FT_log、FT_time_log、Calibration_list（那 20 篇的清单）和 Lists 五张表；FT_log 前 20 行已预填 ws_id、引文（第一作者姓氏加年份）、语种、筛选员（R1 或 R2，灰色），其余各列都是空的，没有任何决定，也不含分层标记。各自另存为 </w:t>
+      </w:r>
+      <w:r>
+        <w:rPr>
+          <w:rFonts w:ascii="Consolas" w:cs="Consolas" w:eastAsia="Microsoft YaHei" w:hAnsi="Consolas"/>
+          <w:sz w:val="19"/>
+          <w:szCs w:val="19"/>
+          <w:shd w:fill="EEEEEE" w:val="clear"/>
+        </w:rPr>
+        <w:t xml:space="preserve">FT_cal_R1.xlsx</w:t>
+      </w:r>
+      <w:r>
+        <w:rPr>
+          <w:rFonts w:ascii="Calibri" w:cs="Calibri" w:eastAsia="Microsoft YaHei" w:hAnsi="Calibri"/>
+        </w:rPr>
+        <w:t xml:space="preserve"> / </w:t>
+      </w:r>
+      <w:r>
+        <w:rPr>
+          <w:rFonts w:ascii="Consolas" w:cs="Consolas" w:eastAsia="Microsoft YaHei" w:hAnsi="Consolas"/>
+          <w:sz w:val="19"/>
+          <w:szCs w:val="19"/>
+          <w:shd w:fill="EEEEEE" w:val="clear"/>
+        </w:rPr>
+        <w:t xml:space="preserve">FT_cal_R2.xlsx</w:t>
+      </w:r>
+      <w:r>
+        <w:rPr>
+          <w:rFonts w:ascii="Calibri" w:cs="Calibri" w:eastAsia="Microsoft YaHei" w:hAnsi="Calibri"/>
+        </w:rPr>
+        <w:t xml:space="preserve"> 后填写，不要改预填的前四列，也不要改行的顺序；校准用的文件和正式筛选的 </w:t>
+      </w:r>
+      <w:r>
+        <w:rPr>
+          <w:rFonts w:ascii="Consolas" w:cs="Consolas" w:eastAsia="Microsoft YaHei" w:hAnsi="Consolas"/>
+          <w:sz w:val="19"/>
+          <w:szCs w:val="19"/>
+          <w:shd w:fill="EEEEEE" w:val="clear"/>
+        </w:rPr>
+        <w:t xml:space="preserve">FT_R1.xlsx</w:t>
+      </w:r>
+      <w:r>
+        <w:rPr>
+          <w:rFonts w:ascii="Calibri" w:cs="Calibri" w:eastAsia="Microsoft YaHei" w:hAnsi="Calibri"/>
+        </w:rPr>
+        <w:t xml:space="preserve"> / </w:t>
+      </w:r>
+      <w:r>
+        <w:rPr>
+          <w:rFonts w:ascii="Consolas" w:cs="Consolas" w:eastAsia="Microsoft YaHei" w:hAnsi="Consolas"/>
+          <w:sz w:val="19"/>
+          <w:szCs w:val="19"/>
+          <w:shd w:fill="EEEEEE" w:val="clear"/>
+        </w:rPr>
+        <w:t xml:space="preserve">FT_R2.xlsx</w:t>
+      </w:r>
+      <w:r>
+        <w:rPr>
+          <w:rFonts w:ascii="Calibri" w:cs="Calibri" w:eastAsia="Microsoft YaHei" w:hAnsi="Calibri"/>
+        </w:rPr>
+        <w:t xml:space="preserve"> 分开。填完后用 </w:t>
+      </w:r>
+      <w:r>
+        <w:rPr>
+          <w:rFonts w:ascii="Consolas" w:cs="Consolas" w:eastAsia="Microsoft YaHei" w:hAnsi="Consolas"/>
+          <w:sz w:val="19"/>
+          <w:szCs w:val="19"/>
+          <w:shd w:fill="EEEEEE" w:val="clear"/>
+        </w:rPr>
+        <w:t xml:space="preserve">compare_fulltext_logs.py check</w:t>
+      </w:r>
+      <w:r>
+        <w:rPr>
+          <w:rFonts w:ascii="Calibri" w:cs="Calibri" w:eastAsia="Microsoft YaHei" w:hAnsi="Calibri"/>
+        </w:rPr>
+        <w:t xml:space="preserve"> 检查自己的文件（预填但还没处理的行显示为“Pre-filled rows not handled yet”，不算记录），两人都完成后才用 </w:t>
+      </w:r>
+      <w:r>
+        <w:rPr>
+          <w:rFonts w:ascii="Consolas" w:cs="Consolas" w:eastAsia="Microsoft YaHei" w:hAnsi="Consolas"/>
+          <w:sz w:val="19"/>
+          <w:szCs w:val="19"/>
+          <w:shd w:fill="EEEEEE" w:val="clear"/>
+        </w:rPr>
+        <w:t xml:space="preserve">compare</w:t>
+      </w:r>
+      <w:r>
+        <w:rPr>
+          <w:rFonts w:ascii="Calibri" w:cs="Calibri" w:eastAsia="Microsoft YaHei" w:hAnsi="Calibri"/>
+        </w:rPr>
+        <w:t xml:space="preserve"> 比对。</w:t>
+      </w:r>
+      <w:r>
+        <w:rPr>
+          <w:rFonts w:ascii="Calibri" w:cs="Calibri" w:eastAsia="Microsoft YaHei" w:hAnsi="Calibri"/>
+          <w:b/>
+          <w:bCs/>
+        </w:rPr>
         <w:t xml:space="preserve">抽样已做（种子 20261018，脚本 tools/draw_ft_calibration.py，可重复）：</w:t>
       </w:r>
       <w:r>
@@ -8116,7 +8289,7 @@
         <w:sz w:val="17"/>
         <w:szCs w:val="17"/>
       </w:rPr>
-      <w:t xml:space="preserve">全文筛选指南 v2026-10-17a   |   第 </w:t>
+      <w:t xml:space="preserve">全文筛选指南 v2026-10-18a   |   第 </w:t>
     </w:r>
     <w:r>
       <w:rPr>

</xml_diff>

<commit_message>
Full-text stage: another screener must retry before reason D is confirmed; compare flags D not confirmed by both
Guide v2026-10-18c, comparison script, CLAUDE.md log.

Co-Authored-By: Claude Sonnet 5.5 <noreply@anthropic.com>
Claude-Session: https://claude.ai/code/session_01FRD7etKqYN8v2bbXeeLMRW
</commit_message>
<xml_diff>
--- a/Full-text screening guide (draft).docx
+++ b/Full-text screening guide (draft).docx
@@ -22,7 +22,7 @@
         <w:rPr>
           <w:rFonts w:ascii="Calibri" w:cs="Calibri" w:eastAsia="Microsoft YaHei" w:hAnsi="Calibri"/>
         </w:rPr>
-        <w:t xml:space="preserve">适用对象：舒俊（筛选员 1）、卞红强（筛选员 2，作者 2026 年 10 月 17 日决定）、杨俊（仲裁）。草稿日期：2026 年 10 月 11 日（v2026-10-11a）；2026 年 10 月 17 日更新为 v2026-10-17a。2026 年 10 月 18 日更新为 v2026-10-18b（第 12 节加入校准工作簿的说明；并按作者 2026 年 10 月 18 日的决定写明两条判断规则：脾脏只是被疝入胸腔或被肿块推移、作者没有诊断游走脾的报告排除（E2）；判断为拿不到全文的排除（D）。曾加入第 3 节的“手工记录”一条，作者决定删除，已删）。</w:t>
+        <w:t xml:space="preserve">适用对象：舒俊（筛选员 1）、卞红强（筛选员 2，作者 2026 年 10 月 17 日决定）、杨俊（仲裁）。草稿日期：2026 年 10 月 11 日（v2026-10-11a）；2026 年 10 月 17 日更新为 v2026-10-17a。2026 年 10 月 18 日更新为 v2026-10-18c（第 12 节加入校准工作簿的说明；并按作者 2026 年 10 月 18 日的决定写明两条判断规则：脾脏只是被疝入胸腔或被肿块推移、作者没有诊断游走脾的报告排除（E2）；判断为拿不到全文的排除（D），确认 D 之前要由另一位筛选员再试一次。曾加入第 3 节的“手工记录”一条，作者决定删除，已删）。</w:t>
       </w:r>
       <w:r>
         <w:rPr>
@@ -36,7 +36,7 @@
         <w:rPr>
           <w:rFonts w:ascii="Calibri" w:cs="Calibri" w:eastAsia="Microsoft YaHei" w:hAnsi="Calibri"/>
         </w:rPr>
-        <w:t xml:space="preserve"> 本指南只是把已注册协议（第 7、10、14 节）的纳入排除标准落成全文阶段的操作规则，不改变协议。带【建议】的是 Claude 的操作化，需要三位决定；第 13 节列出了所有待决定的事项。</w:t>
+        <w:t xml:space="preserve"> 本指南只是把已注册协议（第 7、10、14 节）的纳入排除标准落成全文阶段的操作规则，不改变协议。带【已决定】的是作者做出的决定，带【Claude 的操作化】的是 Claude 对决定的具体做法，需要三位确认；第 13 节是决定表。</w:t>
       </w:r>
     </w:p>
     <w:p>
@@ -459,7 +459,7 @@
         <w:rPr>
           <w:rFonts w:ascii="Calibri" w:cs="Calibri" w:eastAsia="Microsoft YaHei" w:hAnsi="Calibri"/>
         </w:rPr>
-        <w:t xml:space="preserve"> 取不到 → 理由 D，记下试过的途径（4.2、4.3）。</w:t>
+        <w:t xml:space="preserve"> 取不到 → 理由 D，记下试过的途径（4.2、4.3）；两人都试过、都记 D 才确认。</w:t>
       </w:r>
     </w:p>
     <w:p>
@@ -1456,21 +1456,81 @@
         <w:rPr>
           <w:rFonts w:ascii="Calibri" w:cs="Calibri" w:eastAsia="Microsoft YaHei" w:hAnsi="Calibri"/>
         </w:rPr>
-        <w:t xml:space="preserve">【建议，尚未决定】确认 D 之前，</w:t>
-      </w:r>
-      <w:r>
-        <w:rPr>
-          <w:rFonts w:ascii="Calibri" w:cs="Calibri" w:eastAsia="Microsoft YaHei" w:hAnsi="Calibri"/>
-          <w:b/>
-          <w:bCs/>
-        </w:rPr>
-        <w:t xml:space="preserve">由另一位筛选员再试一次</w:t>
-      </w:r>
-      <w:r>
-        <w:rPr>
-          <w:rFonts w:ascii="Calibri" w:cs="Calibri" w:eastAsia="Microsoft YaHei" w:hAnsi="Calibri"/>
-        </w:rPr>
-        <w:t xml:space="preserve">（D 会让这条记录退出证据，不能只靠一个人的判断）。作者 10 月 18 日只说了“拿不到就排除”，没有说是否要这一步。</w:t>
+        <w:t xml:space="preserve">【已决定，作者 2026 年 10 月 18 日】确认 D 之前，</w:t>
+      </w:r>
+      <w:r>
+        <w:rPr>
+          <w:rFonts w:ascii="Calibri" w:cs="Calibri" w:eastAsia="Microsoft YaHei" w:hAnsi="Calibri"/>
+          <w:b/>
+          <w:bCs/>
+        </w:rPr>
+        <w:t xml:space="preserve">要由另一位筛选员再试一次</w:t>
+      </w:r>
+      <w:r>
+        <w:rPr>
+          <w:rFonts w:ascii="Calibri" w:cs="Calibri" w:eastAsia="Microsoft YaHei" w:hAnsi="Calibri"/>
+        </w:rPr>
+        <w:t xml:space="preserve">（D 会让这条记录退出证据，不能只靠一个人的判断）。</w:t>
+      </w:r>
+    </w:p>
+    <w:p>
+      <w:pPr>
+        <w:pStyle w:val="ListParagraph"/>
+        <w:numPr>
+          <w:ilvl w:val="0"/>
+          <w:numId w:val="2"/>
+        </w:numPr>
+        <w:spacing w:after="60"/>
+      </w:pPr>
+      <w:r>
+        <w:rPr>
+          <w:rFonts w:ascii="Calibri" w:cs="Calibri" w:eastAsia="Microsoft YaHei" w:hAnsi="Calibri"/>
+        </w:rPr>
+        <w:t xml:space="preserve">【Claude 的操作化，待三位确认】两人本来就各自独立取全文，所以：</w:t>
+      </w:r>
+      <w:r>
+        <w:rPr>
+          <w:rFonts w:ascii="Calibri" w:cs="Calibri" w:eastAsia="Microsoft YaHei" w:hAnsi="Calibri"/>
+          <w:b/>
+          <w:bCs/>
+        </w:rPr>
+        <w:t xml:space="preserve">两人都按 4.2 试过所有途径、各自在 FT_log 记 D，才算确认 D。</w:t>
+      </w:r>
+      <w:r>
+        <w:rPr>
+          <w:rFonts w:ascii="Calibri" w:cs="Calibri" w:eastAsia="Microsoft YaHei" w:hAnsi="Calibri"/>
+        </w:rPr>
+        <w:t xml:space="preserve"> 只有一人记 D、另一人取到了全文并作了决定的，</w:t>
+      </w:r>
+      <w:r>
+        <w:rPr>
+          <w:rFonts w:ascii="Consolas" w:cs="Consolas" w:eastAsia="Microsoft YaHei" w:hAnsi="Consolas"/>
+          <w:sz w:val="19"/>
+          <w:szCs w:val="19"/>
+          <w:shd w:fill="EEEEEE" w:val="clear"/>
+        </w:rPr>
+        <w:t xml:space="preserve">compare</w:t>
+      </w:r>
+      <w:r>
+        <w:rPr>
+          <w:rFonts w:ascii="Calibri" w:cs="Calibri" w:eastAsia="Microsoft YaHei" w:hAnsi="Calibri"/>
+        </w:rPr>
+        <w:t xml:space="preserve"> 把它列为分歧（“D not confirmed by both”，或 Include 对 Exclude 等）；两人都完成之后，由取到全文的人把全文交给另一位，再按第 10 节解决。第二位没有真正试过所有途径就记 D，不算复核（</w:t>
+      </w:r>
+      <w:r>
+        <w:rPr>
+          <w:rFonts w:ascii="Consolas" w:cs="Consolas" w:eastAsia="Microsoft YaHei" w:hAnsi="Consolas"/>
+          <w:sz w:val="19"/>
+          <w:szCs w:val="19"/>
+          <w:shd w:fill="EEEEEE" w:val="clear"/>
+        </w:rPr>
+        <w:t xml:space="preserve">routes_tried</w:t>
+      </w:r>
+      <w:r>
+        <w:rPr>
+          <w:rFonts w:ascii="Calibri" w:cs="Calibri" w:eastAsia="Microsoft YaHei" w:hAnsi="Calibri"/>
+        </w:rPr>
+        <w:t xml:space="preserve"> 要如实填）。</w:t>
       </w:r>
     </w:p>
     <w:p>
@@ -4059,7 +4119,7 @@
                 <w:sz w:val="20"/>
                 <w:szCs w:val="20"/>
               </w:rPr>
-              <w:t xml:space="preserve">，排除（另一位是否要再试一次，见 4.3，尚未决定）</w:t>
+              <w:t xml:space="preserve">，排除；两人都试过、都记 D 才确认（4.3）</w:t>
             </w:r>
           </w:p>
         </w:tc>
@@ -6388,6 +6448,20 @@
         </w:rPr>
         <w:t xml:space="preserve"> 不算分歧，按第 5 节的顺序取第一条适用的理由，在记录里写明。</w:t>
       </w:r>
+      <w:r>
+        <w:rPr>
+          <w:rFonts w:ascii="Calibri" w:cs="Calibri" w:eastAsia="Microsoft YaHei" w:hAnsi="Calibri"/>
+          <w:b/>
+          <w:bCs/>
+        </w:rPr>
+        <w:t xml:space="preserve">例外（2026 年 10 月 18 日）：</w:t>
+      </w:r>
+      <w:r>
+        <w:rPr>
+          <w:rFonts w:ascii="Calibri" w:cs="Calibri" w:eastAsia="Microsoft YaHei" w:hAnsi="Calibri"/>
+        </w:rPr>
+        <w:t xml:space="preserve"> 一人记 D、另一人记别的理由，说明有人取到了全文，D 没有被两人共同确认，按分歧处理（4.3）。</w:t>
+      </w:r>
     </w:p>
     <w:p>
       <w:pPr>
@@ -6556,7 +6630,7 @@
           <w:b/>
           <w:bCs/>
         </w:rPr>
-        <w:t xml:space="preserve">脚本把 Include 对 Pending IPD 也当作分歧</w:t>
+        <w:t xml:space="preserve">脚本把一人记 D、另一人记别的 Exclude 理由当作分歧（“D not confirmed by both”，4.3），也把 Include 对 Pending IPD 当作分歧</w:t>
       </w:r>
       <w:r>
         <w:rPr>
@@ -8162,7 +8236,7 @@
         <w:rPr>
           <w:rFonts w:ascii="Calibri" w:cs="Calibri" w:eastAsia="Microsoft YaHei" w:hAnsi="Calibri"/>
         </w:rPr>
-        <w:t xml:space="preserve"> (1) 脾脏只是被疝入胸腔的膈疝内容物，或被肿块推移，作者没有诊断游走脾、也没有描述脾蒂活动度异常的报告，排除，理由 E2（6.3、第 7 节）。作者诊断了游走脾、同时伴有膈疝或膈膨升的报告不在此列，仍是 Include（亚组）。(2) 判断为拿不到全文的，排除，理由 D（4.3）。另一位筛选员是否要在确认 D 之前再试一次，作者没有说，仍是 4.3 里的一条【建议】。此外，作者决定不要曾加入第 3 节的“手工记录，不借助自动化工具”一条，已删除；校准工作簿 README 里同样的一句也已删除。</w:t>
+        <w:t xml:space="preserve"> (1) 脾脏只是被疝入胸腔的膈疝内容物，或被肿块推移，作者没有诊断游走脾、也没有描述脾蒂活动度异常的报告，排除，理由 E2（6.3、第 7 节）。作者诊断了游走脾、同时伴有膈疝或膈膨升的报告不在此列，仍是 Include（亚组）。(2) 判断为拿不到全文的，排除，理由 D；确认 D 之前，要由另一位筛选员再试一次（4.3）。具体做法（两人都试过、都记 D 才确认；只有一人记 D 按分歧处理）是 Claude 的操作化，待三位确认。此外，作者决定不要曾加入第 3 节的“手工记录，不借助自动化工具”一条，已删除；校准工作簿 README 里同样的一句也已删除。</w:t>
       </w:r>
     </w:p>
     <w:p>
@@ -8354,7 +8428,7 @@
         <w:sz w:val="17"/>
         <w:szCs w:val="17"/>
       </w:rPr>
-      <w:t xml:space="preserve">全文筛选指南 v2026-10-18b   |   第 </w:t>
+      <w:t xml:space="preserve">全文筛选指南 v2026-10-18c   |   第 </w:t>
     </w:r>
     <w:r>
       <w:rPr>

</xml_diff>

<commit_message>
Full-text stage: finalize script (final decisions, lists, PRISMA counts); guides and manual updated to protocol v1.5
Co-Authored-By: Claude Sonnet 5.5 <noreply@anthropic.com>
Claude-Session: https://claude.ai/code/session_01FRD7etKqYN8v2bbXeeLMRW
</commit_message>
<xml_diff>
--- a/Full-text screening guide (draft).docx
+++ b/Full-text screening guide (draft).docx
@@ -11,7 +11,7 @@
         <w:rPr>
           <w:rFonts w:ascii="Calibri" w:cs="Calibri" w:eastAsia="Microsoft YaHei" w:hAnsi="Calibri"/>
         </w:rPr>
-        <w:t xml:space="preserve">全文筛选指南（草稿）— 儿童游走脾系统综述（PROSPERO CRD420261520329，协议 v1.4）</w:t>
+        <w:t xml:space="preserve">全文筛选指南（草稿）— 儿童游走脾系统综述（PROSPERO CRD420261520329，协议 v1.5）</w:t>
       </w:r>
     </w:p>
     <w:p>
@@ -22,54 +22,7 @@
         <w:rPr>
           <w:rFonts w:ascii="Calibri" w:cs="Calibri" w:eastAsia="Microsoft YaHei" w:hAnsi="Calibri"/>
         </w:rPr>
-        <w:t xml:space="preserve">适用对象：舒俊（筛选员 1）、卞红强（筛选员 2，作者 2026 年 10 月 17 日决定）、杨俊（仲裁）。草稿日期：2026 年 10 月 11 日（v2026-10-11a）；2026 年 10 月 17 日更新为 v2026-10-17a。2026 年 10 月 18 日更新为 v2026-10-18c（第 12 节加入校准工作簿的说明；并按作者 2026 年 10 月 18 日的决定写明两条判断规则：脾脏只是被疝入胸腔或被肿块推移、作者没有诊断游走脾的报告排除（E2）；判断为拿不到全文的排除（D），确认 D 之前要由另一位筛选员再试一次。曾加入第 3 节的“手工记录”一条，作者决定删除，已删）。</w:t>
-      </w:r>
-      <w:r>
-        <w:rPr>
-          <w:rFonts w:ascii="Calibri" w:cs="Calibri" w:eastAsia="Microsoft YaHei" w:hAnsi="Calibri"/>
-          <w:b/>
-          <w:bCs/>
-        </w:rPr>
-        <w:t xml:space="preserve">状态：作者已于 2026 年 10 月 17 日决定 D1–D8（第 13 节）。2026 年 10 月 18 日作者转告：杨俊和卞红强已确认 D1–D8、2000 年规则（理由 Y）和“Include 对 Pending IPD 算分歧”这一读法，这些部分生效。确认的方式和日期没有说明，一页版决定表（Full-text screening - decision sheet D1-D8.docx）上的签字栏没有收到。10 月 18 日的两条补充决定（第 13 节末）只由作者做出，杨俊和卞红强是否已知道没有说明。</w:t>
-      </w:r>
-      <w:r>
-        <w:rPr>
-          <w:rFonts w:ascii="Calibri" w:cs="Calibri" w:eastAsia="Microsoft YaHei" w:hAnsi="Calibri"/>
-        </w:rPr>
-        <w:t xml:space="preserve"> 本指南只是把已注册协议（第 7、10、14 节）的纳入排除标准落成全文阶段的操作规则，不改变协议。带【已决定】的是作者做出的决定，带【Claude 的操作化】的是 Claude 对决定的具体做法，需要三位确认；第 13 节是决定表。</w:t>
-      </w:r>
-    </w:p>
-    <w:p>
-      <w:pPr>
-        <w:spacing w:after="120"/>
-      </w:pPr>
-      <w:r>
-        <w:rPr>
-          <w:rFonts w:ascii="Calibri" w:cs="Calibri" w:eastAsia="Microsoft YaHei" w:hAnsi="Calibri"/>
-          <w:b/>
-          <w:bCs/>
-        </w:rPr>
-        <w:t xml:space="preserve">v2026-10-17a 的改动：</w:t>
-      </w:r>
-      <w:r>
-        <w:rPr>
-          <w:rFonts w:ascii="Calibri" w:cs="Calibri" w:eastAsia="Microsoft YaHei" w:hAnsi="Calibri"/>
-        </w:rPr>
-        <w:t xml:space="preserve"> (1) </w:t>
-      </w:r>
-      <w:r>
-        <w:rPr>
-          <w:rFonts w:ascii="Calibri" w:cs="Calibri" w:eastAsia="Microsoft YaHei" w:hAnsi="Calibri"/>
-          <w:b/>
-          <w:bCs/>
-        </w:rPr>
-        <w:t xml:space="preserve">新增日期规则：2000 年以前发表的报告不取全文</w:t>
-      </w:r>
-      <w:r>
-        <w:rPr>
-          <w:rFonts w:ascii="Calibri" w:cs="Calibri" w:eastAsia="Microsoft YaHei" w:hAnsi="Calibri"/>
-        </w:rPr>
-        <w:t xml:space="preserve">（作者 2026 年 10 月 17 日决定；理由码 </w:t>
+        <w:t xml:space="preserve">适用对象：舒俊（筛选员 1）、卞红强（筛选员 2，作者 2026 年 10 月 17 日决定）、杨俊（仲裁）。草稿日期：2026 年 10 月 11 日（v2026-10-11a）；2026 年 10 月 17 日更新为 v2026-10-17a。2026 年 10 月 18 日更新为 v2026-10-18d（协议版本号改为 v1.5；第 2 节第 7 步和第 10 节加入汇总脚本 </w:t>
       </w:r>
       <w:r>
         <w:rPr>
@@ -78,6 +31,68 @@
           <w:szCs w:val="19"/>
           <w:shd w:fill="EEEEEE" w:val="clear"/>
         </w:rPr>
+        <w:t xml:space="preserve">tools/finalize_fulltext.py</w:t>
+      </w:r>
+      <w:r>
+        <w:rPr>
+          <w:rFonts w:ascii="Calibri" w:cs="Calibri" w:eastAsia="Microsoft YaHei" w:hAnsi="Calibri"/>
+        </w:rPr>
+        <w:t xml:space="preserve">，没有改任何判断规则；第 12 节加入校准工作簿的说明；并按作者 2026 年 10 月 18 日的决定写明两条判断规则：脾脏只是被疝入胸腔或被肿块推移、作者没有诊断游走脾的报告排除（E2）；判断为拿不到全文的排除（D），确认 D 之前要由另一位筛选员再试一次。曾加入第 3 节的“手工记录”一条，作者决定删除，已删）。</w:t>
+      </w:r>
+      <w:r>
+        <w:rPr>
+          <w:rFonts w:ascii="Calibri" w:cs="Calibri" w:eastAsia="Microsoft YaHei" w:hAnsi="Calibri"/>
+          <w:b/>
+          <w:bCs/>
+        </w:rPr>
+        <w:t xml:space="preserve">状态：作者已于 2026 年 10 月 17 日决定 D1–D8（第 13 节）。2026 年 10 月 18 日作者转告：杨俊和卞红强已确认 D1–D8、2000 年规则（理由 Y）和“Include 对 Pending IPD 算分歧”这一读法，这些部分生效。确认的方式和日期没有说明，一页版决定表（Full-text screening - decision sheet D1-D8.docx）上的签字栏没有收到。10 月 18 日的两条补充决定（第 13 节末）只由作者做出，杨俊和卞红强是否已知道没有说明。</w:t>
+      </w:r>
+      <w:r>
+        <w:rPr>
+          <w:rFonts w:ascii="Calibri" w:cs="Calibri" w:eastAsia="Microsoft YaHei" w:hAnsi="Calibri"/>
+        </w:rPr>
+        <w:t xml:space="preserve"> 本指南只是把已注册协议（第 7、10、14 节）的纳入排除标准落成全文阶段的操作规则，不改变协议。带【已决定】的是作者做出的决定，带【Claude 的操作化】的是 Claude 对决定的具体做法，需要三位确认；第 13 节是决定表。</w:t>
+      </w:r>
+    </w:p>
+    <w:p>
+      <w:pPr>
+        <w:spacing w:after="120"/>
+      </w:pPr>
+      <w:r>
+        <w:rPr>
+          <w:rFonts w:ascii="Calibri" w:cs="Calibri" w:eastAsia="Microsoft YaHei" w:hAnsi="Calibri"/>
+          <w:b/>
+          <w:bCs/>
+        </w:rPr>
+        <w:t xml:space="preserve">v2026-10-17a 的改动：</w:t>
+      </w:r>
+      <w:r>
+        <w:rPr>
+          <w:rFonts w:ascii="Calibri" w:cs="Calibri" w:eastAsia="Microsoft YaHei" w:hAnsi="Calibri"/>
+        </w:rPr>
+        <w:t xml:space="preserve"> (1) </w:t>
+      </w:r>
+      <w:r>
+        <w:rPr>
+          <w:rFonts w:ascii="Calibri" w:cs="Calibri" w:eastAsia="Microsoft YaHei" w:hAnsi="Calibri"/>
+          <w:b/>
+          <w:bCs/>
+        </w:rPr>
+        <w:t xml:space="preserve">新增日期规则：2000 年以前发表的报告不取全文</w:t>
+      </w:r>
+      <w:r>
+        <w:rPr>
+          <w:rFonts w:ascii="Calibri" w:cs="Calibri" w:eastAsia="Microsoft YaHei" w:hAnsi="Calibri"/>
+        </w:rPr>
+        <w:t xml:space="preserve">（作者 2026 年 10 月 17 日决定；理由码 </w:t>
+      </w:r>
+      <w:r>
+        <w:rPr>
+          <w:rFonts w:ascii="Consolas" w:cs="Consolas" w:eastAsia="Microsoft YaHei" w:hAnsi="Consolas"/>
+          <w:sz w:val="19"/>
+          <w:szCs w:val="19"/>
+          <w:shd w:fill="EEEEEE" w:val="clear"/>
+        </w:rPr>
         <w:t xml:space="preserve">Y</w:t>
       </w:r>
       <w:r>
@@ -531,7 +546,22 @@
         <w:rPr>
           <w:rFonts w:ascii="Calibri" w:cs="Calibri" w:eastAsia="Microsoft YaHei" w:hAnsi="Calibri"/>
         </w:rPr>
-        <w:t xml:space="preserve">最终名单 → 数据提取（提取工作簿）。</w:t>
+        <w:t xml:space="preserve">分歧解决后汇总最终名单和 PRISMA 数字：</w:t>
+      </w:r>
+      <w:r>
+        <w:rPr>
+          <w:rFonts w:ascii="Consolas" w:cs="Consolas" w:eastAsia="Microsoft YaHei" w:hAnsi="Consolas"/>
+          <w:sz w:val="19"/>
+          <w:szCs w:val="19"/>
+          <w:shd w:fill="EEEEEE" w:val="clear"/>
+        </w:rPr>
+        <w:t xml:space="preserve">tools/finalize_fulltext.py</w:t>
+      </w:r>
+      <w:r>
+        <w:rPr>
+          <w:rFonts w:ascii="Calibri" w:cs="Calibri" w:eastAsia="Microsoft YaHei" w:hAnsi="Calibri"/>
+        </w:rPr>
+        <w:t xml:space="preserve">（第 10 节）→ 数据提取（提取工作簿）。</w:t>
       </w:r>
     </w:p>
     <w:p>
@@ -6708,6 +6738,263 @@
           <w:b/>
           <w:bCs/>
         </w:rPr>
+        <w:t xml:space="preserve">汇总（脚本 tools/finalize_fulltext.py，2026 年 10 月 18 日）：</w:t>
+      </w:r>
+      <w:r>
+        <w:rPr>
+          <w:rFonts w:ascii="Calibri" w:cs="Calibri" w:eastAsia="Microsoft YaHei" w:hAnsi="Calibri"/>
+        </w:rPr>
+        <w:t xml:space="preserve"> 分歧清单填好之后运行 </w:t>
+      </w:r>
+      <w:r>
+        <w:rPr>
+          <w:rFonts w:ascii="Consolas" w:cs="Consolas" w:eastAsia="Microsoft YaHei" w:hAnsi="Consolas"/>
+          <w:sz w:val="19"/>
+          <w:szCs w:val="19"/>
+          <w:shd w:fill="EEEEEE" w:val="clear"/>
+        </w:rPr>
+        <w:t xml:space="preserve">python3 -I tools/finalize_fulltext.py FT_R1.xlsx FT_R2.xlsx --conflicts &lt;填好的分歧清单.csv&gt; [--ipd &lt;提取工作簿.xlsx&gt;] [--out &lt;目录&gt;]</w:t>
+      </w:r>
+      <w:r>
+        <w:rPr>
+          <w:rFonts w:ascii="Calibri" w:cs="Calibri" w:eastAsia="Microsoft YaHei" w:hAnsi="Calibri"/>
+        </w:rPr>
+        <w:t xml:space="preserve">。规则：两人决定相同 → 取该决定；两人都 Exclude 而理由不同 → 按 D3 顺序取第一条适用的理由；分歧 → 取分歧清单里的 </w:t>
+      </w:r>
+      <w:r>
+        <w:rPr>
+          <w:rFonts w:ascii="Consolas" w:cs="Consolas" w:eastAsia="Microsoft YaHei" w:hAnsi="Consolas"/>
+          <w:sz w:val="19"/>
+          <w:szCs w:val="19"/>
+          <w:shd w:fill="EEEEEE" w:val="clear"/>
+        </w:rPr>
+        <w:t xml:space="preserve">final_decision</w:t>
+      </w:r>
+      <w:r>
+        <w:rPr>
+          <w:rFonts w:ascii="Calibri" w:cs="Calibri" w:eastAsia="Microsoft YaHei" w:hAnsi="Calibri"/>
+        </w:rPr>
+        <w:t xml:space="preserve">，该格为空时依次取 </w:t>
+      </w:r>
+      <w:r>
+        <w:rPr>
+          <w:rFonts w:ascii="Consolas" w:cs="Consolas" w:eastAsia="Microsoft YaHei" w:hAnsi="Consolas"/>
+          <w:sz w:val="19"/>
+          <w:szCs w:val="19"/>
+          <w:shd w:fill="EEEEEE" w:val="clear"/>
+        </w:rPr>
+        <w:t xml:space="preserve">adjudicator_decision</w:t>
+      </w:r>
+      <w:r>
+        <w:rPr>
+          <w:rFonts w:ascii="Calibri" w:cs="Calibri" w:eastAsia="Microsoft YaHei" w:hAnsi="Calibri"/>
+        </w:rPr>
+        <w:t xml:space="preserve">、</w:t>
+      </w:r>
+      <w:r>
+        <w:rPr>
+          <w:rFonts w:ascii="Consolas" w:cs="Consolas" w:eastAsia="Microsoft YaHei" w:hAnsi="Consolas"/>
+          <w:sz w:val="19"/>
+          <w:szCs w:val="19"/>
+          <w:shd w:fill="EEEEEE" w:val="clear"/>
+        </w:rPr>
+        <w:t xml:space="preserve">discussion_agreed_decision</w:t>
+      </w:r>
+      <w:r>
+        <w:rPr>
+          <w:rFonts w:ascii="Calibri" w:cs="Calibri" w:eastAsia="Microsoft YaHei" w:hAnsi="Calibri"/>
+        </w:rPr>
+        <w:t xml:space="preserve">（用了后两者会给出提示，</w:t>
+      </w:r>
+      <w:r>
+        <w:rPr>
+          <w:rFonts w:ascii="Consolas" w:cs="Consolas" w:eastAsia="Microsoft YaHei" w:hAnsi="Consolas"/>
+          <w:sz w:val="19"/>
+          <w:szCs w:val="19"/>
+          <w:shd w:fill="EEEEEE" w:val="clear"/>
+        </w:rPr>
+        <w:t xml:space="preserve">resolved_by</w:t>
+      </w:r>
+      <w:r>
+        <w:rPr>
+          <w:rFonts w:ascii="Calibri" w:cs="Calibri" w:eastAsia="Microsoft YaHei" w:hAnsi="Calibri"/>
+        </w:rPr>
+        <w:t xml:space="preserve"> 列写明来源）；没有填、只有一人处理、或还有未处理的待取全文记录 → 列入 </w:t>
+      </w:r>
+      <w:r>
+        <w:rPr>
+          <w:rFonts w:ascii="Consolas" w:cs="Consolas" w:eastAsia="Microsoft YaHei" w:hAnsi="Consolas"/>
+          <w:sz w:val="19"/>
+          <w:szCs w:val="19"/>
+          <w:shd w:fill="EEEEEE" w:val="clear"/>
+        </w:rPr>
+        <w:t xml:space="preserve">fulltext_unresolved.csv</w:t>
+      </w:r>
+      <w:r>
+        <w:rPr>
+          <w:rFonts w:ascii="Calibri" w:cs="Calibri" w:eastAsia="Microsoft YaHei" w:hAnsi="Calibri"/>
+        </w:rPr>
+        <w:t xml:space="preserve">，输出文件改名为 </w:t>
+      </w:r>
+      <w:r>
+        <w:rPr>
+          <w:rFonts w:ascii="Consolas" w:cs="Consolas" w:eastAsia="Microsoft YaHei" w:hAnsi="Consolas"/>
+          <w:sz w:val="19"/>
+          <w:szCs w:val="19"/>
+          <w:shd w:fill="EEEEEE" w:val="clear"/>
+        </w:rPr>
+        <w:t xml:space="preserve">fulltext_provisional_list.csv</w:t>
+      </w:r>
+      <w:r>
+        <w:rPr>
+          <w:rFonts w:ascii="Calibri" w:cs="Calibri" w:eastAsia="Microsoft YaHei" w:hAnsi="Calibri"/>
+        </w:rPr>
+        <w:t xml:space="preserve">，PRISMA 数字标“PROVISIONAL”，不能引用；全部解决后才写 </w:t>
+      </w:r>
+      <w:r>
+        <w:rPr>
+          <w:rFonts w:ascii="Consolas" w:cs="Consolas" w:eastAsia="Microsoft YaHei" w:hAnsi="Consolas"/>
+          <w:sz w:val="19"/>
+          <w:szCs w:val="19"/>
+          <w:shd w:fill="EEEEEE" w:val="clear"/>
+        </w:rPr>
+        <w:t xml:space="preserve">fulltext_final_list.csv</w:t>
+      </w:r>
+      <w:r>
+        <w:rPr>
+          <w:rFonts w:ascii="Calibri" w:cs="Calibri" w:eastAsia="Microsoft YaHei" w:hAnsi="Calibri"/>
+        </w:rPr>
+        <w:t xml:space="preserve">。加 </w:t>
+      </w:r>
+      <w:r>
+        <w:rPr>
+          <w:rFonts w:ascii="Consolas" w:cs="Consolas" w:eastAsia="Microsoft YaHei" w:hAnsi="Consolas"/>
+          <w:sz w:val="19"/>
+          <w:szCs w:val="19"/>
+          <w:shd w:fill="EEEEEE" w:val="clear"/>
+        </w:rPr>
+        <w:t xml:space="preserve">--ipd</w:t>
+      </w:r>
+      <w:r>
+        <w:rPr>
+          <w:rFonts w:ascii="Calibri" w:cs="Calibri" w:eastAsia="Microsoft YaHei" w:hAnsi="Calibri"/>
+        </w:rPr>
+        <w:t xml:space="preserve"> 时，IPD_requests 表的 </w:t>
+      </w:r>
+      <w:r>
+        <w:rPr>
+          <w:rFonts w:ascii="Consolas" w:cs="Consolas" w:eastAsia="Microsoft YaHei" w:hAnsi="Consolas"/>
+          <w:sz w:val="19"/>
+          <w:szCs w:val="19"/>
+          <w:shd w:fill="EEEEEE" w:val="clear"/>
+        </w:rPr>
+        <w:t xml:space="preserve">final_status</w:t>
+      </w:r>
+      <w:r>
+        <w:rPr>
+          <w:rFonts w:ascii="Calibri" w:cs="Calibri" w:eastAsia="Microsoft YaHei" w:hAnsi="Calibri"/>
+        </w:rPr>
+        <w:t xml:space="preserve"> 决定 Pending IPD 的结果：</w:t>
+      </w:r>
+      <w:r>
+        <w:rPr>
+          <w:rFonts w:ascii="Consolas" w:cs="Consolas" w:eastAsia="Microsoft YaHei" w:hAnsi="Consolas"/>
+          <w:sz w:val="19"/>
+          <w:szCs w:val="19"/>
+          <w:shd w:fill="EEEEEE" w:val="clear"/>
+        </w:rPr>
+        <w:t xml:space="preserve">Included with IPD</w:t>
+      </w:r>
+      <w:r>
+        <w:rPr>
+          <w:rFonts w:ascii="Calibri" w:cs="Calibri" w:eastAsia="Microsoft YaHei" w:hAnsi="Calibri"/>
+        </w:rPr>
+        <w:t xml:space="preserve"> → Include，</w:t>
+      </w:r>
+      <w:r>
+        <w:rPr>
+          <w:rFonts w:ascii="Consolas" w:cs="Consolas" w:eastAsia="Microsoft YaHei" w:hAnsi="Consolas"/>
+          <w:sz w:val="19"/>
+          <w:szCs w:val="19"/>
+          <w:shd w:fill="EEEEEE" w:val="clear"/>
+        </w:rPr>
+        <w:t xml:space="preserve">Narrative only</w:t>
+      </w:r>
+      <w:r>
+        <w:rPr>
+          <w:rFonts w:ascii="Calibri" w:cs="Calibri" w:eastAsia="Microsoft YaHei" w:hAnsi="Calibri"/>
+        </w:rPr>
+        <w:t xml:space="preserve"> → Exclude（A），</w:t>
+      </w:r>
+      <w:r>
+        <w:rPr>
+          <w:rFonts w:ascii="Consolas" w:cs="Consolas" w:eastAsia="Microsoft YaHei" w:hAnsi="Consolas"/>
+          <w:sz w:val="19"/>
+          <w:szCs w:val="19"/>
+          <w:shd w:fill="EEEEEE" w:val="clear"/>
+        </w:rPr>
+        <w:t xml:space="preserve">Not eligible after check</w:t>
+      </w:r>
+      <w:r>
+        <w:rPr>
+          <w:rFonts w:ascii="Calibri" w:cs="Calibri" w:eastAsia="Microsoft YaHei" w:hAnsi="Calibri"/>
+        </w:rPr>
+        <w:t xml:space="preserve"> → 未解决（要由筛选员定理由），</w:t>
+      </w:r>
+      <w:r>
+        <w:rPr>
+          <w:rFonts w:ascii="Consolas" w:cs="Consolas" w:eastAsia="Microsoft YaHei" w:hAnsi="Consolas"/>
+          <w:sz w:val="19"/>
+          <w:szCs w:val="19"/>
+          <w:shd w:fill="EEEEEE" w:val="clear"/>
+        </w:rPr>
+        <w:t xml:space="preserve">Pending</w:t>
+      </w:r>
+      <w:r>
+        <w:rPr>
+          <w:rFonts w:ascii="Calibri" w:cs="Calibri" w:eastAsia="Microsoft YaHei" w:hAnsi="Calibri"/>
+        </w:rPr>
+        <w:t xml:space="preserve"> 或没有这一行 → 仍是 Pending IPD。输出：最终名单、纳入名单（</w:t>
+      </w:r>
+      <w:r>
+        <w:rPr>
+          <w:rFonts w:ascii="Consolas" w:cs="Consolas" w:eastAsia="Microsoft YaHei" w:hAnsi="Consolas"/>
+          <w:sz w:val="19"/>
+          <w:szCs w:val="19"/>
+          <w:shd w:fill="EEEEEE" w:val="clear"/>
+        </w:rPr>
+        <w:t xml:space="preserve">fulltext_included.csv</w:t>
+      </w:r>
+      <w:r>
+        <w:rPr>
+          <w:rFonts w:ascii="Calibri" w:cs="Calibri" w:eastAsia="Microsoft YaHei" w:hAnsi="Calibri"/>
+        </w:rPr>
+        <w:t xml:space="preserve">，带两人各自的 ws_basis、儿童数、重复链接，以及它们是否一致）、仍待 IPD 的名单、未解决名单，和第 11 节所列的 PRISMA 数字（Y、L、D、各理由的排除数、Pending IPD、纳入的报告数和儿童数、E4 安全网记录的去向、分歧怎样解决的）。两人的细节不一致的纳入记录，儿童数、ws_basis、重复链接留空，在提取共识时定；只有一人纳入的（另一人 Exclude，经分歧解决后纳入），暂取纳入者的值并标明。</w:t>
+      </w:r>
+      <w:r>
+        <w:rPr>
+          <w:rFonts w:ascii="Calibri" w:cs="Calibri" w:eastAsia="Microsoft YaHei" w:hAnsi="Calibri"/>
+          <w:b/>
+          <w:bCs/>
+        </w:rPr>
+        <w:t xml:space="preserve">这个脚本只用合成数据试过，还没有在真实的 FT_log 上跑过。</w:t>
+      </w:r>
+    </w:p>
+    <w:p>
+      <w:pPr>
+        <w:pStyle w:val="ListParagraph"/>
+        <w:numPr>
+          <w:ilvl w:val="0"/>
+          <w:numId w:val="2"/>
+        </w:numPr>
+        <w:spacing w:after="60"/>
+      </w:pPr>
+      <w:r>
+        <w:rPr>
+          <w:rFonts w:ascii="Calibri" w:cs="Calibri" w:eastAsia="Microsoft YaHei" w:hAnsi="Calibri"/>
+          <w:b/>
+          <w:bCs/>
+        </w:rPr>
         <w:t xml:space="preserve">一致性（D7，已决定）：</w:t>
       </w:r>
       <w:r>
@@ -8428,7 +8715,7 @@
         <w:sz w:val="17"/>
         <w:szCs w:val="17"/>
       </w:rPr>
-      <w:t xml:space="preserve">全文筛选指南 v2026-10-18c   |   第 </w:t>
+      <w:t xml:space="preserve">全文筛选指南 v2026-10-18d   |   第 </w:t>
     </w:r>
     <w:r>
       <w:rPr>

</xml_diff>

<commit_message>
Formal full-text FT_log workbooks for R1/R2 (540 pre-filled rows), --formal builder option, guide v2026-10-19a; log
Co-Authored-By: Claude Sonnet 5.5 <noreply@anthropic.com>
Claude-Session: https://claude.ai/code/session_01FRD7etKqYN8v2bbXeeLMRW
</commit_message>
<xml_diff>
--- a/Full-text screening guide (draft).docx
+++ b/Full-text screening guide (draft).docx
@@ -64,27 +64,13 @@
           <w:b/>
           <w:bCs/>
         </w:rPr>
-        <w:t xml:space="preserve">v2026-10-17a 的改动：</w:t>
-      </w:r>
-      <w:r>
-        <w:rPr>
-          <w:rFonts w:ascii="Calibri" w:cs="Calibri" w:eastAsia="Microsoft YaHei" w:hAnsi="Calibri"/>
-        </w:rPr>
-        <w:t xml:space="preserve"> (1) </w:t>
-      </w:r>
-      <w:r>
-        <w:rPr>
-          <w:rFonts w:ascii="Calibri" w:cs="Calibri" w:eastAsia="Microsoft YaHei" w:hAnsi="Calibri"/>
-          <w:b/>
-          <w:bCs/>
-        </w:rPr>
-        <w:t xml:space="preserve">新增日期规则：2000 年以前发表的报告不取全文</w:t>
-      </w:r>
-      <w:r>
-        <w:rPr>
-          <w:rFonts w:ascii="Calibri" w:cs="Calibri" w:eastAsia="Microsoft YaHei" w:hAnsi="Calibri"/>
-        </w:rPr>
-        <w:t xml:space="preserve">（作者 2026 年 10 月 17 日决定；理由码 </w:t>
+        <w:t xml:space="preserve">v2026-10-19a 的改动（只有状态说明，没有改任何判断规则）：</w:t>
+      </w:r>
+      <w:r>
+        <w:rPr>
+          <w:rFonts w:ascii="Calibri" w:cs="Calibri" w:eastAsia="Microsoft YaHei" w:hAnsi="Calibri"/>
+        </w:rPr>
+        <w:t xml:space="preserve"> 第 3 节加一条，说明已生成预填 540 篇的空白 FT_log（</w:t>
       </w:r>
       <w:r>
         <w:rPr>
@@ -93,6 +79,69 @@
           <w:szCs w:val="19"/>
           <w:shd w:fill="EEEEEE" w:val="clear"/>
         </w:rPr>
+        <w:t xml:space="preserve">FT_R1_blank.xlsx</w:t>
+      </w:r>
+      <w:r>
+        <w:rPr>
+          <w:rFonts w:ascii="Calibri" w:cs="Calibri" w:eastAsia="Microsoft YaHei" w:hAnsi="Calibri"/>
+        </w:rPr>
+        <w:t xml:space="preserve">、</w:t>
+      </w:r>
+      <w:r>
+        <w:rPr>
+          <w:rFonts w:ascii="Consolas" w:cs="Consolas" w:eastAsia="Microsoft YaHei" w:hAnsi="Consolas"/>
+          <w:sz w:val="19"/>
+          <w:szCs w:val="19"/>
+          <w:shd w:fill="EEEEEE" w:val="clear"/>
+        </w:rPr>
+        <w:t xml:space="preserve">FT_R2_blank.xlsx</w:t>
+      </w:r>
+      <w:r>
+        <w:rPr>
+          <w:rFonts w:ascii="Calibri" w:cs="Calibri" w:eastAsia="Microsoft YaHei" w:hAnsi="Calibri"/>
+        </w:rPr>
+        <w:t xml:space="preserve">）；第 12 节末补一句，说明正式记录表要等校准完成之后再用来记决定。</w:t>
+      </w:r>
+    </w:p>
+    <w:p>
+      <w:pPr>
+        <w:spacing w:after="120"/>
+      </w:pPr>
+      <w:r>
+        <w:rPr>
+          <w:rFonts w:ascii="Calibri" w:cs="Calibri" w:eastAsia="Microsoft YaHei" w:hAnsi="Calibri"/>
+          <w:b/>
+          <w:bCs/>
+        </w:rPr>
+        <w:t xml:space="preserve">v2026-10-17a 的改动：</w:t>
+      </w:r>
+      <w:r>
+        <w:rPr>
+          <w:rFonts w:ascii="Calibri" w:cs="Calibri" w:eastAsia="Microsoft YaHei" w:hAnsi="Calibri"/>
+        </w:rPr>
+        <w:t xml:space="preserve"> (1) </w:t>
+      </w:r>
+      <w:r>
+        <w:rPr>
+          <w:rFonts w:ascii="Calibri" w:cs="Calibri" w:eastAsia="Microsoft YaHei" w:hAnsi="Calibri"/>
+          <w:b/>
+          <w:bCs/>
+        </w:rPr>
+        <w:t xml:space="preserve">新增日期规则：2000 年以前发表的报告不取全文</w:t>
+      </w:r>
+      <w:r>
+        <w:rPr>
+          <w:rFonts w:ascii="Calibri" w:cs="Calibri" w:eastAsia="Microsoft YaHei" w:hAnsi="Calibri"/>
+        </w:rPr>
+        <w:t xml:space="preserve">（作者 2026 年 10 月 17 日决定；理由码 </w:t>
+      </w:r>
+      <w:r>
+        <w:rPr>
+          <w:rFonts w:ascii="Consolas" w:cs="Consolas" w:eastAsia="Microsoft YaHei" w:hAnsi="Consolas"/>
+          <w:sz w:val="19"/>
+          <w:szCs w:val="19"/>
+          <w:shd w:fill="EEEEEE" w:val="clear"/>
+        </w:rPr>
         <w:t xml:space="preserve">Y</w:t>
       </w:r>
       <w:r>
@@ -691,6 +740,150 @@
           <w:bCs/>
         </w:rPr>
         <w:t xml:space="preserve">两人都完成之前，不看对方的文件，不讨论具体的篇目。</w:t>
+      </w:r>
+    </w:p>
+    <w:p>
+      <w:pPr>
+        <w:pStyle w:val="ListParagraph"/>
+        <w:numPr>
+          <w:ilvl w:val="0"/>
+          <w:numId w:val="2"/>
+        </w:numPr>
+        <w:spacing w:after="60"/>
+      </w:pPr>
+      <w:r>
+        <w:rPr>
+          <w:rFonts w:ascii="Calibri" w:cs="Calibri" w:eastAsia="Microsoft YaHei" w:hAnsi="Calibri"/>
+          <w:b/>
+          <w:bCs/>
+        </w:rPr>
+        <w:t xml:space="preserve">预填 540 篇的空白 FT_log 已生成（2026 年 10 月 19 日）：</w:t>
+      </w:r>
+      <w:r>
+        <w:rPr>
+          <w:rFonts w:ascii="Calibri" w:cs="Calibri" w:eastAsia="Microsoft YaHei" w:hAnsi="Calibri"/>
+        </w:rPr>
+        <w:t xml:space="preserve"> </w:t>
+      </w:r>
+      <w:r>
+        <w:rPr>
+          <w:rFonts w:ascii="Consolas" w:cs="Consolas" w:eastAsia="Microsoft YaHei" w:hAnsi="Consolas"/>
+          <w:sz w:val="19"/>
+          <w:szCs w:val="19"/>
+          <w:shd w:fill="EEEEEE" w:val="clear"/>
+        </w:rPr>
+        <w:t xml:space="preserve">search/screening/fulltext/formal_workbooks/FT_R1_blank.xlsx</w:t>
+      </w:r>
+      <w:r>
+        <w:rPr>
+          <w:rFonts w:ascii="Calibri" w:cs="Calibri" w:eastAsia="Microsoft YaHei" w:hAnsi="Calibri"/>
+        </w:rPr>
+        <w:t xml:space="preserve">（舒俊）和 </w:t>
+      </w:r>
+      <w:r>
+        <w:rPr>
+          <w:rFonts w:ascii="Consolas" w:cs="Consolas" w:eastAsia="Microsoft YaHei" w:hAnsi="Consolas"/>
+          <w:sz w:val="19"/>
+          <w:szCs w:val="19"/>
+          <w:shd w:fill="EEEEEE" w:val="clear"/>
+        </w:rPr>
+        <w:t xml:space="preserve">FT_R2_blank.xlsx</w:t>
+      </w:r>
+      <w:r>
+        <w:rPr>
+          <w:rFonts w:ascii="Calibri" w:cs="Calibri" w:eastAsia="Microsoft YaHei" w:hAnsi="Calibri"/>
+        </w:rPr>
+        <w:t xml:space="preserve">（卞红强）。结构与校准用的工作簿相同（README、FT_log、FT_time_log、Report_list、Lists），FT_log 前 540 行已预填 ws_id、引文（第一作者姓氏加年份）、语种和筛选员代号（灰色，不要改），其余各列是空的，没有任何决定，也不含来源列或分层标记；Report_list 的 Position 与取回清单 </w:t>
+      </w:r>
+      <w:r>
+        <w:rPr>
+          <w:rFonts w:ascii="Consolas" w:cs="Consolas" w:eastAsia="Microsoft YaHei" w:hAnsi="Consolas"/>
+          <w:sz w:val="19"/>
+          <w:szCs w:val="19"/>
+          <w:shd w:fill="EEEEEE" w:val="clear"/>
+        </w:rPr>
+        <w:t xml:space="preserve">retrieval_worklist_540.xlsx</w:t>
+      </w:r>
+      <w:r>
+        <w:rPr>
+          <w:rFonts w:ascii="Calibri" w:cs="Calibri" w:eastAsia="Microsoft YaHei" w:hAnsi="Calibri"/>
+        </w:rPr>
+        <w:t xml:space="preserve"> 的 No. 一致。各自另存为 </w:t>
+      </w:r>
+      <w:r>
+        <w:rPr>
+          <w:rFonts w:ascii="Consolas" w:cs="Consolas" w:eastAsia="Microsoft YaHei" w:hAnsi="Consolas"/>
+          <w:sz w:val="19"/>
+          <w:szCs w:val="19"/>
+          <w:shd w:fill="EEEEEE" w:val="clear"/>
+        </w:rPr>
+        <w:t xml:space="preserve">FT_R1.xlsx</w:t>
+      </w:r>
+      <w:r>
+        <w:rPr>
+          <w:rFonts w:ascii="Calibri" w:cs="Calibri" w:eastAsia="Microsoft YaHei" w:hAnsi="Calibri"/>
+        </w:rPr>
+        <w:t xml:space="preserve"> / </w:t>
+      </w:r>
+      <w:r>
+        <w:rPr>
+          <w:rFonts w:ascii="Consolas" w:cs="Consolas" w:eastAsia="Microsoft YaHei" w:hAnsi="Consolas"/>
+          <w:sz w:val="19"/>
+          <w:szCs w:val="19"/>
+          <w:shd w:fill="EEEEEE" w:val="clear"/>
+        </w:rPr>
+        <w:t xml:space="preserve">FT_R2.xlsx</w:t>
+      </w:r>
+      <w:r>
+        <w:rPr>
+          <w:rFonts w:ascii="Calibri" w:cs="Calibri" w:eastAsia="Microsoft YaHei" w:hAnsi="Calibri"/>
+        </w:rPr>
+        <w:t xml:space="preserve"> 后使用。这 540 篇就是检索清单里 </w:t>
+      </w:r>
+      <w:r>
+        <w:rPr>
+          <w:rFonts w:ascii="Consolas" w:cs="Consolas" w:eastAsia="Microsoft YaHei" w:hAnsi="Consolas"/>
+          <w:sz w:val="19"/>
+          <w:szCs w:val="19"/>
+          <w:shd w:fill="EEEEEE" w:val="clear"/>
+        </w:rPr>
+        <w:t xml:space="preserve">retrieval_class</w:t>
+      </w:r>
+      <w:r>
+        <w:rPr>
+          <w:rFonts w:ascii="Calibri" w:cs="Calibri" w:eastAsia="Microsoft YaHei" w:hAnsi="Calibri"/>
+        </w:rPr>
+        <w:t xml:space="preserve"> = retrieve 的全部记录（核对过 WS 编号一致）。预填文件 </w:t>
+      </w:r>
+      <w:r>
+        <w:rPr>
+          <w:rFonts w:ascii="Consolas" w:cs="Consolas" w:eastAsia="Microsoft YaHei" w:hAnsi="Consolas"/>
+          <w:sz w:val="19"/>
+          <w:szCs w:val="19"/>
+          <w:shd w:fill="EEEEEE" w:val="clear"/>
+        </w:rPr>
+        <w:t xml:space="preserve">search/screening/fulltext/formal_prefill_540.csv</w:t>
+      </w:r>
+      <w:r>
+        <w:rPr>
+          <w:rFonts w:ascii="Calibri" w:cs="Calibri" w:eastAsia="Microsoft YaHei" w:hAnsi="Calibri"/>
+        </w:rPr>
+        <w:t xml:space="preserve">，生成命令见 </w:t>
+      </w:r>
+      <w:r>
+        <w:rPr>
+          <w:rFonts w:ascii="Consolas" w:cs="Consolas" w:eastAsia="Microsoft YaHei" w:hAnsi="Consolas"/>
+          <w:sz w:val="19"/>
+          <w:szCs w:val="19"/>
+          <w:shd w:fill="EEEEEE" w:val="clear"/>
+        </w:rPr>
+        <w:t xml:space="preserve">tools/build_extraction_workbook.py</w:t>
+      </w:r>
+      <w:r>
+        <w:rPr>
+          <w:rFonts w:ascii="Calibri" w:cs="Calibri" w:eastAsia="Microsoft YaHei" w:hAnsi="Calibri"/>
+        </w:rPr>
+        <w:t xml:space="preserve"> 开头的说明。</w:t>
       </w:r>
     </w:p>
     <w:p>
@@ -7343,7 +7536,21 @@
         <w:rPr>
           <w:rFonts w:ascii="Calibri" w:cs="Calibri" w:eastAsia="Microsoft YaHei" w:hAnsi="Calibri"/>
         </w:rPr>
-        <w:t xml:space="preserve"> 分开。填完后用 </w:t>
+        <w:t xml:space="preserve"> 分开。</w:t>
+      </w:r>
+      <w:r>
+        <w:rPr>
+          <w:rFonts w:ascii="Calibri" w:cs="Calibri" w:eastAsia="Microsoft YaHei" w:hAnsi="Calibri"/>
+          <w:b/>
+          <w:bCs/>
+        </w:rPr>
+        <w:t xml:space="preserve">正式记录表要等两人的校准做完、比对、讨论（指南有改动的话改完）之后再用来记决定；取全文不产生决定，可以先做。</w:t>
+      </w:r>
+      <w:r>
+        <w:rPr>
+          <w:rFonts w:ascii="Calibri" w:cs="Calibri" w:eastAsia="Microsoft YaHei" w:hAnsi="Calibri"/>
+        </w:rPr>
+        <w:t xml:space="preserve">填完后用 </w:t>
       </w:r>
       <w:r>
         <w:rPr>
@@ -8715,7 +8922,7 @@
         <w:sz w:val="17"/>
         <w:szCs w:val="17"/>
       </w:rPr>
-      <w:t xml:space="preserve">全文筛选指南 v2026-10-18d   |   第 </w:t>
+      <w:t xml:space="preserve">全文筛选指南 v2026-10-19a   |   第 </w:t>
     </w:r>
     <w:r>
       <w:rPr>

</xml_diff>

<commit_message>
finalize_fulltext: report IPD contact figures and flag contradictory contact entries
Co-Authored-By: Claude Sonnet 5.5 <noreply@anthropic.com>
Claude-Session: https://claude.ai/code/session_01FRD7etKqYN8v2bbXeeLMRW
</commit_message>
<xml_diff>
--- a/Full-text screening guide (draft).docx
+++ b/Full-text screening guide (draft).docx
@@ -52,6 +52,85 @@
           <w:rFonts w:ascii="Calibri" w:cs="Calibri" w:eastAsia="Microsoft YaHei" w:hAnsi="Calibri"/>
         </w:rPr>
         <w:t xml:space="preserve"> 本指南只是把已注册协议（第 7、10、14 节）的纳入排除标准落成全文阶段的操作规则，不改变协议。带【已决定】的是作者做出的决定，带【Claude 的操作化】的是 Claude 对决定的具体做法，需要三位确认；第 13 节是决定表。</w:t>
+      </w:r>
+    </w:p>
+    <w:p>
+      <w:pPr>
+        <w:spacing w:after="120"/>
+      </w:pPr>
+      <w:r>
+        <w:rPr>
+          <w:rFonts w:ascii="Calibri" w:cs="Calibri" w:eastAsia="Microsoft YaHei" w:hAnsi="Calibri"/>
+          <w:b/>
+          <w:bCs/>
+        </w:rPr>
+        <w:t xml:space="preserve">v2026-10-19b 的改动（只有状态说明，没有改任何判断规则）：</w:t>
+      </w:r>
+      <w:r>
+        <w:rPr>
+          <w:rFonts w:ascii="Calibri" w:cs="Calibri" w:eastAsia="Microsoft YaHei" w:hAnsi="Calibri"/>
+        </w:rPr>
+        <w:t xml:space="preserve"> 第 10 节汇总脚本一段补一句：加 </w:t>
+      </w:r>
+      <w:r>
+        <w:rPr>
+          <w:rFonts w:ascii="Consolas" w:cs="Consolas" w:eastAsia="Microsoft YaHei" w:hAnsi="Consolas"/>
+          <w:sz w:val="19"/>
+          <w:szCs w:val="19"/>
+          <w:shd w:fill="EEEEEE" w:val="clear"/>
+        </w:rPr>
+        <w:t xml:space="preserve">--ipd</w:t>
+      </w:r>
+      <w:r>
+        <w:rPr>
+          <w:rFonts w:ascii="Calibri" w:cs="Calibri" w:eastAsia="Microsoft YaHei" w:hAnsi="Calibri"/>
+        </w:rPr>
+        <w:t xml:space="preserve"> 时计数文件含联系数字（联系不上的作者数等）。脚本同时修了一个错误：提取工作簿里 </w:t>
+      </w:r>
+      <w:r>
+        <w:rPr>
+          <w:rFonts w:ascii="Consolas" w:cs="Consolas" w:eastAsia="Microsoft YaHei" w:hAnsi="Consolas"/>
+          <w:sz w:val="19"/>
+          <w:szCs w:val="19"/>
+          <w:shd w:fill="EEEEEE" w:val="clear"/>
+        </w:rPr>
+        <w:t xml:space="preserve">final_status</w:t>
+      </w:r>
+      <w:r>
+        <w:rPr>
+          <w:rFonts w:ascii="Calibri" w:cs="Calibri" w:eastAsia="Microsoft YaHei" w:hAnsi="Calibri"/>
+        </w:rPr>
+        <w:t xml:space="preserve"> 的下拉值是 </w:t>
+      </w:r>
+      <w:r>
+        <w:rPr>
+          <w:rFonts w:ascii="Consolas" w:cs="Consolas" w:eastAsia="Microsoft YaHei" w:hAnsi="Consolas"/>
+          <w:sz w:val="19"/>
+          <w:szCs w:val="19"/>
+          <w:shd w:fill="EEEEEE" w:val="clear"/>
+        </w:rPr>
+        <w:t xml:space="preserve">Narrative only (no individual data)</w:t>
+      </w:r>
+      <w:r>
+        <w:rPr>
+          <w:rFonts w:ascii="Calibri" w:cs="Calibri" w:eastAsia="Microsoft YaHei" w:hAnsi="Calibri"/>
+        </w:rPr>
+        <w:t xml:space="preserve">，旧脚本只认 </w:t>
+      </w:r>
+      <w:r>
+        <w:rPr>
+          <w:rFonts w:ascii="Consolas" w:cs="Consolas" w:eastAsia="Microsoft YaHei" w:hAnsi="Consolas"/>
+          <w:sz w:val="19"/>
+          <w:szCs w:val="19"/>
+          <w:shd w:fill="EEEEEE" w:val="clear"/>
+        </w:rPr>
+        <w:t xml:space="preserve">narrative only</w:t>
+      </w:r>
+      <w:r>
+        <w:rPr>
+          <w:rFonts w:ascii="Calibri" w:cs="Calibri" w:eastAsia="Microsoft YaHei" w:hAnsi="Calibri"/>
+        </w:rPr>
+        <w:t xml:space="preserve">，选了下拉值的报告会一直停在 Pending IPD。</w:t>
       </w:r>
     </w:p>
     <w:p>
@@ -7147,7 +7226,22 @@
         <w:rPr>
           <w:rFonts w:ascii="Calibri" w:cs="Calibri" w:eastAsia="Microsoft YaHei" w:hAnsi="Calibri"/>
         </w:rPr>
-        <w:t xml:space="preserve"> 或没有这一行 → 仍是 Pending IPD。输出：最终名单、纳入名单（</w:t>
+        <w:t xml:space="preserve"> 或没有这一行 → 仍是 Pending IPD。加 </w:t>
+      </w:r>
+      <w:r>
+        <w:rPr>
+          <w:rFonts w:ascii="Consolas" w:cs="Consolas" w:eastAsia="Microsoft YaHei" w:hAnsi="Consolas"/>
+          <w:sz w:val="19"/>
+          <w:szCs w:val="19"/>
+          <w:shd w:fill="EEEEEE" w:val="clear"/>
+        </w:rPr>
+        <w:t xml:space="preserve">--ipd</w:t>
+      </w:r>
+      <w:r>
+        <w:rPr>
+          <w:rFonts w:ascii="Calibri" w:cs="Calibri" w:eastAsia="Microsoft YaHei" w:hAnsi="Calibri"/>
+        </w:rPr>
+        <w:t xml:space="preserve"> 时，计数文件还会给出索取邮件的联系数字（第一封的结果、除论文地址外用过的途径、联系上和联系不上的作者数；同一位作者的名字写法相同才只算一位）和互相矛盾的登记提示（见《IPD 索取邮件》第 5 节）。输出：最终名单、纳入名单（</w:t>
       </w:r>
       <w:r>
         <w:rPr>
@@ -8922,7 +9016,7 @@
         <w:sz w:val="17"/>
         <w:szCs w:val="17"/>
       </w:rPr>
-      <w:t xml:space="preserve">全文筛选指南 v2026-10-19a   |   第 </w:t>
+      <w:t xml:space="preserve">全文筛选指南 v2026-10-19b   |   第 </w:t>
     </w:r>
     <w:r>
       <w:rPr>

</xml_diff>

<commit_message>
finalize_fulltext: add 4-week and 8-week deadline check for IPD requests
Co-Authored-By: Claude Sonnet 5.5 <noreply@anthropic.com>
Claude-Session: https://claude.ai/code/session_01FRD7etKqYN8v2bbXeeLMRW
</commit_message>
<xml_diff>
--- a/Full-text screening guide (draft).docx
+++ b/Full-text screening guide (draft).docx
@@ -52,6 +52,40 @@
           <w:rFonts w:ascii="Calibri" w:cs="Calibri" w:eastAsia="Microsoft YaHei" w:hAnsi="Calibri"/>
         </w:rPr>
         <w:t xml:space="preserve"> 本指南只是把已注册协议（第 7、10、14 节）的纳入排除标准落成全文阶段的操作规则，不改变协议。带【已决定】的是作者做出的决定，带【Claude 的操作化】的是 Claude 对决定的具体做法，需要三位确认；第 13 节是决定表。</w:t>
+      </w:r>
+    </w:p>
+    <w:p>
+      <w:pPr>
+        <w:spacing w:after="120"/>
+      </w:pPr>
+      <w:r>
+        <w:rPr>
+          <w:rFonts w:ascii="Calibri" w:cs="Calibri" w:eastAsia="Microsoft YaHei" w:hAnsi="Calibri"/>
+          <w:b/>
+          <w:bCs/>
+        </w:rPr>
+        <w:t xml:space="preserve">v2026-10-19c 的改动（只有状态说明，没有改任何判断规则）：</w:t>
+      </w:r>
+      <w:r>
+        <w:rPr>
+          <w:rFonts w:ascii="Calibri" w:cs="Calibri" w:eastAsia="Microsoft YaHei" w:hAnsi="Calibri"/>
+        </w:rPr>
+        <w:t xml:space="preserve"> 第 10 节汇总脚本一段再补一句：加 </w:t>
+      </w:r>
+      <w:r>
+        <w:rPr>
+          <w:rFonts w:ascii="Consolas" w:cs="Consolas" w:eastAsia="Microsoft YaHei" w:hAnsi="Consolas"/>
+          <w:sz w:val="19"/>
+          <w:szCs w:val="19"/>
+          <w:shd w:fill="EEEEEE" w:val="clear"/>
+        </w:rPr>
+        <w:t xml:space="preserve">--ipd</w:t>
+      </w:r>
+      <w:r>
+        <w:rPr>
+          <w:rFonts w:ascii="Calibri" w:cs="Calibri" w:eastAsia="Microsoft YaHei" w:hAnsi="Calibri"/>
+        </w:rPr>
+        <w:t xml:space="preserve"> 时脚本检查 IPD 索取的 4 周和 8 周期限。</w:t>
       </w:r>
     </w:p>
     <w:p>
@@ -7241,7 +7275,22 @@
         <w:rPr>
           <w:rFonts w:ascii="Calibri" w:cs="Calibri" w:eastAsia="Microsoft YaHei" w:hAnsi="Calibri"/>
         </w:rPr>
-        <w:t xml:space="preserve"> 时，计数文件还会给出索取邮件的联系数字（第一封的结果、除论文地址外用过的途径、联系上和联系不上的作者数；同一位作者的名字写法相同才只算一位）和互相矛盾的登记提示（见《IPD 索取邮件》第 5 节）。输出：最终名单、纳入名单（</w:t>
+        <w:t xml:space="preserve"> 时，计数文件还会给出索取邮件的联系数字（第一封的结果、除论文地址外用过的途径、联系上和联系不上的作者数；同一位作者的名字写法相同才只算一位）和互相矛盾的登记提示（见《IPD 索取邮件》第 5 节），以及到期检查：满 4 周没有第二封也没有回复的、满 8 周最终状态仍是 Pending 的（</w:t>
+      </w:r>
+      <w:r>
+        <w:rPr>
+          <w:rFonts w:ascii="Consolas" w:cs="Consolas" w:eastAsia="Microsoft YaHei" w:hAnsi="Consolas"/>
+          <w:sz w:val="19"/>
+          <w:szCs w:val="19"/>
+          <w:shd w:fill="EEEEEE" w:val="clear"/>
+        </w:rPr>
+        <w:t xml:space="preserve">--today yyyy-mm-dd</w:t>
+      </w:r>
+      <w:r>
+        <w:rPr>
+          <w:rFonts w:ascii="Calibri" w:cs="Calibri" w:eastAsia="Microsoft YaHei" w:hAnsi="Calibri"/>
+        </w:rPr>
+        <w:t xml:space="preserve"> 可指定检查日期，默认当天；脚本只在运行时检查）。输出：最终名单、纳入名单（</w:t>
       </w:r>
       <w:r>
         <w:rPr>
@@ -9016,7 +9065,7 @@
         <w:sz w:val="17"/>
         <w:szCs w:val="17"/>
       </w:rPr>
-      <w:t xml:space="preserve">全文筛选指南 v2026-10-19b   |   第 </w:t>
+      <w:t xml:space="preserve">全文筛选指南 v2026-10-19c   |   第 </w:t>
     </w:r>
     <w:r>
       <w:rPr>

</xml_diff>

<commit_message>
finalize_fulltext: make the IPD reminder and limit periods adjustable
Co-Authored-By: Claude Sonnet 5.5 <noreply@anthropic.com>
Claude-Session: https://claude.ai/code/session_01FRD7etKqYN8v2bbXeeLMRW
</commit_message>
<xml_diff>
--- a/Full-text screening guide (draft).docx
+++ b/Full-text screening guide (draft).docx
@@ -52,6 +52,25 @@
           <w:rFonts w:ascii="Calibri" w:cs="Calibri" w:eastAsia="Microsoft YaHei" w:hAnsi="Calibri"/>
         </w:rPr>
         <w:t xml:space="preserve"> 本指南只是把已注册协议（第 7、10、14 节）的纳入排除标准落成全文阶段的操作规则，不改变协议。带【已决定】的是作者做出的决定，带【Claude 的操作化】的是 Claude 对决定的具体做法，需要三位确认；第 13 节是决定表。</w:t>
+      </w:r>
+    </w:p>
+    <w:p>
+      <w:pPr>
+        <w:spacing w:after="120"/>
+      </w:pPr>
+      <w:r>
+        <w:rPr>
+          <w:rFonts w:ascii="Calibri" w:cs="Calibri" w:eastAsia="Microsoft YaHei" w:hAnsi="Calibri"/>
+          <w:b/>
+          <w:bCs/>
+        </w:rPr>
+        <w:t xml:space="preserve">v2026-10-19d 的改动（只有状态说明，没有改任何判断规则）：</w:t>
+      </w:r>
+      <w:r>
+        <w:rPr>
+          <w:rFonts w:ascii="Calibri" w:cs="Calibri" w:eastAsia="Microsoft YaHei" w:hAnsi="Calibri"/>
+        </w:rPr>
+        <w:t xml:space="preserve"> 第 10 节汇总脚本一段补一句：IPD 索取的 4 周和 8 周期限可用参数调整。</w:t>
       </w:r>
     </w:p>
     <w:p>
@@ -7290,7 +7309,37 @@
         <w:rPr>
           <w:rFonts w:ascii="Calibri" w:cs="Calibri" w:eastAsia="Microsoft YaHei" w:hAnsi="Calibri"/>
         </w:rPr>
-        <w:t xml:space="preserve"> 可指定检查日期，默认当天；脚本只在运行时检查）。输出：最终名单、纳入名单（</w:t>
+        <w:t xml:space="preserve"> 可指定检查日期，默认当天；两个期限默认 28 天和 56 天，可用 </w:t>
+      </w:r>
+      <w:r>
+        <w:rPr>
+          <w:rFonts w:ascii="Consolas" w:cs="Consolas" w:eastAsia="Microsoft YaHei" w:hAnsi="Consolas"/>
+          <w:sz w:val="19"/>
+          <w:szCs w:val="19"/>
+          <w:shd w:fill="EEEEEE" w:val="clear"/>
+        </w:rPr>
+        <w:t xml:space="preserve">--reminder-days</w:t>
+      </w:r>
+      <w:r>
+        <w:rPr>
+          <w:rFonts w:ascii="Calibri" w:cs="Calibri" w:eastAsia="Microsoft YaHei" w:hAnsi="Calibri"/>
+        </w:rPr>
+        <w:t xml:space="preserve">、</w:t>
+      </w:r>
+      <w:r>
+        <w:rPr>
+          <w:rFonts w:ascii="Consolas" w:cs="Consolas" w:eastAsia="Microsoft YaHei" w:hAnsi="Consolas"/>
+          <w:sz w:val="19"/>
+          <w:szCs w:val="19"/>
+          <w:shd w:fill="EEEEEE" w:val="clear"/>
+        </w:rPr>
+        <w:t xml:space="preserve">--limit-days</w:t>
+      </w:r>
+      <w:r>
+        <w:rPr>
+          <w:rFonts w:ascii="Calibri" w:cs="Calibri" w:eastAsia="Microsoft YaHei" w:hAnsi="Calibri"/>
+        </w:rPr>
+        <w:t xml:space="preserve"> 改，计数文件会写出用了哪两个值，8 周是 D6 的规定，改动要记录；脚本只在运行时检查）。输出：最终名单、纳入名单（</w:t>
       </w:r>
       <w:r>
         <w:rPr>
@@ -9065,7 +9114,7 @@
         <w:sz w:val="17"/>
         <w:szCs w:val="17"/>
       </w:rPr>
-      <w:t xml:space="preserve">全文筛选指南 v2026-10-19c   |   第 </w:t>
+      <w:t xml:space="preserve">全文筛选指南 v2026-10-19d   |   第 </w:t>
     </w:r>
     <w:r>
       <w:rPr>

</xml_diff>

<commit_message>
Full-text logs: blank n_children_aggregate counts as 0 in compare, check warns on blank for Include; align guide and workbooks
Co-Authored-By: Claude Sonnet 5.5 <noreply@anthropic.com>
Claude-Session: https://claude.ai/code/session_01FRD7etKqYN8v2bbXeeLMRW
</commit_message>
<xml_diff>
--- a/Full-text screening guide (draft).docx
+++ b/Full-text screening guide (draft).docx
@@ -52,6 +52,70 @@
           <w:rFonts w:ascii="Calibri" w:cs="Calibri" w:eastAsia="Microsoft YaHei" w:hAnsi="Calibri"/>
         </w:rPr>
         <w:t xml:space="preserve"> 本指南只是把已注册协议（第 7、10、14 节）的纳入排除标准落成全文阶段的操作规则，不改变协议。带【已决定】的是作者做出的决定，带【Claude 的操作化】的是 Claude 对决定的具体做法，需要三位确认；第 13 节是决定表。</w:t>
+      </w:r>
+    </w:p>
+    <w:p>
+      <w:pPr>
+        <w:spacing w:after="120"/>
+      </w:pPr>
+      <w:r>
+        <w:rPr>
+          <w:rFonts w:ascii="Calibri" w:cs="Calibri" w:eastAsia="Microsoft YaHei" w:hAnsi="Calibri"/>
+          <w:b/>
+          <w:bCs/>
+        </w:rPr>
+        <w:t xml:space="preserve">v2026-10-19e 的改动（只有填写约定和脚本说明，没有改任何判断规则）：</w:t>
+      </w:r>
+      <w:r>
+        <w:rPr>
+          <w:rFonts w:ascii="Calibri" w:cs="Calibri" w:eastAsia="Microsoft YaHei" w:hAnsi="Calibri"/>
+        </w:rPr>
+        <w:t xml:space="preserve"> 第 10 节 FT_log 列说明补一条：Include 的 </w:t>
+      </w:r>
+      <w:r>
+        <w:rPr>
+          <w:rFonts w:ascii="Consolas" w:cs="Consolas" w:eastAsia="Microsoft YaHei" w:hAnsi="Consolas"/>
+          <w:sz w:val="19"/>
+          <w:szCs w:val="19"/>
+          <w:shd w:fill="EEEEEE" w:val="clear"/>
+        </w:rPr>
+        <w:t xml:space="preserve">n_children_aggregate</w:t>
+      </w:r>
+      <w:r>
+        <w:rPr>
+          <w:rFonts w:ascii="Calibri" w:cs="Calibri" w:eastAsia="Microsoft YaHei" w:hAnsi="Calibri"/>
+        </w:rPr>
+        <w:t xml:space="preserve"> 没有就填 0。依据是 2026 年 10 月 19 日 20 篇校准的比对：两人都 Include 的 20 条记录里有 13 条只是一人填 0、一人留空，被当成差异；作者同意把规则改在脚本里。</w:t>
+      </w:r>
+      <w:r>
+        <w:rPr>
+          <w:rFonts w:ascii="Consolas" w:cs="Consolas" w:eastAsia="Microsoft YaHei" w:hAnsi="Consolas"/>
+          <w:sz w:val="19"/>
+          <w:szCs w:val="19"/>
+          <w:shd w:fill="EEEEEE" w:val="clear"/>
+        </w:rPr>
+        <w:t xml:space="preserve">compare_fulltext_logs.py check</w:t>
+      </w:r>
+      <w:r>
+        <w:rPr>
+          <w:rFonts w:ascii="Calibri" w:cs="Calibri" w:eastAsia="Microsoft YaHei" w:hAnsi="Calibri"/>
+        </w:rPr>
+        <w:t xml:space="preserve"> 对留空的 Include 给警告，</w:t>
+      </w:r>
+      <w:r>
+        <w:rPr>
+          <w:rFonts w:ascii="Consolas" w:cs="Consolas" w:eastAsia="Microsoft YaHei" w:hAnsi="Consolas"/>
+          <w:sz w:val="19"/>
+          <w:szCs w:val="19"/>
+          <w:shd w:fill="EEEEEE" w:val="clear"/>
+        </w:rPr>
+        <w:t xml:space="preserve">compare</w:t>
+      </w:r>
+      <w:r>
+        <w:rPr>
+          <w:rFonts w:ascii="Calibri" w:cs="Calibri" w:eastAsia="Microsoft YaHei" w:hAnsi="Calibri"/>
+        </w:rPr>
+        <w:t xml:space="preserve"> 把两人都 Include 的记录里这一列的留空与 0 视为相同（Pending IPD 的这一列仍须填实际人数，留空仍是差异）。空白 FT_log 的列说明和 README 也同步改了。</w:t>
       </w:r>
     </w:p>
     <w:p>
@@ -6668,6 +6732,35 @@
         </w:rPr>
         <w:t xml:space="preserve">：有个体数据的儿童数、只有汇总的儿童数。</w:t>
       </w:r>
+      <w:r>
+        <w:rPr>
+          <w:rFonts w:ascii="Calibri" w:cs="Calibri" w:eastAsia="Microsoft YaHei" w:hAnsi="Calibri"/>
+          <w:b/>
+          <w:bCs/>
+        </w:rPr>
+        <w:t xml:space="preserve">Include 的 n_children_aggregate 没有只有汇总的儿童就填 0，不要留空</w:t>
+      </w:r>
+      <w:r>
+        <w:rPr>
+          <w:rFonts w:ascii="Calibri" w:cs="Calibri" w:eastAsia="Microsoft YaHei" w:hAnsi="Calibri"/>
+        </w:rPr>
+        <w:t xml:space="preserve">（填写约定；检查脚本对留空的 Include 给警告，比对脚本把这一列的留空与 0 视为相同，不再列为差异）。Pending IPD 的 </w:t>
+      </w:r>
+      <w:r>
+        <w:rPr>
+          <w:rFonts w:ascii="Consolas" w:cs="Consolas" w:eastAsia="Microsoft YaHei" w:hAnsi="Consolas"/>
+          <w:sz w:val="19"/>
+          <w:szCs w:val="19"/>
+          <w:shd w:fill="EEEEEE" w:val="clear"/>
+        </w:rPr>
+        <w:t xml:space="preserve">n_children_aggregate</w:t>
+      </w:r>
+      <w:r>
+        <w:rPr>
+          <w:rFonts w:ascii="Calibri" w:cs="Calibri" w:eastAsia="Microsoft YaHei" w:hAnsi="Calibri"/>
+        </w:rPr>
+        <w:t xml:space="preserve"> 必须填实际人数。</w:t>
+      </w:r>
     </w:p>
     <w:p>
       <w:pPr>
@@ -9114,7 +9207,7 @@
         <w:sz w:val="17"/>
         <w:szCs w:val="17"/>
       </w:rPr>
-      <w:t xml:space="preserve">全文筛选指南 v2026-10-19d   |   第 </w:t>
+      <w:t xml:space="preserve">全文筛选指南 v2026-10-19e   |   第 </w:t>
     </w:r>
     <w:r>
       <w:rPr>

</xml_diff>

<commit_message>
Record WS2145 ws_basis agreement; guide v2026-10-19h (status only)
Co-Authored-By: Claude Sonnet 5.5 <noreply@anthropic.com>
Claude-Session: https://claude.ai/code/session_01FRD7etKqYN8v2bbXeeLMRW
</commit_message>
<xml_diff>
--- a/Full-text screening guide (draft).docx
+++ b/Full-text screening guide (draft).docx
@@ -52,6 +52,55 @@
           <w:rFonts w:ascii="Calibri" w:cs="Calibri" w:eastAsia="Microsoft YaHei" w:hAnsi="Calibri"/>
         </w:rPr>
         <w:t xml:space="preserve"> 本指南只是把已注册协议（第 7、10、14 节）的纳入排除标准落成全文阶段的操作规则，不改变协议。带【已决定】的是作者做出的决定，带【Claude 的操作化】的是 Claude 对决定的具体做法，需要三位确认；第 13 节是决定表。</w:t>
+      </w:r>
+    </w:p>
+    <w:p>
+      <w:pPr>
+        <w:spacing w:after="120"/>
+      </w:pPr>
+      <w:r>
+        <w:rPr>
+          <w:rFonts w:ascii="Calibri" w:cs="Calibri" w:eastAsia="Microsoft YaHei" w:hAnsi="Calibri"/>
+          <w:b/>
+          <w:bCs/>
+        </w:rPr>
+        <w:t xml:space="preserve">v2026-10-19h 的改动（只有状态说明）：</w:t>
+      </w:r>
+      <w:r>
+        <w:rPr>
+          <w:rFonts w:ascii="Calibri" w:cs="Calibri" w:eastAsia="Microsoft YaHei" w:hAnsi="Calibri"/>
+        </w:rPr>
+        <w:t xml:space="preserve"> 第 12 节的校准结果里，</w:t>
+      </w:r>
+      <w:r>
+        <w:rPr>
+          <w:rFonts w:ascii="Consolas" w:cs="Consolas" w:eastAsia="Microsoft YaHei" w:hAnsi="Consolas"/>
+          <w:sz w:val="19"/>
+          <w:szCs w:val="19"/>
+          <w:shd w:fill="EEEEEE" w:val="clear"/>
+        </w:rPr>
+        <w:t xml:space="preserve">ws_basis</w:t>
+      </w:r>
+      <w:r>
+        <w:rPr>
+          <w:rFonts w:ascii="Calibri" w:cs="Calibri" w:eastAsia="Microsoft YaHei" w:hAnsi="Calibri"/>
+        </w:rPr>
+        <w:t xml:space="preserve"> 的 5 处差异现在都已统一（作者转告：舒俊同意把最后一处改为 </w:t>
+      </w:r>
+      <w:r>
+        <w:rPr>
+          <w:rFonts w:ascii="Consolas" w:cs="Consolas" w:eastAsia="Microsoft YaHei" w:hAnsi="Consolas"/>
+          <w:sz w:val="19"/>
+          <w:szCs w:val="19"/>
+          <w:shd w:fill="EEEEEE" w:val="clear"/>
+        </w:rPr>
+        <w:t xml:space="preserve">Operation shows ectopic position or mobility</w:t>
+      </w:r>
+      <w:r>
+        <w:rPr>
+          <w:rFonts w:ascii="Calibri" w:cs="Calibri" w:eastAsia="Microsoft YaHei" w:hAnsi="Calibri"/>
+        </w:rPr>
+        <w:t xml:space="preserve">）；没有改任何规则。与 g 相比只差这一句，已发给两位筛选员的 g 不必重发。</w:t>
       </w:r>
     </w:p>
     <w:p>
@@ -8295,7 +8344,37 @@
         <w:rPr>
           <w:rFonts w:ascii="Calibri" w:cs="Calibri" w:eastAsia="Microsoft YaHei" w:hAnsi="Calibri"/>
         </w:rPr>
-        <w:t xml:space="preserve"> 的 5 处差异按 6.7 的选法统一，其中 1 处是否已完全一致作者的转述没有说清。这些是校准讨论的结论，</w:t>
+        <w:t xml:space="preserve"> 的 5 处差异讨论后都已统一（4 处卞红强改为 </w:t>
+      </w:r>
+      <w:r>
+        <w:rPr>
+          <w:rFonts w:ascii="Consolas" w:cs="Consolas" w:eastAsia="Microsoft YaHei" w:hAnsi="Consolas"/>
+          <w:sz w:val="19"/>
+          <w:szCs w:val="19"/>
+          <w:shd w:fill="EEEEEE" w:val="clear"/>
+        </w:rPr>
+        <w:t xml:space="preserve">Imaging and operation</w:t>
+      </w:r>
+      <w:r>
+        <w:rPr>
+          <w:rFonts w:ascii="Calibri" w:cs="Calibri" w:eastAsia="Microsoft YaHei" w:hAnsi="Calibri"/>
+        </w:rPr>
+        <w:t xml:space="preserve">，1 处舒俊同意改为 </w:t>
+      </w:r>
+      <w:r>
+        <w:rPr>
+          <w:rFonts w:ascii="Consolas" w:cs="Consolas" w:eastAsia="Microsoft YaHei" w:hAnsi="Consolas"/>
+          <w:sz w:val="19"/>
+          <w:szCs w:val="19"/>
+          <w:shd w:fill="EEEEEE" w:val="clear"/>
+        </w:rPr>
+        <w:t xml:space="preserve">Operation shows ectopic position or mobility</w:t>
+      </w:r>
+      <w:r>
+        <w:rPr>
+          <w:rFonts w:ascii="Calibri" w:cs="Calibri" w:eastAsia="Microsoft YaHei" w:hAnsi="Calibri"/>
+        </w:rPr>
+        <w:t xml:space="preserve">）。这些是校准讨论的结论，</w:t>
       </w:r>
       <w:r>
         <w:rPr>
@@ -9608,7 +9687,7 @@
         <w:sz w:val="17"/>
         <w:szCs w:val="17"/>
       </w:rPr>
-      <w:t xml:space="preserve">全文筛选指南 v2026-10-19g   |   第 </w:t>
+      <w:t xml:space="preserve">全文筛选指南 v2026-10-19h   |   第 </w:t>
     </w:r>
     <w:r>
       <w:rPr>

</xml_diff>

<commit_message>
Record WS2116 decision and Jun Yang's awareness; guide v2026-10-19i (6.7 wording)
Co-Authored-By: Claude Sonnet 5.5 <noreply@anthropic.com>
Claude-Session: https://claude.ai/code/session_01FRD7etKqYN8v2bbXeeLMRW
</commit_message>
<xml_diff>
--- a/Full-text screening guide (draft).docx
+++ b/Full-text screening guide (draft).docx
@@ -64,6 +64,54 @@
           <w:b/>
           <w:bCs/>
         </w:rPr>
+        <w:t xml:space="preserve">v2026-10-19i 的改动（作者 2026 年 10 月 19 日转告：WS2116 维持 Imaging and operation，杨俊已知道 6.5 和 6.7 的写法）：</w:t>
+      </w:r>
+      <w:r>
+        <w:rPr>
+          <w:rFonts w:ascii="Calibri" w:cs="Calibri" w:eastAsia="Microsoft YaHei" w:hAnsi="Calibri"/>
+        </w:rPr>
+        <w:t xml:space="preserve"> 6.7 补一句：术中明确写了“所见与影像诊断一致”的，也算手术依据（校准里一篇只有这样一句话，两位筛选员维持了 </w:t>
+      </w:r>
+      <w:r>
+        <w:rPr>
+          <w:rFonts w:ascii="Consolas" w:cs="Consolas" w:eastAsia="Microsoft YaHei" w:hAnsi="Consolas"/>
+          <w:sz w:val="19"/>
+          <w:szCs w:val="19"/>
+          <w:shd w:fill="EEEEEE" w:val="clear"/>
+        </w:rPr>
+        <w:t xml:space="preserve">Imaging and operation</w:t>
+      </w:r>
+      <w:r>
+        <w:rPr>
+          <w:rFonts w:ascii="Calibri" w:cs="Calibri" w:eastAsia="Microsoft YaHei" w:hAnsi="Calibri"/>
+        </w:rPr>
+        <w:t xml:space="preserve">；推广成一条规则是 Claude 的读法，待确认）。其余没有变。与 g、h 相比这一句是实质改动，</w:t>
+      </w:r>
+      <w:r>
+        <w:rPr>
+          <w:rFonts w:ascii="Calibri" w:cs="Calibri" w:eastAsia="Microsoft YaHei" w:hAnsi="Calibri"/>
+          <w:b/>
+          <w:bCs/>
+        </w:rPr>
+        <w:t xml:space="preserve">要把 i 重发给两位筛选员</w:t>
+      </w:r>
+      <w:r>
+        <w:rPr>
+          <w:rFonts w:ascii="Calibri" w:cs="Calibri" w:eastAsia="Microsoft YaHei" w:hAnsi="Calibri"/>
+        </w:rPr>
+        <w:t xml:space="preserve">。</w:t>
+      </w:r>
+    </w:p>
+    <w:p>
+      <w:pPr>
+        <w:spacing w:after="120"/>
+      </w:pPr>
+      <w:r>
+        <w:rPr>
+          <w:rFonts w:ascii="Calibri" w:cs="Calibri" w:eastAsia="Microsoft YaHei" w:hAnsi="Calibri"/>
+          <w:b/>
+          <w:bCs/>
+        </w:rPr>
         <w:t xml:space="preserve">v2026-10-19h 的改动（只有状态说明）：</w:t>
       </w:r>
       <w:r>
@@ -100,7 +148,7 @@
         <w:rPr>
           <w:rFonts w:ascii="Calibri" w:cs="Calibri" w:eastAsia="Microsoft YaHei" w:hAnsi="Calibri"/>
         </w:rPr>
-        <w:t xml:space="preserve">）；没有改任何规则。与 g 相比只差这一句，已发给两位筛选员的 g 不必重发。</w:t>
+        <w:t xml:space="preserve">）；没有改任何规则。与 g 相比只差这一句。</w:t>
       </w:r>
     </w:p>
     <w:p>
@@ -179,7 +227,7 @@
         <w:rPr>
           <w:rFonts w:ascii="Calibri" w:cs="Calibri" w:eastAsia="Microsoft YaHei" w:hAnsi="Calibri"/>
         </w:rPr>
-        <w:t xml:space="preserve">。指南里没有写具体篇目的决定。杨俊是否知道这两处写法，作者没有说明（两人讨论一致，没有交他仲裁）。</w:t>
+        <w:t xml:space="preserve">。指南里没有写具体篇目的决定。杨俊是否知道这两处写法，作者当时没有说明（两人讨论一致，没有交他仲裁）；作者后来转告他已知道。</w:t>
       </w:r>
     </w:p>
     <w:p>
@@ -4587,6 +4635,35 @@
           <w:b/>
           <w:bCs/>
         </w:rPr>
+        <w:t xml:space="preserve">【Claude 的读法，待确认】</w:t>
+      </w:r>
+      <w:r>
+        <w:rPr>
+          <w:rFonts w:ascii="Calibri" w:cs="Calibri" w:eastAsia="Microsoft YaHei" w:hAnsi="Calibri"/>
+        </w:rPr>
+        <w:t xml:space="preserve"> 术中明确写了“所见与影像诊断一致”的，算手术依据（校准里一篇只有这样一句话，两位筛选员维持了 </w:t>
+      </w:r>
+      <w:r>
+        <w:rPr>
+          <w:rFonts w:ascii="Consolas" w:cs="Consolas" w:eastAsia="Microsoft YaHei" w:hAnsi="Consolas"/>
+          <w:sz w:val="19"/>
+          <w:szCs w:val="19"/>
+          <w:shd w:fill="EEEEEE" w:val="clear"/>
+        </w:rPr>
+        <w:t xml:space="preserve">Imaging and operation</w:t>
+      </w:r>
+      <w:r>
+        <w:rPr>
+          <w:rFonts w:ascii="Calibri" w:cs="Calibri" w:eastAsia="Microsoft YaHei" w:hAnsi="Calibri"/>
+        </w:rPr>
+        <w:t xml:space="preserve">）。</w:t>
+      </w:r>
+      <w:r>
+        <w:rPr>
+          <w:rFonts w:ascii="Calibri" w:cs="Calibri" w:eastAsia="Microsoft YaHei" w:hAnsi="Calibri"/>
+          <w:b/>
+          <w:bCs/>
+        </w:rPr>
         <w:t xml:space="preserve">一篇报告里各例的依据不同时 FT_log 里填哪一个，讨论没有定。【Claude 的操作化，待确认】</w:t>
       </w:r>
       <w:r>
@@ -9687,7 +9764,7 @@
         <w:sz w:val="17"/>
         <w:szCs w:val="17"/>
       </w:rPr>
-      <w:t xml:space="preserve">全文筛选指南 v2026-10-19h   |   第 </w:t>
+      <w:t xml:space="preserve">全文筛选指南 v2026-10-19i   |   第 </w:t>
     </w:r>
     <w:r>
       <w:rPr>

</xml_diff>

<commit_message>
Approve 6.7 generalisation; guide v2026-10-19j (status tag only)
Co-Authored-By: Claude Sonnet 5.5 <noreply@anthropic.com>
Claude-Session: https://claude.ai/code/session_01FRD7etKqYN8v2bbXeeLMRW
</commit_message>
<xml_diff>
--- a/Full-text screening guide (draft).docx
+++ b/Full-text screening guide (draft).docx
@@ -52,6 +52,25 @@
           <w:rFonts w:ascii="Calibri" w:cs="Calibri" w:eastAsia="Microsoft YaHei" w:hAnsi="Calibri"/>
         </w:rPr>
         <w:t xml:space="preserve"> 本指南只是把已注册协议（第 7、10、14 节）的纳入排除标准落成全文阶段的操作规则，不改变协议。带【已决定】的是作者做出的决定，带【Claude 的操作化】的是 Claude 对决定的具体做法，需要三位确认；第 13 节是决定表。</w:t>
+      </w:r>
+    </w:p>
+    <w:p>
+      <w:pPr>
+        <w:spacing w:after="120"/>
+      </w:pPr>
+      <w:r>
+        <w:rPr>
+          <w:rFonts w:ascii="Calibri" w:cs="Calibri" w:eastAsia="Microsoft YaHei" w:hAnsi="Calibri"/>
+          <w:b/>
+          <w:bCs/>
+        </w:rPr>
+        <w:t xml:space="preserve">v2026-10-19j 的改动（只有状态说明）：</w:t>
+      </w:r>
+      <w:r>
+        <w:rPr>
+          <w:rFonts w:ascii="Calibri" w:cs="Calibri" w:eastAsia="Microsoft YaHei" w:hAnsi="Calibri"/>
+        </w:rPr>
+        <w:t xml:space="preserve"> 6.7 里“术中明确写了所见与影像诊断一致的，算手术依据”这一句，作者 2026 年 10 月 19 日同意按此推广，标记由“待确认”改为“已决定”；规则内容与 i 相同。卞红强是否已看到这一句，作者没有说明。</w:t>
       </w:r>
     </w:p>
     <w:p>
@@ -4635,7 +4654,7 @@
           <w:b/>
           <w:bCs/>
         </w:rPr>
-        <w:t xml:space="preserve">【Claude 的读法，待确认】</w:t>
+        <w:t xml:space="preserve">【已决定，2026 年 10 月 19 日作者同意按此推广】</w:t>
       </w:r>
       <w:r>
         <w:rPr>
@@ -9764,7 +9783,7 @@
         <w:sz w:val="17"/>
         <w:szCs w:val="17"/>
       </w:rPr>
-      <w:t xml:space="preserve">全文筛选指南 v2026-10-19i   |   第 </w:t>
+      <w:t xml:space="preserve">全文筛选指南 v2026-10-19j   |   第 </w:t>
     </w:r>
     <w:r>
       <w:rPr>

</xml_diff>

<commit_message>
Mixed ws_basis rule decided; guide v2026-10-19k
Co-Authored-By: Claude Sonnet 5.5 <noreply@anthropic.com>
Claude-Session: https://claude.ai/code/session_01FRD7etKqYN8v2bbXeeLMRW
</commit_message>
<xml_diff>
--- a/Full-text screening guide (draft).docx
+++ b/Full-text screening guide (draft).docx
@@ -52,6 +52,40 @@
           <w:rFonts w:ascii="Calibri" w:cs="Calibri" w:eastAsia="Microsoft YaHei" w:hAnsi="Calibri"/>
         </w:rPr>
         <w:t xml:space="preserve"> 本指南只是把已注册协议（第 7、10、14 节）的纳入排除标准落成全文阶段的操作规则，不改变协议。带【已决定】的是作者做出的决定，带【Claude 的操作化】的是 Claude 对决定的具体做法，需要三位确认；第 13 节是决定表。</w:t>
+      </w:r>
+    </w:p>
+    <w:p>
+      <w:pPr>
+        <w:spacing w:after="120"/>
+      </w:pPr>
+      <w:r>
+        <w:rPr>
+          <w:rFonts w:ascii="Calibri" w:cs="Calibri" w:eastAsia="Microsoft YaHei" w:hAnsi="Calibri"/>
+          <w:b/>
+          <w:bCs/>
+        </w:rPr>
+        <w:t xml:space="preserve">v2026-10-19k 的改动（只有状态说明和一处措辞）：</w:t>
+      </w:r>
+      <w:r>
+        <w:rPr>
+          <w:rFonts w:ascii="Calibri" w:cs="Calibri" w:eastAsia="Microsoft YaHei" w:hAnsi="Calibri"/>
+        </w:rPr>
+        <w:t xml:space="preserve"> 6.7 里“一篇报告里各例依据不同时 FT_log 填哪一个”由“Claude 的操作化，待确认”改为“已决定”（作者 2026 年 10 月 19 日决定：按最能说明问题的一个填，在 </w:t>
+      </w:r>
+      <w:r>
+        <w:rPr>
+          <w:rFonts w:ascii="Consolas" w:cs="Consolas" w:eastAsia="Microsoft YaHei" w:hAnsi="Consolas"/>
+          <w:sz w:val="19"/>
+          <w:szCs w:val="19"/>
+          <w:shd w:fill="EEEEEE" w:val="clear"/>
+        </w:rPr>
+        <w:t xml:space="preserve">note</w:t>
+      </w:r>
+      <w:r>
+        <w:rPr>
+          <w:rFonts w:ascii="Calibri" w:cs="Calibri" w:eastAsia="Microsoft YaHei" w:hAnsi="Calibri"/>
+        </w:rPr>
+        <w:t xml:space="preserve"> 里写明）；第 10 节随之删去“6.7 没有覆盖的取证据更强的”这一句。规则内容不变。附录取不到的情形仍未决定。</w:t>
       </w:r>
     </w:p>
     <w:p>
@@ -4683,13 +4717,13 @@
           <w:b/>
           <w:bCs/>
         </w:rPr>
-        <w:t xml:space="preserve">一篇报告里各例的依据不同时 FT_log 里填哪一个，讨论没有定。【Claude 的操作化，待确认】</w:t>
-      </w:r>
-      <w:r>
-        <w:rPr>
-          <w:rFonts w:ascii="Calibri" w:cs="Calibri" w:eastAsia="Microsoft YaHei" w:hAnsi="Calibri"/>
-        </w:rPr>
-        <w:t xml:space="preserve"> 先按这篇报告最能说明问题的一个填，在 </w:t>
+        <w:t xml:space="preserve">一篇报告里各例的依据不同时 FT_log 里填哪一个：【已决定，2026 年 10 月 19 日作者决定】</w:t>
+      </w:r>
+      <w:r>
+        <w:rPr>
+          <w:rFonts w:ascii="Calibri" w:cs="Calibri" w:eastAsia="Microsoft YaHei" w:hAnsi="Calibri"/>
+        </w:rPr>
+        <w:t xml:space="preserve"> 按这篇报告最能说明问题的一个填，在 </w:t>
       </w:r>
       <w:r>
         <w:rPr>
@@ -7415,7 +7449,7 @@
         <w:rPr>
           <w:rFonts w:ascii="Calibri" w:cs="Calibri" w:eastAsia="Microsoft YaHei" w:hAnsi="Calibri"/>
         </w:rPr>
-        <w:t xml:space="preserve"> 不影响是否纳入，在提取共识时统一，按 6.7 的选法；6.7 没有覆盖的（一篇里各例依据不同），取证据更强的。</w:t>
+        <w:t xml:space="preserve"> 不影响是否纳入，在提取共识时统一，按 6.7 的选法（包括一篇里各例依据不同的情形）。</w:t>
       </w:r>
     </w:p>
     <w:p>
@@ -9783,7 +9817,7 @@
         <w:sz w:val="17"/>
         <w:szCs w:val="17"/>
       </w:rPr>
-      <w:t xml:space="preserve">全文筛选指南 v2026-10-19j   |   第 </w:t>
+      <w:t xml:space="preserve">全文筛选指南 v2026-10-19k   |   第 </w:t>
     </w:r>
     <w:r>
       <w:rPr>

</xml_diff>

<commit_message>
Guide v2026-10-19l: appendix-not-obtainable rule in 6.5; IPD e-mail draft updated
Co-Authored-By: Claude Sonnet 5.5 <noreply@anthropic.com>
Claude-Session: https://claude.ai/code/session_01FRD7etKqYN8v2bbXeeLMRW
</commit_message>
<xml_diff>
--- a/Full-text screening guide (draft).docx
+++ b/Full-text screening guide (draft).docx
@@ -64,6 +64,54 @@
           <w:b/>
           <w:bCs/>
         </w:rPr>
+        <w:t xml:space="preserve">v2026-10-19l 的改动（作者 2026 年 10 月 19 日同意 Claude 的建议）：</w:t>
+      </w:r>
+      <w:r>
+        <w:rPr>
+          <w:rFonts w:ascii="Calibri" w:cs="Calibri" w:eastAsia="Microsoft YaHei" w:hAnsi="Calibri"/>
+        </w:rPr>
+        <w:t xml:space="preserve"> 6.5 写入“附录取不到”的处理：正文有部分个体信息的，这部分纳入、其余进 IPD 索取；正文完全没有个体数据的，两位筛选员都试过 4.2 的 1–4 条仍取不到，才记 Pending IPD（理由 A），IPD 邮件向作者要这份附录；一人取到、一人没取到按“Include 对 Pending IPD”的分歧处理；不用 D，也不直接 Exclude A。第 7 节速查表加了一行，4.2 指向 6.5。这是新增的实质规则，</w:t>
+      </w:r>
+      <w:r>
+        <w:rPr>
+          <w:rFonts w:ascii="Calibri" w:cs="Calibri" w:eastAsia="Microsoft YaHei" w:hAnsi="Calibri"/>
+          <w:b/>
+          <w:bCs/>
+        </w:rPr>
+        <w:t xml:space="preserve">要把 l 发给两位筛选员</w:t>
+      </w:r>
+      <w:r>
+        <w:rPr>
+          <w:rFonts w:ascii="Calibri" w:cs="Calibri" w:eastAsia="Microsoft YaHei" w:hAnsi="Calibri"/>
+        </w:rPr>
+        <w:t xml:space="preserve">。同日 k 版的改动（混合依据的 </w:t>
+      </w:r>
+      <w:r>
+        <w:rPr>
+          <w:rFonts w:ascii="Consolas" w:cs="Consolas" w:eastAsia="Microsoft YaHei" w:hAnsi="Consolas"/>
+          <w:sz w:val="19"/>
+          <w:szCs w:val="19"/>
+          <w:shd w:fill="EEEEEE" w:val="clear"/>
+        </w:rPr>
+        <w:t xml:space="preserve">ws_basis</w:t>
+      </w:r>
+      <w:r>
+        <w:rPr>
+          <w:rFonts w:ascii="Calibri" w:cs="Calibri" w:eastAsia="Microsoft YaHei" w:hAnsi="Calibri"/>
+        </w:rPr>
+        <w:t xml:space="preserve"> 已决定）一并包含。</w:t>
+      </w:r>
+    </w:p>
+    <w:p>
+      <w:pPr>
+        <w:spacing w:after="120"/>
+      </w:pPr>
+      <w:r>
+        <w:rPr>
+          <w:rFonts w:ascii="Calibri" w:cs="Calibri" w:eastAsia="Microsoft YaHei" w:hAnsi="Calibri"/>
+          <w:b/>
+          <w:bCs/>
+        </w:rPr>
         <w:t xml:space="preserve">v2026-10-19k 的改动（只有状态说明和一处措辞）：</w:t>
       </w:r>
       <w:r>
@@ -2144,7 +2192,7 @@
         <w:rPr>
           <w:rFonts w:ascii="Calibri" w:cs="Calibri" w:eastAsia="Microsoft YaHei" w:hAnsi="Calibri"/>
         </w:rPr>
-        <w:t xml:space="preserve"> 里写明；6.5 的判断要打开附录之后才能做。</w:t>
+        <w:t xml:space="preserve"> 里写明；6.5 的判断要打开附录之后才能做；附录取不到怎么办见 6.5。</w:t>
       </w:r>
     </w:p>
     <w:p>
@@ -4453,19 +4501,207 @@
         </w:rPr>
         <w:t xml:space="preserve"> 写明个体数据在哪里（如“逐例表在线上附录 1”）。</w:t>
       </w:r>
-      <w:r>
-        <w:rPr>
-          <w:rFonts w:ascii="Calibri" w:cs="Calibri" w:eastAsia="Microsoft YaHei" w:hAnsi="Calibri"/>
-          <w:b/>
-          <w:bCs/>
-        </w:rPr>
-        <w:t xml:space="preserve">附录取不到、正文又只有汇总或部分病例信息时怎么判，校准里没有遇到，没有决定</w:t>
-      </w:r>
-      <w:r>
-        <w:rPr>
-          <w:rFonts w:ascii="Calibri" w:cs="Calibri" w:eastAsia="Microsoft YaHei" w:hAnsi="Calibri"/>
-        </w:rPr>
-        <w:t xml:space="preserve">；遇到时记下 WS 编号，告诉 Claude 和杨俊。</w:t>
+    </w:p>
+    <w:p>
+      <w:pPr>
+        <w:pStyle w:val="ListParagraph"/>
+        <w:numPr>
+          <w:ilvl w:val="0"/>
+          <w:numId w:val="2"/>
+        </w:numPr>
+        <w:spacing w:after="60"/>
+      </w:pPr>
+      <w:r>
+        <w:rPr>
+          <w:rFonts w:ascii="Calibri" w:cs="Calibri" w:eastAsia="Microsoft YaHei" w:hAnsi="Calibri"/>
+          <w:b/>
+          <w:bCs/>
+        </w:rPr>
+        <w:t xml:space="preserve">【已决定，2026 年 10 月 19 日作者同意】逐例资料在附录里、而附录取不到：</w:t>
+      </w:r>
+    </w:p>
+    <w:p>
+      <w:pPr>
+        <w:pStyle w:val="ListParagraph"/>
+        <w:numPr>
+          <w:ilvl w:val="1"/>
+          <w:numId w:val="2"/>
+        </w:numPr>
+        <w:spacing w:after="60"/>
+      </w:pPr>
+      <w:r>
+        <w:rPr>
+          <w:rFonts w:ascii="Calibri" w:cs="Calibri" w:eastAsia="Microsoft YaHei" w:hAnsi="Calibri"/>
+          <w:b/>
+          <w:bCs/>
+        </w:rPr>
+        <w:t xml:space="preserve">正文有部分病例的个体信息：</w:t>
+      </w:r>
+      <w:r>
+        <w:rPr>
+          <w:rFonts w:ascii="Calibri" w:cs="Calibri" w:eastAsia="Microsoft YaHei" w:hAnsi="Calibri"/>
+        </w:rPr>
+        <w:t xml:space="preserve"> 按本节第一条，这部分病例纳入，其余的进 IPD 索取。</w:t>
+      </w:r>
+    </w:p>
+    <w:p>
+      <w:pPr>
+        <w:pStyle w:val="ListParagraph"/>
+        <w:numPr>
+          <w:ilvl w:val="1"/>
+          <w:numId w:val="2"/>
+        </w:numPr>
+        <w:spacing w:after="60"/>
+      </w:pPr>
+      <w:r>
+        <w:rPr>
+          <w:rFonts w:ascii="Calibri" w:cs="Calibri" w:eastAsia="Microsoft YaHei" w:hAnsi="Calibri"/>
+          <w:b/>
+          <w:bCs/>
+        </w:rPr>
+        <w:t xml:space="preserve">正文完全没有个体数据：</w:t>
+      </w:r>
+      <w:r>
+        <w:rPr>
+          <w:rFonts w:ascii="Calibri" w:cs="Calibri" w:eastAsia="Microsoft YaHei" w:hAnsi="Calibri"/>
+        </w:rPr>
+        <w:t xml:space="preserve"> 先按 4.2 的第 1–4 条找附录（出版社的补充文件页、PMC 补充材料、图书馆、期刊编辑部）。</w:t>
+      </w:r>
+      <w:r>
+        <w:rPr>
+          <w:rFonts w:ascii="Calibri" w:cs="Calibri" w:eastAsia="Microsoft YaHei" w:hAnsi="Calibri"/>
+          <w:b/>
+          <w:bCs/>
+        </w:rPr>
+        <w:t xml:space="preserve">两位筛选员都试过、都取不到</w:t>
+      </w:r>
+      <w:r>
+        <w:rPr>
+          <w:rFonts w:ascii="Calibri" w:cs="Calibri" w:eastAsia="Microsoft YaHei" w:hAnsi="Calibri"/>
+        </w:rPr>
+        <w:t xml:space="preserve">，才记 </w:t>
+      </w:r>
+      <w:r>
+        <w:rPr>
+          <w:rFonts w:ascii="Calibri" w:cs="Calibri" w:eastAsia="Microsoft YaHei" w:hAnsi="Calibri"/>
+          <w:b/>
+          <w:bCs/>
+        </w:rPr>
+        <w:t xml:space="preserve">Pending IPD（理由 A）</w:t>
+      </w:r>
+      <w:r>
+        <w:rPr>
+          <w:rFonts w:ascii="Calibri" w:cs="Calibri" w:eastAsia="Microsoft YaHei" w:hAnsi="Calibri"/>
+        </w:rPr>
+        <w:t xml:space="preserve">；</w:t>
+      </w:r>
+      <w:r>
+        <w:rPr>
+          <w:rFonts w:ascii="Consolas" w:cs="Consolas" w:eastAsia="Microsoft YaHei" w:hAnsi="Consolas"/>
+          <w:sz w:val="19"/>
+          <w:szCs w:val="19"/>
+          <w:shd w:fill="EEEEEE" w:val="clear"/>
+        </w:rPr>
+        <w:t xml:space="preserve">note</w:t>
+      </w:r>
+      <w:r>
+        <w:rPr>
+          <w:rFonts w:ascii="Calibri" w:cs="Calibri" w:eastAsia="Microsoft YaHei" w:hAnsi="Calibri"/>
+        </w:rPr>
+        <w:t xml:space="preserve"> 写“逐例资料在附录 X，取不到”，</w:t>
+      </w:r>
+      <w:r>
+        <w:rPr>
+          <w:rFonts w:ascii="Consolas" w:cs="Consolas" w:eastAsia="Microsoft YaHei" w:hAnsi="Consolas"/>
+          <w:sz w:val="19"/>
+          <w:szCs w:val="19"/>
+          <w:shd w:fill="EEEEEE" w:val="clear"/>
+        </w:rPr>
+        <w:t xml:space="preserve">routes_tried</w:t>
+      </w:r>
+      <w:r>
+        <w:rPr>
+          <w:rFonts w:ascii="Calibri" w:cs="Calibri" w:eastAsia="Microsoft YaHei" w:hAnsi="Calibri"/>
+        </w:rPr>
+        <w:t xml:space="preserve"> 或 </w:t>
+      </w:r>
+      <w:r>
+        <w:rPr>
+          <w:rFonts w:ascii="Consolas" w:cs="Consolas" w:eastAsia="Microsoft YaHei" w:hAnsi="Consolas"/>
+          <w:sz w:val="19"/>
+          <w:szCs w:val="19"/>
+          <w:shd w:fill="EEEEEE" w:val="clear"/>
+        </w:rPr>
+        <w:t xml:space="preserve">note</w:t>
+      </w:r>
+      <w:r>
+        <w:rPr>
+          <w:rFonts w:ascii="Calibri" w:cs="Calibri" w:eastAsia="Microsoft YaHei" w:hAnsi="Calibri"/>
+        </w:rPr>
+        <w:t xml:space="preserve"> 写试过的途径，</w:t>
+      </w:r>
+      <w:r>
+        <w:rPr>
+          <w:rFonts w:ascii="Consolas" w:cs="Consolas" w:eastAsia="Microsoft YaHei" w:hAnsi="Consolas"/>
+          <w:sz w:val="19"/>
+          <w:szCs w:val="19"/>
+          <w:shd w:fill="EEEEEE" w:val="clear"/>
+        </w:rPr>
+        <w:t xml:space="preserve">n_children_aggregate</w:t>
+      </w:r>
+      <w:r>
+        <w:rPr>
+          <w:rFonts w:ascii="Calibri" w:cs="Calibri" w:eastAsia="Microsoft YaHei" w:hAnsi="Calibri"/>
+        </w:rPr>
+        <w:t xml:space="preserve"> 填正文报告的儿童数。IPD 索取邮件直接向作者要这份附录（IPD 邮件草稿第 1 节），不另发 4.2 第 5 条的索取邮件，免得对同一位作者发两封。</w:t>
+      </w:r>
+    </w:p>
+    <w:p>
+      <w:pPr>
+        <w:pStyle w:val="ListParagraph"/>
+        <w:numPr>
+          <w:ilvl w:val="1"/>
+          <w:numId w:val="2"/>
+        </w:numPr>
+        <w:spacing w:after="60"/>
+      </w:pPr>
+      <w:r>
+        <w:rPr>
+          <w:rFonts w:ascii="Calibri" w:cs="Calibri" w:eastAsia="Microsoft YaHei" w:hAnsi="Calibri"/>
+          <w:b/>
+          <w:bCs/>
+        </w:rPr>
+        <w:t xml:space="preserve">一人取到、一人没取到：</w:t>
+      </w:r>
+      <w:r>
+        <w:rPr>
+          <w:rFonts w:ascii="Calibri" w:cs="Calibri" w:eastAsia="Microsoft YaHei" w:hAnsi="Calibri"/>
+        </w:rPr>
+        <w:t xml:space="preserve"> 取到的人记 Include，另一人记 Pending IPD，是“Include 对 Pending IPD”的分歧（第 10 节）；取到附录的人把文件交给对方，两人看过附录后按 6.5 统一。</w:t>
+      </w:r>
+    </w:p>
+    <w:p>
+      <w:pPr>
+        <w:pStyle w:val="ListParagraph"/>
+        <w:numPr>
+          <w:ilvl w:val="1"/>
+          <w:numId w:val="2"/>
+        </w:numPr>
+        <w:spacing w:after="60"/>
+      </w:pPr>
+      <w:r>
+        <w:rPr>
+          <w:rFonts w:ascii="Calibri" w:cs="Calibri" w:eastAsia="Microsoft YaHei" w:hAnsi="Calibri"/>
+          <w:b/>
+          <w:bCs/>
+        </w:rPr>
+        <w:t xml:space="preserve">不用 D，也不直接记 Exclude A：</w:t>
+      </w:r>
+      <w:r>
+        <w:rPr>
+          <w:rFonts w:ascii="Calibri" w:cs="Calibri" w:eastAsia="Microsoft YaHei" w:hAnsi="Calibri"/>
+        </w:rPr>
+        <w:t xml:space="preserve"> D 指报告本身的全文取不到，这里全文已经拿到；直接 Exclude A 则没有索取就放弃了。</w:t>
       </w:r>
     </w:p>
     <w:p>
@@ -5056,6 +5292,84 @@
                 <w:szCs w:val="20"/>
               </w:rPr>
               <w:t xml:space="preserve">，排除；两人都试过、都记 D 才确认（4.3）</w:t>
+            </w:r>
+          </w:p>
+        </w:tc>
+      </w:tr>
+      <w:tr>
+        <w:trPr>
+          <w:cantSplit/>
+          <w:tblHeader w:val="false"/>
+        </w:trPr>
+        <w:tc>
+          <w:tcPr>
+            <w:tcW w:type="dxa" w:w="4300"/>
+            <w:tcBorders>
+              <w:top w:val="single" w:color="BBBBBB" w:sz="4"/>
+              <w:left w:val="single" w:color="BBBBBB" w:sz="4"/>
+              <w:bottom w:val="single" w:color="BBBBBB" w:sz="4"/>
+              <w:right w:val="single" w:color="BBBBBB" w:sz="4"/>
+            </w:tcBorders>
+            <w:tcMar>
+              <w:top w:type="dxa" w:w="60"/>
+              <w:left w:type="dxa" w:w="100"/>
+              <w:bottom w:type="dxa" w:w="60"/>
+              <w:right w:type="dxa" w:w="100"/>
+            </w:tcMar>
+          </w:tcPr>
+          <w:p>
+            <w:r>
+              <w:rPr>
+                <w:rFonts w:ascii="Calibri" w:cs="Calibri" w:eastAsia="Microsoft YaHei" w:hAnsi="Calibri"/>
+                <w:sz w:val="20"/>
+                <w:szCs w:val="20"/>
+              </w:rPr>
+              <w:t xml:space="preserve">逐例资料在线上附录，附录取不到，正文只有汇总</w:t>
+            </w:r>
+          </w:p>
+        </w:tc>
+        <w:tc>
+          <w:tcPr>
+            <w:tcW w:type="dxa" w:w="4726"/>
+            <w:tcBorders>
+              <w:top w:val="single" w:color="BBBBBB" w:sz="4"/>
+              <w:left w:val="single" w:color="BBBBBB" w:sz="4"/>
+              <w:bottom w:val="single" w:color="BBBBBB" w:sz="4"/>
+              <w:right w:val="single" w:color="BBBBBB" w:sz="4"/>
+            </w:tcBorders>
+            <w:tcMar>
+              <w:top w:type="dxa" w:w="60"/>
+              <w:left w:type="dxa" w:w="100"/>
+              <w:bottom w:type="dxa" w:w="60"/>
+              <w:right w:type="dxa" w:w="100"/>
+            </w:tcMar>
+          </w:tcPr>
+          <w:p>
+            <w:r>
+              <w:rPr>
+                <w:rFonts w:ascii="Calibri" w:cs="Calibri" w:eastAsia="Microsoft YaHei" w:hAnsi="Calibri"/>
+                <w:sz w:val="20"/>
+                <w:szCs w:val="20"/>
+              </w:rPr>
+              <w:t xml:space="preserve">两人都试过 4.2 的 1–4 条仍取不到 → </w:t>
+            </w:r>
+            <w:r>
+              <w:rPr>
+                <w:rFonts w:ascii="Calibri" w:cs="Calibri" w:eastAsia="Microsoft YaHei" w:hAnsi="Calibri"/>
+                <w:b/>
+                <w:bCs/>
+                <w:sz w:val="20"/>
+                <w:szCs w:val="20"/>
+              </w:rPr>
+              <w:t xml:space="preserve">A</w:t>
+            </w:r>
+            <w:r>
+              <w:rPr>
+                <w:rFonts w:ascii="Calibri" w:cs="Calibri" w:eastAsia="Microsoft YaHei" w:hAnsi="Calibri"/>
+                <w:sz w:val="20"/>
+                <w:szCs w:val="20"/>
+              </w:rPr>
+              <w:t xml:space="preserve">（Pending IPD），邮件向作者要这份附录；不是 D（6.5）</w:t>
             </w:r>
           </w:p>
         </w:tc>
@@ -9817,7 +10131,7 @@
         <w:sz w:val="17"/>
         <w:szCs w:val="17"/>
       </w:rPr>
-      <w:t xml:space="preserve">全文筛选指南 v2026-10-19k   |   第 </w:t>
+      <w:t xml:space="preserve">全文筛选指南 v2026-10-19l   |   第 </w:t>
     </w:r>
     <w:r>
       <w:rPr>

</xml_diff>

<commit_message>
Guide v2026-10-19m: record that Jun Yang and Hongqiang Bian know the 6.5/6.7 rules (status only)
Co-Authored-By: Claude Sonnet 5.5 <noreply@anthropic.com>
Claude-Session: https://claude.ai/code/session_01FRD7etKqYN8v2bbXeeLMRW
</commit_message>
<xml_diff>
--- a/Full-text screening guide (draft).docx
+++ b/Full-text screening guide (draft).docx
@@ -64,6 +64,40 @@
           <w:b/>
           <w:bCs/>
         </w:rPr>
+        <w:t xml:space="preserve">v2026-10-19m 的改动（只有状态说明）：</w:t>
+      </w:r>
+      <w:r>
+        <w:rPr>
+          <w:rFonts w:ascii="Calibri" w:cs="Calibri" w:eastAsia="Microsoft YaHei" w:hAnsi="Calibri"/>
+        </w:rPr>
+        <w:t xml:space="preserve"> 作者 2026 年 10 月 19 日转告：杨俊和卞红强都已知道 6.5（附录里的逐例表、附录取不到）和 6.7（</w:t>
+      </w:r>
+      <w:r>
+        <w:rPr>
+          <w:rFonts w:ascii="Consolas" w:cs="Consolas" w:eastAsia="Microsoft YaHei" w:hAnsi="Consolas"/>
+          <w:sz w:val="19"/>
+          <w:szCs w:val="19"/>
+          <w:shd w:fill="EEEEEE" w:val="clear"/>
+        </w:rPr>
+        <w:t xml:space="preserve">ws_basis</w:t>
+      </w:r>
+      <w:r>
+        <w:rPr>
+          <w:rFonts w:ascii="Calibri" w:cs="Calibri" w:eastAsia="Microsoft YaHei" w:hAnsi="Calibri"/>
+        </w:rPr>
+        <w:t xml:space="preserve"> 的选法）的新规则。这里和 j 版说明里“是否知道”的几处随之更新。规则与 l 相同，已发出的 l 不必重发。</w:t>
+      </w:r>
+    </w:p>
+    <w:p>
+      <w:pPr>
+        <w:spacing w:after="120"/>
+      </w:pPr>
+      <w:r>
+        <w:rPr>
+          <w:rFonts w:ascii="Calibri" w:cs="Calibri" w:eastAsia="Microsoft YaHei" w:hAnsi="Calibri"/>
+          <w:b/>
+          <w:bCs/>
+        </w:rPr>
         <w:t xml:space="preserve">v2026-10-19l 的改动（作者 2026 年 10 月 19 日同意 Claude 的建议）：</w:t>
       </w:r>
       <w:r>
@@ -152,7 +186,7 @@
         <w:rPr>
           <w:rFonts w:ascii="Calibri" w:cs="Calibri" w:eastAsia="Microsoft YaHei" w:hAnsi="Calibri"/>
         </w:rPr>
-        <w:t xml:space="preserve"> 6.7 里“术中明确写了所见与影像诊断一致的，算手术依据”这一句，作者 2026 年 10 月 19 日同意按此推广，标记由“待确认”改为“已决定”；规则内容与 i 相同。卞红强是否已看到这一句，作者没有说明。</w:t>
+        <w:t xml:space="preserve"> 6.7 里“术中明确写了所见与影像诊断一致的，算手术依据”这一句，作者 2026 年 10 月 19 日同意按此推广，标记由“待确认”改为“已决定”；规则内容与 i 相同。卞红强是否已看到这一句，作者当时没有说明；后来作者转告他已知道 6.5 和 6.7 的新规则。</w:t>
       </w:r>
     </w:p>
     <w:p>
@@ -10131,7 +10165,7 @@
         <w:sz w:val="17"/>
         <w:szCs w:val="17"/>
       </w:rPr>
-      <w:t xml:space="preserve">全文筛选指南 v2026-10-19l   |   第 </w:t>
+      <w:t xml:space="preserve">全文筛选指南 v2026-10-19m   |   第 </w:t>
     </w:r>
     <w:r>
       <w:rPr>

</xml_diff>

<commit_message>
Guide v2026-10-19n: midpoint-check arrangement
Co-Authored-By: Claude Sonnet 5.5 <noreply@anthropic.com>
Claude-Session: https://claude.ai/code/session_01FRD7etKqYN8v2bbXeeLMRW
</commit_message>
<xml_diff>
--- a/Full-text screening guide (draft).docx
+++ b/Full-text screening guide (draft).docx
@@ -64,6 +64,33 @@
           <w:b/>
           <w:bCs/>
         </w:rPr>
+        <w:t xml:space="preserve">v2026-10-19n 的改动（作者 2026 年 10 月 19 日同意）：</w:t>
+      </w:r>
+      <w:r>
+        <w:rPr>
+          <w:rFonts w:ascii="Calibri" w:cs="Calibri" w:eastAsia="Microsoft YaHei" w:hAnsi="Calibri"/>
+        </w:rPr>
+        <w:t xml:space="preserve"> 第 3 节“中途检查”补了具体做法：每人 50 篇后按原样把文件交 Claude、一次一份只做格式检查；卞红强的文件在对话里只报各类问题的条数，逐行清单另存为单独文件。没有改任何纳入排除的规则。</w:t>
+      </w:r>
+      <w:r>
+        <w:rPr>
+          <w:rFonts w:ascii="Calibri" w:cs="Calibri" w:eastAsia="Microsoft YaHei" w:hAnsi="Calibri"/>
+          <w:b/>
+          <w:bCs/>
+        </w:rPr>
+        <w:t xml:space="preserve">这一条涉及卞红强的文件会经过舒俊的对话，要让卞红强和杨俊知道，并把 n 发给两位筛选员。</w:t>
+      </w:r>
+    </w:p>
+    <w:p>
+      <w:pPr>
+        <w:spacing w:after="120"/>
+      </w:pPr>
+      <w:r>
+        <w:rPr>
+          <w:rFonts w:ascii="Calibri" w:cs="Calibri" w:eastAsia="Microsoft YaHei" w:hAnsi="Calibri"/>
+          <w:b/>
+          <w:bCs/>
+        </w:rPr>
         <w:t xml:space="preserve">v2026-10-19m 的改动（只有状态说明）：</w:t>
       </w:r>
       <w:r>
@@ -1596,6 +1623,44 @@
           <w:rFonts w:ascii="Calibri" w:cs="Calibri" w:eastAsia="Microsoft YaHei" w:hAnsi="Calibri"/>
         </w:rPr>
         <w:t xml:space="preserve">（一次只看一份文件；列出决定值、理由名称、必填项、重复行、不该读的记录——发表早于 2000 年的；脚本不检查用时）。两人都完成后再互相交换。</w:t>
+      </w:r>
+    </w:p>
+    <w:p>
+      <w:pPr>
+        <w:pStyle w:val="ListParagraph"/>
+        <w:numPr>
+          <w:ilvl w:val="1"/>
+          <w:numId w:val="2"/>
+        </w:numPr>
+        <w:spacing w:after="60"/>
+      </w:pPr>
+      <w:r>
+        <w:rPr>
+          <w:rFonts w:ascii="Calibri" w:cs="Calibri" w:eastAsia="Microsoft YaHei" w:hAnsi="Calibri"/>
+          <w:b/>
+          <w:bCs/>
+        </w:rPr>
+        <w:t xml:space="preserve">【已决定，2026 年 10 月 19 日作者同意】中途检查的具体做法：</w:t>
+      </w:r>
+      <w:r>
+        <w:rPr>
+          <w:rFonts w:ascii="Calibri" w:cs="Calibri" w:eastAsia="Microsoft YaHei" w:hAnsi="Calibri"/>
+        </w:rPr>
+        <w:t xml:space="preserve"> 每人做完 50 篇（指已记了决定的行，预填没处理的行不算）后，另存带日期的副本，按原样交给 Claude，一次一份，每份分别检查，此时不做两人的比对。唯一的联系渠道是舒俊的对话，所以卞红强的文件会经过舒俊那里；因此 Claude 对卞红强的文件</w:t>
+      </w:r>
+      <w:r>
+        <w:rPr>
+          <w:rFonts w:ascii="Calibri" w:cs="Calibri" w:eastAsia="Microsoft YaHei" w:hAnsi="Calibri"/>
+          <w:b/>
+          <w:bCs/>
+        </w:rPr>
+        <w:t xml:space="preserve">在对话里只报告各类问题的条数</w:t>
+      </w:r>
+      <w:r>
+        <w:rPr>
+          <w:rFonts w:ascii="Calibri" w:cs="Calibri" w:eastAsia="Microsoft YaHei" w:hAnsi="Calibri"/>
+        </w:rPr>
+        <w:t xml:space="preserve">（如“2 条 Exclude 没写理由”），不说是哪几篇、各记了什么；逐行的问题清单写成单独的文件，舒俊可以不打开，直接转给杨俊或卞红强。舒俊自己的文件，问题逐行告诉他。Claude 不会把一位筛选员的任何一篇决定说给另一位。这只查格式，不判断决定对不对，也没有一致率。卞红强和杨俊是否知道这个做法，作者没有说明，请告知。</w:t>
       </w:r>
     </w:p>
     <w:p>
@@ -10165,7 +10230,7 @@
         <w:sz w:val="17"/>
         <w:szCs w:val="17"/>
       </w:rPr>
-      <w:t xml:space="preserve">全文筛选指南 v2026-10-19m   |   第 </w:t>
+      <w:t xml:space="preserve">全文筛选指南 v2026-10-19n   |   第 </w:t>
     </w:r>
     <w:r>
       <w:rPr>

</xml_diff>

<commit_message>
Full-text guide v2026-10-19o: rule for book chapters
Co-Authored-By: Claude Sonnet 5.5 <noreply@anthropic.com>
Claude-Session: https://claude.ai/code/session_01FRD7etKqYN8v2bbXeeLMRW
</commit_message>
<xml_diff>
--- a/Full-text screening guide (draft).docx
+++ b/Full-text screening guide (draft).docx
@@ -52,6 +52,25 @@
           <w:rFonts w:ascii="Calibri" w:cs="Calibri" w:eastAsia="Microsoft YaHei" w:hAnsi="Calibri"/>
         </w:rPr>
         <w:t xml:space="preserve"> 本指南只是把已注册协议（第 7、10、14 节）的纳入排除标准落成全文阶段的操作规则，不改变协议。带【已决定】的是作者做出的决定，带【Claude 的操作化】的是 Claude 对决定的具体做法，需要三位确认；第 13 节是决定表。</w:t>
+      </w:r>
+    </w:p>
+    <w:p>
+      <w:pPr>
+        <w:spacing w:after="120"/>
+      </w:pPr>
+      <w:r>
+        <w:rPr>
+          <w:rFonts w:ascii="Calibri" w:cs="Calibri" w:eastAsia="Microsoft YaHei" w:hAnsi="Calibri"/>
+          <w:b/>
+          <w:bCs/>
+        </w:rPr>
+        <w:t xml:space="preserve">v2026-10-19o 的改动（作者 2026 年 10 月 23 日同意 Claude 的建议）：</w:t>
+      </w:r>
+      <w:r>
+        <w:rPr>
+          <w:rFonts w:ascii="Calibri" w:cs="Calibri" w:eastAsia="Microsoft YaHei" w:hAnsi="Calibri"/>
+        </w:rPr>
+        <w:t xml:space="preserve"> 6.1 第 3 题和第 7 节速查表各补书的章节的处理：没有本章作者自己的新病例记 E4（兽医书记 E1，两条都符合记 E4），有新病例的照期刊文章继续判断，不因为是章节而排除；E6 只留给读后无法归类的。原指南没有这一类的规则（全文阶段、标题摘要阶段都没有）。没有改其他规则；这不是对已注册纳入标准的偏离。卞红强和杨俊是否已知道这一条，作者没有说明。</w:t>
       </w:r>
     </w:p>
     <w:p>
@@ -3735,6 +3754,147 @@
     </w:p>
     <w:p>
       <w:pPr>
+        <w:spacing w:after="120"/>
+      </w:pPr>
+      <w:r>
+        <w:rPr>
+          <w:rFonts w:ascii="Calibri" w:cs="Calibri" w:eastAsia="Microsoft YaHei" w:hAnsi="Calibri"/>
+        </w:rPr>
+        <w:t xml:space="preserve">书的章节</w:t>
+      </w:r>
+      <w:r>
+        <w:rPr>
+          <w:rFonts w:ascii="Calibri" w:cs="Calibri" w:eastAsia="Microsoft YaHei" w:hAnsi="Calibri"/>
+          <w:b/>
+          <w:bCs/>
+        </w:rPr>
+        <w:t xml:space="preserve">不是 E5</w:t>
+      </w:r>
+      <w:r>
+        <w:rPr>
+          <w:rFonts w:ascii="Calibri" w:cs="Calibri" w:eastAsia="Microsoft YaHei" w:hAnsi="Calibri"/>
+        </w:rPr>
+        <w:t xml:space="preserve">，也不因为是章节而排除（【已决定】，作者 2026 年 10 月 23 日）：读后按内容判断——没有本章作者自己的新病例 → </w:t>
+      </w:r>
+      <w:r>
+        <w:rPr>
+          <w:rFonts w:ascii="Calibri" w:cs="Calibri" w:eastAsia="Microsoft YaHei" w:hAnsi="Calibri"/>
+          <w:b/>
+          <w:bCs/>
+        </w:rPr>
+        <w:t xml:space="preserve">E4</w:t>
+      </w:r>
+      <w:r>
+        <w:rPr>
+          <w:rFonts w:ascii="Calibri" w:cs="Calibri" w:eastAsia="Microsoft YaHei" w:hAnsi="Calibri"/>
+        </w:rPr>
+        <w:t xml:space="preserve">（</w:t>
+      </w:r>
+      <w:r>
+        <w:rPr>
+          <w:rFonts w:ascii="Consolas" w:cs="Consolas" w:eastAsia="Microsoft YaHei" w:hAnsi="Consolas"/>
+          <w:sz w:val="19"/>
+          <w:szCs w:val="19"/>
+          <w:shd w:fill="EEEEEE" w:val="clear"/>
+        </w:rPr>
+        <w:t xml:space="preserve">note</w:t>
+      </w:r>
+      <w:r>
+        <w:rPr>
+          <w:rFonts w:ascii="Calibri" w:cs="Calibri" w:eastAsia="Microsoft YaHei" w:hAnsi="Calibri"/>
+        </w:rPr>
+        <w:t xml:space="preserve"> 写“书的章节，不是期刊文章”，可同时写 </w:t>
+      </w:r>
+      <w:r>
+        <w:rPr>
+          <w:rFonts w:ascii="Consolas" w:cs="Consolas" w:eastAsia="Microsoft YaHei" w:hAnsi="Consolas"/>
+          <w:sz w:val="19"/>
+          <w:szCs w:val="19"/>
+          <w:shd w:fill="EEEEEE" w:val="clear"/>
+        </w:rPr>
+        <w:t xml:space="preserve">review-for-refs</w:t>
+      </w:r>
+      <w:r>
+        <w:rPr>
+          <w:rFonts w:ascii="Calibri" w:cs="Calibri" w:eastAsia="Microsoft YaHei" w:hAnsi="Calibri"/>
+        </w:rPr>
+        <w:t xml:space="preserve">）；兽医书的章节 → </w:t>
+      </w:r>
+      <w:r>
+        <w:rPr>
+          <w:rFonts w:ascii="Calibri" w:cs="Calibri" w:eastAsia="Microsoft YaHei" w:hAnsi="Calibri"/>
+          <w:b/>
+          <w:bCs/>
+        </w:rPr>
+        <w:t xml:space="preserve">E1</w:t>
+      </w:r>
+      <w:r>
+        <w:rPr>
+          <w:rFonts w:ascii="Calibri" w:cs="Calibri" w:eastAsia="Microsoft YaHei" w:hAnsi="Calibri"/>
+        </w:rPr>
+        <w:t xml:space="preserve">（两条都符合时按第 5 节的顺序记 E4）；</w:t>
+      </w:r>
+      <w:r>
+        <w:rPr>
+          <w:rFonts w:ascii="Calibri" w:cs="Calibri" w:eastAsia="Microsoft YaHei" w:hAnsi="Calibri"/>
+          <w:b/>
+          <w:bCs/>
+        </w:rPr>
+        <w:t xml:space="preserve">有作者自己的新病例 → 照期刊文章继续往下判断</w:t>
+      </w:r>
+      <w:r>
+        <w:rPr>
+          <w:rFonts w:ascii="Calibri" w:cs="Calibri" w:eastAsia="Microsoft YaHei" w:hAnsi="Calibri"/>
+        </w:rPr>
+        <w:t xml:space="preserve">（6.2 起），</w:t>
+      </w:r>
+      <w:r>
+        <w:rPr>
+          <w:rFonts w:ascii="Consolas" w:cs="Consolas" w:eastAsia="Microsoft YaHei" w:hAnsi="Consolas"/>
+          <w:sz w:val="19"/>
+          <w:szCs w:val="19"/>
+          <w:shd w:fill="EEEEEE" w:val="clear"/>
+        </w:rPr>
+        <w:t xml:space="preserve">note</w:t>
+      </w:r>
+      <w:r>
+        <w:rPr>
+          <w:rFonts w:ascii="Calibri" w:cs="Calibri" w:eastAsia="Microsoft YaHei" w:hAnsi="Calibri"/>
+        </w:rPr>
+        <w:t xml:space="preserve"> 写“书的章节”以便核对出处；读后确实不属于这几种、也不符合其他理由的 → </w:t>
+      </w:r>
+      <w:r>
+        <w:rPr>
+          <w:rFonts w:ascii="Calibri" w:cs="Calibri" w:eastAsia="Microsoft YaHei" w:hAnsi="Calibri"/>
+          <w:b/>
+          <w:bCs/>
+        </w:rPr>
+        <w:t xml:space="preserve">E6</w:t>
+      </w:r>
+      <w:r>
+        <w:rPr>
+          <w:rFonts w:ascii="Calibri" w:cs="Calibri" w:eastAsia="Microsoft YaHei" w:hAnsi="Calibri"/>
+        </w:rPr>
+        <w:t xml:space="preserve">，</w:t>
+      </w:r>
+      <w:r>
+        <w:rPr>
+          <w:rFonts w:ascii="Consolas" w:cs="Consolas" w:eastAsia="Microsoft YaHei" w:hAnsi="Consolas"/>
+          <w:sz w:val="19"/>
+          <w:szCs w:val="19"/>
+          <w:shd w:fill="EEEEEE" w:val="clear"/>
+        </w:rPr>
+        <w:t xml:space="preserve">note</w:t>
+      </w:r>
+      <w:r>
+        <w:rPr>
+          <w:rFonts w:ascii="Calibri" w:cs="Calibri" w:eastAsia="Microsoft YaHei" w:hAnsi="Calibri"/>
+        </w:rPr>
+        <w:t xml:space="preserve"> 写具体说明。</w:t>
+      </w:r>
+    </w:p>
+    <w:p>
+      <w:pPr>
         <w:pStyle w:val="Heading3"/>
         <w:keepNext/>
       </w:pPr>
@@ -5765,6 +5925,170 @@
                 <w:szCs w:val="20"/>
               </w:rPr>
               <w:t xml:space="preserve">；不从综述表里取别人的病例</w:t>
+            </w:r>
+          </w:p>
+        </w:tc>
+      </w:tr>
+      <w:tr>
+        <w:trPr>
+          <w:cantSplit/>
+          <w:tblHeader w:val="false"/>
+        </w:trPr>
+        <w:tc>
+          <w:tcPr>
+            <w:tcW w:type="dxa" w:w="4300"/>
+            <w:tcBorders>
+              <w:top w:val="single" w:color="BBBBBB" w:sz="4"/>
+              <w:left w:val="single" w:color="BBBBBB" w:sz="4"/>
+              <w:bottom w:val="single" w:color="BBBBBB" w:sz="4"/>
+              <w:right w:val="single" w:color="BBBBBB" w:sz="4"/>
+            </w:tcBorders>
+            <w:tcMar>
+              <w:top w:type="dxa" w:w="60"/>
+              <w:left w:type="dxa" w:w="100"/>
+              <w:bottom w:type="dxa" w:w="60"/>
+              <w:right w:type="dxa" w:w="100"/>
+            </w:tcMar>
+          </w:tcPr>
+          <w:p>
+            <w:r>
+              <w:rPr>
+                <w:rFonts w:ascii="Calibri" w:cs="Calibri" w:eastAsia="Microsoft YaHei" w:hAnsi="Calibri"/>
+                <w:sz w:val="20"/>
+                <w:szCs w:val="20"/>
+              </w:rPr>
+              <w:t xml:space="preserve">书的章节，没有本章作者自己的新病例</w:t>
+            </w:r>
+          </w:p>
+        </w:tc>
+        <w:tc>
+          <w:tcPr>
+            <w:tcW w:type="dxa" w:w="4726"/>
+            <w:tcBorders>
+              <w:top w:val="single" w:color="BBBBBB" w:sz="4"/>
+              <w:left w:val="single" w:color="BBBBBB" w:sz="4"/>
+              <w:bottom w:val="single" w:color="BBBBBB" w:sz="4"/>
+              <w:right w:val="single" w:color="BBBBBB" w:sz="4"/>
+            </w:tcBorders>
+            <w:tcMar>
+              <w:top w:type="dxa" w:w="60"/>
+              <w:left w:type="dxa" w:w="100"/>
+              <w:bottom w:type="dxa" w:w="60"/>
+              <w:right w:type="dxa" w:w="100"/>
+            </w:tcMar>
+          </w:tcPr>
+          <w:p>
+            <w:r>
+              <w:rPr>
+                <w:rFonts w:ascii="Calibri" w:cs="Calibri" w:eastAsia="Microsoft YaHei" w:hAnsi="Calibri"/>
+                <w:b/>
+                <w:bCs/>
+                <w:sz w:val="20"/>
+                <w:szCs w:val="20"/>
+              </w:rPr>
+              <w:t xml:space="preserve">E4</w:t>
+            </w:r>
+            <w:r>
+              <w:rPr>
+                <w:rFonts w:ascii="Calibri" w:cs="Calibri" w:eastAsia="Microsoft YaHei" w:hAnsi="Calibri"/>
+                <w:sz w:val="20"/>
+                <w:szCs w:val="20"/>
+              </w:rPr>
+              <w:t xml:space="preserve">（兽医书的章节记 E1；两条都符合时按顺序记 E4）；</w:t>
+            </w:r>
+            <w:r>
+              <w:rPr>
+                <w:rFonts w:ascii="Consolas" w:cs="Consolas" w:eastAsia="Microsoft YaHei" w:hAnsi="Consolas"/>
+                <w:sz w:val="20"/>
+                <w:szCs w:val="20"/>
+                <w:shd w:fill="EEEEEE" w:val="clear"/>
+              </w:rPr>
+              <w:t xml:space="preserve">note</w:t>
+            </w:r>
+            <w:r>
+              <w:rPr>
+                <w:rFonts w:ascii="Calibri" w:cs="Calibri" w:eastAsia="Microsoft YaHei" w:hAnsi="Calibri"/>
+                <w:sz w:val="20"/>
+                <w:szCs w:val="20"/>
+              </w:rPr>
+              <w:t xml:space="preserve"> 写“书的章节，不是期刊文章”</w:t>
+            </w:r>
+          </w:p>
+        </w:tc>
+      </w:tr>
+      <w:tr>
+        <w:trPr>
+          <w:cantSplit/>
+          <w:tblHeader w:val="false"/>
+        </w:trPr>
+        <w:tc>
+          <w:tcPr>
+            <w:tcW w:type="dxa" w:w="4300"/>
+            <w:tcBorders>
+              <w:top w:val="single" w:color="BBBBBB" w:sz="4"/>
+              <w:left w:val="single" w:color="BBBBBB" w:sz="4"/>
+              <w:bottom w:val="single" w:color="BBBBBB" w:sz="4"/>
+              <w:right w:val="single" w:color="BBBBBB" w:sz="4"/>
+            </w:tcBorders>
+            <w:tcMar>
+              <w:top w:type="dxa" w:w="60"/>
+              <w:left w:type="dxa" w:w="100"/>
+              <w:bottom w:type="dxa" w:w="60"/>
+              <w:right w:type="dxa" w:w="100"/>
+            </w:tcMar>
+          </w:tcPr>
+          <w:p>
+            <w:r>
+              <w:rPr>
+                <w:rFonts w:ascii="Calibri" w:cs="Calibri" w:eastAsia="Microsoft YaHei" w:hAnsi="Calibri"/>
+                <w:sz w:val="20"/>
+                <w:szCs w:val="20"/>
+              </w:rPr>
+              <w:t xml:space="preserve">书的章节，有作者自己的新病例</w:t>
+            </w:r>
+          </w:p>
+        </w:tc>
+        <w:tc>
+          <w:tcPr>
+            <w:tcW w:type="dxa" w:w="4726"/>
+            <w:tcBorders>
+              <w:top w:val="single" w:color="BBBBBB" w:sz="4"/>
+              <w:left w:val="single" w:color="BBBBBB" w:sz="4"/>
+              <w:bottom w:val="single" w:color="BBBBBB" w:sz="4"/>
+              <w:right w:val="single" w:color="BBBBBB" w:sz="4"/>
+            </w:tcBorders>
+            <w:tcMar>
+              <w:top w:type="dxa" w:w="60"/>
+              <w:left w:type="dxa" w:w="100"/>
+              <w:bottom w:type="dxa" w:w="60"/>
+              <w:right w:type="dxa" w:w="100"/>
+            </w:tcMar>
+          </w:tcPr>
+          <w:p>
+            <w:r>
+              <w:rPr>
+                <w:rFonts w:ascii="Calibri" w:cs="Calibri" w:eastAsia="Microsoft YaHei" w:hAnsi="Calibri"/>
+                <w:sz w:val="20"/>
+                <w:szCs w:val="20"/>
+              </w:rPr>
+              <w:t xml:space="preserve">不因为是章节而排除，照期刊文章继续判断；</w:t>
+            </w:r>
+            <w:r>
+              <w:rPr>
+                <w:rFonts w:ascii="Consolas" w:cs="Consolas" w:eastAsia="Microsoft YaHei" w:hAnsi="Consolas"/>
+                <w:sz w:val="20"/>
+                <w:szCs w:val="20"/>
+                <w:shd w:fill="EEEEEE" w:val="clear"/>
+              </w:rPr>
+              <w:t xml:space="preserve">note</w:t>
+            </w:r>
+            <w:r>
+              <w:rPr>
+                <w:rFonts w:ascii="Calibri" w:cs="Calibri" w:eastAsia="Microsoft YaHei" w:hAnsi="Calibri"/>
+                <w:sz w:val="20"/>
+                <w:szCs w:val="20"/>
+              </w:rPr>
+              <w:t xml:space="preserve"> 写“书的章节”</w:t>
             </w:r>
           </w:p>
         </w:tc>
@@ -10230,7 +10554,7 @@
         <w:sz w:val="17"/>
         <w:szCs w:val="17"/>
       </w:rPr>
-      <w:t xml:space="preserve">全文筛选指南 v2026-10-19n   |   第 </w:t>
+      <w:t xml:space="preserve">全文筛选指南 v2026-10-19o   |   第 </w:t>
     </w:r>
     <w:r>
       <w:rPr>

</xml_diff>